<commit_message>
Finally completed 25HF from the single volume from the Folders and project management category , also completed 5 patterns also .At the end We updated the registries and metrics.
I have reached my goal for today. I was going to stop thinking about next days and stay at current and complete the small tasks that is valuable for us.
</commit_message>
<xml_diff>
--- a/atlas/Registries/APID-Registry.docx
+++ b/atlas/Registries/APID-Registry.docx
@@ -18,6 +18,12 @@
       </w:r>
     </w:p>
     <w:p>
+      <w:pPr>
+        <w:rPr>
+          <w:b/>
+          <w:bCs/>
+        </w:rPr>
+      </w:pPr>
       <w:r>
         <w:rPr>
           <w:b/>
@@ -28,13 +34,68 @@
     </w:p>
     <w:p>
       <w:r>
-        <w:t>The APID Registry serves as the master index of all Human Frictions documented in the ATLAS repository. It provides a centralized reference for tracking APIDs, titles, categories, versions, and document status, ensuring every Human Friction can be uniquely identified and managed throughout its lifecycle.</w:t>
+        <w:t xml:space="preserve">The </w:t>
+      </w:r>
+      <w:r>
+        <w:rPr>
+          <w:b/>
+          <w:bCs/>
+        </w:rPr>
+        <w:t>APID Registry</w:t>
+      </w:r>
+      <w:r>
+        <w:t xml:space="preserve"> serves as the authoritative master index of all </w:t>
+      </w:r>
+      <w:r>
+        <w:rPr>
+          <w:b/>
+          <w:bCs/>
+        </w:rPr>
+        <w:t>Human Frictions</w:t>
+      </w:r>
+      <w:r>
+        <w:t xml:space="preserve"> documented within the </w:t>
+      </w:r>
+      <w:r>
+        <w:rPr>
+          <w:b/>
+          <w:bCs/>
+        </w:rPr>
+        <w:t>ATLAS</w:t>
+      </w:r>
+      <w:r>
+        <w:t xml:space="preserve"> repository. It provides a centralized reference for tracking every Human Friction using a unique </w:t>
+      </w:r>
+      <w:r>
+        <w:rPr>
+          <w:b/>
+          <w:bCs/>
+        </w:rPr>
+        <w:t>APID (ATLAS Problem Identifier)</w:t>
+      </w:r>
+      <w:r>
+        <w:t>, ensuring each documented observation can be consistently referenced, maintained, and expanded throughout its lifecycle.</w:t>
       </w:r>
     </w:p>
     <w:p>
       <w:r>
-        <w:pict w14:anchorId="74E58A2E">
-          <v:rect id="_x0000_i1045" style="width:0;height:1.5pt" o:hralign="center" o:hrstd="t" o:hr="t" fillcolor="#a0a0a0" stroked="f"/>
+        <w:t xml:space="preserve">The Registry functions as the </w:t>
+      </w:r>
+      <w:r>
+        <w:rPr>
+          <w:b/>
+          <w:bCs/>
+        </w:rPr>
+        <w:t>single source of truth</w:t>
+      </w:r>
+      <w:r>
+        <w:t xml:space="preserve"> for Human Friction identification. Detailed metadata, evidence, research notes, revision history, and supporting information are maintained within the individual Human Friction documents rather than duplicated in this Registry.</w:t>
+      </w:r>
+    </w:p>
+    <w:p>
+      <w:r>
+        <w:pict w14:anchorId="5BA59697">
+          <v:rect id="_x0000_i1106" style="width:0;height:1.5pt" o:hralign="center" o:hrstd="t" o:hr="t" fillcolor="#a0a0a0" stroked="f"/>
         </w:pict>
       </w:r>
     </w:p>
@@ -66,8 +127,8 @@
         <w:tblLook w:val="04A0" w:firstRow="1" w:lastRow="0" w:firstColumn="1" w:lastColumn="0" w:noHBand="0" w:noVBand="1"/>
       </w:tblPr>
       <w:tblGrid>
-        <w:gridCol w:w="1528"/>
-        <w:gridCol w:w="4945"/>
+        <w:gridCol w:w="784"/>
+        <w:gridCol w:w="7997"/>
       </w:tblGrid>
       <w:tr>
         <w:trPr>
@@ -201,72 +262,6 @@
                 <w:b/>
                 <w:bCs/>
               </w:rPr>
-              <w:t>Category</w:t>
-            </w:r>
-          </w:p>
-        </w:tc>
-        <w:tc>
-          <w:tcPr>
-            <w:tcW w:w="0" w:type="auto"/>
-            <w:vAlign w:val="center"/>
-            <w:hideMark/>
-          </w:tcPr>
-          <w:p>
-            <w:r>
-              <w:t>Primary ATLAS category.</w:t>
-            </w:r>
-          </w:p>
-        </w:tc>
-      </w:tr>
-      <w:tr>
-        <w:trPr>
-          <w:tblCellSpacing w:w="15" w:type="dxa"/>
-        </w:trPr>
-        <w:tc>
-          <w:tcPr>
-            <w:tcW w:w="0" w:type="auto"/>
-            <w:vAlign w:val="center"/>
-            <w:hideMark/>
-          </w:tcPr>
-          <w:p>
-            <w:r>
-              <w:rPr>
-                <w:b/>
-                <w:bCs/>
-              </w:rPr>
-              <w:t>Subcategory</w:t>
-            </w:r>
-          </w:p>
-        </w:tc>
-        <w:tc>
-          <w:tcPr>
-            <w:tcW w:w="0" w:type="auto"/>
-            <w:vAlign w:val="center"/>
-            <w:hideMark/>
-          </w:tcPr>
-          <w:p>
-            <w:r>
-              <w:t>Classification within the category.</w:t>
-            </w:r>
-          </w:p>
-        </w:tc>
-      </w:tr>
-      <w:tr>
-        <w:trPr>
-          <w:tblCellSpacing w:w="15" w:type="dxa"/>
-        </w:trPr>
-        <w:tc>
-          <w:tcPr>
-            <w:tcW w:w="0" w:type="auto"/>
-            <w:vAlign w:val="center"/>
-            <w:hideMark/>
-          </w:tcPr>
-          <w:p>
-            <w:r>
-              <w:rPr>
-                <w:b/>
-                <w:bCs/>
-              </w:rPr>
               <w:t>Status</w:t>
             </w:r>
           </w:p>
@@ -279,106 +274,7 @@
           </w:tcPr>
           <w:p>
             <w:r>
-              <w:t>Current documentation status (e.g., Accepted).</w:t>
-            </w:r>
-          </w:p>
-        </w:tc>
-      </w:tr>
-      <w:tr>
-        <w:trPr>
-          <w:tblCellSpacing w:w="15" w:type="dxa"/>
-        </w:trPr>
-        <w:tc>
-          <w:tcPr>
-            <w:tcW w:w="0" w:type="auto"/>
-            <w:vAlign w:val="center"/>
-            <w:hideMark/>
-          </w:tcPr>
-          <w:p>
-            <w:r>
-              <w:rPr>
-                <w:b/>
-                <w:bCs/>
-              </w:rPr>
-              <w:t>Version</w:t>
-            </w:r>
-          </w:p>
-        </w:tc>
-        <w:tc>
-          <w:tcPr>
-            <w:tcW w:w="0" w:type="auto"/>
-            <w:vAlign w:val="center"/>
-            <w:hideMark/>
-          </w:tcPr>
-          <w:p>
-            <w:r>
-              <w:t>Current document version.</w:t>
-            </w:r>
-          </w:p>
-        </w:tc>
-      </w:tr>
-      <w:tr>
-        <w:trPr>
-          <w:tblCellSpacing w:w="15" w:type="dxa"/>
-        </w:trPr>
-        <w:tc>
-          <w:tcPr>
-            <w:tcW w:w="0" w:type="auto"/>
-            <w:vAlign w:val="center"/>
-            <w:hideMark/>
-          </w:tcPr>
-          <w:p>
-            <w:r>
-              <w:rPr>
-                <w:b/>
-                <w:bCs/>
-              </w:rPr>
-              <w:t>Created</w:t>
-            </w:r>
-          </w:p>
-        </w:tc>
-        <w:tc>
-          <w:tcPr>
-            <w:tcW w:w="0" w:type="auto"/>
-            <w:vAlign w:val="center"/>
-            <w:hideMark/>
-          </w:tcPr>
-          <w:p>
-            <w:r>
-              <w:t>Initial creation date.</w:t>
-            </w:r>
-          </w:p>
-        </w:tc>
-      </w:tr>
-      <w:tr>
-        <w:trPr>
-          <w:tblCellSpacing w:w="15" w:type="dxa"/>
-        </w:trPr>
-        <w:tc>
-          <w:tcPr>
-            <w:tcW w:w="0" w:type="auto"/>
-            <w:vAlign w:val="center"/>
-            <w:hideMark/>
-          </w:tcPr>
-          <w:p>
-            <w:r>
-              <w:rPr>
-                <w:b/>
-                <w:bCs/>
-              </w:rPr>
-              <w:t>Last Updated</w:t>
-            </w:r>
-          </w:p>
-        </w:tc>
-        <w:tc>
-          <w:tcPr>
-            <w:tcW w:w="0" w:type="auto"/>
-            <w:vAlign w:val="center"/>
-            <w:hideMark/>
-          </w:tcPr>
-          <w:p>
-            <w:r>
-              <w:t>Most recent revision date.</w:t>
+              <w:t>Current documentation status (Candidate, Accepted, Archived, Deprecated).</w:t>
             </w:r>
           </w:p>
         </w:tc>
@@ -386,8 +282,8 @@
     </w:tbl>
     <w:p>
       <w:r>
-        <w:pict w14:anchorId="24F30DA9">
-          <v:rect id="_x0000_i1046" style="width:0;height:1.5pt" o:hralign="center" o:hrstd="t" o:hr="t" fillcolor="#a0a0a0" stroked="f"/>
+        <w:pict w14:anchorId="7A8F07D4">
+          <v:rect id="_x0000_i1107" style="width:0;height:1.5pt" o:hralign="center" o:hrstd="t" o:hr="t" fillcolor="#a0a0a0" stroked="f"/>
         </w:pict>
       </w:r>
     </w:p>
@@ -398,30 +294,27 @@
           <w:bCs/>
         </w:rPr>
       </w:pPr>
-      <w:r>
-        <w:pict w14:anchorId="1B5FC51E">
-          <v:rect id="_x0000_i1054" style="width:0;height:1.5pt" o:hralign="center" o:hrstd="t" o:hr="t" fillcolor="#a0a0a0" stroked="f"/>
-        </w:pict>
-      </w:r>
-      <w:r>
-        <w:rPr>
-          <w:rFonts w:ascii="Times New Roman" w:eastAsia="Times New Roman" w:hAnsi="Times New Roman" w:cs="Times New Roman"/>
-          <w:b/>
-          <w:bCs/>
-          <w:kern w:val="0"/>
-          <w:sz w:val="27"/>
-          <w:szCs w:val="27"/>
-          <w:lang w:eastAsia="en-IN" w:bidi="te-IN"/>
-          <w14:ligatures w14:val="none"/>
-        </w:rPr>
-        <w:t xml:space="preserve"> </w:t>
-      </w:r>
       <w:r>
         <w:rPr>
           <w:b/>
           <w:bCs/>
         </w:rPr>
         <w:t>APID Registry</w:t>
+      </w:r>
+    </w:p>
+    <w:p>
+      <w:pPr>
+        <w:rPr>
+          <w:b/>
+          <w:bCs/>
+        </w:rPr>
+      </w:pPr>
+      <w:r>
+        <w:rPr>
+          <w:b/>
+          <w:bCs/>
+        </w:rPr>
+        <w:t>Category: Files &amp; Project Management (FF)</w:t>
       </w:r>
     </w:p>
     <w:tbl>
@@ -437,10 +330,9 @@
         <w:tblLook w:val="04A0" w:firstRow="1" w:lastRow="0" w:firstColumn="1" w:lastColumn="0" w:noHBand="0" w:noVBand="1"/>
       </w:tblPr>
       <w:tblGrid>
-        <w:gridCol w:w="706"/>
-        <w:gridCol w:w="5015"/>
-        <w:gridCol w:w="2212"/>
-        <w:gridCol w:w="1093"/>
+        <w:gridCol w:w="767"/>
+        <w:gridCol w:w="7192"/>
+        <w:gridCol w:w="1067"/>
       </w:tblGrid>
       <w:tr>
         <w:trPr>
@@ -487,7 +379,7 @@
                 <w:b/>
                 <w:bCs/>
               </w:rPr>
-              <w:t>Title</w:t>
+              <w:t>Human Friction</w:t>
             </w:r>
           </w:p>
         </w:tc>
@@ -509,28 +401,6 @@
                 <w:b/>
                 <w:bCs/>
               </w:rPr>
-              <w:t>Category</w:t>
-            </w:r>
-          </w:p>
-        </w:tc>
-        <w:tc>
-          <w:tcPr>
-            <w:tcW w:w="0" w:type="auto"/>
-            <w:vAlign w:val="center"/>
-            <w:hideMark/>
-          </w:tcPr>
-          <w:p>
-            <w:pPr>
-              <w:rPr>
-                <w:b/>
-                <w:bCs/>
-              </w:rPr>
-            </w:pPr>
-            <w:r>
-              <w:rPr>
-                <w:b/>
-                <w:bCs/>
-              </w:rPr>
               <w:t>Status</w:t>
             </w:r>
           </w:p>
@@ -548,6 +418,10 @@
           </w:tcPr>
           <w:p>
             <w:r>
+              <w:rPr>
+                <w:b/>
+                <w:bCs/>
+              </w:rPr>
               <w:t>FF-001</w:t>
             </w:r>
           </w:p>
@@ -572,35 +446,27 @@
           </w:tcPr>
           <w:p>
             <w:r>
-              <w:t>Files &amp; Project Management</w:t>
-            </w:r>
-          </w:p>
-        </w:tc>
-        <w:tc>
-          <w:tcPr>
-            <w:tcW w:w="0" w:type="auto"/>
-            <w:vAlign w:val="center"/>
-            <w:hideMark/>
-          </w:tcPr>
-          <w:p>
-            <w:r>
-              <w:t xml:space="preserve"> Accepted</w:t>
-            </w:r>
-          </w:p>
-        </w:tc>
-      </w:tr>
-      <w:tr>
-        <w:trPr>
-          <w:tblCellSpacing w:w="15" w:type="dxa"/>
-        </w:trPr>
-        <w:tc>
-          <w:tcPr>
-            <w:tcW w:w="0" w:type="auto"/>
-            <w:vAlign w:val="center"/>
-            <w:hideMark/>
-          </w:tcPr>
-          <w:p>
-            <w:r>
+              <w:t>Accepted</w:t>
+            </w:r>
+          </w:p>
+        </w:tc>
+      </w:tr>
+      <w:tr>
+        <w:trPr>
+          <w:tblCellSpacing w:w="15" w:type="dxa"/>
+        </w:trPr>
+        <w:tc>
+          <w:tcPr>
+            <w:tcW w:w="0" w:type="auto"/>
+            <w:vAlign w:val="center"/>
+            <w:hideMark/>
+          </w:tcPr>
+          <w:p>
+            <w:r>
+              <w:rPr>
+                <w:b/>
+                <w:bCs/>
+              </w:rPr>
               <w:t>FF-002</w:t>
             </w:r>
           </w:p>
@@ -625,18 +491,6 @@
           </w:tcPr>
           <w:p>
             <w:r>
-              <w:t>Files &amp; Project Management</w:t>
-            </w:r>
-          </w:p>
-        </w:tc>
-        <w:tc>
-          <w:tcPr>
-            <w:tcW w:w="0" w:type="auto"/>
-            <w:vAlign w:val="center"/>
-            <w:hideMark/>
-          </w:tcPr>
-          <w:p>
-            <w:r>
               <w:t>Accepted</w:t>
             </w:r>
           </w:p>
@@ -654,6 +508,10 @@
           </w:tcPr>
           <w:p>
             <w:r>
+              <w:rPr>
+                <w:b/>
+                <w:bCs/>
+              </w:rPr>
               <w:t>FF-003</w:t>
             </w:r>
           </w:p>
@@ -678,18 +536,6 @@
           </w:tcPr>
           <w:p>
             <w:r>
-              <w:t>Files &amp; Project Management</w:t>
-            </w:r>
-          </w:p>
-        </w:tc>
-        <w:tc>
-          <w:tcPr>
-            <w:tcW w:w="0" w:type="auto"/>
-            <w:vAlign w:val="center"/>
-            <w:hideMark/>
-          </w:tcPr>
-          <w:p>
-            <w:r>
               <w:t>Accepted</w:t>
             </w:r>
           </w:p>
@@ -707,32 +553,69 @@
           </w:tcPr>
           <w:p>
             <w:r>
+              <w:rPr>
+                <w:b/>
+                <w:bCs/>
+              </w:rPr>
+              <w:t>FF-004</w:t>
+            </w:r>
+          </w:p>
+        </w:tc>
+        <w:tc>
+          <w:tcPr>
+            <w:tcW w:w="0" w:type="auto"/>
+            <w:vAlign w:val="center"/>
+            <w:hideMark/>
+          </w:tcPr>
+          <w:p>
+            <w:r>
+              <w:t>Navigating large software projects is difficult</w:t>
+            </w:r>
+          </w:p>
+        </w:tc>
+        <w:tc>
+          <w:tcPr>
+            <w:tcW w:w="0" w:type="auto"/>
+            <w:vAlign w:val="center"/>
+            <w:hideMark/>
+          </w:tcPr>
+          <w:p>
+            <w:r>
+              <w:t>Accepted</w:t>
+            </w:r>
+          </w:p>
+        </w:tc>
+      </w:tr>
+      <w:tr>
+        <w:trPr>
+          <w:tblCellSpacing w:w="15" w:type="dxa"/>
+        </w:trPr>
+        <w:tc>
+          <w:tcPr>
+            <w:tcW w:w="0" w:type="auto"/>
+            <w:vAlign w:val="center"/>
+            <w:hideMark/>
+          </w:tcPr>
+          <w:p>
+            <w:r>
+              <w:rPr>
+                <w:b/>
+                <w:bCs/>
+              </w:rPr>
               <w:lastRenderedPageBreak/>
-              <w:t>FF-004</w:t>
-            </w:r>
-          </w:p>
-        </w:tc>
-        <w:tc>
-          <w:tcPr>
-            <w:tcW w:w="0" w:type="auto"/>
-            <w:vAlign w:val="center"/>
-            <w:hideMark/>
-          </w:tcPr>
-          <w:p>
-            <w:r>
-              <w:t>Navigating large software projects is difficult</w:t>
-            </w:r>
-          </w:p>
-        </w:tc>
-        <w:tc>
-          <w:tcPr>
-            <w:tcW w:w="0" w:type="auto"/>
-            <w:vAlign w:val="center"/>
-            <w:hideMark/>
-          </w:tcPr>
-          <w:p>
-            <w:r>
-              <w:t>Files &amp; Project Management</w:t>
+              <w:t>FF-005</w:t>
+            </w:r>
+          </w:p>
+        </w:tc>
+        <w:tc>
+          <w:tcPr>
+            <w:tcW w:w="0" w:type="auto"/>
+            <w:vAlign w:val="center"/>
+            <w:hideMark/>
+          </w:tcPr>
+          <w:p>
+            <w:r>
+              <w:t>Users struggle to distinguish original files from duplicate or copied versions</w:t>
             </w:r>
           </w:p>
         </w:tc>
@@ -761,31 +644,23 @@
           </w:tcPr>
           <w:p>
             <w:r>
-              <w:t>FF-005</w:t>
-            </w:r>
-          </w:p>
-        </w:tc>
-        <w:tc>
-          <w:tcPr>
-            <w:tcW w:w="0" w:type="auto"/>
-            <w:vAlign w:val="center"/>
-            <w:hideMark/>
-          </w:tcPr>
-          <w:p>
-            <w:r>
-              <w:t>Users struggle to distinguish original files from duplicate or copied versions</w:t>
-            </w:r>
-          </w:p>
-        </w:tc>
-        <w:tc>
-          <w:tcPr>
-            <w:tcW w:w="0" w:type="auto"/>
-            <w:vAlign w:val="center"/>
-            <w:hideMark/>
-          </w:tcPr>
-          <w:p>
-            <w:r>
-              <w:t>Files &amp; Project Management</w:t>
+              <w:rPr>
+                <w:b/>
+                <w:bCs/>
+              </w:rPr>
+              <w:t>FF-006</w:t>
+            </w:r>
+          </w:p>
+        </w:tc>
+        <w:tc>
+          <w:tcPr>
+            <w:tcW w:w="0" w:type="auto"/>
+            <w:vAlign w:val="center"/>
+            <w:hideMark/>
+          </w:tcPr>
+          <w:p>
+            <w:r>
+              <w:t>Users struggle to find files when they remember the content but not the filename</w:t>
             </w:r>
           </w:p>
         </w:tc>
@@ -814,31 +689,23 @@
           </w:tcPr>
           <w:p>
             <w:r>
-              <w:t>FF-006</w:t>
-            </w:r>
-          </w:p>
-        </w:tc>
-        <w:tc>
-          <w:tcPr>
-            <w:tcW w:w="0" w:type="auto"/>
-            <w:vAlign w:val="center"/>
-            <w:hideMark/>
-          </w:tcPr>
-          <w:p>
-            <w:r>
-              <w:t>Users struggle to find files when they remember the content but not the filename</w:t>
-            </w:r>
-          </w:p>
-        </w:tc>
-        <w:tc>
-          <w:tcPr>
-            <w:tcW w:w="0" w:type="auto"/>
-            <w:vAlign w:val="center"/>
-            <w:hideMark/>
-          </w:tcPr>
-          <w:p>
-            <w:r>
-              <w:t>Files &amp; Project Management</w:t>
+              <w:rPr>
+                <w:b/>
+                <w:bCs/>
+              </w:rPr>
+              <w:t>FF-007</w:t>
+            </w:r>
+          </w:p>
+        </w:tc>
+        <w:tc>
+          <w:tcPr>
+            <w:tcW w:w="0" w:type="auto"/>
+            <w:vAlign w:val="center"/>
+            <w:hideMark/>
+          </w:tcPr>
+          <w:p>
+            <w:r>
+              <w:t>Users cannot easily locate files created for a specific task or purpose</w:t>
             </w:r>
           </w:p>
         </w:tc>
@@ -867,31 +734,23 @@
           </w:tcPr>
           <w:p>
             <w:r>
-              <w:t>FF-007</w:t>
-            </w:r>
-          </w:p>
-        </w:tc>
-        <w:tc>
-          <w:tcPr>
-            <w:tcW w:w="0" w:type="auto"/>
-            <w:vAlign w:val="center"/>
-            <w:hideMark/>
-          </w:tcPr>
-          <w:p>
-            <w:r>
-              <w:t>Users cannot easily locate files created for a specific task or purpose</w:t>
-            </w:r>
-          </w:p>
-        </w:tc>
-        <w:tc>
-          <w:tcPr>
-            <w:tcW w:w="0" w:type="auto"/>
-            <w:vAlign w:val="center"/>
-            <w:hideMark/>
-          </w:tcPr>
-          <w:p>
-            <w:r>
-              <w:t>Files &amp; Project Management</w:t>
+              <w:rPr>
+                <w:b/>
+                <w:bCs/>
+              </w:rPr>
+              <w:t>FF-008</w:t>
+            </w:r>
+          </w:p>
+        </w:tc>
+        <w:tc>
+          <w:tcPr>
+            <w:tcW w:w="0" w:type="auto"/>
+            <w:vAlign w:val="center"/>
+            <w:hideMark/>
+          </w:tcPr>
+          <w:p>
+            <w:r>
+              <w:t>Users forget where they saved newly created files</w:t>
             </w:r>
           </w:p>
         </w:tc>
@@ -920,31 +779,23 @@
           </w:tcPr>
           <w:p>
             <w:r>
-              <w:t>FF-008</w:t>
-            </w:r>
-          </w:p>
-        </w:tc>
-        <w:tc>
-          <w:tcPr>
-            <w:tcW w:w="0" w:type="auto"/>
-            <w:vAlign w:val="center"/>
-            <w:hideMark/>
-          </w:tcPr>
-          <w:p>
-            <w:r>
-              <w:t>Users forget where they saved newly created files</w:t>
-            </w:r>
-          </w:p>
-        </w:tc>
-        <w:tc>
-          <w:tcPr>
-            <w:tcW w:w="0" w:type="auto"/>
-            <w:vAlign w:val="center"/>
-            <w:hideMark/>
-          </w:tcPr>
-          <w:p>
-            <w:r>
-              <w:t>Files &amp; Project Management</w:t>
+              <w:rPr>
+                <w:b/>
+                <w:bCs/>
+              </w:rPr>
+              <w:t>FF-009</w:t>
+            </w:r>
+          </w:p>
+        </w:tc>
+        <w:tc>
+          <w:tcPr>
+            <w:tcW w:w="0" w:type="auto"/>
+            <w:vAlign w:val="center"/>
+            <w:hideMark/>
+          </w:tcPr>
+          <w:p>
+            <w:r>
+              <w:t>Users create inconsistent folder structures for similar projects</w:t>
             </w:r>
           </w:p>
         </w:tc>
@@ -973,31 +824,23 @@
           </w:tcPr>
           <w:p>
             <w:r>
-              <w:t>FF-009</w:t>
-            </w:r>
-          </w:p>
-        </w:tc>
-        <w:tc>
-          <w:tcPr>
-            <w:tcW w:w="0" w:type="auto"/>
-            <w:vAlign w:val="center"/>
-            <w:hideMark/>
-          </w:tcPr>
-          <w:p>
-            <w:r>
-              <w:t>Users create inconsistent folder structures for similar projects</w:t>
-            </w:r>
-          </w:p>
-        </w:tc>
-        <w:tc>
-          <w:tcPr>
-            <w:tcW w:w="0" w:type="auto"/>
-            <w:vAlign w:val="center"/>
-            <w:hideMark/>
-          </w:tcPr>
-          <w:p>
-            <w:r>
-              <w:t>Files &amp; Project Management</w:t>
+              <w:rPr>
+                <w:b/>
+                <w:bCs/>
+              </w:rPr>
+              <w:t>FF-010</w:t>
+            </w:r>
+          </w:p>
+        </w:tc>
+        <w:tc>
+          <w:tcPr>
+            <w:tcW w:w="0" w:type="auto"/>
+            <w:vAlign w:val="center"/>
+            <w:hideMark/>
+          </w:tcPr>
+          <w:p>
+            <w:r>
+              <w:t>Users spend time opening multiple files to find the correct information</w:t>
             </w:r>
           </w:p>
         </w:tc>
@@ -1026,31 +869,23 @@
           </w:tcPr>
           <w:p>
             <w:r>
-              <w:t>FF-010</w:t>
-            </w:r>
-          </w:p>
-        </w:tc>
-        <w:tc>
-          <w:tcPr>
-            <w:tcW w:w="0" w:type="auto"/>
-            <w:vAlign w:val="center"/>
-            <w:hideMark/>
-          </w:tcPr>
-          <w:p>
-            <w:r>
-              <w:t>Users spend time opening multiple files to find the correct information</w:t>
-            </w:r>
-          </w:p>
-        </w:tc>
-        <w:tc>
-          <w:tcPr>
-            <w:tcW w:w="0" w:type="auto"/>
-            <w:vAlign w:val="center"/>
-            <w:hideMark/>
-          </w:tcPr>
-          <w:p>
-            <w:r>
-              <w:t>Files &amp; Project Management</w:t>
+              <w:rPr>
+                <w:b/>
+                <w:bCs/>
+              </w:rPr>
+              <w:t>FF-011</w:t>
+            </w:r>
+          </w:p>
+        </w:tc>
+        <w:tc>
+          <w:tcPr>
+            <w:tcW w:w="0" w:type="auto"/>
+            <w:vAlign w:val="center"/>
+            <w:hideMark/>
+          </w:tcPr>
+          <w:p>
+            <w:r>
+              <w:t>Users lose the context behind files over time</w:t>
             </w:r>
           </w:p>
         </w:tc>
@@ -1067,8 +902,645 @@
           </w:p>
         </w:tc>
       </w:tr>
+      <w:tr>
+        <w:trPr>
+          <w:tblCellSpacing w:w="15" w:type="dxa"/>
+        </w:trPr>
+        <w:tc>
+          <w:tcPr>
+            <w:tcW w:w="0" w:type="auto"/>
+            <w:vAlign w:val="center"/>
+            <w:hideMark/>
+          </w:tcPr>
+          <w:p>
+            <w:r>
+              <w:rPr>
+                <w:b/>
+                <w:bCs/>
+              </w:rPr>
+              <w:t>FF-012</w:t>
+            </w:r>
+          </w:p>
+        </w:tc>
+        <w:tc>
+          <w:tcPr>
+            <w:tcW w:w="0" w:type="auto"/>
+            <w:vAlign w:val="center"/>
+            <w:hideMark/>
+          </w:tcPr>
+          <w:p>
+            <w:r>
+              <w:t>Users struggle to understand relationships between related files</w:t>
+            </w:r>
+          </w:p>
+        </w:tc>
+        <w:tc>
+          <w:tcPr>
+            <w:tcW w:w="0" w:type="auto"/>
+            <w:vAlign w:val="center"/>
+            <w:hideMark/>
+          </w:tcPr>
+          <w:p>
+            <w:r>
+              <w:t>Accepted</w:t>
+            </w:r>
+          </w:p>
+        </w:tc>
+      </w:tr>
+      <w:tr>
+        <w:trPr>
+          <w:tblCellSpacing w:w="15" w:type="dxa"/>
+        </w:trPr>
+        <w:tc>
+          <w:tcPr>
+            <w:tcW w:w="0" w:type="auto"/>
+            <w:vAlign w:val="center"/>
+            <w:hideMark/>
+          </w:tcPr>
+          <w:p>
+            <w:r>
+              <w:rPr>
+                <w:b/>
+                <w:bCs/>
+              </w:rPr>
+              <w:t>FF-013</w:t>
+            </w:r>
+          </w:p>
+        </w:tc>
+        <w:tc>
+          <w:tcPr>
+            <w:tcW w:w="0" w:type="auto"/>
+            <w:vAlign w:val="center"/>
+            <w:hideMark/>
+          </w:tcPr>
+          <w:p>
+            <w:r>
+              <w:t>Users cannot easily identify recently worked-on files</w:t>
+            </w:r>
+          </w:p>
+        </w:tc>
+        <w:tc>
+          <w:tcPr>
+            <w:tcW w:w="0" w:type="auto"/>
+            <w:vAlign w:val="center"/>
+            <w:hideMark/>
+          </w:tcPr>
+          <w:p>
+            <w:r>
+              <w:t>Accepted</w:t>
+            </w:r>
+          </w:p>
+        </w:tc>
+      </w:tr>
+      <w:tr>
+        <w:trPr>
+          <w:tblCellSpacing w:w="15" w:type="dxa"/>
+        </w:trPr>
+        <w:tc>
+          <w:tcPr>
+            <w:tcW w:w="0" w:type="auto"/>
+            <w:vAlign w:val="center"/>
+            <w:hideMark/>
+          </w:tcPr>
+          <w:p>
+            <w:r>
+              <w:rPr>
+                <w:b/>
+                <w:bCs/>
+              </w:rPr>
+              <w:t>FF-014</w:t>
+            </w:r>
+          </w:p>
+        </w:tc>
+        <w:tc>
+          <w:tcPr>
+            <w:tcW w:w="0" w:type="auto"/>
+            <w:vAlign w:val="center"/>
+            <w:hideMark/>
+          </w:tcPr>
+          <w:p>
+            <w:r>
+              <w:t>Users cannot easily determine the current status of a file</w:t>
+            </w:r>
+          </w:p>
+        </w:tc>
+        <w:tc>
+          <w:tcPr>
+            <w:tcW w:w="0" w:type="auto"/>
+            <w:vAlign w:val="center"/>
+            <w:hideMark/>
+          </w:tcPr>
+          <w:p>
+            <w:r>
+              <w:t>Accepted</w:t>
+            </w:r>
+          </w:p>
+        </w:tc>
+      </w:tr>
+      <w:tr>
+        <w:trPr>
+          <w:tblCellSpacing w:w="15" w:type="dxa"/>
+        </w:trPr>
+        <w:tc>
+          <w:tcPr>
+            <w:tcW w:w="0" w:type="auto"/>
+            <w:vAlign w:val="center"/>
+            <w:hideMark/>
+          </w:tcPr>
+          <w:p>
+            <w:r>
+              <w:rPr>
+                <w:b/>
+                <w:bCs/>
+              </w:rPr>
+              <w:t>FF-015</w:t>
+            </w:r>
+          </w:p>
+        </w:tc>
+        <w:tc>
+          <w:tcPr>
+            <w:tcW w:w="0" w:type="auto"/>
+            <w:vAlign w:val="center"/>
+            <w:hideMark/>
+          </w:tcPr>
+          <w:p>
+            <w:r>
+              <w:t>Users struggle to locate files after moving or reorganizing them</w:t>
+            </w:r>
+          </w:p>
+        </w:tc>
+        <w:tc>
+          <w:tcPr>
+            <w:tcW w:w="0" w:type="auto"/>
+            <w:vAlign w:val="center"/>
+            <w:hideMark/>
+          </w:tcPr>
+          <w:p>
+            <w:r>
+              <w:t>Accepted</w:t>
+            </w:r>
+          </w:p>
+        </w:tc>
+      </w:tr>
+      <w:tr>
+        <w:trPr>
+          <w:tblCellSpacing w:w="15" w:type="dxa"/>
+        </w:trPr>
+        <w:tc>
+          <w:tcPr>
+            <w:tcW w:w="0" w:type="auto"/>
+            <w:vAlign w:val="center"/>
+            <w:hideMark/>
+          </w:tcPr>
+          <w:p>
+            <w:r>
+              <w:rPr>
+                <w:b/>
+                <w:bCs/>
+              </w:rPr>
+              <w:t>FF-016</w:t>
+            </w:r>
+          </w:p>
+        </w:tc>
+        <w:tc>
+          <w:tcPr>
+            <w:tcW w:w="0" w:type="auto"/>
+            <w:vAlign w:val="center"/>
+            <w:hideMark/>
+          </w:tcPr>
+          <w:p>
+            <w:r>
+              <w:t>Users struggle to remember which application was used to create or edit a file</w:t>
+            </w:r>
+          </w:p>
+        </w:tc>
+        <w:tc>
+          <w:tcPr>
+            <w:tcW w:w="0" w:type="auto"/>
+            <w:vAlign w:val="center"/>
+            <w:hideMark/>
+          </w:tcPr>
+          <w:p>
+            <w:r>
+              <w:t>Accepted</w:t>
+            </w:r>
+          </w:p>
+        </w:tc>
+      </w:tr>
+      <w:tr>
+        <w:trPr>
+          <w:tblCellSpacing w:w="15" w:type="dxa"/>
+        </w:trPr>
+        <w:tc>
+          <w:tcPr>
+            <w:tcW w:w="0" w:type="auto"/>
+            <w:vAlign w:val="center"/>
+            <w:hideMark/>
+          </w:tcPr>
+          <w:p>
+            <w:r>
+              <w:rPr>
+                <w:b/>
+                <w:bCs/>
+              </w:rPr>
+              <w:t>FF-017</w:t>
+            </w:r>
+          </w:p>
+        </w:tc>
+        <w:tc>
+          <w:tcPr>
+            <w:tcW w:w="0" w:type="auto"/>
+            <w:vAlign w:val="center"/>
+            <w:hideMark/>
+          </w:tcPr>
+          <w:p>
+            <w:r>
+              <w:t>Users forget unfinished work stored across multiple files</w:t>
+            </w:r>
+          </w:p>
+        </w:tc>
+        <w:tc>
+          <w:tcPr>
+            <w:tcW w:w="0" w:type="auto"/>
+            <w:vAlign w:val="center"/>
+            <w:hideMark/>
+          </w:tcPr>
+          <w:p>
+            <w:r>
+              <w:t>Accepted</w:t>
+            </w:r>
+          </w:p>
+        </w:tc>
+      </w:tr>
+      <w:tr>
+        <w:trPr>
+          <w:tblCellSpacing w:w="15" w:type="dxa"/>
+        </w:trPr>
+        <w:tc>
+          <w:tcPr>
+            <w:tcW w:w="0" w:type="auto"/>
+            <w:vAlign w:val="center"/>
+            <w:hideMark/>
+          </w:tcPr>
+          <w:p>
+            <w:r>
+              <w:rPr>
+                <w:b/>
+                <w:bCs/>
+              </w:rPr>
+              <w:t>FF-018</w:t>
+            </w:r>
+          </w:p>
+        </w:tc>
+        <w:tc>
+          <w:tcPr>
+            <w:tcW w:w="0" w:type="auto"/>
+            <w:vAlign w:val="center"/>
+            <w:hideMark/>
+          </w:tcPr>
+          <w:p>
+            <w:r>
+              <w:t>Users struggle to determine whether a file can be safely deleted</w:t>
+            </w:r>
+          </w:p>
+        </w:tc>
+        <w:tc>
+          <w:tcPr>
+            <w:tcW w:w="0" w:type="auto"/>
+            <w:vAlign w:val="center"/>
+            <w:hideMark/>
+          </w:tcPr>
+          <w:p>
+            <w:r>
+              <w:t>Accepted</w:t>
+            </w:r>
+          </w:p>
+        </w:tc>
+      </w:tr>
+      <w:tr>
+        <w:trPr>
+          <w:tblCellSpacing w:w="15" w:type="dxa"/>
+        </w:trPr>
+        <w:tc>
+          <w:tcPr>
+            <w:tcW w:w="0" w:type="auto"/>
+            <w:vAlign w:val="center"/>
+            <w:hideMark/>
+          </w:tcPr>
+          <w:p>
+            <w:r>
+              <w:rPr>
+                <w:b/>
+                <w:bCs/>
+              </w:rPr>
+              <w:lastRenderedPageBreak/>
+              <w:t>FF-019</w:t>
+            </w:r>
+          </w:p>
+        </w:tc>
+        <w:tc>
+          <w:tcPr>
+            <w:tcW w:w="0" w:type="auto"/>
+            <w:vAlign w:val="center"/>
+            <w:hideMark/>
+          </w:tcPr>
+          <w:p>
+            <w:r>
+              <w:t>Users struggle to trust file search results</w:t>
+            </w:r>
+          </w:p>
+        </w:tc>
+        <w:tc>
+          <w:tcPr>
+            <w:tcW w:w="0" w:type="auto"/>
+            <w:vAlign w:val="center"/>
+            <w:hideMark/>
+          </w:tcPr>
+          <w:p>
+            <w:r>
+              <w:t>Accepted</w:t>
+            </w:r>
+          </w:p>
+        </w:tc>
+      </w:tr>
+      <w:tr>
+        <w:trPr>
+          <w:tblCellSpacing w:w="15" w:type="dxa"/>
+        </w:trPr>
+        <w:tc>
+          <w:tcPr>
+            <w:tcW w:w="0" w:type="auto"/>
+            <w:vAlign w:val="center"/>
+            <w:hideMark/>
+          </w:tcPr>
+          <w:p>
+            <w:r>
+              <w:rPr>
+                <w:b/>
+                <w:bCs/>
+              </w:rPr>
+              <w:t>FF-020</w:t>
+            </w:r>
+          </w:p>
+        </w:tc>
+        <w:tc>
+          <w:tcPr>
+            <w:tcW w:w="0" w:type="auto"/>
+            <w:vAlign w:val="center"/>
+            <w:hideMark/>
+          </w:tcPr>
+          <w:p>
+            <w:r>
+              <w:t>Users struggle to remember which storage location contains a file</w:t>
+            </w:r>
+          </w:p>
+        </w:tc>
+        <w:tc>
+          <w:tcPr>
+            <w:tcW w:w="0" w:type="auto"/>
+            <w:vAlign w:val="center"/>
+            <w:hideMark/>
+          </w:tcPr>
+          <w:p>
+            <w:r>
+              <w:t>Accepted</w:t>
+            </w:r>
+          </w:p>
+        </w:tc>
+      </w:tr>
+      <w:tr>
+        <w:trPr>
+          <w:tblCellSpacing w:w="15" w:type="dxa"/>
+        </w:trPr>
+        <w:tc>
+          <w:tcPr>
+            <w:tcW w:w="0" w:type="auto"/>
+            <w:vAlign w:val="center"/>
+            <w:hideMark/>
+          </w:tcPr>
+          <w:p>
+            <w:r>
+              <w:rPr>
+                <w:b/>
+                <w:bCs/>
+              </w:rPr>
+              <w:t>FF-021</w:t>
+            </w:r>
+          </w:p>
+        </w:tc>
+        <w:tc>
+          <w:tcPr>
+            <w:tcW w:w="0" w:type="auto"/>
+            <w:vAlign w:val="center"/>
+            <w:hideMark/>
+          </w:tcPr>
+          <w:p>
+            <w:r>
+              <w:t>Users struggle to identify files that are no longer actively used</w:t>
+            </w:r>
+          </w:p>
+        </w:tc>
+        <w:tc>
+          <w:tcPr>
+            <w:tcW w:w="0" w:type="auto"/>
+            <w:vAlign w:val="center"/>
+            <w:hideMark/>
+          </w:tcPr>
+          <w:p>
+            <w:r>
+              <w:t>Accepted</w:t>
+            </w:r>
+          </w:p>
+        </w:tc>
+      </w:tr>
+      <w:tr>
+        <w:trPr>
+          <w:tblCellSpacing w:w="15" w:type="dxa"/>
+        </w:trPr>
+        <w:tc>
+          <w:tcPr>
+            <w:tcW w:w="0" w:type="auto"/>
+            <w:vAlign w:val="center"/>
+            <w:hideMark/>
+          </w:tcPr>
+          <w:p>
+            <w:r>
+              <w:rPr>
+                <w:b/>
+                <w:bCs/>
+              </w:rPr>
+              <w:t>FF-022</w:t>
+            </w:r>
+          </w:p>
+        </w:tc>
+        <w:tc>
+          <w:tcPr>
+            <w:tcW w:w="0" w:type="auto"/>
+            <w:vAlign w:val="center"/>
+            <w:hideMark/>
+          </w:tcPr>
+          <w:p>
+            <w:r>
+              <w:t>Users struggle to remember why similar files exist</w:t>
+            </w:r>
+          </w:p>
+        </w:tc>
+        <w:tc>
+          <w:tcPr>
+            <w:tcW w:w="0" w:type="auto"/>
+            <w:vAlign w:val="center"/>
+            <w:hideMark/>
+          </w:tcPr>
+          <w:p>
+            <w:r>
+              <w:t>Accepted</w:t>
+            </w:r>
+          </w:p>
+        </w:tc>
+      </w:tr>
+      <w:tr>
+        <w:trPr>
+          <w:tblCellSpacing w:w="15" w:type="dxa"/>
+        </w:trPr>
+        <w:tc>
+          <w:tcPr>
+            <w:tcW w:w="0" w:type="auto"/>
+            <w:vAlign w:val="center"/>
+            <w:hideMark/>
+          </w:tcPr>
+          <w:p>
+            <w:r>
+              <w:rPr>
+                <w:b/>
+                <w:bCs/>
+              </w:rPr>
+              <w:t>FF-023</w:t>
+            </w:r>
+          </w:p>
+        </w:tc>
+        <w:tc>
+          <w:tcPr>
+            <w:tcW w:w="0" w:type="auto"/>
+            <w:vAlign w:val="center"/>
+            <w:hideMark/>
+          </w:tcPr>
+          <w:p>
+            <w:r>
+              <w:t>Users struggle to understand the purpose of unfamiliar files</w:t>
+            </w:r>
+          </w:p>
+        </w:tc>
+        <w:tc>
+          <w:tcPr>
+            <w:tcW w:w="0" w:type="auto"/>
+            <w:vAlign w:val="center"/>
+            <w:hideMark/>
+          </w:tcPr>
+          <w:p>
+            <w:r>
+              <w:t>Accepted</w:t>
+            </w:r>
+          </w:p>
+        </w:tc>
+      </w:tr>
+      <w:tr>
+        <w:trPr>
+          <w:tblCellSpacing w:w="15" w:type="dxa"/>
+        </w:trPr>
+        <w:tc>
+          <w:tcPr>
+            <w:tcW w:w="0" w:type="auto"/>
+            <w:vAlign w:val="center"/>
+            <w:hideMark/>
+          </w:tcPr>
+          <w:p>
+            <w:r>
+              <w:rPr>
+                <w:b/>
+                <w:bCs/>
+              </w:rPr>
+              <w:t>FF-024</w:t>
+            </w:r>
+          </w:p>
+        </w:tc>
+        <w:tc>
+          <w:tcPr>
+            <w:tcW w:w="0" w:type="auto"/>
+            <w:vAlign w:val="center"/>
+            <w:hideMark/>
+          </w:tcPr>
+          <w:p>
+            <w:r>
+              <w:t>Users struggle to locate related resources scattered across different locations</w:t>
+            </w:r>
+          </w:p>
+        </w:tc>
+        <w:tc>
+          <w:tcPr>
+            <w:tcW w:w="0" w:type="auto"/>
+            <w:vAlign w:val="center"/>
+            <w:hideMark/>
+          </w:tcPr>
+          <w:p>
+            <w:r>
+              <w:t>Accepted</w:t>
+            </w:r>
+          </w:p>
+        </w:tc>
+      </w:tr>
+      <w:tr>
+        <w:trPr>
+          <w:tblCellSpacing w:w="15" w:type="dxa"/>
+        </w:trPr>
+        <w:tc>
+          <w:tcPr>
+            <w:tcW w:w="0" w:type="auto"/>
+            <w:vAlign w:val="center"/>
+            <w:hideMark/>
+          </w:tcPr>
+          <w:p>
+            <w:r>
+              <w:rPr>
+                <w:b/>
+                <w:bCs/>
+              </w:rPr>
+              <w:t>FF-025</w:t>
+            </w:r>
+          </w:p>
+        </w:tc>
+        <w:tc>
+          <w:tcPr>
+            <w:tcW w:w="0" w:type="auto"/>
+            <w:vAlign w:val="center"/>
+            <w:hideMark/>
+          </w:tcPr>
+          <w:p>
+            <w:r>
+              <w:t>Users gradually lose understanding of their own file collections over time</w:t>
+            </w:r>
+          </w:p>
+        </w:tc>
+        <w:tc>
+          <w:tcPr>
+            <w:tcW w:w="0" w:type="auto"/>
+            <w:vAlign w:val="center"/>
+            <w:hideMark/>
+          </w:tcPr>
+          <w:p>
+            <w:r>
+              <w:t>Accepted</w:t>
+            </w:r>
+          </w:p>
+        </w:tc>
+      </w:tr>
     </w:tbl>
-    <w:p/>
+    <w:p>
+      <w:r>
+        <w:pict w14:anchorId="5C2C3C36">
+          <v:rect id="_x0000_i1108" style="width:0;height:1.5pt" o:hralign="center" o:hrstd="t" o:hr="t" fillcolor="#a0a0a0" stroked="f"/>
+        </w:pict>
+      </w:r>
+    </w:p>
     <w:p>
       <w:pPr>
         <w:rPr>
@@ -1081,6 +1553,297 @@
           <w:b/>
           <w:bCs/>
         </w:rPr>
+        <w:t>Registry Statistics</w:t>
+      </w:r>
+    </w:p>
+    <w:tbl>
+      <w:tblPr>
+        <w:tblW w:w="0" w:type="auto"/>
+        <w:tblCellSpacing w:w="15" w:type="dxa"/>
+        <w:tblCellMar>
+          <w:top w:w="15" w:type="dxa"/>
+          <w:left w:w="15" w:type="dxa"/>
+          <w:bottom w:w="15" w:type="dxa"/>
+          <w:right w:w="15" w:type="dxa"/>
+        </w:tblCellMar>
+        <w:tblLook w:val="04A0" w:firstRow="1" w:lastRow="0" w:firstColumn="1" w:lastColumn="0" w:noHBand="0" w:noVBand="1"/>
+      </w:tblPr>
+      <w:tblGrid>
+        <w:gridCol w:w="2730"/>
+        <w:gridCol w:w="687"/>
+      </w:tblGrid>
+      <w:tr>
+        <w:trPr>
+          <w:tblHeader/>
+          <w:tblCellSpacing w:w="15" w:type="dxa"/>
+        </w:trPr>
+        <w:tc>
+          <w:tcPr>
+            <w:tcW w:w="0" w:type="auto"/>
+            <w:vAlign w:val="center"/>
+            <w:hideMark/>
+          </w:tcPr>
+          <w:p>
+            <w:pPr>
+              <w:rPr>
+                <w:b/>
+                <w:bCs/>
+              </w:rPr>
+            </w:pPr>
+            <w:r>
+              <w:rPr>
+                <w:b/>
+                <w:bCs/>
+              </w:rPr>
+              <w:t>Metric</w:t>
+            </w:r>
+          </w:p>
+        </w:tc>
+        <w:tc>
+          <w:tcPr>
+            <w:tcW w:w="0" w:type="auto"/>
+            <w:vAlign w:val="center"/>
+            <w:hideMark/>
+          </w:tcPr>
+          <w:p>
+            <w:pPr>
+              <w:rPr>
+                <w:b/>
+                <w:bCs/>
+              </w:rPr>
+            </w:pPr>
+            <w:r>
+              <w:rPr>
+                <w:b/>
+                <w:bCs/>
+              </w:rPr>
+              <w:t>Value</w:t>
+            </w:r>
+          </w:p>
+        </w:tc>
+      </w:tr>
+      <w:tr>
+        <w:trPr>
+          <w:tblCellSpacing w:w="15" w:type="dxa"/>
+        </w:trPr>
+        <w:tc>
+          <w:tcPr>
+            <w:tcW w:w="0" w:type="auto"/>
+            <w:vAlign w:val="center"/>
+            <w:hideMark/>
+          </w:tcPr>
+          <w:p>
+            <w:r>
+              <w:rPr>
+                <w:b/>
+                <w:bCs/>
+              </w:rPr>
+              <w:t>Categories Documented</w:t>
+            </w:r>
+          </w:p>
+        </w:tc>
+        <w:tc>
+          <w:tcPr>
+            <w:tcW w:w="0" w:type="auto"/>
+            <w:vAlign w:val="center"/>
+            <w:hideMark/>
+          </w:tcPr>
+          <w:p>
+            <w:r>
+              <w:t>1</w:t>
+            </w:r>
+          </w:p>
+        </w:tc>
+      </w:tr>
+      <w:tr>
+        <w:trPr>
+          <w:tblCellSpacing w:w="15" w:type="dxa"/>
+        </w:trPr>
+        <w:tc>
+          <w:tcPr>
+            <w:tcW w:w="0" w:type="auto"/>
+            <w:vAlign w:val="center"/>
+            <w:hideMark/>
+          </w:tcPr>
+          <w:p>
+            <w:r>
+              <w:rPr>
+                <w:b/>
+                <w:bCs/>
+              </w:rPr>
+              <w:t>Total Human Frictions</w:t>
+            </w:r>
+          </w:p>
+        </w:tc>
+        <w:tc>
+          <w:tcPr>
+            <w:tcW w:w="0" w:type="auto"/>
+            <w:vAlign w:val="center"/>
+            <w:hideMark/>
+          </w:tcPr>
+          <w:p>
+            <w:r>
+              <w:t>25</w:t>
+            </w:r>
+          </w:p>
+        </w:tc>
+      </w:tr>
+      <w:tr>
+        <w:trPr>
+          <w:tblCellSpacing w:w="15" w:type="dxa"/>
+        </w:trPr>
+        <w:tc>
+          <w:tcPr>
+            <w:tcW w:w="0" w:type="auto"/>
+            <w:vAlign w:val="center"/>
+            <w:hideMark/>
+          </w:tcPr>
+          <w:p>
+            <w:r>
+              <w:rPr>
+                <w:b/>
+                <w:bCs/>
+              </w:rPr>
+              <w:t>Accepted</w:t>
+            </w:r>
+          </w:p>
+        </w:tc>
+        <w:tc>
+          <w:tcPr>
+            <w:tcW w:w="0" w:type="auto"/>
+            <w:vAlign w:val="center"/>
+            <w:hideMark/>
+          </w:tcPr>
+          <w:p>
+            <w:r>
+              <w:t>25</w:t>
+            </w:r>
+          </w:p>
+        </w:tc>
+      </w:tr>
+      <w:tr>
+        <w:trPr>
+          <w:tblCellSpacing w:w="15" w:type="dxa"/>
+        </w:trPr>
+        <w:tc>
+          <w:tcPr>
+            <w:tcW w:w="0" w:type="auto"/>
+            <w:vAlign w:val="center"/>
+            <w:hideMark/>
+          </w:tcPr>
+          <w:p>
+            <w:r>
+              <w:rPr>
+                <w:b/>
+                <w:bCs/>
+              </w:rPr>
+              <w:t>Candidate</w:t>
+            </w:r>
+          </w:p>
+        </w:tc>
+        <w:tc>
+          <w:tcPr>
+            <w:tcW w:w="0" w:type="auto"/>
+            <w:vAlign w:val="center"/>
+            <w:hideMark/>
+          </w:tcPr>
+          <w:p>
+            <w:r>
+              <w:t>0</w:t>
+            </w:r>
+          </w:p>
+        </w:tc>
+      </w:tr>
+      <w:tr>
+        <w:trPr>
+          <w:tblCellSpacing w:w="15" w:type="dxa"/>
+        </w:trPr>
+        <w:tc>
+          <w:tcPr>
+            <w:tcW w:w="0" w:type="auto"/>
+            <w:vAlign w:val="center"/>
+            <w:hideMark/>
+          </w:tcPr>
+          <w:p>
+            <w:r>
+              <w:rPr>
+                <w:b/>
+                <w:bCs/>
+              </w:rPr>
+              <w:t>Archived</w:t>
+            </w:r>
+          </w:p>
+        </w:tc>
+        <w:tc>
+          <w:tcPr>
+            <w:tcW w:w="0" w:type="auto"/>
+            <w:vAlign w:val="center"/>
+            <w:hideMark/>
+          </w:tcPr>
+          <w:p>
+            <w:r>
+              <w:t>0</w:t>
+            </w:r>
+          </w:p>
+        </w:tc>
+      </w:tr>
+      <w:tr>
+        <w:trPr>
+          <w:tblCellSpacing w:w="15" w:type="dxa"/>
+        </w:trPr>
+        <w:tc>
+          <w:tcPr>
+            <w:tcW w:w="0" w:type="auto"/>
+            <w:vAlign w:val="center"/>
+            <w:hideMark/>
+          </w:tcPr>
+          <w:p>
+            <w:r>
+              <w:rPr>
+                <w:b/>
+                <w:bCs/>
+              </w:rPr>
+              <w:t>Deprecated</w:t>
+            </w:r>
+          </w:p>
+        </w:tc>
+        <w:tc>
+          <w:tcPr>
+            <w:tcW w:w="0" w:type="auto"/>
+            <w:vAlign w:val="center"/>
+            <w:hideMark/>
+          </w:tcPr>
+          <w:p>
+            <w:r>
+              <w:t>0</w:t>
+            </w:r>
+          </w:p>
+        </w:tc>
+      </w:tr>
+    </w:tbl>
+    <w:p>
+      <w:r>
+        <w:pict w14:anchorId="280EC88C">
+          <v:rect id="_x0000_i1109" style="width:0;height:1.5pt" o:hralign="center" o:hrstd="t" o:hr="t" fillcolor="#a0a0a0" stroked="f"/>
+        </w:pict>
+      </w:r>
+    </w:p>
+    <w:p/>
+    <w:p/>
+    <w:p/>
+    <w:p>
+      <w:pPr>
+        <w:rPr>
+          <w:b/>
+          <w:bCs/>
+        </w:rPr>
+      </w:pPr>
+      <w:r>
+        <w:rPr>
+          <w:b/>
+          <w:bCs/>
+        </w:rPr>
+        <w:lastRenderedPageBreak/>
         <w:t>Registry Rules</w:t>
       </w:r>
     </w:p>
@@ -1088,68 +1851,425 @@
       <w:pPr>
         <w:numPr>
           <w:ilvl w:val="0"/>
-          <w:numId w:val="1"/>
+          <w:numId w:val="3"/>
         </w:numPr>
       </w:pPr>
       <w:r>
-        <w:t xml:space="preserve">Every Human Friction receives a unique APID before being added to ATLAS. </w:t>
+        <w:t xml:space="preserve">Every Human Friction must receive a unique </w:t>
+      </w:r>
+      <w:r>
+        <w:rPr>
+          <w:b/>
+          <w:bCs/>
+        </w:rPr>
+        <w:t>APID</w:t>
+      </w:r>
+      <w:r>
+        <w:t xml:space="preserve"> before being added to the ATLAS repository. </w:t>
       </w:r>
     </w:p>
     <w:p>
       <w:pPr>
         <w:numPr>
           <w:ilvl w:val="0"/>
-          <w:numId w:val="1"/>
+          <w:numId w:val="3"/>
         </w:numPr>
       </w:pPr>
       <w:r>
-        <w:t xml:space="preserve">Each APID appears only once in the registry. </w:t>
+        <w:t xml:space="preserve">Each APID shall appear only once within the Registry. </w:t>
       </w:r>
     </w:p>
     <w:p>
       <w:pPr>
         <w:numPr>
           <w:ilvl w:val="0"/>
-          <w:numId w:val="1"/>
+          <w:numId w:val="3"/>
         </w:numPr>
       </w:pPr>
       <w:r>
-        <w:t xml:space="preserve">The registry is updated whenever a new Human Friction is accepted. </w:t>
+        <w:t xml:space="preserve">The Registry shall be updated whenever a Human Friction is accepted, archived, deprecated, or newly created. </w:t>
       </w:r>
     </w:p>
     <w:p>
       <w:pPr>
         <w:numPr>
           <w:ilvl w:val="0"/>
-          <w:numId w:val="1"/>
+          <w:numId w:val="3"/>
         </w:numPr>
       </w:pPr>
       <w:r>
-        <w:t xml:space="preserve">Changes to a Human Friction's title, version, status, or classification must also be reflected in the registry. </w:t>
+        <w:t xml:space="preserve">APIDs are permanent identifiers and shall never be reused, even if a Human Friction is removed from active documentation. </w:t>
       </w:r>
     </w:p>
     <w:p>
       <w:pPr>
         <w:numPr>
           <w:ilvl w:val="0"/>
-          <w:numId w:val="1"/>
+          <w:numId w:val="3"/>
         </w:numPr>
       </w:pPr>
       <w:r>
-        <w:t xml:space="preserve">APIDs are never reused, even if a Human Friction is archived or deprecated. </w:t>
+        <w:t xml:space="preserve">Detailed metadata—including category, subcategory, version history, evidence, research notes, and revision history—shall be maintained within the corresponding Human Friction document. </w:t>
       </w:r>
     </w:p>
     <w:p>
       <w:pPr>
         <w:numPr>
           <w:ilvl w:val="0"/>
-          <w:numId w:val="1"/>
+          <w:numId w:val="3"/>
         </w:numPr>
       </w:pPr>
       <w:r>
-        <w:t>The APID Registry is the authoritative index for all Human Frictions in the repository.</w:t>
+        <w:t xml:space="preserve">The APID Registry serves solely as the authoritative index for identifying and locating Human Frictions. </w:t>
       </w:r>
     </w:p>
+    <w:p>
+      <w:pPr>
+        <w:numPr>
+          <w:ilvl w:val="0"/>
+          <w:numId w:val="3"/>
+        </w:numPr>
+      </w:pPr>
+      <w:r>
+        <w:t xml:space="preserve">Human Frictions shall be listed in ascending APID order within their respective categories. </w:t>
+      </w:r>
+    </w:p>
+    <w:p>
+      <w:pPr>
+        <w:numPr>
+          <w:ilvl w:val="0"/>
+          <w:numId w:val="3"/>
+        </w:numPr>
+      </w:pPr>
+      <w:r>
+        <w:t xml:space="preserve">Additional ATLAS categories (e.g., </w:t>
+      </w:r>
+      <w:r>
+        <w:rPr>
+          <w:b/>
+          <w:bCs/>
+        </w:rPr>
+        <w:t>OS</w:t>
+      </w:r>
+      <w:r>
+        <w:t xml:space="preserve">, </w:t>
+      </w:r>
+      <w:r>
+        <w:rPr>
+          <w:b/>
+          <w:bCs/>
+        </w:rPr>
+        <w:t>KI</w:t>
+      </w:r>
+      <w:r>
+        <w:t xml:space="preserve">, </w:t>
+      </w:r>
+      <w:r>
+        <w:rPr>
+          <w:b/>
+          <w:bCs/>
+        </w:rPr>
+        <w:t>WI</w:t>
+      </w:r>
+      <w:r>
+        <w:t xml:space="preserve">, </w:t>
+      </w:r>
+      <w:r>
+        <w:rPr>
+          <w:b/>
+          <w:bCs/>
+        </w:rPr>
+        <w:t>MB</w:t>
+      </w:r>
+      <w:r>
+        <w:t xml:space="preserve">, </w:t>
+      </w:r>
+      <w:r>
+        <w:rPr>
+          <w:b/>
+          <w:bCs/>
+        </w:rPr>
+        <w:t>NT</w:t>
+      </w:r>
+      <w:r>
+        <w:t xml:space="preserve">, </w:t>
+      </w:r>
+      <w:r>
+        <w:rPr>
+          <w:b/>
+          <w:bCs/>
+        </w:rPr>
+        <w:t>LE</w:t>
+      </w:r>
+      <w:r>
+        <w:t xml:space="preserve">) shall be appended to this Registry as they are formally documented. </w:t>
+      </w:r>
+    </w:p>
+    <w:p>
+      <w:pPr>
+        <w:numPr>
+          <w:ilvl w:val="0"/>
+          <w:numId w:val="3"/>
+        </w:numPr>
+      </w:pPr>
+      <w:r>
+        <w:t xml:space="preserve">All references to Human Frictions within Patterns, Principles, Research Papers, and other ATLAS artifacts shall use the official APIDs defined in this Registry. </w:t>
+      </w:r>
+    </w:p>
+    <w:p>
+      <w:r>
+        <w:pict w14:anchorId="5A307009">
+          <v:rect id="_x0000_i1110" style="width:0;height:1.5pt" o:hralign="center" o:hrstd="t" o:hr="t" fillcolor="#a0a0a0" stroked="f"/>
+        </w:pict>
+      </w:r>
+    </w:p>
+    <w:p>
+      <w:pPr>
+        <w:rPr>
+          <w:b/>
+          <w:bCs/>
+        </w:rPr>
+      </w:pPr>
+      <w:r>
+        <w:rPr>
+          <w:b/>
+          <w:bCs/>
+        </w:rPr>
+        <w:t>Document Information</w:t>
+      </w:r>
+    </w:p>
+    <w:tbl>
+      <w:tblPr>
+        <w:tblW w:w="0" w:type="auto"/>
+        <w:tblCellSpacing w:w="15" w:type="dxa"/>
+        <w:tblCellMar>
+          <w:top w:w="15" w:type="dxa"/>
+          <w:left w:w="15" w:type="dxa"/>
+          <w:bottom w:w="15" w:type="dxa"/>
+          <w:right w:w="15" w:type="dxa"/>
+        </w:tblCellMar>
+        <w:tblLook w:val="04A0" w:firstRow="1" w:lastRow="0" w:firstColumn="1" w:lastColumn="0" w:noHBand="0" w:noVBand="1"/>
+      </w:tblPr>
+      <w:tblGrid>
+        <w:gridCol w:w="1926"/>
+        <w:gridCol w:w="1461"/>
+      </w:tblGrid>
+      <w:tr>
+        <w:trPr>
+          <w:tblHeader/>
+          <w:tblCellSpacing w:w="15" w:type="dxa"/>
+        </w:trPr>
+        <w:tc>
+          <w:tcPr>
+            <w:tcW w:w="0" w:type="auto"/>
+            <w:vAlign w:val="center"/>
+            <w:hideMark/>
+          </w:tcPr>
+          <w:p>
+            <w:pPr>
+              <w:rPr>
+                <w:b/>
+                <w:bCs/>
+              </w:rPr>
+            </w:pPr>
+            <w:r>
+              <w:rPr>
+                <w:b/>
+                <w:bCs/>
+              </w:rPr>
+              <w:t>Field</w:t>
+            </w:r>
+          </w:p>
+        </w:tc>
+        <w:tc>
+          <w:tcPr>
+            <w:tcW w:w="0" w:type="auto"/>
+            <w:vAlign w:val="center"/>
+            <w:hideMark/>
+          </w:tcPr>
+          <w:p>
+            <w:pPr>
+              <w:rPr>
+                <w:b/>
+                <w:bCs/>
+              </w:rPr>
+            </w:pPr>
+            <w:r>
+              <w:rPr>
+                <w:b/>
+                <w:bCs/>
+              </w:rPr>
+              <w:t>Value</w:t>
+            </w:r>
+          </w:p>
+        </w:tc>
+      </w:tr>
+      <w:tr>
+        <w:trPr>
+          <w:tblCellSpacing w:w="15" w:type="dxa"/>
+        </w:trPr>
+        <w:tc>
+          <w:tcPr>
+            <w:tcW w:w="0" w:type="auto"/>
+            <w:vAlign w:val="center"/>
+            <w:hideMark/>
+          </w:tcPr>
+          <w:p>
+            <w:r>
+              <w:rPr>
+                <w:b/>
+                <w:bCs/>
+              </w:rPr>
+              <w:t>Document Name</w:t>
+            </w:r>
+          </w:p>
+        </w:tc>
+        <w:tc>
+          <w:tcPr>
+            <w:tcW w:w="0" w:type="auto"/>
+            <w:vAlign w:val="center"/>
+            <w:hideMark/>
+          </w:tcPr>
+          <w:p>
+            <w:r>
+              <w:t>APID Registry</w:t>
+            </w:r>
+          </w:p>
+        </w:tc>
+      </w:tr>
+      <w:tr>
+        <w:trPr>
+          <w:tblCellSpacing w:w="15" w:type="dxa"/>
+        </w:trPr>
+        <w:tc>
+          <w:tcPr>
+            <w:tcW w:w="0" w:type="auto"/>
+            <w:vAlign w:val="center"/>
+            <w:hideMark/>
+          </w:tcPr>
+          <w:p>
+            <w:r>
+              <w:rPr>
+                <w:b/>
+                <w:bCs/>
+              </w:rPr>
+              <w:t>Repository</w:t>
+            </w:r>
+          </w:p>
+        </w:tc>
+        <w:tc>
+          <w:tcPr>
+            <w:tcW w:w="0" w:type="auto"/>
+            <w:vAlign w:val="center"/>
+            <w:hideMark/>
+          </w:tcPr>
+          <w:p>
+            <w:r>
+              <w:t>ATLAS</w:t>
+            </w:r>
+          </w:p>
+        </w:tc>
+      </w:tr>
+      <w:tr>
+        <w:trPr>
+          <w:tblCellSpacing w:w="15" w:type="dxa"/>
+        </w:trPr>
+        <w:tc>
+          <w:tcPr>
+            <w:tcW w:w="0" w:type="auto"/>
+            <w:vAlign w:val="center"/>
+            <w:hideMark/>
+          </w:tcPr>
+          <w:p>
+            <w:r>
+              <w:rPr>
+                <w:b/>
+                <w:bCs/>
+              </w:rPr>
+              <w:t>Version</w:t>
+            </w:r>
+          </w:p>
+        </w:tc>
+        <w:tc>
+          <w:tcPr>
+            <w:tcW w:w="0" w:type="auto"/>
+            <w:vAlign w:val="center"/>
+            <w:hideMark/>
+          </w:tcPr>
+          <w:p>
+            <w:r>
+              <w:t>1.0</w:t>
+            </w:r>
+          </w:p>
+        </w:tc>
+      </w:tr>
+      <w:tr>
+        <w:trPr>
+          <w:tblCellSpacing w:w="15" w:type="dxa"/>
+        </w:trPr>
+        <w:tc>
+          <w:tcPr>
+            <w:tcW w:w="0" w:type="auto"/>
+            <w:vAlign w:val="center"/>
+            <w:hideMark/>
+          </w:tcPr>
+          <w:p>
+            <w:r>
+              <w:rPr>
+                <w:b/>
+                <w:bCs/>
+              </w:rPr>
+              <w:t>Status</w:t>
+            </w:r>
+          </w:p>
+        </w:tc>
+        <w:tc>
+          <w:tcPr>
+            <w:tcW w:w="0" w:type="auto"/>
+            <w:vAlign w:val="center"/>
+            <w:hideMark/>
+          </w:tcPr>
+          <w:p>
+            <w:r>
+              <w:t>Active</w:t>
+            </w:r>
+          </w:p>
+        </w:tc>
+      </w:tr>
+      <w:tr>
+        <w:trPr>
+          <w:tblCellSpacing w:w="15" w:type="dxa"/>
+        </w:trPr>
+        <w:tc>
+          <w:tcPr>
+            <w:tcW w:w="0" w:type="auto"/>
+            <w:vAlign w:val="center"/>
+            <w:hideMark/>
+          </w:tcPr>
+          <w:p>
+            <w:r>
+              <w:rPr>
+                <w:b/>
+                <w:bCs/>
+              </w:rPr>
+              <w:t>Last Updated</w:t>
+            </w:r>
+          </w:p>
+        </w:tc>
+        <w:tc>
+          <w:tcPr>
+            <w:tcW w:w="0" w:type="auto"/>
+            <w:vAlign w:val="center"/>
+            <w:hideMark/>
+          </w:tcPr>
+          <w:p>
+            <w:r>
+              <w:t>2026-07-28</w:t>
+            </w:r>
+          </w:p>
+        </w:tc>
+      </w:tr>
+    </w:tbl>
     <w:p/>
     <w:sectPr>
       <w:pgSz w:w="11906" w:h="16838"/>
@@ -1164,6 +2284,119 @@
 <file path=word/numbering.xml><?xml version="1.0" encoding="utf-8"?>
 <w:numbering xmlns:wpc="http://schemas.microsoft.com/office/word/2010/wordprocessingCanvas" xmlns:cx="http://schemas.microsoft.com/office/drawing/2014/chartex" xmlns:cx1="http://schemas.microsoft.com/office/drawing/2015/9/8/chartex" xmlns:cx2="http://schemas.microsoft.com/office/drawing/2015/10/21/chartex" xmlns:cx3="http://schemas.microsoft.com/office/drawing/2016/5/9/chartex" xmlns:cx4="http://schemas.microsoft.com/office/drawing/2016/5/10/chartex" xmlns:cx5="http://schemas.microsoft.com/office/drawing/2016/5/11/chartex" xmlns:cx6="http://schemas.microsoft.com/office/drawing/2016/5/12/chartex" xmlns:cx7="http://schemas.microsoft.com/office/drawing/2016/5/13/chartex" xmlns:cx8="http://schemas.microsoft.com/office/drawing/2016/5/14/chartex" xmlns:mc="http://schemas.openxmlformats.org/markup-compatibility/2006" xmlns:aink="http://schemas.microsoft.com/office/drawing/2016/ink" xmlns:am3d="http://schemas.microsoft.com/office/drawing/2017/model3d" xmlns:o="urn:schemas-microsoft-com:office:office" xmlns:oel="http://schemas.microsoft.com/office/2019/extlst" xmlns:r="http://schemas.openxmlformats.org/officeDocument/2006/relationships" xmlns:m="http://schemas.openxmlformats.org/officeDocument/2006/math" xmlns:v="urn:schemas-microsoft-com:vml" xmlns:wp14="http://schemas.microsoft.com/office/word/2010/wordprocessingDrawing" xmlns:wp="http://schemas.openxmlformats.org/drawingml/2006/wordprocessingDrawing" xmlns:w10="urn:schemas-microsoft-com:office:word" xmlns:w="http://schemas.openxmlformats.org/wordprocessingml/2006/main" xmlns:w14="http://schemas.microsoft.com/office/word/2010/wordml" xmlns:w15="http://schemas.microsoft.com/office/word/2012/wordml" xmlns:w16cex="http://schemas.microsoft.com/office/word/2018/wordml/cex" xmlns:w16cid="http://schemas.microsoft.com/office/word/2016/wordml/cid" xmlns:w16="http://schemas.microsoft.com/office/word/2018/wordml" xmlns:w16du="http://schemas.microsoft.com/office/word/2023/wordml/word16du" xmlns:w16sdtdh="http://schemas.microsoft.com/office/word/2020/wordml/sdtdatahash" xmlns:w16sdtfl="http://schemas.microsoft.com/office/word/2024/wordml/sdtformatlock" xmlns:w16se="http://schemas.microsoft.com/office/word/2015/wordml/symex" xmlns:wpg="http://schemas.microsoft.com/office/word/2010/wordprocessingGroup" xmlns:wpi="http://schemas.microsoft.com/office/word/2010/wordprocessingInk" xmlns:wne="http://schemas.microsoft.com/office/word/2006/wordml" xmlns:wps="http://schemas.microsoft.com/office/word/2010/wordprocessingShape" mc:Ignorable="w14 w15 w16se w16cid w16 w16cex w16sdtdh w16sdtfl w16du wp14">
   <w:abstractNum w:abstractNumId="0" w15:restartNumberingAfterBreak="0">
+    <w:nsid w:val="08C46E81"/>
+    <w:multiLevelType w:val="multilevel"/>
+    <w:tmpl w:val="2FD20F6C"/>
+    <w:lvl w:ilvl="0">
+      <w:start w:val="1"/>
+      <w:numFmt w:val="decimal"/>
+      <w:lvlText w:val="%1."/>
+      <w:lvlJc w:val="left"/>
+      <w:pPr>
+        <w:tabs>
+          <w:tab w:val="num" w:pos="720"/>
+        </w:tabs>
+        <w:ind w:left="720" w:hanging="360"/>
+      </w:pPr>
+    </w:lvl>
+    <w:lvl w:ilvl="1" w:tentative="1">
+      <w:start w:val="1"/>
+      <w:numFmt w:val="decimal"/>
+      <w:lvlText w:val="%2."/>
+      <w:lvlJc w:val="left"/>
+      <w:pPr>
+        <w:tabs>
+          <w:tab w:val="num" w:pos="1440"/>
+        </w:tabs>
+        <w:ind w:left="1440" w:hanging="360"/>
+      </w:pPr>
+    </w:lvl>
+    <w:lvl w:ilvl="2" w:tentative="1">
+      <w:start w:val="1"/>
+      <w:numFmt w:val="decimal"/>
+      <w:lvlText w:val="%3."/>
+      <w:lvlJc w:val="left"/>
+      <w:pPr>
+        <w:tabs>
+          <w:tab w:val="num" w:pos="2160"/>
+        </w:tabs>
+        <w:ind w:left="2160" w:hanging="360"/>
+      </w:pPr>
+    </w:lvl>
+    <w:lvl w:ilvl="3" w:tentative="1">
+      <w:start w:val="1"/>
+      <w:numFmt w:val="decimal"/>
+      <w:lvlText w:val="%4."/>
+      <w:lvlJc w:val="left"/>
+      <w:pPr>
+        <w:tabs>
+          <w:tab w:val="num" w:pos="2880"/>
+        </w:tabs>
+        <w:ind w:left="2880" w:hanging="360"/>
+      </w:pPr>
+    </w:lvl>
+    <w:lvl w:ilvl="4" w:tentative="1">
+      <w:start w:val="1"/>
+      <w:numFmt w:val="decimal"/>
+      <w:lvlText w:val="%5."/>
+      <w:lvlJc w:val="left"/>
+      <w:pPr>
+        <w:tabs>
+          <w:tab w:val="num" w:pos="3600"/>
+        </w:tabs>
+        <w:ind w:left="3600" w:hanging="360"/>
+      </w:pPr>
+    </w:lvl>
+    <w:lvl w:ilvl="5" w:tentative="1">
+      <w:start w:val="1"/>
+      <w:numFmt w:val="decimal"/>
+      <w:lvlText w:val="%6."/>
+      <w:lvlJc w:val="left"/>
+      <w:pPr>
+        <w:tabs>
+          <w:tab w:val="num" w:pos="4320"/>
+        </w:tabs>
+        <w:ind w:left="4320" w:hanging="360"/>
+      </w:pPr>
+    </w:lvl>
+    <w:lvl w:ilvl="6" w:tentative="1">
+      <w:start w:val="1"/>
+      <w:numFmt w:val="decimal"/>
+      <w:lvlText w:val="%7."/>
+      <w:lvlJc w:val="left"/>
+      <w:pPr>
+        <w:tabs>
+          <w:tab w:val="num" w:pos="5040"/>
+        </w:tabs>
+        <w:ind w:left="5040" w:hanging="360"/>
+      </w:pPr>
+    </w:lvl>
+    <w:lvl w:ilvl="7" w:tentative="1">
+      <w:start w:val="1"/>
+      <w:numFmt w:val="decimal"/>
+      <w:lvlText w:val="%8."/>
+      <w:lvlJc w:val="left"/>
+      <w:pPr>
+        <w:tabs>
+          <w:tab w:val="num" w:pos="5760"/>
+        </w:tabs>
+        <w:ind w:left="5760" w:hanging="360"/>
+      </w:pPr>
+    </w:lvl>
+    <w:lvl w:ilvl="8" w:tentative="1">
+      <w:start w:val="1"/>
+      <w:numFmt w:val="decimal"/>
+      <w:lvlText w:val="%9."/>
+      <w:lvlJc w:val="left"/>
+      <w:pPr>
+        <w:tabs>
+          <w:tab w:val="num" w:pos="6480"/>
+        </w:tabs>
+        <w:ind w:left="6480" w:hanging="360"/>
+      </w:pPr>
+    </w:lvl>
+  </w:abstractNum>
+  <w:abstractNum w:abstractNumId="1" w15:restartNumberingAfterBreak="0">
     <w:nsid w:val="1E3F072E"/>
     <w:multiLevelType w:val="multilevel"/>
     <w:tmpl w:val="5352CE06"/>
@@ -1276,8 +2509,127 @@
       </w:pPr>
     </w:lvl>
   </w:abstractNum>
+  <w:abstractNum w:abstractNumId="2" w15:restartNumberingAfterBreak="0">
+    <w:nsid w:val="41A065C4"/>
+    <w:multiLevelType w:val="multilevel"/>
+    <w:tmpl w:val="A4A6EE48"/>
+    <w:lvl w:ilvl="0">
+      <w:start w:val="1"/>
+      <w:numFmt w:val="decimal"/>
+      <w:lvlText w:val="%1."/>
+      <w:lvlJc w:val="left"/>
+      <w:pPr>
+        <w:tabs>
+          <w:tab w:val="num" w:pos="720"/>
+        </w:tabs>
+        <w:ind w:left="720" w:hanging="360"/>
+      </w:pPr>
+    </w:lvl>
+    <w:lvl w:ilvl="1" w:tentative="1">
+      <w:start w:val="1"/>
+      <w:numFmt w:val="decimal"/>
+      <w:lvlText w:val="%2."/>
+      <w:lvlJc w:val="left"/>
+      <w:pPr>
+        <w:tabs>
+          <w:tab w:val="num" w:pos="1440"/>
+        </w:tabs>
+        <w:ind w:left="1440" w:hanging="360"/>
+      </w:pPr>
+    </w:lvl>
+    <w:lvl w:ilvl="2" w:tentative="1">
+      <w:start w:val="1"/>
+      <w:numFmt w:val="decimal"/>
+      <w:lvlText w:val="%3."/>
+      <w:lvlJc w:val="left"/>
+      <w:pPr>
+        <w:tabs>
+          <w:tab w:val="num" w:pos="2160"/>
+        </w:tabs>
+        <w:ind w:left="2160" w:hanging="360"/>
+      </w:pPr>
+    </w:lvl>
+    <w:lvl w:ilvl="3" w:tentative="1">
+      <w:start w:val="1"/>
+      <w:numFmt w:val="decimal"/>
+      <w:lvlText w:val="%4."/>
+      <w:lvlJc w:val="left"/>
+      <w:pPr>
+        <w:tabs>
+          <w:tab w:val="num" w:pos="2880"/>
+        </w:tabs>
+        <w:ind w:left="2880" w:hanging="360"/>
+      </w:pPr>
+    </w:lvl>
+    <w:lvl w:ilvl="4" w:tentative="1">
+      <w:start w:val="1"/>
+      <w:numFmt w:val="decimal"/>
+      <w:lvlText w:val="%5."/>
+      <w:lvlJc w:val="left"/>
+      <w:pPr>
+        <w:tabs>
+          <w:tab w:val="num" w:pos="3600"/>
+        </w:tabs>
+        <w:ind w:left="3600" w:hanging="360"/>
+      </w:pPr>
+    </w:lvl>
+    <w:lvl w:ilvl="5" w:tentative="1">
+      <w:start w:val="1"/>
+      <w:numFmt w:val="decimal"/>
+      <w:lvlText w:val="%6."/>
+      <w:lvlJc w:val="left"/>
+      <w:pPr>
+        <w:tabs>
+          <w:tab w:val="num" w:pos="4320"/>
+        </w:tabs>
+        <w:ind w:left="4320" w:hanging="360"/>
+      </w:pPr>
+    </w:lvl>
+    <w:lvl w:ilvl="6" w:tentative="1">
+      <w:start w:val="1"/>
+      <w:numFmt w:val="decimal"/>
+      <w:lvlText w:val="%7."/>
+      <w:lvlJc w:val="left"/>
+      <w:pPr>
+        <w:tabs>
+          <w:tab w:val="num" w:pos="5040"/>
+        </w:tabs>
+        <w:ind w:left="5040" w:hanging="360"/>
+      </w:pPr>
+    </w:lvl>
+    <w:lvl w:ilvl="7" w:tentative="1">
+      <w:start w:val="1"/>
+      <w:numFmt w:val="decimal"/>
+      <w:lvlText w:val="%8."/>
+      <w:lvlJc w:val="left"/>
+      <w:pPr>
+        <w:tabs>
+          <w:tab w:val="num" w:pos="5760"/>
+        </w:tabs>
+        <w:ind w:left="5760" w:hanging="360"/>
+      </w:pPr>
+    </w:lvl>
+    <w:lvl w:ilvl="8" w:tentative="1">
+      <w:start w:val="1"/>
+      <w:numFmt w:val="decimal"/>
+      <w:lvlText w:val="%9."/>
+      <w:lvlJc w:val="left"/>
+      <w:pPr>
+        <w:tabs>
+          <w:tab w:val="num" w:pos="6480"/>
+        </w:tabs>
+        <w:ind w:left="6480" w:hanging="360"/>
+      </w:pPr>
+    </w:lvl>
+  </w:abstractNum>
   <w:num w:numId="1" w16cid:durableId="518542539">
+    <w:abstractNumId w:val="1"/>
+  </w:num>
+  <w:num w:numId="2" w16cid:durableId="2035886747">
     <w:abstractNumId w:val="0"/>
+  </w:num>
+  <w:num w:numId="3" w16cid:durableId="1993173586">
+    <w:abstractNumId w:val="2"/>
   </w:num>
 </w:numbering>
 </file>
@@ -1682,6 +3034,7 @@
   <w:style w:type="paragraph" w:default="1" w:styleId="Normal">
     <w:name w:val="Normal"/>
     <w:qFormat/>
+    <w:rsid w:val="00ED721E"/>
   </w:style>
   <w:style w:type="paragraph" w:styleId="Heading1">
     <w:name w:val="heading 1"/>

</xml_diff>

<commit_message>
I have introduced new section named OS and also completed Volume -01 .
Co-Authored-By: jothish-blip <215570346+jothish-blip@users.noreply.github.com>
</commit_message>
<xml_diff>
--- a/atlas/Registries/APID-Registry.docx
+++ b/atlas/Registries/APID-Registry.docx
@@ -6549,6 +6549,2349 @@
           <w:bCs/>
         </w:rPr>
       </w:pPr>
+    </w:p>
+    <w:p>
+      <w:pPr>
+        <w:rPr>
+          <w:b/>
+          <w:bCs/>
+        </w:rPr>
+      </w:pPr>
+      <w:r>
+        <w:rPr>
+          <w:b/>
+          <w:bCs/>
+        </w:rPr>
+        <w:t>Category: Operating System (OS)</w:t>
+      </w:r>
+    </w:p>
+    <w:tbl>
+      <w:tblPr>
+        <w:tblW w:w="0" w:type="auto"/>
+        <w:tblCellSpacing w:w="15" w:type="dxa"/>
+        <w:tblCellMar>
+          <w:top w:w="15" w:type="dxa"/>
+          <w:left w:w="15" w:type="dxa"/>
+          <w:bottom w:w="15" w:type="dxa"/>
+          <w:right w:w="15" w:type="dxa"/>
+        </w:tblCellMar>
+        <w:tblLook w:val="04A0" w:firstRow="1" w:lastRow="0" w:firstColumn="1" w:lastColumn="0" w:noHBand="0" w:noVBand="1"/>
+      </w:tblPr>
+      <w:tblGrid>
+        <w:gridCol w:w="1096"/>
+        <w:gridCol w:w="6487"/>
+        <w:gridCol w:w="1427"/>
+      </w:tblGrid>
+      <w:tr>
+        <w:trPr>
+          <w:tblHeader/>
+          <w:tblCellSpacing w:w="15" w:type="dxa"/>
+        </w:trPr>
+        <w:tc>
+          <w:tcPr>
+            <w:tcW w:w="0" w:type="auto"/>
+            <w:tcBorders>
+              <w:top w:val="single" w:sz="6" w:space="0" w:color="C4C7C5"/>
+              <w:left w:val="single" w:sz="6" w:space="0" w:color="C4C7C5"/>
+              <w:bottom w:val="single" w:sz="6" w:space="0" w:color="C4C7C5"/>
+              <w:right w:val="single" w:sz="6" w:space="0" w:color="C4C7C5"/>
+            </w:tcBorders>
+            <w:tcMar>
+              <w:top w:w="120" w:type="dxa"/>
+              <w:left w:w="180" w:type="dxa"/>
+              <w:bottom w:w="120" w:type="dxa"/>
+              <w:right w:w="180" w:type="dxa"/>
+            </w:tcMar>
+            <w:vAlign w:val="center"/>
+            <w:hideMark/>
+          </w:tcPr>
+          <w:p>
+            <w:pPr>
+              <w:rPr>
+                <w:b/>
+                <w:bCs/>
+              </w:rPr>
+            </w:pPr>
+            <w:r>
+              <w:rPr>
+                <w:b/>
+                <w:bCs/>
+              </w:rPr>
+              <w:t>APID</w:t>
+            </w:r>
+          </w:p>
+        </w:tc>
+        <w:tc>
+          <w:tcPr>
+            <w:tcW w:w="0" w:type="auto"/>
+            <w:tcBorders>
+              <w:top w:val="single" w:sz="6" w:space="0" w:color="C4C7C5"/>
+              <w:left w:val="single" w:sz="6" w:space="0" w:color="C4C7C5"/>
+              <w:bottom w:val="single" w:sz="6" w:space="0" w:color="C4C7C5"/>
+              <w:right w:val="single" w:sz="6" w:space="0" w:color="C4C7C5"/>
+            </w:tcBorders>
+            <w:tcMar>
+              <w:top w:w="120" w:type="dxa"/>
+              <w:left w:w="180" w:type="dxa"/>
+              <w:bottom w:w="120" w:type="dxa"/>
+              <w:right w:w="180" w:type="dxa"/>
+            </w:tcMar>
+            <w:vAlign w:val="center"/>
+            <w:hideMark/>
+          </w:tcPr>
+          <w:p>
+            <w:pPr>
+              <w:rPr>
+                <w:b/>
+                <w:bCs/>
+              </w:rPr>
+            </w:pPr>
+            <w:r>
+              <w:rPr>
+                <w:b/>
+                <w:bCs/>
+              </w:rPr>
+              <w:t>Human Friction</w:t>
+            </w:r>
+          </w:p>
+        </w:tc>
+        <w:tc>
+          <w:tcPr>
+            <w:tcW w:w="0" w:type="auto"/>
+            <w:tcBorders>
+              <w:top w:val="single" w:sz="6" w:space="0" w:color="C4C7C5"/>
+              <w:left w:val="single" w:sz="6" w:space="0" w:color="C4C7C5"/>
+              <w:bottom w:val="single" w:sz="6" w:space="0" w:color="C4C7C5"/>
+              <w:right w:val="single" w:sz="6" w:space="0" w:color="C4C7C5"/>
+            </w:tcBorders>
+            <w:tcMar>
+              <w:top w:w="120" w:type="dxa"/>
+              <w:left w:w="180" w:type="dxa"/>
+              <w:bottom w:w="120" w:type="dxa"/>
+              <w:right w:w="180" w:type="dxa"/>
+            </w:tcMar>
+            <w:vAlign w:val="center"/>
+            <w:hideMark/>
+          </w:tcPr>
+          <w:p>
+            <w:pPr>
+              <w:rPr>
+                <w:b/>
+                <w:bCs/>
+              </w:rPr>
+            </w:pPr>
+            <w:r>
+              <w:rPr>
+                <w:b/>
+                <w:bCs/>
+              </w:rPr>
+              <w:t>Status</w:t>
+            </w:r>
+          </w:p>
+        </w:tc>
+      </w:tr>
+      <w:tr>
+        <w:trPr>
+          <w:tblCellSpacing w:w="15" w:type="dxa"/>
+        </w:trPr>
+        <w:tc>
+          <w:tcPr>
+            <w:tcW w:w="0" w:type="auto"/>
+            <w:tcBorders>
+              <w:top w:val="single" w:sz="6" w:space="0" w:color="C4C7C5"/>
+              <w:left w:val="single" w:sz="6" w:space="0" w:color="C4C7C5"/>
+              <w:bottom w:val="single" w:sz="6" w:space="0" w:color="C4C7C5"/>
+              <w:right w:val="single" w:sz="6" w:space="0" w:color="C4C7C5"/>
+            </w:tcBorders>
+            <w:tcMar>
+              <w:top w:w="120" w:type="dxa"/>
+              <w:left w:w="180" w:type="dxa"/>
+              <w:bottom w:w="120" w:type="dxa"/>
+              <w:right w:w="180" w:type="dxa"/>
+            </w:tcMar>
+            <w:vAlign w:val="center"/>
+            <w:hideMark/>
+          </w:tcPr>
+          <w:p>
+            <w:pPr>
+              <w:rPr>
+                <w:b/>
+                <w:bCs/>
+              </w:rPr>
+            </w:pPr>
+            <w:r>
+              <w:rPr>
+                <w:b/>
+                <w:bCs/>
+              </w:rPr>
+              <w:t>OS-001</w:t>
+            </w:r>
+          </w:p>
+        </w:tc>
+        <w:tc>
+          <w:tcPr>
+            <w:tcW w:w="0" w:type="auto"/>
+            <w:tcBorders>
+              <w:top w:val="single" w:sz="6" w:space="0" w:color="C4C7C5"/>
+              <w:left w:val="single" w:sz="6" w:space="0" w:color="C4C7C5"/>
+              <w:bottom w:val="single" w:sz="6" w:space="0" w:color="C4C7C5"/>
+              <w:right w:val="single" w:sz="6" w:space="0" w:color="C4C7C5"/>
+            </w:tcBorders>
+            <w:tcMar>
+              <w:top w:w="120" w:type="dxa"/>
+              <w:left w:w="180" w:type="dxa"/>
+              <w:bottom w:w="120" w:type="dxa"/>
+              <w:right w:w="180" w:type="dxa"/>
+            </w:tcMar>
+            <w:vAlign w:val="center"/>
+            <w:hideMark/>
+          </w:tcPr>
+          <w:p>
+            <w:r>
+              <w:t>Users struggle to understand the purpose of the desktop after first using a computer</w:t>
+            </w:r>
+          </w:p>
+        </w:tc>
+        <w:tc>
+          <w:tcPr>
+            <w:tcW w:w="0" w:type="auto"/>
+            <w:tcBorders>
+              <w:top w:val="single" w:sz="6" w:space="0" w:color="C4C7C5"/>
+              <w:left w:val="single" w:sz="6" w:space="0" w:color="C4C7C5"/>
+              <w:bottom w:val="single" w:sz="6" w:space="0" w:color="C4C7C5"/>
+              <w:right w:val="single" w:sz="6" w:space="0" w:color="C4C7C5"/>
+            </w:tcBorders>
+            <w:tcMar>
+              <w:top w:w="120" w:type="dxa"/>
+              <w:left w:w="180" w:type="dxa"/>
+              <w:bottom w:w="120" w:type="dxa"/>
+              <w:right w:w="180" w:type="dxa"/>
+            </w:tcMar>
+            <w:vAlign w:val="center"/>
+            <w:hideMark/>
+          </w:tcPr>
+          <w:p>
+            <w:r>
+              <w:t>Accepted</w:t>
+            </w:r>
+          </w:p>
+        </w:tc>
+      </w:tr>
+      <w:tr>
+        <w:trPr>
+          <w:tblCellSpacing w:w="15" w:type="dxa"/>
+        </w:trPr>
+        <w:tc>
+          <w:tcPr>
+            <w:tcW w:w="0" w:type="auto"/>
+            <w:tcBorders>
+              <w:top w:val="single" w:sz="6" w:space="0" w:color="C4C7C5"/>
+              <w:left w:val="single" w:sz="6" w:space="0" w:color="C4C7C5"/>
+              <w:bottom w:val="single" w:sz="6" w:space="0" w:color="C4C7C5"/>
+              <w:right w:val="single" w:sz="6" w:space="0" w:color="C4C7C5"/>
+            </w:tcBorders>
+            <w:tcMar>
+              <w:top w:w="120" w:type="dxa"/>
+              <w:left w:w="180" w:type="dxa"/>
+              <w:bottom w:w="120" w:type="dxa"/>
+              <w:right w:w="180" w:type="dxa"/>
+            </w:tcMar>
+            <w:vAlign w:val="center"/>
+            <w:hideMark/>
+          </w:tcPr>
+          <w:p>
+            <w:pPr>
+              <w:rPr>
+                <w:b/>
+                <w:bCs/>
+              </w:rPr>
+            </w:pPr>
+            <w:r>
+              <w:rPr>
+                <w:b/>
+                <w:bCs/>
+              </w:rPr>
+              <w:t>OS-002</w:t>
+            </w:r>
+          </w:p>
+        </w:tc>
+        <w:tc>
+          <w:tcPr>
+            <w:tcW w:w="0" w:type="auto"/>
+            <w:tcBorders>
+              <w:top w:val="single" w:sz="6" w:space="0" w:color="C4C7C5"/>
+              <w:left w:val="single" w:sz="6" w:space="0" w:color="C4C7C5"/>
+              <w:bottom w:val="single" w:sz="6" w:space="0" w:color="C4C7C5"/>
+              <w:right w:val="single" w:sz="6" w:space="0" w:color="C4C7C5"/>
+            </w:tcBorders>
+            <w:tcMar>
+              <w:top w:w="120" w:type="dxa"/>
+              <w:left w:w="180" w:type="dxa"/>
+              <w:bottom w:w="120" w:type="dxa"/>
+              <w:right w:w="180" w:type="dxa"/>
+            </w:tcMar>
+            <w:vAlign w:val="center"/>
+            <w:hideMark/>
+          </w:tcPr>
+          <w:p>
+            <w:r>
+              <w:t>Users struggle to understand the difference between files, folders, drives, and applications</w:t>
+            </w:r>
+          </w:p>
+        </w:tc>
+        <w:tc>
+          <w:tcPr>
+            <w:tcW w:w="0" w:type="auto"/>
+            <w:tcBorders>
+              <w:top w:val="single" w:sz="6" w:space="0" w:color="C4C7C5"/>
+              <w:left w:val="single" w:sz="6" w:space="0" w:color="C4C7C5"/>
+              <w:bottom w:val="single" w:sz="6" w:space="0" w:color="C4C7C5"/>
+              <w:right w:val="single" w:sz="6" w:space="0" w:color="C4C7C5"/>
+            </w:tcBorders>
+            <w:tcMar>
+              <w:top w:w="120" w:type="dxa"/>
+              <w:left w:w="180" w:type="dxa"/>
+              <w:bottom w:w="120" w:type="dxa"/>
+              <w:right w:w="180" w:type="dxa"/>
+            </w:tcMar>
+            <w:vAlign w:val="center"/>
+            <w:hideMark/>
+          </w:tcPr>
+          <w:p>
+            <w:r>
+              <w:t>Accepted</w:t>
+            </w:r>
+          </w:p>
+        </w:tc>
+      </w:tr>
+      <w:tr>
+        <w:trPr>
+          <w:tblCellSpacing w:w="15" w:type="dxa"/>
+        </w:trPr>
+        <w:tc>
+          <w:tcPr>
+            <w:tcW w:w="0" w:type="auto"/>
+            <w:tcBorders>
+              <w:top w:val="single" w:sz="6" w:space="0" w:color="C4C7C5"/>
+              <w:left w:val="single" w:sz="6" w:space="0" w:color="C4C7C5"/>
+              <w:bottom w:val="single" w:sz="6" w:space="0" w:color="C4C7C5"/>
+              <w:right w:val="single" w:sz="6" w:space="0" w:color="C4C7C5"/>
+            </w:tcBorders>
+            <w:tcMar>
+              <w:top w:w="120" w:type="dxa"/>
+              <w:left w:w="180" w:type="dxa"/>
+              <w:bottom w:w="120" w:type="dxa"/>
+              <w:right w:w="180" w:type="dxa"/>
+            </w:tcMar>
+            <w:vAlign w:val="center"/>
+            <w:hideMark/>
+          </w:tcPr>
+          <w:p>
+            <w:pPr>
+              <w:rPr>
+                <w:b/>
+                <w:bCs/>
+              </w:rPr>
+            </w:pPr>
+            <w:r>
+              <w:rPr>
+                <w:b/>
+                <w:bCs/>
+              </w:rPr>
+              <w:lastRenderedPageBreak/>
+              <w:t>OS-003</w:t>
+            </w:r>
+          </w:p>
+        </w:tc>
+        <w:tc>
+          <w:tcPr>
+            <w:tcW w:w="0" w:type="auto"/>
+            <w:tcBorders>
+              <w:top w:val="single" w:sz="6" w:space="0" w:color="C4C7C5"/>
+              <w:left w:val="single" w:sz="6" w:space="0" w:color="C4C7C5"/>
+              <w:bottom w:val="single" w:sz="6" w:space="0" w:color="C4C7C5"/>
+              <w:right w:val="single" w:sz="6" w:space="0" w:color="C4C7C5"/>
+            </w:tcBorders>
+            <w:tcMar>
+              <w:top w:w="120" w:type="dxa"/>
+              <w:left w:w="180" w:type="dxa"/>
+              <w:bottom w:w="120" w:type="dxa"/>
+              <w:right w:w="180" w:type="dxa"/>
+            </w:tcMar>
+            <w:vAlign w:val="center"/>
+            <w:hideMark/>
+          </w:tcPr>
+          <w:p>
+            <w:r>
+              <w:t>Users struggle to remember where system settings are located</w:t>
+            </w:r>
+          </w:p>
+        </w:tc>
+        <w:tc>
+          <w:tcPr>
+            <w:tcW w:w="0" w:type="auto"/>
+            <w:tcBorders>
+              <w:top w:val="single" w:sz="6" w:space="0" w:color="C4C7C5"/>
+              <w:left w:val="single" w:sz="6" w:space="0" w:color="C4C7C5"/>
+              <w:bottom w:val="single" w:sz="6" w:space="0" w:color="C4C7C5"/>
+              <w:right w:val="single" w:sz="6" w:space="0" w:color="C4C7C5"/>
+            </w:tcBorders>
+            <w:tcMar>
+              <w:top w:w="120" w:type="dxa"/>
+              <w:left w:w="180" w:type="dxa"/>
+              <w:bottom w:w="120" w:type="dxa"/>
+              <w:right w:w="180" w:type="dxa"/>
+            </w:tcMar>
+            <w:vAlign w:val="center"/>
+            <w:hideMark/>
+          </w:tcPr>
+          <w:p>
+            <w:r>
+              <w:t>Accepted</w:t>
+            </w:r>
+          </w:p>
+        </w:tc>
+      </w:tr>
+      <w:tr>
+        <w:trPr>
+          <w:tblCellSpacing w:w="15" w:type="dxa"/>
+        </w:trPr>
+        <w:tc>
+          <w:tcPr>
+            <w:tcW w:w="0" w:type="auto"/>
+            <w:tcBorders>
+              <w:top w:val="single" w:sz="6" w:space="0" w:color="C4C7C5"/>
+              <w:left w:val="single" w:sz="6" w:space="0" w:color="C4C7C5"/>
+              <w:bottom w:val="single" w:sz="6" w:space="0" w:color="C4C7C5"/>
+              <w:right w:val="single" w:sz="6" w:space="0" w:color="C4C7C5"/>
+            </w:tcBorders>
+            <w:tcMar>
+              <w:top w:w="120" w:type="dxa"/>
+              <w:left w:w="180" w:type="dxa"/>
+              <w:bottom w:w="120" w:type="dxa"/>
+              <w:right w:w="180" w:type="dxa"/>
+            </w:tcMar>
+            <w:vAlign w:val="center"/>
+            <w:hideMark/>
+          </w:tcPr>
+          <w:p>
+            <w:pPr>
+              <w:rPr>
+                <w:b/>
+                <w:bCs/>
+              </w:rPr>
+            </w:pPr>
+            <w:r>
+              <w:rPr>
+                <w:b/>
+                <w:bCs/>
+              </w:rPr>
+              <w:t>OS-004</w:t>
+            </w:r>
+          </w:p>
+        </w:tc>
+        <w:tc>
+          <w:tcPr>
+            <w:tcW w:w="0" w:type="auto"/>
+            <w:tcBorders>
+              <w:top w:val="single" w:sz="6" w:space="0" w:color="C4C7C5"/>
+              <w:left w:val="single" w:sz="6" w:space="0" w:color="C4C7C5"/>
+              <w:bottom w:val="single" w:sz="6" w:space="0" w:color="C4C7C5"/>
+              <w:right w:val="single" w:sz="6" w:space="0" w:color="C4C7C5"/>
+            </w:tcBorders>
+            <w:tcMar>
+              <w:top w:w="120" w:type="dxa"/>
+              <w:left w:w="180" w:type="dxa"/>
+              <w:bottom w:w="120" w:type="dxa"/>
+              <w:right w:w="180" w:type="dxa"/>
+            </w:tcMar>
+            <w:vAlign w:val="center"/>
+            <w:hideMark/>
+          </w:tcPr>
+          <w:p>
+            <w:r>
+              <w:t>Users struggle to understand the purpose of different system applications</w:t>
+            </w:r>
+          </w:p>
+        </w:tc>
+        <w:tc>
+          <w:tcPr>
+            <w:tcW w:w="0" w:type="auto"/>
+            <w:tcBorders>
+              <w:top w:val="single" w:sz="6" w:space="0" w:color="C4C7C5"/>
+              <w:left w:val="single" w:sz="6" w:space="0" w:color="C4C7C5"/>
+              <w:bottom w:val="single" w:sz="6" w:space="0" w:color="C4C7C5"/>
+              <w:right w:val="single" w:sz="6" w:space="0" w:color="C4C7C5"/>
+            </w:tcBorders>
+            <w:tcMar>
+              <w:top w:w="120" w:type="dxa"/>
+              <w:left w:w="180" w:type="dxa"/>
+              <w:bottom w:w="120" w:type="dxa"/>
+              <w:right w:w="180" w:type="dxa"/>
+            </w:tcMar>
+            <w:vAlign w:val="center"/>
+            <w:hideMark/>
+          </w:tcPr>
+          <w:p>
+            <w:r>
+              <w:t>Accepted</w:t>
+            </w:r>
+          </w:p>
+        </w:tc>
+      </w:tr>
+      <w:tr>
+        <w:trPr>
+          <w:tblCellSpacing w:w="15" w:type="dxa"/>
+        </w:trPr>
+        <w:tc>
+          <w:tcPr>
+            <w:tcW w:w="0" w:type="auto"/>
+            <w:tcBorders>
+              <w:top w:val="single" w:sz="6" w:space="0" w:color="C4C7C5"/>
+              <w:left w:val="single" w:sz="6" w:space="0" w:color="C4C7C5"/>
+              <w:bottom w:val="single" w:sz="6" w:space="0" w:color="C4C7C5"/>
+              <w:right w:val="single" w:sz="6" w:space="0" w:color="C4C7C5"/>
+            </w:tcBorders>
+            <w:tcMar>
+              <w:top w:w="120" w:type="dxa"/>
+              <w:left w:w="180" w:type="dxa"/>
+              <w:bottom w:w="120" w:type="dxa"/>
+              <w:right w:w="180" w:type="dxa"/>
+            </w:tcMar>
+            <w:vAlign w:val="center"/>
+            <w:hideMark/>
+          </w:tcPr>
+          <w:p>
+            <w:pPr>
+              <w:rPr>
+                <w:b/>
+                <w:bCs/>
+              </w:rPr>
+            </w:pPr>
+            <w:r>
+              <w:rPr>
+                <w:b/>
+                <w:bCs/>
+              </w:rPr>
+              <w:t>OS-005</w:t>
+            </w:r>
+          </w:p>
+        </w:tc>
+        <w:tc>
+          <w:tcPr>
+            <w:tcW w:w="0" w:type="auto"/>
+            <w:tcBorders>
+              <w:top w:val="single" w:sz="6" w:space="0" w:color="C4C7C5"/>
+              <w:left w:val="single" w:sz="6" w:space="0" w:color="C4C7C5"/>
+              <w:bottom w:val="single" w:sz="6" w:space="0" w:color="C4C7C5"/>
+              <w:right w:val="single" w:sz="6" w:space="0" w:color="C4C7C5"/>
+            </w:tcBorders>
+            <w:tcMar>
+              <w:top w:w="120" w:type="dxa"/>
+              <w:left w:w="180" w:type="dxa"/>
+              <w:bottom w:w="120" w:type="dxa"/>
+              <w:right w:w="180" w:type="dxa"/>
+            </w:tcMar>
+            <w:vAlign w:val="center"/>
+            <w:hideMark/>
+          </w:tcPr>
+          <w:p>
+            <w:r>
+              <w:t>Users struggle to identify which application should be used for a particular task</w:t>
+            </w:r>
+          </w:p>
+        </w:tc>
+        <w:tc>
+          <w:tcPr>
+            <w:tcW w:w="0" w:type="auto"/>
+            <w:tcBorders>
+              <w:top w:val="single" w:sz="6" w:space="0" w:color="C4C7C5"/>
+              <w:left w:val="single" w:sz="6" w:space="0" w:color="C4C7C5"/>
+              <w:bottom w:val="single" w:sz="6" w:space="0" w:color="C4C7C5"/>
+              <w:right w:val="single" w:sz="6" w:space="0" w:color="C4C7C5"/>
+            </w:tcBorders>
+            <w:tcMar>
+              <w:top w:w="120" w:type="dxa"/>
+              <w:left w:w="180" w:type="dxa"/>
+              <w:bottom w:w="120" w:type="dxa"/>
+              <w:right w:w="180" w:type="dxa"/>
+            </w:tcMar>
+            <w:vAlign w:val="center"/>
+            <w:hideMark/>
+          </w:tcPr>
+          <w:p>
+            <w:r>
+              <w:t>Accepted</w:t>
+            </w:r>
+          </w:p>
+        </w:tc>
+      </w:tr>
+      <w:tr>
+        <w:trPr>
+          <w:tblCellSpacing w:w="15" w:type="dxa"/>
+        </w:trPr>
+        <w:tc>
+          <w:tcPr>
+            <w:tcW w:w="0" w:type="auto"/>
+            <w:tcBorders>
+              <w:top w:val="single" w:sz="6" w:space="0" w:color="C4C7C5"/>
+              <w:left w:val="single" w:sz="6" w:space="0" w:color="C4C7C5"/>
+              <w:bottom w:val="single" w:sz="6" w:space="0" w:color="C4C7C5"/>
+              <w:right w:val="single" w:sz="6" w:space="0" w:color="C4C7C5"/>
+            </w:tcBorders>
+            <w:tcMar>
+              <w:top w:w="120" w:type="dxa"/>
+              <w:left w:w="180" w:type="dxa"/>
+              <w:bottom w:w="120" w:type="dxa"/>
+              <w:right w:w="180" w:type="dxa"/>
+            </w:tcMar>
+            <w:vAlign w:val="center"/>
+            <w:hideMark/>
+          </w:tcPr>
+          <w:p>
+            <w:pPr>
+              <w:rPr>
+                <w:b/>
+                <w:bCs/>
+              </w:rPr>
+            </w:pPr>
+            <w:r>
+              <w:rPr>
+                <w:b/>
+                <w:bCs/>
+              </w:rPr>
+              <w:t>OS-006</w:t>
+            </w:r>
+          </w:p>
+        </w:tc>
+        <w:tc>
+          <w:tcPr>
+            <w:tcW w:w="0" w:type="auto"/>
+            <w:tcBorders>
+              <w:top w:val="single" w:sz="6" w:space="0" w:color="C4C7C5"/>
+              <w:left w:val="single" w:sz="6" w:space="0" w:color="C4C7C5"/>
+              <w:bottom w:val="single" w:sz="6" w:space="0" w:color="C4C7C5"/>
+              <w:right w:val="single" w:sz="6" w:space="0" w:color="C4C7C5"/>
+            </w:tcBorders>
+            <w:tcMar>
+              <w:top w:w="120" w:type="dxa"/>
+              <w:left w:w="180" w:type="dxa"/>
+              <w:bottom w:w="120" w:type="dxa"/>
+              <w:right w:w="180" w:type="dxa"/>
+            </w:tcMar>
+            <w:vAlign w:val="center"/>
+            <w:hideMark/>
+          </w:tcPr>
+          <w:p>
+            <w:r>
+              <w:t>Users struggle to understand the difference between installing, downloading, and opening software</w:t>
+            </w:r>
+          </w:p>
+        </w:tc>
+        <w:tc>
+          <w:tcPr>
+            <w:tcW w:w="0" w:type="auto"/>
+            <w:tcBorders>
+              <w:top w:val="single" w:sz="6" w:space="0" w:color="C4C7C5"/>
+              <w:left w:val="single" w:sz="6" w:space="0" w:color="C4C7C5"/>
+              <w:bottom w:val="single" w:sz="6" w:space="0" w:color="C4C7C5"/>
+              <w:right w:val="single" w:sz="6" w:space="0" w:color="C4C7C5"/>
+            </w:tcBorders>
+            <w:tcMar>
+              <w:top w:w="120" w:type="dxa"/>
+              <w:left w:w="180" w:type="dxa"/>
+              <w:bottom w:w="120" w:type="dxa"/>
+              <w:right w:w="180" w:type="dxa"/>
+            </w:tcMar>
+            <w:vAlign w:val="center"/>
+            <w:hideMark/>
+          </w:tcPr>
+          <w:p>
+            <w:r>
+              <w:t>Accepted</w:t>
+            </w:r>
+          </w:p>
+        </w:tc>
+      </w:tr>
+      <w:tr>
+        <w:trPr>
+          <w:tblCellSpacing w:w="15" w:type="dxa"/>
+        </w:trPr>
+        <w:tc>
+          <w:tcPr>
+            <w:tcW w:w="0" w:type="auto"/>
+            <w:tcBorders>
+              <w:top w:val="single" w:sz="6" w:space="0" w:color="C4C7C5"/>
+              <w:left w:val="single" w:sz="6" w:space="0" w:color="C4C7C5"/>
+              <w:bottom w:val="single" w:sz="6" w:space="0" w:color="C4C7C5"/>
+              <w:right w:val="single" w:sz="6" w:space="0" w:color="C4C7C5"/>
+            </w:tcBorders>
+            <w:tcMar>
+              <w:top w:w="120" w:type="dxa"/>
+              <w:left w:w="180" w:type="dxa"/>
+              <w:bottom w:w="120" w:type="dxa"/>
+              <w:right w:w="180" w:type="dxa"/>
+            </w:tcMar>
+            <w:vAlign w:val="center"/>
+            <w:hideMark/>
+          </w:tcPr>
+          <w:p>
+            <w:pPr>
+              <w:rPr>
+                <w:b/>
+                <w:bCs/>
+              </w:rPr>
+            </w:pPr>
+            <w:r>
+              <w:rPr>
+                <w:b/>
+                <w:bCs/>
+              </w:rPr>
+              <w:t>OS-007</w:t>
+            </w:r>
+          </w:p>
+        </w:tc>
+        <w:tc>
+          <w:tcPr>
+            <w:tcW w:w="0" w:type="auto"/>
+            <w:tcBorders>
+              <w:top w:val="single" w:sz="6" w:space="0" w:color="C4C7C5"/>
+              <w:left w:val="single" w:sz="6" w:space="0" w:color="C4C7C5"/>
+              <w:bottom w:val="single" w:sz="6" w:space="0" w:color="C4C7C5"/>
+              <w:right w:val="single" w:sz="6" w:space="0" w:color="C4C7C5"/>
+            </w:tcBorders>
+            <w:tcMar>
+              <w:top w:w="120" w:type="dxa"/>
+              <w:left w:w="180" w:type="dxa"/>
+              <w:bottom w:w="120" w:type="dxa"/>
+              <w:right w:w="180" w:type="dxa"/>
+            </w:tcMar>
+            <w:vAlign w:val="center"/>
+            <w:hideMark/>
+          </w:tcPr>
+          <w:p>
+            <w:r>
+              <w:t>Users struggle to understand software installation processes</w:t>
+            </w:r>
+          </w:p>
+        </w:tc>
+        <w:tc>
+          <w:tcPr>
+            <w:tcW w:w="0" w:type="auto"/>
+            <w:tcBorders>
+              <w:top w:val="single" w:sz="6" w:space="0" w:color="C4C7C5"/>
+              <w:left w:val="single" w:sz="6" w:space="0" w:color="C4C7C5"/>
+              <w:bottom w:val="single" w:sz="6" w:space="0" w:color="C4C7C5"/>
+              <w:right w:val="single" w:sz="6" w:space="0" w:color="C4C7C5"/>
+            </w:tcBorders>
+            <w:tcMar>
+              <w:top w:w="120" w:type="dxa"/>
+              <w:left w:w="180" w:type="dxa"/>
+              <w:bottom w:w="120" w:type="dxa"/>
+              <w:right w:w="180" w:type="dxa"/>
+            </w:tcMar>
+            <w:vAlign w:val="center"/>
+            <w:hideMark/>
+          </w:tcPr>
+          <w:p>
+            <w:r>
+              <w:t>Accepted</w:t>
+            </w:r>
+          </w:p>
+        </w:tc>
+      </w:tr>
+      <w:tr>
+        <w:trPr>
+          <w:tblCellSpacing w:w="15" w:type="dxa"/>
+        </w:trPr>
+        <w:tc>
+          <w:tcPr>
+            <w:tcW w:w="0" w:type="auto"/>
+            <w:tcBorders>
+              <w:top w:val="single" w:sz="6" w:space="0" w:color="C4C7C5"/>
+              <w:left w:val="single" w:sz="6" w:space="0" w:color="C4C7C5"/>
+              <w:bottom w:val="single" w:sz="6" w:space="0" w:color="C4C7C5"/>
+              <w:right w:val="single" w:sz="6" w:space="0" w:color="C4C7C5"/>
+            </w:tcBorders>
+            <w:tcMar>
+              <w:top w:w="120" w:type="dxa"/>
+              <w:left w:w="180" w:type="dxa"/>
+              <w:bottom w:w="120" w:type="dxa"/>
+              <w:right w:w="180" w:type="dxa"/>
+            </w:tcMar>
+            <w:vAlign w:val="center"/>
+            <w:hideMark/>
+          </w:tcPr>
+          <w:p>
+            <w:pPr>
+              <w:rPr>
+                <w:b/>
+                <w:bCs/>
+              </w:rPr>
+            </w:pPr>
+            <w:r>
+              <w:rPr>
+                <w:b/>
+                <w:bCs/>
+              </w:rPr>
+              <w:t>OS-008</w:t>
+            </w:r>
+          </w:p>
+        </w:tc>
+        <w:tc>
+          <w:tcPr>
+            <w:tcW w:w="0" w:type="auto"/>
+            <w:tcBorders>
+              <w:top w:val="single" w:sz="6" w:space="0" w:color="C4C7C5"/>
+              <w:left w:val="single" w:sz="6" w:space="0" w:color="C4C7C5"/>
+              <w:bottom w:val="single" w:sz="6" w:space="0" w:color="C4C7C5"/>
+              <w:right w:val="single" w:sz="6" w:space="0" w:color="C4C7C5"/>
+            </w:tcBorders>
+            <w:tcMar>
+              <w:top w:w="120" w:type="dxa"/>
+              <w:left w:w="180" w:type="dxa"/>
+              <w:bottom w:w="120" w:type="dxa"/>
+              <w:right w:w="180" w:type="dxa"/>
+            </w:tcMar>
+            <w:vAlign w:val="center"/>
+            <w:hideMark/>
+          </w:tcPr>
+          <w:p>
+            <w:r>
+              <w:t>Users struggle to identify where newly installed applications are located</w:t>
+            </w:r>
+          </w:p>
+        </w:tc>
+        <w:tc>
+          <w:tcPr>
+            <w:tcW w:w="0" w:type="auto"/>
+            <w:tcBorders>
+              <w:top w:val="single" w:sz="6" w:space="0" w:color="C4C7C5"/>
+              <w:left w:val="single" w:sz="6" w:space="0" w:color="C4C7C5"/>
+              <w:bottom w:val="single" w:sz="6" w:space="0" w:color="C4C7C5"/>
+              <w:right w:val="single" w:sz="6" w:space="0" w:color="C4C7C5"/>
+            </w:tcBorders>
+            <w:tcMar>
+              <w:top w:w="120" w:type="dxa"/>
+              <w:left w:w="180" w:type="dxa"/>
+              <w:bottom w:w="120" w:type="dxa"/>
+              <w:right w:w="180" w:type="dxa"/>
+            </w:tcMar>
+            <w:vAlign w:val="center"/>
+            <w:hideMark/>
+          </w:tcPr>
+          <w:p>
+            <w:r>
+              <w:t>Accepted</w:t>
+            </w:r>
+          </w:p>
+        </w:tc>
+      </w:tr>
+      <w:tr>
+        <w:trPr>
+          <w:tblCellSpacing w:w="15" w:type="dxa"/>
+        </w:trPr>
+        <w:tc>
+          <w:tcPr>
+            <w:tcW w:w="0" w:type="auto"/>
+            <w:tcBorders>
+              <w:top w:val="single" w:sz="6" w:space="0" w:color="C4C7C5"/>
+              <w:left w:val="single" w:sz="6" w:space="0" w:color="C4C7C5"/>
+              <w:bottom w:val="single" w:sz="6" w:space="0" w:color="C4C7C5"/>
+              <w:right w:val="single" w:sz="6" w:space="0" w:color="C4C7C5"/>
+            </w:tcBorders>
+            <w:tcMar>
+              <w:top w:w="120" w:type="dxa"/>
+              <w:left w:w="180" w:type="dxa"/>
+              <w:bottom w:w="120" w:type="dxa"/>
+              <w:right w:w="180" w:type="dxa"/>
+            </w:tcMar>
+            <w:vAlign w:val="center"/>
+            <w:hideMark/>
+          </w:tcPr>
+          <w:p>
+            <w:pPr>
+              <w:rPr>
+                <w:b/>
+                <w:bCs/>
+              </w:rPr>
+            </w:pPr>
+            <w:r>
+              <w:rPr>
+                <w:b/>
+                <w:bCs/>
+              </w:rPr>
+              <w:t>OS-009</w:t>
+            </w:r>
+          </w:p>
+        </w:tc>
+        <w:tc>
+          <w:tcPr>
+            <w:tcW w:w="0" w:type="auto"/>
+            <w:tcBorders>
+              <w:top w:val="single" w:sz="6" w:space="0" w:color="C4C7C5"/>
+              <w:left w:val="single" w:sz="6" w:space="0" w:color="C4C7C5"/>
+              <w:bottom w:val="single" w:sz="6" w:space="0" w:color="C4C7C5"/>
+              <w:right w:val="single" w:sz="6" w:space="0" w:color="C4C7C5"/>
+            </w:tcBorders>
+            <w:tcMar>
+              <w:top w:w="120" w:type="dxa"/>
+              <w:left w:w="180" w:type="dxa"/>
+              <w:bottom w:w="120" w:type="dxa"/>
+              <w:right w:w="180" w:type="dxa"/>
+            </w:tcMar>
+            <w:vAlign w:val="center"/>
+            <w:hideMark/>
+          </w:tcPr>
+          <w:p>
+            <w:r>
+              <w:t>Users struggle to understand background system processes</w:t>
+            </w:r>
+          </w:p>
+        </w:tc>
+        <w:tc>
+          <w:tcPr>
+            <w:tcW w:w="0" w:type="auto"/>
+            <w:tcBorders>
+              <w:top w:val="single" w:sz="6" w:space="0" w:color="C4C7C5"/>
+              <w:left w:val="single" w:sz="6" w:space="0" w:color="C4C7C5"/>
+              <w:bottom w:val="single" w:sz="6" w:space="0" w:color="C4C7C5"/>
+              <w:right w:val="single" w:sz="6" w:space="0" w:color="C4C7C5"/>
+            </w:tcBorders>
+            <w:tcMar>
+              <w:top w:w="120" w:type="dxa"/>
+              <w:left w:w="180" w:type="dxa"/>
+              <w:bottom w:w="120" w:type="dxa"/>
+              <w:right w:w="180" w:type="dxa"/>
+            </w:tcMar>
+            <w:vAlign w:val="center"/>
+            <w:hideMark/>
+          </w:tcPr>
+          <w:p>
+            <w:r>
+              <w:t>Accepted</w:t>
+            </w:r>
+          </w:p>
+        </w:tc>
+      </w:tr>
+      <w:tr>
+        <w:trPr>
+          <w:tblCellSpacing w:w="15" w:type="dxa"/>
+        </w:trPr>
+        <w:tc>
+          <w:tcPr>
+            <w:tcW w:w="0" w:type="auto"/>
+            <w:tcBorders>
+              <w:top w:val="single" w:sz="6" w:space="0" w:color="C4C7C5"/>
+              <w:left w:val="single" w:sz="6" w:space="0" w:color="C4C7C5"/>
+              <w:bottom w:val="single" w:sz="6" w:space="0" w:color="C4C7C5"/>
+              <w:right w:val="single" w:sz="6" w:space="0" w:color="C4C7C5"/>
+            </w:tcBorders>
+            <w:tcMar>
+              <w:top w:w="120" w:type="dxa"/>
+              <w:left w:w="180" w:type="dxa"/>
+              <w:bottom w:w="120" w:type="dxa"/>
+              <w:right w:w="180" w:type="dxa"/>
+            </w:tcMar>
+            <w:vAlign w:val="center"/>
+            <w:hideMark/>
+          </w:tcPr>
+          <w:p>
+            <w:pPr>
+              <w:rPr>
+                <w:b/>
+                <w:bCs/>
+              </w:rPr>
+            </w:pPr>
+            <w:r>
+              <w:rPr>
+                <w:b/>
+                <w:bCs/>
+              </w:rPr>
+              <w:t>OS-010</w:t>
+            </w:r>
+          </w:p>
+        </w:tc>
+        <w:tc>
+          <w:tcPr>
+            <w:tcW w:w="0" w:type="auto"/>
+            <w:tcBorders>
+              <w:top w:val="single" w:sz="6" w:space="0" w:color="C4C7C5"/>
+              <w:left w:val="single" w:sz="6" w:space="0" w:color="C4C7C5"/>
+              <w:bottom w:val="single" w:sz="6" w:space="0" w:color="C4C7C5"/>
+              <w:right w:val="single" w:sz="6" w:space="0" w:color="C4C7C5"/>
+            </w:tcBorders>
+            <w:tcMar>
+              <w:top w:w="120" w:type="dxa"/>
+              <w:left w:w="180" w:type="dxa"/>
+              <w:bottom w:w="120" w:type="dxa"/>
+              <w:right w:w="180" w:type="dxa"/>
+            </w:tcMar>
+            <w:vAlign w:val="center"/>
+            <w:hideMark/>
+          </w:tcPr>
+          <w:p>
+            <w:r>
+              <w:t>Users struggle to understand system notifications and alerts</w:t>
+            </w:r>
+          </w:p>
+        </w:tc>
+        <w:tc>
+          <w:tcPr>
+            <w:tcW w:w="0" w:type="auto"/>
+            <w:tcBorders>
+              <w:top w:val="single" w:sz="6" w:space="0" w:color="C4C7C5"/>
+              <w:left w:val="single" w:sz="6" w:space="0" w:color="C4C7C5"/>
+              <w:bottom w:val="single" w:sz="6" w:space="0" w:color="C4C7C5"/>
+              <w:right w:val="single" w:sz="6" w:space="0" w:color="C4C7C5"/>
+            </w:tcBorders>
+            <w:tcMar>
+              <w:top w:w="120" w:type="dxa"/>
+              <w:left w:w="180" w:type="dxa"/>
+              <w:bottom w:w="120" w:type="dxa"/>
+              <w:right w:w="180" w:type="dxa"/>
+            </w:tcMar>
+            <w:vAlign w:val="center"/>
+            <w:hideMark/>
+          </w:tcPr>
+          <w:p>
+            <w:r>
+              <w:t>Accepted</w:t>
+            </w:r>
+          </w:p>
+        </w:tc>
+      </w:tr>
+      <w:tr>
+        <w:trPr>
+          <w:tblCellSpacing w:w="15" w:type="dxa"/>
+        </w:trPr>
+        <w:tc>
+          <w:tcPr>
+            <w:tcW w:w="0" w:type="auto"/>
+            <w:tcBorders>
+              <w:top w:val="single" w:sz="6" w:space="0" w:color="C4C7C5"/>
+              <w:left w:val="single" w:sz="6" w:space="0" w:color="C4C7C5"/>
+              <w:bottom w:val="single" w:sz="6" w:space="0" w:color="C4C7C5"/>
+              <w:right w:val="single" w:sz="6" w:space="0" w:color="C4C7C5"/>
+            </w:tcBorders>
+            <w:tcMar>
+              <w:top w:w="120" w:type="dxa"/>
+              <w:left w:w="180" w:type="dxa"/>
+              <w:bottom w:w="120" w:type="dxa"/>
+              <w:right w:w="180" w:type="dxa"/>
+            </w:tcMar>
+            <w:vAlign w:val="center"/>
+            <w:hideMark/>
+          </w:tcPr>
+          <w:p>
+            <w:pPr>
+              <w:rPr>
+                <w:b/>
+                <w:bCs/>
+              </w:rPr>
+            </w:pPr>
+            <w:r>
+              <w:rPr>
+                <w:b/>
+                <w:bCs/>
+              </w:rPr>
+              <w:t>OS-011</w:t>
+            </w:r>
+          </w:p>
+        </w:tc>
+        <w:tc>
+          <w:tcPr>
+            <w:tcW w:w="0" w:type="auto"/>
+            <w:tcBorders>
+              <w:top w:val="single" w:sz="6" w:space="0" w:color="C4C7C5"/>
+              <w:left w:val="single" w:sz="6" w:space="0" w:color="C4C7C5"/>
+              <w:bottom w:val="single" w:sz="6" w:space="0" w:color="C4C7C5"/>
+              <w:right w:val="single" w:sz="6" w:space="0" w:color="C4C7C5"/>
+            </w:tcBorders>
+            <w:tcMar>
+              <w:top w:w="120" w:type="dxa"/>
+              <w:left w:w="180" w:type="dxa"/>
+              <w:bottom w:w="120" w:type="dxa"/>
+              <w:right w:w="180" w:type="dxa"/>
+            </w:tcMar>
+            <w:vAlign w:val="center"/>
+            <w:hideMark/>
+          </w:tcPr>
+          <w:p>
+            <w:r>
+              <w:t>Users struggle to understand file associations and default applications</w:t>
+            </w:r>
+          </w:p>
+        </w:tc>
+        <w:tc>
+          <w:tcPr>
+            <w:tcW w:w="0" w:type="auto"/>
+            <w:tcBorders>
+              <w:top w:val="single" w:sz="6" w:space="0" w:color="C4C7C5"/>
+              <w:left w:val="single" w:sz="6" w:space="0" w:color="C4C7C5"/>
+              <w:bottom w:val="single" w:sz="6" w:space="0" w:color="C4C7C5"/>
+              <w:right w:val="single" w:sz="6" w:space="0" w:color="C4C7C5"/>
+            </w:tcBorders>
+            <w:tcMar>
+              <w:top w:w="120" w:type="dxa"/>
+              <w:left w:w="180" w:type="dxa"/>
+              <w:bottom w:w="120" w:type="dxa"/>
+              <w:right w:w="180" w:type="dxa"/>
+            </w:tcMar>
+            <w:vAlign w:val="center"/>
+            <w:hideMark/>
+          </w:tcPr>
+          <w:p>
+            <w:r>
+              <w:t>Accepted</w:t>
+            </w:r>
+          </w:p>
+        </w:tc>
+      </w:tr>
+      <w:tr>
+        <w:trPr>
+          <w:tblCellSpacing w:w="15" w:type="dxa"/>
+        </w:trPr>
+        <w:tc>
+          <w:tcPr>
+            <w:tcW w:w="0" w:type="auto"/>
+            <w:tcBorders>
+              <w:top w:val="single" w:sz="6" w:space="0" w:color="C4C7C5"/>
+              <w:left w:val="single" w:sz="6" w:space="0" w:color="C4C7C5"/>
+              <w:bottom w:val="single" w:sz="6" w:space="0" w:color="C4C7C5"/>
+              <w:right w:val="single" w:sz="6" w:space="0" w:color="C4C7C5"/>
+            </w:tcBorders>
+            <w:tcMar>
+              <w:top w:w="120" w:type="dxa"/>
+              <w:left w:w="180" w:type="dxa"/>
+              <w:bottom w:w="120" w:type="dxa"/>
+              <w:right w:w="180" w:type="dxa"/>
+            </w:tcMar>
+            <w:vAlign w:val="center"/>
+            <w:hideMark/>
+          </w:tcPr>
+          <w:p>
+            <w:pPr>
+              <w:rPr>
+                <w:b/>
+                <w:bCs/>
+              </w:rPr>
+            </w:pPr>
+            <w:r>
+              <w:rPr>
+                <w:b/>
+                <w:bCs/>
+              </w:rPr>
+              <w:t>OS-012</w:t>
+            </w:r>
+          </w:p>
+        </w:tc>
+        <w:tc>
+          <w:tcPr>
+            <w:tcW w:w="0" w:type="auto"/>
+            <w:tcBorders>
+              <w:top w:val="single" w:sz="6" w:space="0" w:color="C4C7C5"/>
+              <w:left w:val="single" w:sz="6" w:space="0" w:color="C4C7C5"/>
+              <w:bottom w:val="single" w:sz="6" w:space="0" w:color="C4C7C5"/>
+              <w:right w:val="single" w:sz="6" w:space="0" w:color="C4C7C5"/>
+            </w:tcBorders>
+            <w:tcMar>
+              <w:top w:w="120" w:type="dxa"/>
+              <w:left w:w="180" w:type="dxa"/>
+              <w:bottom w:w="120" w:type="dxa"/>
+              <w:right w:w="180" w:type="dxa"/>
+            </w:tcMar>
+            <w:vAlign w:val="center"/>
+            <w:hideMark/>
+          </w:tcPr>
+          <w:p>
+            <w:r>
+              <w:t>Users struggle to understand user accounts and permissions</w:t>
+            </w:r>
+          </w:p>
+        </w:tc>
+        <w:tc>
+          <w:tcPr>
+            <w:tcW w:w="0" w:type="auto"/>
+            <w:tcBorders>
+              <w:top w:val="single" w:sz="6" w:space="0" w:color="C4C7C5"/>
+              <w:left w:val="single" w:sz="6" w:space="0" w:color="C4C7C5"/>
+              <w:bottom w:val="single" w:sz="6" w:space="0" w:color="C4C7C5"/>
+              <w:right w:val="single" w:sz="6" w:space="0" w:color="C4C7C5"/>
+            </w:tcBorders>
+            <w:tcMar>
+              <w:top w:w="120" w:type="dxa"/>
+              <w:left w:w="180" w:type="dxa"/>
+              <w:bottom w:w="120" w:type="dxa"/>
+              <w:right w:w="180" w:type="dxa"/>
+            </w:tcMar>
+            <w:vAlign w:val="center"/>
+            <w:hideMark/>
+          </w:tcPr>
+          <w:p>
+            <w:r>
+              <w:t>Accepted</w:t>
+            </w:r>
+          </w:p>
+        </w:tc>
+      </w:tr>
+      <w:tr>
+        <w:trPr>
+          <w:tblCellSpacing w:w="15" w:type="dxa"/>
+        </w:trPr>
+        <w:tc>
+          <w:tcPr>
+            <w:tcW w:w="0" w:type="auto"/>
+            <w:tcBorders>
+              <w:top w:val="single" w:sz="6" w:space="0" w:color="C4C7C5"/>
+              <w:left w:val="single" w:sz="6" w:space="0" w:color="C4C7C5"/>
+              <w:bottom w:val="single" w:sz="6" w:space="0" w:color="C4C7C5"/>
+              <w:right w:val="single" w:sz="6" w:space="0" w:color="C4C7C5"/>
+            </w:tcBorders>
+            <w:tcMar>
+              <w:top w:w="120" w:type="dxa"/>
+              <w:left w:w="180" w:type="dxa"/>
+              <w:bottom w:w="120" w:type="dxa"/>
+              <w:right w:w="180" w:type="dxa"/>
+            </w:tcMar>
+            <w:vAlign w:val="center"/>
+            <w:hideMark/>
+          </w:tcPr>
+          <w:p>
+            <w:pPr>
+              <w:rPr>
+                <w:b/>
+                <w:bCs/>
+              </w:rPr>
+            </w:pPr>
+            <w:r>
+              <w:rPr>
+                <w:b/>
+                <w:bCs/>
+              </w:rPr>
+              <w:t>OS-013</w:t>
+            </w:r>
+          </w:p>
+        </w:tc>
+        <w:tc>
+          <w:tcPr>
+            <w:tcW w:w="0" w:type="auto"/>
+            <w:tcBorders>
+              <w:top w:val="single" w:sz="6" w:space="0" w:color="C4C7C5"/>
+              <w:left w:val="single" w:sz="6" w:space="0" w:color="C4C7C5"/>
+              <w:bottom w:val="single" w:sz="6" w:space="0" w:color="C4C7C5"/>
+              <w:right w:val="single" w:sz="6" w:space="0" w:color="C4C7C5"/>
+            </w:tcBorders>
+            <w:tcMar>
+              <w:top w:w="120" w:type="dxa"/>
+              <w:left w:w="180" w:type="dxa"/>
+              <w:bottom w:w="120" w:type="dxa"/>
+              <w:right w:w="180" w:type="dxa"/>
+            </w:tcMar>
+            <w:vAlign w:val="center"/>
+            <w:hideMark/>
+          </w:tcPr>
+          <w:p>
+            <w:r>
+              <w:t>Users struggle to understand system updates and their impact</w:t>
+            </w:r>
+          </w:p>
+        </w:tc>
+        <w:tc>
+          <w:tcPr>
+            <w:tcW w:w="0" w:type="auto"/>
+            <w:tcBorders>
+              <w:top w:val="single" w:sz="6" w:space="0" w:color="C4C7C5"/>
+              <w:left w:val="single" w:sz="6" w:space="0" w:color="C4C7C5"/>
+              <w:bottom w:val="single" w:sz="6" w:space="0" w:color="C4C7C5"/>
+              <w:right w:val="single" w:sz="6" w:space="0" w:color="C4C7C5"/>
+            </w:tcBorders>
+            <w:tcMar>
+              <w:top w:w="120" w:type="dxa"/>
+              <w:left w:w="180" w:type="dxa"/>
+              <w:bottom w:w="120" w:type="dxa"/>
+              <w:right w:w="180" w:type="dxa"/>
+            </w:tcMar>
+            <w:vAlign w:val="center"/>
+            <w:hideMark/>
+          </w:tcPr>
+          <w:p>
+            <w:r>
+              <w:t>Accepted</w:t>
+            </w:r>
+          </w:p>
+        </w:tc>
+      </w:tr>
+      <w:tr>
+        <w:trPr>
+          <w:tblCellSpacing w:w="15" w:type="dxa"/>
+        </w:trPr>
+        <w:tc>
+          <w:tcPr>
+            <w:tcW w:w="0" w:type="auto"/>
+            <w:tcBorders>
+              <w:top w:val="single" w:sz="6" w:space="0" w:color="C4C7C5"/>
+              <w:left w:val="single" w:sz="6" w:space="0" w:color="C4C7C5"/>
+              <w:bottom w:val="single" w:sz="6" w:space="0" w:color="C4C7C5"/>
+              <w:right w:val="single" w:sz="6" w:space="0" w:color="C4C7C5"/>
+            </w:tcBorders>
+            <w:tcMar>
+              <w:top w:w="120" w:type="dxa"/>
+              <w:left w:w="180" w:type="dxa"/>
+              <w:bottom w:w="120" w:type="dxa"/>
+              <w:right w:w="180" w:type="dxa"/>
+            </w:tcMar>
+            <w:vAlign w:val="center"/>
+            <w:hideMark/>
+          </w:tcPr>
+          <w:p>
+            <w:pPr>
+              <w:rPr>
+                <w:b/>
+                <w:bCs/>
+              </w:rPr>
+            </w:pPr>
+            <w:r>
+              <w:rPr>
+                <w:b/>
+                <w:bCs/>
+              </w:rPr>
+              <w:lastRenderedPageBreak/>
+              <w:t>OS-014</w:t>
+            </w:r>
+          </w:p>
+        </w:tc>
+        <w:tc>
+          <w:tcPr>
+            <w:tcW w:w="0" w:type="auto"/>
+            <w:tcBorders>
+              <w:top w:val="single" w:sz="6" w:space="0" w:color="C4C7C5"/>
+              <w:left w:val="single" w:sz="6" w:space="0" w:color="C4C7C5"/>
+              <w:bottom w:val="single" w:sz="6" w:space="0" w:color="C4C7C5"/>
+              <w:right w:val="single" w:sz="6" w:space="0" w:color="C4C7C5"/>
+            </w:tcBorders>
+            <w:tcMar>
+              <w:top w:w="120" w:type="dxa"/>
+              <w:left w:w="180" w:type="dxa"/>
+              <w:bottom w:w="120" w:type="dxa"/>
+              <w:right w:w="180" w:type="dxa"/>
+            </w:tcMar>
+            <w:vAlign w:val="center"/>
+            <w:hideMark/>
+          </w:tcPr>
+          <w:p>
+            <w:r>
+              <w:t>Users struggle to identify why a computer has become slow</w:t>
+            </w:r>
+          </w:p>
+        </w:tc>
+        <w:tc>
+          <w:tcPr>
+            <w:tcW w:w="0" w:type="auto"/>
+            <w:tcBorders>
+              <w:top w:val="single" w:sz="6" w:space="0" w:color="C4C7C5"/>
+              <w:left w:val="single" w:sz="6" w:space="0" w:color="C4C7C5"/>
+              <w:bottom w:val="single" w:sz="6" w:space="0" w:color="C4C7C5"/>
+              <w:right w:val="single" w:sz="6" w:space="0" w:color="C4C7C5"/>
+            </w:tcBorders>
+            <w:tcMar>
+              <w:top w:w="120" w:type="dxa"/>
+              <w:left w:w="180" w:type="dxa"/>
+              <w:bottom w:w="120" w:type="dxa"/>
+              <w:right w:w="180" w:type="dxa"/>
+            </w:tcMar>
+            <w:vAlign w:val="center"/>
+            <w:hideMark/>
+          </w:tcPr>
+          <w:p>
+            <w:r>
+              <w:t>Accepted</w:t>
+            </w:r>
+          </w:p>
+        </w:tc>
+      </w:tr>
+      <w:tr>
+        <w:trPr>
+          <w:tblCellSpacing w:w="15" w:type="dxa"/>
+        </w:trPr>
+        <w:tc>
+          <w:tcPr>
+            <w:tcW w:w="0" w:type="auto"/>
+            <w:tcBorders>
+              <w:top w:val="single" w:sz="6" w:space="0" w:color="C4C7C5"/>
+              <w:left w:val="single" w:sz="6" w:space="0" w:color="C4C7C5"/>
+              <w:bottom w:val="single" w:sz="6" w:space="0" w:color="C4C7C5"/>
+              <w:right w:val="single" w:sz="6" w:space="0" w:color="C4C7C5"/>
+            </w:tcBorders>
+            <w:tcMar>
+              <w:top w:w="120" w:type="dxa"/>
+              <w:left w:w="180" w:type="dxa"/>
+              <w:bottom w:w="120" w:type="dxa"/>
+              <w:right w:w="180" w:type="dxa"/>
+            </w:tcMar>
+            <w:vAlign w:val="center"/>
+            <w:hideMark/>
+          </w:tcPr>
+          <w:p>
+            <w:pPr>
+              <w:rPr>
+                <w:b/>
+                <w:bCs/>
+              </w:rPr>
+            </w:pPr>
+            <w:r>
+              <w:rPr>
+                <w:b/>
+                <w:bCs/>
+              </w:rPr>
+              <w:t>OS-015</w:t>
+            </w:r>
+          </w:p>
+        </w:tc>
+        <w:tc>
+          <w:tcPr>
+            <w:tcW w:w="0" w:type="auto"/>
+            <w:tcBorders>
+              <w:top w:val="single" w:sz="6" w:space="0" w:color="C4C7C5"/>
+              <w:left w:val="single" w:sz="6" w:space="0" w:color="C4C7C5"/>
+              <w:bottom w:val="single" w:sz="6" w:space="0" w:color="C4C7C5"/>
+              <w:right w:val="single" w:sz="6" w:space="0" w:color="C4C7C5"/>
+            </w:tcBorders>
+            <w:tcMar>
+              <w:top w:w="120" w:type="dxa"/>
+              <w:left w:w="180" w:type="dxa"/>
+              <w:bottom w:w="120" w:type="dxa"/>
+              <w:right w:w="180" w:type="dxa"/>
+            </w:tcMar>
+            <w:vAlign w:val="center"/>
+            <w:hideMark/>
+          </w:tcPr>
+          <w:p>
+            <w:r>
+              <w:t>Users struggle to understand storage usage and disk space</w:t>
+            </w:r>
+          </w:p>
+        </w:tc>
+        <w:tc>
+          <w:tcPr>
+            <w:tcW w:w="0" w:type="auto"/>
+            <w:tcBorders>
+              <w:top w:val="single" w:sz="6" w:space="0" w:color="C4C7C5"/>
+              <w:left w:val="single" w:sz="6" w:space="0" w:color="C4C7C5"/>
+              <w:bottom w:val="single" w:sz="6" w:space="0" w:color="C4C7C5"/>
+              <w:right w:val="single" w:sz="6" w:space="0" w:color="C4C7C5"/>
+            </w:tcBorders>
+            <w:tcMar>
+              <w:top w:w="120" w:type="dxa"/>
+              <w:left w:w="180" w:type="dxa"/>
+              <w:bottom w:w="120" w:type="dxa"/>
+              <w:right w:w="180" w:type="dxa"/>
+            </w:tcMar>
+            <w:vAlign w:val="center"/>
+            <w:hideMark/>
+          </w:tcPr>
+          <w:p>
+            <w:r>
+              <w:t>Accepted</w:t>
+            </w:r>
+          </w:p>
+        </w:tc>
+      </w:tr>
+      <w:tr>
+        <w:trPr>
+          <w:tblCellSpacing w:w="15" w:type="dxa"/>
+        </w:trPr>
+        <w:tc>
+          <w:tcPr>
+            <w:tcW w:w="0" w:type="auto"/>
+            <w:tcBorders>
+              <w:top w:val="single" w:sz="6" w:space="0" w:color="C4C7C5"/>
+              <w:left w:val="single" w:sz="6" w:space="0" w:color="C4C7C5"/>
+              <w:bottom w:val="single" w:sz="6" w:space="0" w:color="C4C7C5"/>
+              <w:right w:val="single" w:sz="6" w:space="0" w:color="C4C7C5"/>
+            </w:tcBorders>
+            <w:tcMar>
+              <w:top w:w="120" w:type="dxa"/>
+              <w:left w:w="180" w:type="dxa"/>
+              <w:bottom w:w="120" w:type="dxa"/>
+              <w:right w:w="180" w:type="dxa"/>
+            </w:tcMar>
+            <w:vAlign w:val="center"/>
+            <w:hideMark/>
+          </w:tcPr>
+          <w:p>
+            <w:pPr>
+              <w:rPr>
+                <w:b/>
+                <w:bCs/>
+              </w:rPr>
+            </w:pPr>
+            <w:r>
+              <w:rPr>
+                <w:b/>
+                <w:bCs/>
+              </w:rPr>
+              <w:t>OS-016</w:t>
+            </w:r>
+          </w:p>
+        </w:tc>
+        <w:tc>
+          <w:tcPr>
+            <w:tcW w:w="0" w:type="auto"/>
+            <w:tcBorders>
+              <w:top w:val="single" w:sz="6" w:space="0" w:color="C4C7C5"/>
+              <w:left w:val="single" w:sz="6" w:space="0" w:color="C4C7C5"/>
+              <w:bottom w:val="single" w:sz="6" w:space="0" w:color="C4C7C5"/>
+              <w:right w:val="single" w:sz="6" w:space="0" w:color="C4C7C5"/>
+            </w:tcBorders>
+            <w:tcMar>
+              <w:top w:w="120" w:type="dxa"/>
+              <w:left w:w="180" w:type="dxa"/>
+              <w:bottom w:w="120" w:type="dxa"/>
+              <w:right w:w="180" w:type="dxa"/>
+            </w:tcMar>
+            <w:vAlign w:val="center"/>
+            <w:hideMark/>
+          </w:tcPr>
+          <w:p>
+            <w:r>
+              <w:t>Users struggle to understand memory (RAM) usage</w:t>
+            </w:r>
+          </w:p>
+        </w:tc>
+        <w:tc>
+          <w:tcPr>
+            <w:tcW w:w="0" w:type="auto"/>
+            <w:tcBorders>
+              <w:top w:val="single" w:sz="6" w:space="0" w:color="C4C7C5"/>
+              <w:left w:val="single" w:sz="6" w:space="0" w:color="C4C7C5"/>
+              <w:bottom w:val="single" w:sz="6" w:space="0" w:color="C4C7C5"/>
+              <w:right w:val="single" w:sz="6" w:space="0" w:color="C4C7C5"/>
+            </w:tcBorders>
+            <w:tcMar>
+              <w:top w:w="120" w:type="dxa"/>
+              <w:left w:w="180" w:type="dxa"/>
+              <w:bottom w:w="120" w:type="dxa"/>
+              <w:right w:w="180" w:type="dxa"/>
+            </w:tcMar>
+            <w:vAlign w:val="center"/>
+            <w:hideMark/>
+          </w:tcPr>
+          <w:p>
+            <w:r>
+              <w:t>Accepted</w:t>
+            </w:r>
+          </w:p>
+        </w:tc>
+      </w:tr>
+      <w:tr>
+        <w:trPr>
+          <w:tblCellSpacing w:w="15" w:type="dxa"/>
+        </w:trPr>
+        <w:tc>
+          <w:tcPr>
+            <w:tcW w:w="0" w:type="auto"/>
+            <w:tcBorders>
+              <w:top w:val="single" w:sz="6" w:space="0" w:color="C4C7C5"/>
+              <w:left w:val="single" w:sz="6" w:space="0" w:color="C4C7C5"/>
+              <w:bottom w:val="single" w:sz="6" w:space="0" w:color="C4C7C5"/>
+              <w:right w:val="single" w:sz="6" w:space="0" w:color="C4C7C5"/>
+            </w:tcBorders>
+            <w:tcMar>
+              <w:top w:w="120" w:type="dxa"/>
+              <w:left w:w="180" w:type="dxa"/>
+              <w:bottom w:w="120" w:type="dxa"/>
+              <w:right w:w="180" w:type="dxa"/>
+            </w:tcMar>
+            <w:vAlign w:val="center"/>
+            <w:hideMark/>
+          </w:tcPr>
+          <w:p>
+            <w:pPr>
+              <w:rPr>
+                <w:b/>
+                <w:bCs/>
+              </w:rPr>
+            </w:pPr>
+            <w:r>
+              <w:rPr>
+                <w:b/>
+                <w:bCs/>
+              </w:rPr>
+              <w:t>OS-017</w:t>
+            </w:r>
+          </w:p>
+        </w:tc>
+        <w:tc>
+          <w:tcPr>
+            <w:tcW w:w="0" w:type="auto"/>
+            <w:tcBorders>
+              <w:top w:val="single" w:sz="6" w:space="0" w:color="C4C7C5"/>
+              <w:left w:val="single" w:sz="6" w:space="0" w:color="C4C7C5"/>
+              <w:bottom w:val="single" w:sz="6" w:space="0" w:color="C4C7C5"/>
+              <w:right w:val="single" w:sz="6" w:space="0" w:color="C4C7C5"/>
+            </w:tcBorders>
+            <w:tcMar>
+              <w:top w:w="120" w:type="dxa"/>
+              <w:left w:w="180" w:type="dxa"/>
+              <w:bottom w:w="120" w:type="dxa"/>
+              <w:right w:w="180" w:type="dxa"/>
+            </w:tcMar>
+            <w:vAlign w:val="center"/>
+            <w:hideMark/>
+          </w:tcPr>
+          <w:p>
+            <w:r>
+              <w:t>Users struggle to identify why applications stop responding</w:t>
+            </w:r>
+          </w:p>
+        </w:tc>
+        <w:tc>
+          <w:tcPr>
+            <w:tcW w:w="0" w:type="auto"/>
+            <w:tcBorders>
+              <w:top w:val="single" w:sz="6" w:space="0" w:color="C4C7C5"/>
+              <w:left w:val="single" w:sz="6" w:space="0" w:color="C4C7C5"/>
+              <w:bottom w:val="single" w:sz="6" w:space="0" w:color="C4C7C5"/>
+              <w:right w:val="single" w:sz="6" w:space="0" w:color="C4C7C5"/>
+            </w:tcBorders>
+            <w:tcMar>
+              <w:top w:w="120" w:type="dxa"/>
+              <w:left w:w="180" w:type="dxa"/>
+              <w:bottom w:w="120" w:type="dxa"/>
+              <w:right w:w="180" w:type="dxa"/>
+            </w:tcMar>
+            <w:vAlign w:val="center"/>
+            <w:hideMark/>
+          </w:tcPr>
+          <w:p>
+            <w:r>
+              <w:t>Accepted</w:t>
+            </w:r>
+          </w:p>
+        </w:tc>
+      </w:tr>
+      <w:tr>
+        <w:trPr>
+          <w:tblCellSpacing w:w="15" w:type="dxa"/>
+        </w:trPr>
+        <w:tc>
+          <w:tcPr>
+            <w:tcW w:w="0" w:type="auto"/>
+            <w:tcBorders>
+              <w:top w:val="single" w:sz="6" w:space="0" w:color="C4C7C5"/>
+              <w:left w:val="single" w:sz="6" w:space="0" w:color="C4C7C5"/>
+              <w:bottom w:val="single" w:sz="6" w:space="0" w:color="C4C7C5"/>
+              <w:right w:val="single" w:sz="6" w:space="0" w:color="C4C7C5"/>
+            </w:tcBorders>
+            <w:tcMar>
+              <w:top w:w="120" w:type="dxa"/>
+              <w:left w:w="180" w:type="dxa"/>
+              <w:bottom w:w="120" w:type="dxa"/>
+              <w:right w:w="180" w:type="dxa"/>
+            </w:tcMar>
+            <w:vAlign w:val="center"/>
+            <w:hideMark/>
+          </w:tcPr>
+          <w:p>
+            <w:pPr>
+              <w:rPr>
+                <w:b/>
+                <w:bCs/>
+              </w:rPr>
+            </w:pPr>
+            <w:r>
+              <w:rPr>
+                <w:b/>
+                <w:bCs/>
+              </w:rPr>
+              <w:t>OS-018</w:t>
+            </w:r>
+          </w:p>
+        </w:tc>
+        <w:tc>
+          <w:tcPr>
+            <w:tcW w:w="0" w:type="auto"/>
+            <w:tcBorders>
+              <w:top w:val="single" w:sz="6" w:space="0" w:color="C4C7C5"/>
+              <w:left w:val="single" w:sz="6" w:space="0" w:color="C4C7C5"/>
+              <w:bottom w:val="single" w:sz="6" w:space="0" w:color="C4C7C5"/>
+              <w:right w:val="single" w:sz="6" w:space="0" w:color="C4C7C5"/>
+            </w:tcBorders>
+            <w:tcMar>
+              <w:top w:w="120" w:type="dxa"/>
+              <w:left w:w="180" w:type="dxa"/>
+              <w:bottom w:w="120" w:type="dxa"/>
+              <w:right w:w="180" w:type="dxa"/>
+            </w:tcMar>
+            <w:vAlign w:val="center"/>
+            <w:hideMark/>
+          </w:tcPr>
+          <w:p>
+            <w:r>
+              <w:t>Users struggle to understand startup applications and boot behavior</w:t>
+            </w:r>
+          </w:p>
+        </w:tc>
+        <w:tc>
+          <w:tcPr>
+            <w:tcW w:w="0" w:type="auto"/>
+            <w:tcBorders>
+              <w:top w:val="single" w:sz="6" w:space="0" w:color="C4C7C5"/>
+              <w:left w:val="single" w:sz="6" w:space="0" w:color="C4C7C5"/>
+              <w:bottom w:val="single" w:sz="6" w:space="0" w:color="C4C7C5"/>
+              <w:right w:val="single" w:sz="6" w:space="0" w:color="C4C7C5"/>
+            </w:tcBorders>
+            <w:tcMar>
+              <w:top w:w="120" w:type="dxa"/>
+              <w:left w:w="180" w:type="dxa"/>
+              <w:bottom w:w="120" w:type="dxa"/>
+              <w:right w:w="180" w:type="dxa"/>
+            </w:tcMar>
+            <w:vAlign w:val="center"/>
+            <w:hideMark/>
+          </w:tcPr>
+          <w:p>
+            <w:r>
+              <w:t>Accepted</w:t>
+            </w:r>
+          </w:p>
+        </w:tc>
+      </w:tr>
+      <w:tr>
+        <w:trPr>
+          <w:tblCellSpacing w:w="15" w:type="dxa"/>
+        </w:trPr>
+        <w:tc>
+          <w:tcPr>
+            <w:tcW w:w="0" w:type="auto"/>
+            <w:tcBorders>
+              <w:top w:val="single" w:sz="6" w:space="0" w:color="C4C7C5"/>
+              <w:left w:val="single" w:sz="6" w:space="0" w:color="C4C7C5"/>
+              <w:bottom w:val="single" w:sz="6" w:space="0" w:color="C4C7C5"/>
+              <w:right w:val="single" w:sz="6" w:space="0" w:color="C4C7C5"/>
+            </w:tcBorders>
+            <w:tcMar>
+              <w:top w:w="120" w:type="dxa"/>
+              <w:left w:w="180" w:type="dxa"/>
+              <w:bottom w:w="120" w:type="dxa"/>
+              <w:right w:w="180" w:type="dxa"/>
+            </w:tcMar>
+            <w:vAlign w:val="center"/>
+            <w:hideMark/>
+          </w:tcPr>
+          <w:p>
+            <w:pPr>
+              <w:rPr>
+                <w:b/>
+                <w:bCs/>
+              </w:rPr>
+            </w:pPr>
+            <w:r>
+              <w:rPr>
+                <w:b/>
+                <w:bCs/>
+              </w:rPr>
+              <w:t>OS-019</w:t>
+            </w:r>
+          </w:p>
+        </w:tc>
+        <w:tc>
+          <w:tcPr>
+            <w:tcW w:w="0" w:type="auto"/>
+            <w:tcBorders>
+              <w:top w:val="single" w:sz="6" w:space="0" w:color="C4C7C5"/>
+              <w:left w:val="single" w:sz="6" w:space="0" w:color="C4C7C5"/>
+              <w:bottom w:val="single" w:sz="6" w:space="0" w:color="C4C7C5"/>
+              <w:right w:val="single" w:sz="6" w:space="0" w:color="C4C7C5"/>
+            </w:tcBorders>
+            <w:tcMar>
+              <w:top w:w="120" w:type="dxa"/>
+              <w:left w:w="180" w:type="dxa"/>
+              <w:bottom w:w="120" w:type="dxa"/>
+              <w:right w:w="180" w:type="dxa"/>
+            </w:tcMar>
+            <w:vAlign w:val="center"/>
+            <w:hideMark/>
+          </w:tcPr>
+          <w:p>
+            <w:r>
+              <w:t>Users struggle to distinguish between operating system problems and application problems</w:t>
+            </w:r>
+          </w:p>
+        </w:tc>
+        <w:tc>
+          <w:tcPr>
+            <w:tcW w:w="0" w:type="auto"/>
+            <w:tcBorders>
+              <w:top w:val="single" w:sz="6" w:space="0" w:color="C4C7C5"/>
+              <w:left w:val="single" w:sz="6" w:space="0" w:color="C4C7C5"/>
+              <w:bottom w:val="single" w:sz="6" w:space="0" w:color="C4C7C5"/>
+              <w:right w:val="single" w:sz="6" w:space="0" w:color="C4C7C5"/>
+            </w:tcBorders>
+            <w:tcMar>
+              <w:top w:w="120" w:type="dxa"/>
+              <w:left w:w="180" w:type="dxa"/>
+              <w:bottom w:w="120" w:type="dxa"/>
+              <w:right w:w="180" w:type="dxa"/>
+            </w:tcMar>
+            <w:vAlign w:val="center"/>
+            <w:hideMark/>
+          </w:tcPr>
+          <w:p>
+            <w:r>
+              <w:t>Accepted</w:t>
+            </w:r>
+          </w:p>
+        </w:tc>
+      </w:tr>
+      <w:tr>
+        <w:trPr>
+          <w:tblCellSpacing w:w="15" w:type="dxa"/>
+        </w:trPr>
+        <w:tc>
+          <w:tcPr>
+            <w:tcW w:w="0" w:type="auto"/>
+            <w:tcBorders>
+              <w:top w:val="single" w:sz="6" w:space="0" w:color="C4C7C5"/>
+              <w:left w:val="single" w:sz="6" w:space="0" w:color="C4C7C5"/>
+              <w:bottom w:val="single" w:sz="6" w:space="0" w:color="C4C7C5"/>
+              <w:right w:val="single" w:sz="6" w:space="0" w:color="C4C7C5"/>
+            </w:tcBorders>
+            <w:tcMar>
+              <w:top w:w="120" w:type="dxa"/>
+              <w:left w:w="180" w:type="dxa"/>
+              <w:bottom w:w="120" w:type="dxa"/>
+              <w:right w:w="180" w:type="dxa"/>
+            </w:tcMar>
+            <w:vAlign w:val="center"/>
+            <w:hideMark/>
+          </w:tcPr>
+          <w:p>
+            <w:pPr>
+              <w:rPr>
+                <w:b/>
+                <w:bCs/>
+              </w:rPr>
+            </w:pPr>
+            <w:r>
+              <w:rPr>
+                <w:b/>
+                <w:bCs/>
+              </w:rPr>
+              <w:t>OS-020</w:t>
+            </w:r>
+          </w:p>
+        </w:tc>
+        <w:tc>
+          <w:tcPr>
+            <w:tcW w:w="0" w:type="auto"/>
+            <w:tcBorders>
+              <w:top w:val="single" w:sz="6" w:space="0" w:color="C4C7C5"/>
+              <w:left w:val="single" w:sz="6" w:space="0" w:color="C4C7C5"/>
+              <w:bottom w:val="single" w:sz="6" w:space="0" w:color="C4C7C5"/>
+              <w:right w:val="single" w:sz="6" w:space="0" w:color="C4C7C5"/>
+            </w:tcBorders>
+            <w:tcMar>
+              <w:top w:w="120" w:type="dxa"/>
+              <w:left w:w="180" w:type="dxa"/>
+              <w:bottom w:w="120" w:type="dxa"/>
+              <w:right w:w="180" w:type="dxa"/>
+            </w:tcMar>
+            <w:vAlign w:val="center"/>
+            <w:hideMark/>
+          </w:tcPr>
+          <w:p>
+            <w:r>
+              <w:t>Users struggle to understand hardware and software dependencies</w:t>
+            </w:r>
+          </w:p>
+        </w:tc>
+        <w:tc>
+          <w:tcPr>
+            <w:tcW w:w="0" w:type="auto"/>
+            <w:tcBorders>
+              <w:top w:val="single" w:sz="6" w:space="0" w:color="C4C7C5"/>
+              <w:left w:val="single" w:sz="6" w:space="0" w:color="C4C7C5"/>
+              <w:bottom w:val="single" w:sz="6" w:space="0" w:color="C4C7C5"/>
+              <w:right w:val="single" w:sz="6" w:space="0" w:color="C4C7C5"/>
+            </w:tcBorders>
+            <w:tcMar>
+              <w:top w:w="120" w:type="dxa"/>
+              <w:left w:w="180" w:type="dxa"/>
+              <w:bottom w:w="120" w:type="dxa"/>
+              <w:right w:w="180" w:type="dxa"/>
+            </w:tcMar>
+            <w:vAlign w:val="center"/>
+            <w:hideMark/>
+          </w:tcPr>
+          <w:p>
+            <w:r>
+              <w:t>Accepted</w:t>
+            </w:r>
+          </w:p>
+        </w:tc>
+      </w:tr>
+      <w:tr>
+        <w:trPr>
+          <w:tblCellSpacing w:w="15" w:type="dxa"/>
+        </w:trPr>
+        <w:tc>
+          <w:tcPr>
+            <w:tcW w:w="0" w:type="auto"/>
+            <w:tcBorders>
+              <w:top w:val="single" w:sz="6" w:space="0" w:color="C4C7C5"/>
+              <w:left w:val="single" w:sz="6" w:space="0" w:color="C4C7C5"/>
+              <w:bottom w:val="single" w:sz="6" w:space="0" w:color="C4C7C5"/>
+              <w:right w:val="single" w:sz="6" w:space="0" w:color="C4C7C5"/>
+            </w:tcBorders>
+            <w:tcMar>
+              <w:top w:w="120" w:type="dxa"/>
+              <w:left w:w="180" w:type="dxa"/>
+              <w:bottom w:w="120" w:type="dxa"/>
+              <w:right w:w="180" w:type="dxa"/>
+            </w:tcMar>
+            <w:vAlign w:val="center"/>
+            <w:hideMark/>
+          </w:tcPr>
+          <w:p>
+            <w:pPr>
+              <w:rPr>
+                <w:b/>
+                <w:bCs/>
+              </w:rPr>
+            </w:pPr>
+            <w:r>
+              <w:rPr>
+                <w:b/>
+                <w:bCs/>
+              </w:rPr>
+              <w:t>OS-021</w:t>
+            </w:r>
+          </w:p>
+        </w:tc>
+        <w:tc>
+          <w:tcPr>
+            <w:tcW w:w="0" w:type="auto"/>
+            <w:tcBorders>
+              <w:top w:val="single" w:sz="6" w:space="0" w:color="C4C7C5"/>
+              <w:left w:val="single" w:sz="6" w:space="0" w:color="C4C7C5"/>
+              <w:bottom w:val="single" w:sz="6" w:space="0" w:color="C4C7C5"/>
+              <w:right w:val="single" w:sz="6" w:space="0" w:color="C4C7C5"/>
+            </w:tcBorders>
+            <w:tcMar>
+              <w:top w:w="120" w:type="dxa"/>
+              <w:left w:w="180" w:type="dxa"/>
+              <w:bottom w:w="120" w:type="dxa"/>
+              <w:right w:w="180" w:type="dxa"/>
+            </w:tcMar>
+            <w:vAlign w:val="center"/>
+            <w:hideMark/>
+          </w:tcPr>
+          <w:p>
+            <w:r>
+              <w:t>Users struggle to understand system security warnings</w:t>
+            </w:r>
+          </w:p>
+        </w:tc>
+        <w:tc>
+          <w:tcPr>
+            <w:tcW w:w="0" w:type="auto"/>
+            <w:tcBorders>
+              <w:top w:val="single" w:sz="6" w:space="0" w:color="C4C7C5"/>
+              <w:left w:val="single" w:sz="6" w:space="0" w:color="C4C7C5"/>
+              <w:bottom w:val="single" w:sz="6" w:space="0" w:color="C4C7C5"/>
+              <w:right w:val="single" w:sz="6" w:space="0" w:color="C4C7C5"/>
+            </w:tcBorders>
+            <w:tcMar>
+              <w:top w:w="120" w:type="dxa"/>
+              <w:left w:w="180" w:type="dxa"/>
+              <w:bottom w:w="120" w:type="dxa"/>
+              <w:right w:w="180" w:type="dxa"/>
+            </w:tcMar>
+            <w:vAlign w:val="center"/>
+            <w:hideMark/>
+          </w:tcPr>
+          <w:p>
+            <w:r>
+              <w:t>Accepted</w:t>
+            </w:r>
+          </w:p>
+        </w:tc>
+      </w:tr>
+      <w:tr>
+        <w:trPr>
+          <w:tblCellSpacing w:w="15" w:type="dxa"/>
+        </w:trPr>
+        <w:tc>
+          <w:tcPr>
+            <w:tcW w:w="0" w:type="auto"/>
+            <w:tcBorders>
+              <w:top w:val="single" w:sz="6" w:space="0" w:color="C4C7C5"/>
+              <w:left w:val="single" w:sz="6" w:space="0" w:color="C4C7C5"/>
+              <w:bottom w:val="single" w:sz="6" w:space="0" w:color="C4C7C5"/>
+              <w:right w:val="single" w:sz="6" w:space="0" w:color="C4C7C5"/>
+            </w:tcBorders>
+            <w:tcMar>
+              <w:top w:w="120" w:type="dxa"/>
+              <w:left w:w="180" w:type="dxa"/>
+              <w:bottom w:w="120" w:type="dxa"/>
+              <w:right w:w="180" w:type="dxa"/>
+            </w:tcMar>
+            <w:vAlign w:val="center"/>
+            <w:hideMark/>
+          </w:tcPr>
+          <w:p>
+            <w:pPr>
+              <w:rPr>
+                <w:b/>
+                <w:bCs/>
+              </w:rPr>
+            </w:pPr>
+            <w:r>
+              <w:rPr>
+                <w:b/>
+                <w:bCs/>
+              </w:rPr>
+              <w:t>OS-022</w:t>
+            </w:r>
+          </w:p>
+        </w:tc>
+        <w:tc>
+          <w:tcPr>
+            <w:tcW w:w="0" w:type="auto"/>
+            <w:tcBorders>
+              <w:top w:val="single" w:sz="6" w:space="0" w:color="C4C7C5"/>
+              <w:left w:val="single" w:sz="6" w:space="0" w:color="C4C7C5"/>
+              <w:bottom w:val="single" w:sz="6" w:space="0" w:color="C4C7C5"/>
+              <w:right w:val="single" w:sz="6" w:space="0" w:color="C4C7C5"/>
+            </w:tcBorders>
+            <w:tcMar>
+              <w:top w:w="120" w:type="dxa"/>
+              <w:left w:w="180" w:type="dxa"/>
+              <w:bottom w:w="120" w:type="dxa"/>
+              <w:right w:w="180" w:type="dxa"/>
+            </w:tcMar>
+            <w:vAlign w:val="center"/>
+            <w:hideMark/>
+          </w:tcPr>
+          <w:p>
+            <w:r>
+              <w:t>Users struggle to understand device drivers and hardware compatibility</w:t>
+            </w:r>
+          </w:p>
+        </w:tc>
+        <w:tc>
+          <w:tcPr>
+            <w:tcW w:w="0" w:type="auto"/>
+            <w:tcBorders>
+              <w:top w:val="single" w:sz="6" w:space="0" w:color="C4C7C5"/>
+              <w:left w:val="single" w:sz="6" w:space="0" w:color="C4C7C5"/>
+              <w:bottom w:val="single" w:sz="6" w:space="0" w:color="C4C7C5"/>
+              <w:right w:val="single" w:sz="6" w:space="0" w:color="C4C7C5"/>
+            </w:tcBorders>
+            <w:tcMar>
+              <w:top w:w="120" w:type="dxa"/>
+              <w:left w:w="180" w:type="dxa"/>
+              <w:bottom w:w="120" w:type="dxa"/>
+              <w:right w:w="180" w:type="dxa"/>
+            </w:tcMar>
+            <w:vAlign w:val="center"/>
+            <w:hideMark/>
+          </w:tcPr>
+          <w:p>
+            <w:r>
+              <w:t>Accepted</w:t>
+            </w:r>
+          </w:p>
+        </w:tc>
+      </w:tr>
+      <w:tr>
+        <w:trPr>
+          <w:tblCellSpacing w:w="15" w:type="dxa"/>
+        </w:trPr>
+        <w:tc>
+          <w:tcPr>
+            <w:tcW w:w="0" w:type="auto"/>
+            <w:tcBorders>
+              <w:top w:val="single" w:sz="6" w:space="0" w:color="C4C7C5"/>
+              <w:left w:val="single" w:sz="6" w:space="0" w:color="C4C7C5"/>
+              <w:bottom w:val="single" w:sz="6" w:space="0" w:color="C4C7C5"/>
+              <w:right w:val="single" w:sz="6" w:space="0" w:color="C4C7C5"/>
+            </w:tcBorders>
+            <w:tcMar>
+              <w:top w:w="120" w:type="dxa"/>
+              <w:left w:w="180" w:type="dxa"/>
+              <w:bottom w:w="120" w:type="dxa"/>
+              <w:right w:w="180" w:type="dxa"/>
+            </w:tcMar>
+            <w:vAlign w:val="center"/>
+            <w:hideMark/>
+          </w:tcPr>
+          <w:p>
+            <w:pPr>
+              <w:rPr>
+                <w:b/>
+                <w:bCs/>
+              </w:rPr>
+            </w:pPr>
+            <w:r>
+              <w:rPr>
+                <w:b/>
+                <w:bCs/>
+              </w:rPr>
+              <w:t>OS-023</w:t>
+            </w:r>
+          </w:p>
+        </w:tc>
+        <w:tc>
+          <w:tcPr>
+            <w:tcW w:w="0" w:type="auto"/>
+            <w:tcBorders>
+              <w:top w:val="single" w:sz="6" w:space="0" w:color="C4C7C5"/>
+              <w:left w:val="single" w:sz="6" w:space="0" w:color="C4C7C5"/>
+              <w:bottom w:val="single" w:sz="6" w:space="0" w:color="C4C7C5"/>
+              <w:right w:val="single" w:sz="6" w:space="0" w:color="C4C7C5"/>
+            </w:tcBorders>
+            <w:tcMar>
+              <w:top w:w="120" w:type="dxa"/>
+              <w:left w:w="180" w:type="dxa"/>
+              <w:bottom w:w="120" w:type="dxa"/>
+              <w:right w:w="180" w:type="dxa"/>
+            </w:tcMar>
+            <w:vAlign w:val="center"/>
+            <w:hideMark/>
+          </w:tcPr>
+          <w:p>
+            <w:r>
+              <w:t>Users struggle to troubleshoot operating system problems systematically</w:t>
+            </w:r>
+          </w:p>
+        </w:tc>
+        <w:tc>
+          <w:tcPr>
+            <w:tcW w:w="0" w:type="auto"/>
+            <w:tcBorders>
+              <w:top w:val="single" w:sz="6" w:space="0" w:color="C4C7C5"/>
+              <w:left w:val="single" w:sz="6" w:space="0" w:color="C4C7C5"/>
+              <w:bottom w:val="single" w:sz="6" w:space="0" w:color="C4C7C5"/>
+              <w:right w:val="single" w:sz="6" w:space="0" w:color="C4C7C5"/>
+            </w:tcBorders>
+            <w:tcMar>
+              <w:top w:w="120" w:type="dxa"/>
+              <w:left w:w="180" w:type="dxa"/>
+              <w:bottom w:w="120" w:type="dxa"/>
+              <w:right w:w="180" w:type="dxa"/>
+            </w:tcMar>
+            <w:vAlign w:val="center"/>
+            <w:hideMark/>
+          </w:tcPr>
+          <w:p>
+            <w:r>
+              <w:t>Accepted</w:t>
+            </w:r>
+          </w:p>
+        </w:tc>
+      </w:tr>
+      <w:tr>
+        <w:trPr>
+          <w:tblCellSpacing w:w="15" w:type="dxa"/>
+        </w:trPr>
+        <w:tc>
+          <w:tcPr>
+            <w:tcW w:w="0" w:type="auto"/>
+            <w:tcBorders>
+              <w:top w:val="single" w:sz="6" w:space="0" w:color="C4C7C5"/>
+              <w:left w:val="single" w:sz="6" w:space="0" w:color="C4C7C5"/>
+              <w:bottom w:val="single" w:sz="6" w:space="0" w:color="C4C7C5"/>
+              <w:right w:val="single" w:sz="6" w:space="0" w:color="C4C7C5"/>
+            </w:tcBorders>
+            <w:tcMar>
+              <w:top w:w="120" w:type="dxa"/>
+              <w:left w:w="180" w:type="dxa"/>
+              <w:bottom w:w="120" w:type="dxa"/>
+              <w:right w:w="180" w:type="dxa"/>
+            </w:tcMar>
+            <w:vAlign w:val="center"/>
+            <w:hideMark/>
+          </w:tcPr>
+          <w:p>
+            <w:pPr>
+              <w:rPr>
+                <w:b/>
+                <w:bCs/>
+              </w:rPr>
+            </w:pPr>
+            <w:r>
+              <w:rPr>
+                <w:b/>
+                <w:bCs/>
+              </w:rPr>
+              <w:t>OS-024</w:t>
+            </w:r>
+          </w:p>
+        </w:tc>
+        <w:tc>
+          <w:tcPr>
+            <w:tcW w:w="0" w:type="auto"/>
+            <w:tcBorders>
+              <w:top w:val="single" w:sz="6" w:space="0" w:color="C4C7C5"/>
+              <w:left w:val="single" w:sz="6" w:space="0" w:color="C4C7C5"/>
+              <w:bottom w:val="single" w:sz="6" w:space="0" w:color="C4C7C5"/>
+              <w:right w:val="single" w:sz="6" w:space="0" w:color="C4C7C5"/>
+            </w:tcBorders>
+            <w:tcMar>
+              <w:top w:w="120" w:type="dxa"/>
+              <w:left w:w="180" w:type="dxa"/>
+              <w:bottom w:w="120" w:type="dxa"/>
+              <w:right w:w="180" w:type="dxa"/>
+            </w:tcMar>
+            <w:vAlign w:val="center"/>
+            <w:hideMark/>
+          </w:tcPr>
+          <w:p>
+            <w:r>
+              <w:t>Users struggle to understand how different operating system components interact</w:t>
+            </w:r>
+          </w:p>
+        </w:tc>
+        <w:tc>
+          <w:tcPr>
+            <w:tcW w:w="0" w:type="auto"/>
+            <w:tcBorders>
+              <w:top w:val="single" w:sz="6" w:space="0" w:color="C4C7C5"/>
+              <w:left w:val="single" w:sz="6" w:space="0" w:color="C4C7C5"/>
+              <w:bottom w:val="single" w:sz="6" w:space="0" w:color="C4C7C5"/>
+              <w:right w:val="single" w:sz="6" w:space="0" w:color="C4C7C5"/>
+            </w:tcBorders>
+            <w:tcMar>
+              <w:top w:w="120" w:type="dxa"/>
+              <w:left w:w="180" w:type="dxa"/>
+              <w:bottom w:w="120" w:type="dxa"/>
+              <w:right w:w="180" w:type="dxa"/>
+            </w:tcMar>
+            <w:vAlign w:val="center"/>
+            <w:hideMark/>
+          </w:tcPr>
+          <w:p>
+            <w:r>
+              <w:t>Accepted</w:t>
+            </w:r>
+          </w:p>
+        </w:tc>
+      </w:tr>
+      <w:tr>
+        <w:trPr>
+          <w:tblCellSpacing w:w="15" w:type="dxa"/>
+        </w:trPr>
+        <w:tc>
+          <w:tcPr>
+            <w:tcW w:w="0" w:type="auto"/>
+            <w:tcBorders>
+              <w:top w:val="single" w:sz="6" w:space="0" w:color="C4C7C5"/>
+              <w:left w:val="single" w:sz="6" w:space="0" w:color="C4C7C5"/>
+              <w:bottom w:val="single" w:sz="6" w:space="0" w:color="C4C7C5"/>
+              <w:right w:val="single" w:sz="6" w:space="0" w:color="C4C7C5"/>
+            </w:tcBorders>
+            <w:tcMar>
+              <w:top w:w="120" w:type="dxa"/>
+              <w:left w:w="180" w:type="dxa"/>
+              <w:bottom w:w="120" w:type="dxa"/>
+              <w:right w:w="180" w:type="dxa"/>
+            </w:tcMar>
+            <w:vAlign w:val="center"/>
+            <w:hideMark/>
+          </w:tcPr>
+          <w:p>
+            <w:pPr>
+              <w:rPr>
+                <w:b/>
+                <w:bCs/>
+              </w:rPr>
+            </w:pPr>
+            <w:r>
+              <w:rPr>
+                <w:b/>
+                <w:bCs/>
+              </w:rPr>
+              <w:lastRenderedPageBreak/>
+              <w:t>OS-025</w:t>
+            </w:r>
+          </w:p>
+        </w:tc>
+        <w:tc>
+          <w:tcPr>
+            <w:tcW w:w="0" w:type="auto"/>
+            <w:tcBorders>
+              <w:top w:val="single" w:sz="6" w:space="0" w:color="C4C7C5"/>
+              <w:left w:val="single" w:sz="6" w:space="0" w:color="C4C7C5"/>
+              <w:bottom w:val="single" w:sz="6" w:space="0" w:color="C4C7C5"/>
+              <w:right w:val="single" w:sz="6" w:space="0" w:color="C4C7C5"/>
+            </w:tcBorders>
+            <w:tcMar>
+              <w:top w:w="120" w:type="dxa"/>
+              <w:left w:w="180" w:type="dxa"/>
+              <w:bottom w:w="120" w:type="dxa"/>
+              <w:right w:w="180" w:type="dxa"/>
+            </w:tcMar>
+            <w:vAlign w:val="center"/>
+            <w:hideMark/>
+          </w:tcPr>
+          <w:p>
+            <w:r>
+              <w:t>Users gradually lose understanding of how their operating system functions as it becomes more complex</w:t>
+            </w:r>
+          </w:p>
+        </w:tc>
+        <w:tc>
+          <w:tcPr>
+            <w:tcW w:w="0" w:type="auto"/>
+            <w:tcBorders>
+              <w:top w:val="single" w:sz="6" w:space="0" w:color="C4C7C5"/>
+              <w:left w:val="single" w:sz="6" w:space="0" w:color="C4C7C5"/>
+              <w:bottom w:val="single" w:sz="6" w:space="0" w:color="C4C7C5"/>
+              <w:right w:val="single" w:sz="6" w:space="0" w:color="C4C7C5"/>
+            </w:tcBorders>
+            <w:tcMar>
+              <w:top w:w="120" w:type="dxa"/>
+              <w:left w:w="180" w:type="dxa"/>
+              <w:bottom w:w="120" w:type="dxa"/>
+              <w:right w:w="180" w:type="dxa"/>
+            </w:tcMar>
+            <w:vAlign w:val="center"/>
+            <w:hideMark/>
+          </w:tcPr>
+          <w:p>
+            <w:r>
+              <w:t>Accepted</w:t>
+            </w:r>
+          </w:p>
+        </w:tc>
+      </w:tr>
+    </w:tbl>
+    <w:p>
+      <w:pPr>
+        <w:rPr>
+          <w:b/>
+          <w:bCs/>
+        </w:rPr>
+      </w:pPr>
+    </w:p>
+    <w:p>
+      <w:pPr>
+        <w:rPr>
+          <w:b/>
+          <w:bCs/>
+        </w:rPr>
+      </w:pPr>
+    </w:p>
+    <w:p>
+      <w:pPr>
+        <w:rPr>
+          <w:b/>
+          <w:bCs/>
+        </w:rPr>
+      </w:pPr>
       <w:r>
         <w:rPr>
           <w:b/>
@@ -6687,7 +9030,7 @@
           </w:tcPr>
           <w:p>
             <w:r>
-              <w:t>1</w:t>
+              <w:t>2</w:t>
             </w:r>
           </w:p>
         </w:tc>
@@ -6744,7 +9087,7 @@
           </w:tcPr>
           <w:p>
             <w:r>
-              <w:t>75</w:t>
+              <w:t>100</w:t>
             </w:r>
           </w:p>
         </w:tc>
@@ -6801,7 +9144,7 @@
           </w:tcPr>
           <w:p>
             <w:r>
-              <w:t>75</w:t>
+              <w:t>100</w:t>
             </w:r>
           </w:p>
         </w:tc>
@@ -6891,7 +9234,6 @@
                 <w:b/>
                 <w:bCs/>
               </w:rPr>
-              <w:lastRenderedPageBreak/>
               <w:t>Archived</w:t>
             </w:r>
           </w:p>
@@ -7057,6 +9399,7 @@
         </w:numPr>
       </w:pPr>
       <w:r>
+        <w:lastRenderedPageBreak/>
         <w:t>The APID Registry serves solely as the authoritative index for identifying and locating Human Frictions.</w:t>
       </w:r>
     </w:p>
@@ -7328,7 +9671,6 @@
                 <w:b/>
                 <w:bCs/>
               </w:rPr>
-              <w:lastRenderedPageBreak/>
               <w:t>Version</w:t>
             </w:r>
           </w:p>

</xml_diff>

<commit_message>
Add new pattern docs; update registries & metrics
Adds several new .docx documents: WI Volume 01 (Web & Internet) and PAT-027 through PAT-033 under atlas/Patterns and atlas/Human-Frictions. Updates existing registry and metrics documents: atlas/Registries/APID-Registry.docx, Category-Registry.docx, Pattern-Registry.docx, and atlas/metrics/Human Friction Metrics.docx and Pattern Metrics.docx. All changes are binary .docx additions/edits containing content updates to the atlas.

Co-Authored-By: Project UIL <309146262+researchprojectuil-prog@users.noreply.github.com>
Co-Authored-By: jothish-blip <215570346+jothish-blip@users.noreply.github.com>
</commit_message>
<xml_diff>
--- a/atlas/Registries/APID-Registry.docx
+++ b/atlas/Registries/APID-Registry.docx
@@ -10725,6 +10725,2332 @@
           <w:bCs/>
         </w:rPr>
       </w:pPr>
+      <w:r>
+        <w:rPr>
+          <w:b/>
+          <w:bCs/>
+        </w:rPr>
+        <w:t>Category: Web &amp; Internet (WI)</w:t>
+      </w:r>
+    </w:p>
+    <w:tbl>
+      <w:tblPr>
+        <w:tblW w:w="0" w:type="auto"/>
+        <w:tblCellSpacing w:w="15" w:type="dxa"/>
+        <w:tblCellMar>
+          <w:top w:w="15" w:type="dxa"/>
+          <w:left w:w="15" w:type="dxa"/>
+          <w:bottom w:w="15" w:type="dxa"/>
+          <w:right w:w="15" w:type="dxa"/>
+        </w:tblCellMar>
+        <w:tblLook w:val="04A0" w:firstRow="1" w:lastRow="0" w:firstColumn="1" w:lastColumn="0" w:noHBand="0" w:noVBand="1"/>
+      </w:tblPr>
+      <w:tblGrid>
+        <w:gridCol w:w="1064"/>
+        <w:gridCol w:w="6519"/>
+        <w:gridCol w:w="1427"/>
+      </w:tblGrid>
+      <w:tr>
+        <w:trPr>
+          <w:tblHeader/>
+          <w:tblCellSpacing w:w="15" w:type="dxa"/>
+        </w:trPr>
+        <w:tc>
+          <w:tcPr>
+            <w:tcW w:w="0" w:type="auto"/>
+            <w:tcBorders>
+              <w:top w:val="single" w:sz="6" w:space="0" w:color="C4C7C5"/>
+              <w:left w:val="single" w:sz="6" w:space="0" w:color="C4C7C5"/>
+              <w:bottom w:val="single" w:sz="6" w:space="0" w:color="C4C7C5"/>
+              <w:right w:val="single" w:sz="6" w:space="0" w:color="C4C7C5"/>
+            </w:tcBorders>
+            <w:tcMar>
+              <w:top w:w="120" w:type="dxa"/>
+              <w:left w:w="180" w:type="dxa"/>
+              <w:bottom w:w="120" w:type="dxa"/>
+              <w:right w:w="180" w:type="dxa"/>
+            </w:tcMar>
+            <w:vAlign w:val="center"/>
+            <w:hideMark/>
+          </w:tcPr>
+          <w:p>
+            <w:pPr>
+              <w:rPr>
+                <w:b/>
+                <w:bCs/>
+              </w:rPr>
+            </w:pPr>
+            <w:r>
+              <w:rPr>
+                <w:b/>
+                <w:bCs/>
+              </w:rPr>
+              <w:t>APID</w:t>
+            </w:r>
+          </w:p>
+        </w:tc>
+        <w:tc>
+          <w:tcPr>
+            <w:tcW w:w="0" w:type="auto"/>
+            <w:tcBorders>
+              <w:top w:val="single" w:sz="6" w:space="0" w:color="C4C7C5"/>
+              <w:left w:val="single" w:sz="6" w:space="0" w:color="C4C7C5"/>
+              <w:bottom w:val="single" w:sz="6" w:space="0" w:color="C4C7C5"/>
+              <w:right w:val="single" w:sz="6" w:space="0" w:color="C4C7C5"/>
+            </w:tcBorders>
+            <w:tcMar>
+              <w:top w:w="120" w:type="dxa"/>
+              <w:left w:w="180" w:type="dxa"/>
+              <w:bottom w:w="120" w:type="dxa"/>
+              <w:right w:w="180" w:type="dxa"/>
+            </w:tcMar>
+            <w:vAlign w:val="center"/>
+            <w:hideMark/>
+          </w:tcPr>
+          <w:p>
+            <w:pPr>
+              <w:rPr>
+                <w:b/>
+                <w:bCs/>
+              </w:rPr>
+            </w:pPr>
+            <w:r>
+              <w:rPr>
+                <w:b/>
+                <w:bCs/>
+              </w:rPr>
+              <w:t>Human Friction</w:t>
+            </w:r>
+          </w:p>
+        </w:tc>
+        <w:tc>
+          <w:tcPr>
+            <w:tcW w:w="0" w:type="auto"/>
+            <w:tcBorders>
+              <w:top w:val="single" w:sz="6" w:space="0" w:color="C4C7C5"/>
+              <w:left w:val="single" w:sz="6" w:space="0" w:color="C4C7C5"/>
+              <w:bottom w:val="single" w:sz="6" w:space="0" w:color="C4C7C5"/>
+              <w:right w:val="single" w:sz="6" w:space="0" w:color="C4C7C5"/>
+            </w:tcBorders>
+            <w:tcMar>
+              <w:top w:w="120" w:type="dxa"/>
+              <w:left w:w="180" w:type="dxa"/>
+              <w:bottom w:w="120" w:type="dxa"/>
+              <w:right w:w="180" w:type="dxa"/>
+            </w:tcMar>
+            <w:vAlign w:val="center"/>
+            <w:hideMark/>
+          </w:tcPr>
+          <w:p>
+            <w:pPr>
+              <w:rPr>
+                <w:b/>
+                <w:bCs/>
+              </w:rPr>
+            </w:pPr>
+            <w:r>
+              <w:rPr>
+                <w:b/>
+                <w:bCs/>
+              </w:rPr>
+              <w:t>Status</w:t>
+            </w:r>
+          </w:p>
+        </w:tc>
+      </w:tr>
+      <w:tr>
+        <w:trPr>
+          <w:tblCellSpacing w:w="15" w:type="dxa"/>
+        </w:trPr>
+        <w:tc>
+          <w:tcPr>
+            <w:tcW w:w="0" w:type="auto"/>
+            <w:tcBorders>
+              <w:top w:val="single" w:sz="6" w:space="0" w:color="C4C7C5"/>
+              <w:left w:val="single" w:sz="6" w:space="0" w:color="C4C7C5"/>
+              <w:bottom w:val="single" w:sz="6" w:space="0" w:color="C4C7C5"/>
+              <w:right w:val="single" w:sz="6" w:space="0" w:color="C4C7C5"/>
+            </w:tcBorders>
+            <w:tcMar>
+              <w:top w:w="120" w:type="dxa"/>
+              <w:left w:w="180" w:type="dxa"/>
+              <w:bottom w:w="120" w:type="dxa"/>
+              <w:right w:w="180" w:type="dxa"/>
+            </w:tcMar>
+            <w:vAlign w:val="center"/>
+            <w:hideMark/>
+          </w:tcPr>
+          <w:p>
+            <w:pPr>
+              <w:rPr>
+                <w:b/>
+                <w:bCs/>
+              </w:rPr>
+            </w:pPr>
+            <w:r>
+              <w:rPr>
+                <w:b/>
+                <w:bCs/>
+              </w:rPr>
+              <w:t>WI-001</w:t>
+            </w:r>
+          </w:p>
+        </w:tc>
+        <w:tc>
+          <w:tcPr>
+            <w:tcW w:w="0" w:type="auto"/>
+            <w:tcBorders>
+              <w:top w:val="single" w:sz="6" w:space="0" w:color="C4C7C5"/>
+              <w:left w:val="single" w:sz="6" w:space="0" w:color="C4C7C5"/>
+              <w:bottom w:val="single" w:sz="6" w:space="0" w:color="C4C7C5"/>
+              <w:right w:val="single" w:sz="6" w:space="0" w:color="C4C7C5"/>
+            </w:tcBorders>
+            <w:tcMar>
+              <w:top w:w="120" w:type="dxa"/>
+              <w:left w:w="180" w:type="dxa"/>
+              <w:bottom w:w="120" w:type="dxa"/>
+              <w:right w:w="180" w:type="dxa"/>
+            </w:tcMar>
+            <w:vAlign w:val="center"/>
+            <w:hideMark/>
+          </w:tcPr>
+          <w:p>
+            <w:r>
+              <w:t>Users struggle to select the best search result for their intent</w:t>
+            </w:r>
+          </w:p>
+        </w:tc>
+        <w:tc>
+          <w:tcPr>
+            <w:tcW w:w="0" w:type="auto"/>
+            <w:tcBorders>
+              <w:top w:val="single" w:sz="6" w:space="0" w:color="C4C7C5"/>
+              <w:left w:val="single" w:sz="6" w:space="0" w:color="C4C7C5"/>
+              <w:bottom w:val="single" w:sz="6" w:space="0" w:color="C4C7C5"/>
+              <w:right w:val="single" w:sz="6" w:space="0" w:color="C4C7C5"/>
+            </w:tcBorders>
+            <w:tcMar>
+              <w:top w:w="120" w:type="dxa"/>
+              <w:left w:w="180" w:type="dxa"/>
+              <w:bottom w:w="120" w:type="dxa"/>
+              <w:right w:w="180" w:type="dxa"/>
+            </w:tcMar>
+            <w:vAlign w:val="center"/>
+            <w:hideMark/>
+          </w:tcPr>
+          <w:p>
+            <w:r>
+              <w:t>Accepted</w:t>
+            </w:r>
+          </w:p>
+        </w:tc>
+      </w:tr>
+      <w:tr>
+        <w:trPr>
+          <w:tblCellSpacing w:w="15" w:type="dxa"/>
+        </w:trPr>
+        <w:tc>
+          <w:tcPr>
+            <w:tcW w:w="0" w:type="auto"/>
+            <w:tcBorders>
+              <w:top w:val="single" w:sz="6" w:space="0" w:color="C4C7C5"/>
+              <w:left w:val="single" w:sz="6" w:space="0" w:color="C4C7C5"/>
+              <w:bottom w:val="single" w:sz="6" w:space="0" w:color="C4C7C5"/>
+              <w:right w:val="single" w:sz="6" w:space="0" w:color="C4C7C5"/>
+            </w:tcBorders>
+            <w:tcMar>
+              <w:top w:w="120" w:type="dxa"/>
+              <w:left w:w="180" w:type="dxa"/>
+              <w:bottom w:w="120" w:type="dxa"/>
+              <w:right w:w="180" w:type="dxa"/>
+            </w:tcMar>
+            <w:vAlign w:val="center"/>
+            <w:hideMark/>
+          </w:tcPr>
+          <w:p>
+            <w:pPr>
+              <w:rPr>
+                <w:b/>
+                <w:bCs/>
+              </w:rPr>
+            </w:pPr>
+            <w:r>
+              <w:rPr>
+                <w:b/>
+                <w:bCs/>
+              </w:rPr>
+              <w:t>WI-002</w:t>
+            </w:r>
+          </w:p>
+        </w:tc>
+        <w:tc>
+          <w:tcPr>
+            <w:tcW w:w="0" w:type="auto"/>
+            <w:tcBorders>
+              <w:top w:val="single" w:sz="6" w:space="0" w:color="C4C7C5"/>
+              <w:left w:val="single" w:sz="6" w:space="0" w:color="C4C7C5"/>
+              <w:bottom w:val="single" w:sz="6" w:space="0" w:color="C4C7C5"/>
+              <w:right w:val="single" w:sz="6" w:space="0" w:color="C4C7C5"/>
+            </w:tcBorders>
+            <w:tcMar>
+              <w:top w:w="120" w:type="dxa"/>
+              <w:left w:w="180" w:type="dxa"/>
+              <w:bottom w:w="120" w:type="dxa"/>
+              <w:right w:w="180" w:type="dxa"/>
+            </w:tcMar>
+            <w:vAlign w:val="center"/>
+            <w:hideMark/>
+          </w:tcPr>
+          <w:p>
+            <w:r>
+              <w:t>Users struggle to understand how to navigate an unfamiliar website layout</w:t>
+            </w:r>
+          </w:p>
+        </w:tc>
+        <w:tc>
+          <w:tcPr>
+            <w:tcW w:w="0" w:type="auto"/>
+            <w:tcBorders>
+              <w:top w:val="single" w:sz="6" w:space="0" w:color="C4C7C5"/>
+              <w:left w:val="single" w:sz="6" w:space="0" w:color="C4C7C5"/>
+              <w:bottom w:val="single" w:sz="6" w:space="0" w:color="C4C7C5"/>
+              <w:right w:val="single" w:sz="6" w:space="0" w:color="C4C7C5"/>
+            </w:tcBorders>
+            <w:tcMar>
+              <w:top w:w="120" w:type="dxa"/>
+              <w:left w:w="180" w:type="dxa"/>
+              <w:bottom w:w="120" w:type="dxa"/>
+              <w:right w:w="180" w:type="dxa"/>
+            </w:tcMar>
+            <w:vAlign w:val="center"/>
+            <w:hideMark/>
+          </w:tcPr>
+          <w:p>
+            <w:r>
+              <w:t>Accepted</w:t>
+            </w:r>
+          </w:p>
+        </w:tc>
+      </w:tr>
+      <w:tr>
+        <w:trPr>
+          <w:tblCellSpacing w:w="15" w:type="dxa"/>
+        </w:trPr>
+        <w:tc>
+          <w:tcPr>
+            <w:tcW w:w="0" w:type="auto"/>
+            <w:tcBorders>
+              <w:top w:val="single" w:sz="6" w:space="0" w:color="C4C7C5"/>
+              <w:left w:val="single" w:sz="6" w:space="0" w:color="C4C7C5"/>
+              <w:bottom w:val="single" w:sz="6" w:space="0" w:color="C4C7C5"/>
+              <w:right w:val="single" w:sz="6" w:space="0" w:color="C4C7C5"/>
+            </w:tcBorders>
+            <w:tcMar>
+              <w:top w:w="120" w:type="dxa"/>
+              <w:left w:w="180" w:type="dxa"/>
+              <w:bottom w:w="120" w:type="dxa"/>
+              <w:right w:w="180" w:type="dxa"/>
+            </w:tcMar>
+            <w:vAlign w:val="center"/>
+            <w:hideMark/>
+          </w:tcPr>
+          <w:p>
+            <w:pPr>
+              <w:rPr>
+                <w:b/>
+                <w:bCs/>
+              </w:rPr>
+            </w:pPr>
+            <w:r>
+              <w:rPr>
+                <w:b/>
+                <w:bCs/>
+              </w:rPr>
+              <w:t>WI-003</w:t>
+            </w:r>
+          </w:p>
+        </w:tc>
+        <w:tc>
+          <w:tcPr>
+            <w:tcW w:w="0" w:type="auto"/>
+            <w:tcBorders>
+              <w:top w:val="single" w:sz="6" w:space="0" w:color="C4C7C5"/>
+              <w:left w:val="single" w:sz="6" w:space="0" w:color="C4C7C5"/>
+              <w:bottom w:val="single" w:sz="6" w:space="0" w:color="C4C7C5"/>
+              <w:right w:val="single" w:sz="6" w:space="0" w:color="C4C7C5"/>
+            </w:tcBorders>
+            <w:tcMar>
+              <w:top w:w="120" w:type="dxa"/>
+              <w:left w:w="180" w:type="dxa"/>
+              <w:bottom w:w="120" w:type="dxa"/>
+              <w:right w:w="180" w:type="dxa"/>
+            </w:tcMar>
+            <w:vAlign w:val="center"/>
+            <w:hideMark/>
+          </w:tcPr>
+          <w:p>
+            <w:r>
+              <w:t>Users struggle to find specific information on pages with dense text or complex layouts</w:t>
+            </w:r>
+          </w:p>
+        </w:tc>
+        <w:tc>
+          <w:tcPr>
+            <w:tcW w:w="0" w:type="auto"/>
+            <w:tcBorders>
+              <w:top w:val="single" w:sz="6" w:space="0" w:color="C4C7C5"/>
+              <w:left w:val="single" w:sz="6" w:space="0" w:color="C4C7C5"/>
+              <w:bottom w:val="single" w:sz="6" w:space="0" w:color="C4C7C5"/>
+              <w:right w:val="single" w:sz="6" w:space="0" w:color="C4C7C5"/>
+            </w:tcBorders>
+            <w:tcMar>
+              <w:top w:w="120" w:type="dxa"/>
+              <w:left w:w="180" w:type="dxa"/>
+              <w:bottom w:w="120" w:type="dxa"/>
+              <w:right w:w="180" w:type="dxa"/>
+            </w:tcMar>
+            <w:vAlign w:val="center"/>
+            <w:hideMark/>
+          </w:tcPr>
+          <w:p>
+            <w:r>
+              <w:t>Accepted</w:t>
+            </w:r>
+          </w:p>
+        </w:tc>
+      </w:tr>
+      <w:tr>
+        <w:trPr>
+          <w:tblCellSpacing w:w="15" w:type="dxa"/>
+        </w:trPr>
+        <w:tc>
+          <w:tcPr>
+            <w:tcW w:w="0" w:type="auto"/>
+            <w:tcBorders>
+              <w:top w:val="single" w:sz="6" w:space="0" w:color="C4C7C5"/>
+              <w:left w:val="single" w:sz="6" w:space="0" w:color="C4C7C5"/>
+              <w:bottom w:val="single" w:sz="6" w:space="0" w:color="C4C7C5"/>
+              <w:right w:val="single" w:sz="6" w:space="0" w:color="C4C7C5"/>
+            </w:tcBorders>
+            <w:tcMar>
+              <w:top w:w="120" w:type="dxa"/>
+              <w:left w:w="180" w:type="dxa"/>
+              <w:bottom w:w="120" w:type="dxa"/>
+              <w:right w:w="180" w:type="dxa"/>
+            </w:tcMar>
+            <w:vAlign w:val="center"/>
+            <w:hideMark/>
+          </w:tcPr>
+          <w:p>
+            <w:pPr>
+              <w:rPr>
+                <w:b/>
+                <w:bCs/>
+              </w:rPr>
+            </w:pPr>
+            <w:r>
+              <w:rPr>
+                <w:b/>
+                <w:bCs/>
+              </w:rPr>
+              <w:t>WI-004</w:t>
+            </w:r>
+          </w:p>
+        </w:tc>
+        <w:tc>
+          <w:tcPr>
+            <w:tcW w:w="0" w:type="auto"/>
+            <w:tcBorders>
+              <w:top w:val="single" w:sz="6" w:space="0" w:color="C4C7C5"/>
+              <w:left w:val="single" w:sz="6" w:space="0" w:color="C4C7C5"/>
+              <w:bottom w:val="single" w:sz="6" w:space="0" w:color="C4C7C5"/>
+              <w:right w:val="single" w:sz="6" w:space="0" w:color="C4C7C5"/>
+            </w:tcBorders>
+            <w:tcMar>
+              <w:top w:w="120" w:type="dxa"/>
+              <w:left w:w="180" w:type="dxa"/>
+              <w:bottom w:w="120" w:type="dxa"/>
+              <w:right w:w="180" w:type="dxa"/>
+            </w:tcMar>
+            <w:vAlign w:val="center"/>
+            <w:hideMark/>
+          </w:tcPr>
+          <w:p>
+            <w:r>
+              <w:t>Users struggle to determine whether a website is trustworthy and secure</w:t>
+            </w:r>
+          </w:p>
+        </w:tc>
+        <w:tc>
+          <w:tcPr>
+            <w:tcW w:w="0" w:type="auto"/>
+            <w:tcBorders>
+              <w:top w:val="single" w:sz="6" w:space="0" w:color="C4C7C5"/>
+              <w:left w:val="single" w:sz="6" w:space="0" w:color="C4C7C5"/>
+              <w:bottom w:val="single" w:sz="6" w:space="0" w:color="C4C7C5"/>
+              <w:right w:val="single" w:sz="6" w:space="0" w:color="C4C7C5"/>
+            </w:tcBorders>
+            <w:tcMar>
+              <w:top w:w="120" w:type="dxa"/>
+              <w:left w:w="180" w:type="dxa"/>
+              <w:bottom w:w="120" w:type="dxa"/>
+              <w:right w:w="180" w:type="dxa"/>
+            </w:tcMar>
+            <w:vAlign w:val="center"/>
+            <w:hideMark/>
+          </w:tcPr>
+          <w:p>
+            <w:r>
+              <w:t>Accepted</w:t>
+            </w:r>
+          </w:p>
+        </w:tc>
+      </w:tr>
+      <w:tr>
+        <w:trPr>
+          <w:tblCellSpacing w:w="15" w:type="dxa"/>
+        </w:trPr>
+        <w:tc>
+          <w:tcPr>
+            <w:tcW w:w="0" w:type="auto"/>
+            <w:tcBorders>
+              <w:top w:val="single" w:sz="6" w:space="0" w:color="C4C7C5"/>
+              <w:left w:val="single" w:sz="6" w:space="0" w:color="C4C7C5"/>
+              <w:bottom w:val="single" w:sz="6" w:space="0" w:color="C4C7C5"/>
+              <w:right w:val="single" w:sz="6" w:space="0" w:color="C4C7C5"/>
+            </w:tcBorders>
+            <w:tcMar>
+              <w:top w:w="120" w:type="dxa"/>
+              <w:left w:w="180" w:type="dxa"/>
+              <w:bottom w:w="120" w:type="dxa"/>
+              <w:right w:w="180" w:type="dxa"/>
+            </w:tcMar>
+            <w:vAlign w:val="center"/>
+            <w:hideMark/>
+          </w:tcPr>
+          <w:p>
+            <w:pPr>
+              <w:rPr>
+                <w:b/>
+                <w:bCs/>
+              </w:rPr>
+            </w:pPr>
+            <w:r>
+              <w:rPr>
+                <w:b/>
+                <w:bCs/>
+              </w:rPr>
+              <w:t>WI-005</w:t>
+            </w:r>
+          </w:p>
+        </w:tc>
+        <w:tc>
+          <w:tcPr>
+            <w:tcW w:w="0" w:type="auto"/>
+            <w:tcBorders>
+              <w:top w:val="single" w:sz="6" w:space="0" w:color="C4C7C5"/>
+              <w:left w:val="single" w:sz="6" w:space="0" w:color="C4C7C5"/>
+              <w:bottom w:val="single" w:sz="6" w:space="0" w:color="C4C7C5"/>
+              <w:right w:val="single" w:sz="6" w:space="0" w:color="C4C7C5"/>
+            </w:tcBorders>
+            <w:tcMar>
+              <w:top w:w="120" w:type="dxa"/>
+              <w:left w:w="180" w:type="dxa"/>
+              <w:bottom w:w="120" w:type="dxa"/>
+              <w:right w:w="180" w:type="dxa"/>
+            </w:tcMar>
+            <w:vAlign w:val="center"/>
+            <w:hideMark/>
+          </w:tcPr>
+          <w:p>
+            <w:r>
+              <w:t>Users struggle to understand the purpose of different sections within a website</w:t>
+            </w:r>
+          </w:p>
+        </w:tc>
+        <w:tc>
+          <w:tcPr>
+            <w:tcW w:w="0" w:type="auto"/>
+            <w:tcBorders>
+              <w:top w:val="single" w:sz="6" w:space="0" w:color="C4C7C5"/>
+              <w:left w:val="single" w:sz="6" w:space="0" w:color="C4C7C5"/>
+              <w:bottom w:val="single" w:sz="6" w:space="0" w:color="C4C7C5"/>
+              <w:right w:val="single" w:sz="6" w:space="0" w:color="C4C7C5"/>
+            </w:tcBorders>
+            <w:tcMar>
+              <w:top w:w="120" w:type="dxa"/>
+              <w:left w:w="180" w:type="dxa"/>
+              <w:bottom w:w="120" w:type="dxa"/>
+              <w:right w:w="180" w:type="dxa"/>
+            </w:tcMar>
+            <w:vAlign w:val="center"/>
+            <w:hideMark/>
+          </w:tcPr>
+          <w:p>
+            <w:r>
+              <w:t>Accepted</w:t>
+            </w:r>
+          </w:p>
+        </w:tc>
+      </w:tr>
+      <w:tr>
+        <w:trPr>
+          <w:tblCellSpacing w:w="15" w:type="dxa"/>
+        </w:trPr>
+        <w:tc>
+          <w:tcPr>
+            <w:tcW w:w="0" w:type="auto"/>
+            <w:tcBorders>
+              <w:top w:val="single" w:sz="6" w:space="0" w:color="C4C7C5"/>
+              <w:left w:val="single" w:sz="6" w:space="0" w:color="C4C7C5"/>
+              <w:bottom w:val="single" w:sz="6" w:space="0" w:color="C4C7C5"/>
+              <w:right w:val="single" w:sz="6" w:space="0" w:color="C4C7C5"/>
+            </w:tcBorders>
+            <w:tcMar>
+              <w:top w:w="120" w:type="dxa"/>
+              <w:left w:w="180" w:type="dxa"/>
+              <w:bottom w:w="120" w:type="dxa"/>
+              <w:right w:w="180" w:type="dxa"/>
+            </w:tcMar>
+            <w:vAlign w:val="center"/>
+            <w:hideMark/>
+          </w:tcPr>
+          <w:p>
+            <w:pPr>
+              <w:rPr>
+                <w:b/>
+                <w:bCs/>
+              </w:rPr>
+            </w:pPr>
+            <w:r>
+              <w:rPr>
+                <w:b/>
+                <w:bCs/>
+              </w:rPr>
+              <w:t>WI-006</w:t>
+            </w:r>
+          </w:p>
+        </w:tc>
+        <w:tc>
+          <w:tcPr>
+            <w:tcW w:w="0" w:type="auto"/>
+            <w:tcBorders>
+              <w:top w:val="single" w:sz="6" w:space="0" w:color="C4C7C5"/>
+              <w:left w:val="single" w:sz="6" w:space="0" w:color="C4C7C5"/>
+              <w:bottom w:val="single" w:sz="6" w:space="0" w:color="C4C7C5"/>
+              <w:right w:val="single" w:sz="6" w:space="0" w:color="C4C7C5"/>
+            </w:tcBorders>
+            <w:tcMar>
+              <w:top w:w="120" w:type="dxa"/>
+              <w:left w:w="180" w:type="dxa"/>
+              <w:bottom w:w="120" w:type="dxa"/>
+              <w:right w:w="180" w:type="dxa"/>
+            </w:tcMar>
+            <w:vAlign w:val="center"/>
+            <w:hideMark/>
+          </w:tcPr>
+          <w:p>
+            <w:r>
+              <w:t>Users struggle to remember where features and settings are located on websites they have previously used</w:t>
+            </w:r>
+          </w:p>
+        </w:tc>
+        <w:tc>
+          <w:tcPr>
+            <w:tcW w:w="0" w:type="auto"/>
+            <w:tcBorders>
+              <w:top w:val="single" w:sz="6" w:space="0" w:color="C4C7C5"/>
+              <w:left w:val="single" w:sz="6" w:space="0" w:color="C4C7C5"/>
+              <w:bottom w:val="single" w:sz="6" w:space="0" w:color="C4C7C5"/>
+              <w:right w:val="single" w:sz="6" w:space="0" w:color="C4C7C5"/>
+            </w:tcBorders>
+            <w:tcMar>
+              <w:top w:w="120" w:type="dxa"/>
+              <w:left w:w="180" w:type="dxa"/>
+              <w:bottom w:w="120" w:type="dxa"/>
+              <w:right w:w="180" w:type="dxa"/>
+            </w:tcMar>
+            <w:vAlign w:val="center"/>
+            <w:hideMark/>
+          </w:tcPr>
+          <w:p>
+            <w:r>
+              <w:t>Accepted</w:t>
+            </w:r>
+          </w:p>
+        </w:tc>
+      </w:tr>
+      <w:tr>
+        <w:trPr>
+          <w:tblCellSpacing w:w="15" w:type="dxa"/>
+        </w:trPr>
+        <w:tc>
+          <w:tcPr>
+            <w:tcW w:w="0" w:type="auto"/>
+            <w:tcBorders>
+              <w:top w:val="single" w:sz="6" w:space="0" w:color="C4C7C5"/>
+              <w:left w:val="single" w:sz="6" w:space="0" w:color="C4C7C5"/>
+              <w:bottom w:val="single" w:sz="6" w:space="0" w:color="C4C7C5"/>
+              <w:right w:val="single" w:sz="6" w:space="0" w:color="C4C7C5"/>
+            </w:tcBorders>
+            <w:tcMar>
+              <w:top w:w="120" w:type="dxa"/>
+              <w:left w:w="180" w:type="dxa"/>
+              <w:bottom w:w="120" w:type="dxa"/>
+              <w:right w:w="180" w:type="dxa"/>
+            </w:tcMar>
+            <w:vAlign w:val="center"/>
+            <w:hideMark/>
+          </w:tcPr>
+          <w:p>
+            <w:pPr>
+              <w:rPr>
+                <w:b/>
+                <w:bCs/>
+              </w:rPr>
+            </w:pPr>
+            <w:r>
+              <w:rPr>
+                <w:b/>
+                <w:bCs/>
+              </w:rPr>
+              <w:t>WI-007</w:t>
+            </w:r>
+          </w:p>
+        </w:tc>
+        <w:tc>
+          <w:tcPr>
+            <w:tcW w:w="0" w:type="auto"/>
+            <w:tcBorders>
+              <w:top w:val="single" w:sz="6" w:space="0" w:color="C4C7C5"/>
+              <w:left w:val="single" w:sz="6" w:space="0" w:color="C4C7C5"/>
+              <w:bottom w:val="single" w:sz="6" w:space="0" w:color="C4C7C5"/>
+              <w:right w:val="single" w:sz="6" w:space="0" w:color="C4C7C5"/>
+            </w:tcBorders>
+            <w:tcMar>
+              <w:top w:w="120" w:type="dxa"/>
+              <w:left w:w="180" w:type="dxa"/>
+              <w:bottom w:w="120" w:type="dxa"/>
+              <w:right w:w="180" w:type="dxa"/>
+            </w:tcMar>
+            <w:vAlign w:val="center"/>
+            <w:hideMark/>
+          </w:tcPr>
+          <w:p>
+            <w:r>
+              <w:t>Users struggle to construct effective search queries for complex information needs</w:t>
+            </w:r>
+          </w:p>
+        </w:tc>
+        <w:tc>
+          <w:tcPr>
+            <w:tcW w:w="0" w:type="auto"/>
+            <w:tcBorders>
+              <w:top w:val="single" w:sz="6" w:space="0" w:color="C4C7C5"/>
+              <w:left w:val="single" w:sz="6" w:space="0" w:color="C4C7C5"/>
+              <w:bottom w:val="single" w:sz="6" w:space="0" w:color="C4C7C5"/>
+              <w:right w:val="single" w:sz="6" w:space="0" w:color="C4C7C5"/>
+            </w:tcBorders>
+            <w:tcMar>
+              <w:top w:w="120" w:type="dxa"/>
+              <w:left w:w="180" w:type="dxa"/>
+              <w:bottom w:w="120" w:type="dxa"/>
+              <w:right w:w="180" w:type="dxa"/>
+            </w:tcMar>
+            <w:vAlign w:val="center"/>
+            <w:hideMark/>
+          </w:tcPr>
+          <w:p>
+            <w:r>
+              <w:t>Accepted</w:t>
+            </w:r>
+          </w:p>
+        </w:tc>
+      </w:tr>
+      <w:tr>
+        <w:trPr>
+          <w:tblCellSpacing w:w="15" w:type="dxa"/>
+        </w:trPr>
+        <w:tc>
+          <w:tcPr>
+            <w:tcW w:w="0" w:type="auto"/>
+            <w:tcBorders>
+              <w:top w:val="single" w:sz="6" w:space="0" w:color="C4C7C5"/>
+              <w:left w:val="single" w:sz="6" w:space="0" w:color="C4C7C5"/>
+              <w:bottom w:val="single" w:sz="6" w:space="0" w:color="C4C7C5"/>
+              <w:right w:val="single" w:sz="6" w:space="0" w:color="C4C7C5"/>
+            </w:tcBorders>
+            <w:tcMar>
+              <w:top w:w="120" w:type="dxa"/>
+              <w:left w:w="180" w:type="dxa"/>
+              <w:bottom w:w="120" w:type="dxa"/>
+              <w:right w:w="180" w:type="dxa"/>
+            </w:tcMar>
+            <w:vAlign w:val="center"/>
+            <w:hideMark/>
+          </w:tcPr>
+          <w:p>
+            <w:pPr>
+              <w:rPr>
+                <w:b/>
+                <w:bCs/>
+              </w:rPr>
+            </w:pPr>
+            <w:r>
+              <w:rPr>
+                <w:b/>
+                <w:bCs/>
+              </w:rPr>
+              <w:lastRenderedPageBreak/>
+              <w:t>WI-008</w:t>
+            </w:r>
+          </w:p>
+        </w:tc>
+        <w:tc>
+          <w:tcPr>
+            <w:tcW w:w="0" w:type="auto"/>
+            <w:tcBorders>
+              <w:top w:val="single" w:sz="6" w:space="0" w:color="C4C7C5"/>
+              <w:left w:val="single" w:sz="6" w:space="0" w:color="C4C7C5"/>
+              <w:bottom w:val="single" w:sz="6" w:space="0" w:color="C4C7C5"/>
+              <w:right w:val="single" w:sz="6" w:space="0" w:color="C4C7C5"/>
+            </w:tcBorders>
+            <w:tcMar>
+              <w:top w:w="120" w:type="dxa"/>
+              <w:left w:w="180" w:type="dxa"/>
+              <w:bottom w:w="120" w:type="dxa"/>
+              <w:right w:w="180" w:type="dxa"/>
+            </w:tcMar>
+            <w:vAlign w:val="center"/>
+            <w:hideMark/>
+          </w:tcPr>
+          <w:p>
+            <w:r>
+              <w:t>Users struggle to compare information presented across multiple websites</w:t>
+            </w:r>
+          </w:p>
+        </w:tc>
+        <w:tc>
+          <w:tcPr>
+            <w:tcW w:w="0" w:type="auto"/>
+            <w:tcBorders>
+              <w:top w:val="single" w:sz="6" w:space="0" w:color="C4C7C5"/>
+              <w:left w:val="single" w:sz="6" w:space="0" w:color="C4C7C5"/>
+              <w:bottom w:val="single" w:sz="6" w:space="0" w:color="C4C7C5"/>
+              <w:right w:val="single" w:sz="6" w:space="0" w:color="C4C7C5"/>
+            </w:tcBorders>
+            <w:tcMar>
+              <w:top w:w="120" w:type="dxa"/>
+              <w:left w:w="180" w:type="dxa"/>
+              <w:bottom w:w="120" w:type="dxa"/>
+              <w:right w:w="180" w:type="dxa"/>
+            </w:tcMar>
+            <w:vAlign w:val="center"/>
+            <w:hideMark/>
+          </w:tcPr>
+          <w:p>
+            <w:r>
+              <w:t>Accepted</w:t>
+            </w:r>
+          </w:p>
+        </w:tc>
+      </w:tr>
+      <w:tr>
+        <w:trPr>
+          <w:tblCellSpacing w:w="15" w:type="dxa"/>
+        </w:trPr>
+        <w:tc>
+          <w:tcPr>
+            <w:tcW w:w="0" w:type="auto"/>
+            <w:tcBorders>
+              <w:top w:val="single" w:sz="6" w:space="0" w:color="C4C7C5"/>
+              <w:left w:val="single" w:sz="6" w:space="0" w:color="C4C7C5"/>
+              <w:bottom w:val="single" w:sz="6" w:space="0" w:color="C4C7C5"/>
+              <w:right w:val="single" w:sz="6" w:space="0" w:color="C4C7C5"/>
+            </w:tcBorders>
+            <w:tcMar>
+              <w:top w:w="120" w:type="dxa"/>
+              <w:left w:w="180" w:type="dxa"/>
+              <w:bottom w:w="120" w:type="dxa"/>
+              <w:right w:w="180" w:type="dxa"/>
+            </w:tcMar>
+            <w:vAlign w:val="center"/>
+            <w:hideMark/>
+          </w:tcPr>
+          <w:p>
+            <w:pPr>
+              <w:rPr>
+                <w:b/>
+                <w:bCs/>
+              </w:rPr>
+            </w:pPr>
+            <w:r>
+              <w:rPr>
+                <w:b/>
+                <w:bCs/>
+              </w:rPr>
+              <w:t>WI-009</w:t>
+            </w:r>
+          </w:p>
+        </w:tc>
+        <w:tc>
+          <w:tcPr>
+            <w:tcW w:w="0" w:type="auto"/>
+            <w:tcBorders>
+              <w:top w:val="single" w:sz="6" w:space="0" w:color="C4C7C5"/>
+              <w:left w:val="single" w:sz="6" w:space="0" w:color="C4C7C5"/>
+              <w:bottom w:val="single" w:sz="6" w:space="0" w:color="C4C7C5"/>
+              <w:right w:val="single" w:sz="6" w:space="0" w:color="C4C7C5"/>
+            </w:tcBorders>
+            <w:tcMar>
+              <w:top w:w="120" w:type="dxa"/>
+              <w:left w:w="180" w:type="dxa"/>
+              <w:bottom w:w="120" w:type="dxa"/>
+              <w:right w:w="180" w:type="dxa"/>
+            </w:tcMar>
+            <w:vAlign w:val="center"/>
+            <w:hideMark/>
+          </w:tcPr>
+          <w:p>
+            <w:r>
+              <w:t>Users struggle to identify which information on a webpage is most important</w:t>
+            </w:r>
+          </w:p>
+        </w:tc>
+        <w:tc>
+          <w:tcPr>
+            <w:tcW w:w="0" w:type="auto"/>
+            <w:tcBorders>
+              <w:top w:val="single" w:sz="6" w:space="0" w:color="C4C7C5"/>
+              <w:left w:val="single" w:sz="6" w:space="0" w:color="C4C7C5"/>
+              <w:bottom w:val="single" w:sz="6" w:space="0" w:color="C4C7C5"/>
+              <w:right w:val="single" w:sz="6" w:space="0" w:color="C4C7C5"/>
+            </w:tcBorders>
+            <w:tcMar>
+              <w:top w:w="120" w:type="dxa"/>
+              <w:left w:w="180" w:type="dxa"/>
+              <w:bottom w:w="120" w:type="dxa"/>
+              <w:right w:w="180" w:type="dxa"/>
+            </w:tcMar>
+            <w:vAlign w:val="center"/>
+            <w:hideMark/>
+          </w:tcPr>
+          <w:p>
+            <w:r>
+              <w:t>Accepted</w:t>
+            </w:r>
+          </w:p>
+        </w:tc>
+      </w:tr>
+      <w:tr>
+        <w:trPr>
+          <w:tblCellSpacing w:w="15" w:type="dxa"/>
+        </w:trPr>
+        <w:tc>
+          <w:tcPr>
+            <w:tcW w:w="0" w:type="auto"/>
+            <w:tcBorders>
+              <w:top w:val="single" w:sz="6" w:space="0" w:color="C4C7C5"/>
+              <w:left w:val="single" w:sz="6" w:space="0" w:color="C4C7C5"/>
+              <w:bottom w:val="single" w:sz="6" w:space="0" w:color="C4C7C5"/>
+              <w:right w:val="single" w:sz="6" w:space="0" w:color="C4C7C5"/>
+            </w:tcBorders>
+            <w:tcMar>
+              <w:top w:w="120" w:type="dxa"/>
+              <w:left w:w="180" w:type="dxa"/>
+              <w:bottom w:w="120" w:type="dxa"/>
+              <w:right w:w="180" w:type="dxa"/>
+            </w:tcMar>
+            <w:vAlign w:val="center"/>
+            <w:hideMark/>
+          </w:tcPr>
+          <w:p>
+            <w:pPr>
+              <w:rPr>
+                <w:b/>
+                <w:bCs/>
+              </w:rPr>
+            </w:pPr>
+            <w:r>
+              <w:rPr>
+                <w:b/>
+                <w:bCs/>
+              </w:rPr>
+              <w:t>WI-010</w:t>
+            </w:r>
+          </w:p>
+        </w:tc>
+        <w:tc>
+          <w:tcPr>
+            <w:tcW w:w="0" w:type="auto"/>
+            <w:tcBorders>
+              <w:top w:val="single" w:sz="6" w:space="0" w:color="C4C7C5"/>
+              <w:left w:val="single" w:sz="6" w:space="0" w:color="C4C7C5"/>
+              <w:bottom w:val="single" w:sz="6" w:space="0" w:color="C4C7C5"/>
+              <w:right w:val="single" w:sz="6" w:space="0" w:color="C4C7C5"/>
+            </w:tcBorders>
+            <w:tcMar>
+              <w:top w:w="120" w:type="dxa"/>
+              <w:left w:w="180" w:type="dxa"/>
+              <w:bottom w:w="120" w:type="dxa"/>
+              <w:right w:w="180" w:type="dxa"/>
+            </w:tcMar>
+            <w:vAlign w:val="center"/>
+            <w:hideMark/>
+          </w:tcPr>
+          <w:p>
+            <w:r>
+              <w:t>Users struggle to distinguish advertisements, sponsored content, and organic content</w:t>
+            </w:r>
+          </w:p>
+        </w:tc>
+        <w:tc>
+          <w:tcPr>
+            <w:tcW w:w="0" w:type="auto"/>
+            <w:tcBorders>
+              <w:top w:val="single" w:sz="6" w:space="0" w:color="C4C7C5"/>
+              <w:left w:val="single" w:sz="6" w:space="0" w:color="C4C7C5"/>
+              <w:bottom w:val="single" w:sz="6" w:space="0" w:color="C4C7C5"/>
+              <w:right w:val="single" w:sz="6" w:space="0" w:color="C4C7C5"/>
+            </w:tcBorders>
+            <w:tcMar>
+              <w:top w:w="120" w:type="dxa"/>
+              <w:left w:w="180" w:type="dxa"/>
+              <w:bottom w:w="120" w:type="dxa"/>
+              <w:right w:w="180" w:type="dxa"/>
+            </w:tcMar>
+            <w:vAlign w:val="center"/>
+            <w:hideMark/>
+          </w:tcPr>
+          <w:p>
+            <w:r>
+              <w:t>Accepted</w:t>
+            </w:r>
+          </w:p>
+        </w:tc>
+      </w:tr>
+      <w:tr>
+        <w:trPr>
+          <w:tblCellSpacing w:w="15" w:type="dxa"/>
+        </w:trPr>
+        <w:tc>
+          <w:tcPr>
+            <w:tcW w:w="0" w:type="auto"/>
+            <w:tcBorders>
+              <w:top w:val="single" w:sz="6" w:space="0" w:color="C4C7C5"/>
+              <w:left w:val="single" w:sz="6" w:space="0" w:color="C4C7C5"/>
+              <w:bottom w:val="single" w:sz="6" w:space="0" w:color="C4C7C5"/>
+              <w:right w:val="single" w:sz="6" w:space="0" w:color="C4C7C5"/>
+            </w:tcBorders>
+            <w:tcMar>
+              <w:top w:w="120" w:type="dxa"/>
+              <w:left w:w="180" w:type="dxa"/>
+              <w:bottom w:w="120" w:type="dxa"/>
+              <w:right w:w="180" w:type="dxa"/>
+            </w:tcMar>
+            <w:vAlign w:val="center"/>
+            <w:hideMark/>
+          </w:tcPr>
+          <w:p>
+            <w:pPr>
+              <w:rPr>
+                <w:b/>
+                <w:bCs/>
+              </w:rPr>
+            </w:pPr>
+            <w:r>
+              <w:rPr>
+                <w:b/>
+                <w:bCs/>
+              </w:rPr>
+              <w:t>WI-011</w:t>
+            </w:r>
+          </w:p>
+        </w:tc>
+        <w:tc>
+          <w:tcPr>
+            <w:tcW w:w="0" w:type="auto"/>
+            <w:tcBorders>
+              <w:top w:val="single" w:sz="6" w:space="0" w:color="C4C7C5"/>
+              <w:left w:val="single" w:sz="6" w:space="0" w:color="C4C7C5"/>
+              <w:bottom w:val="single" w:sz="6" w:space="0" w:color="C4C7C5"/>
+              <w:right w:val="single" w:sz="6" w:space="0" w:color="C4C7C5"/>
+            </w:tcBorders>
+            <w:tcMar>
+              <w:top w:w="120" w:type="dxa"/>
+              <w:left w:w="180" w:type="dxa"/>
+              <w:bottom w:w="120" w:type="dxa"/>
+              <w:right w:w="180" w:type="dxa"/>
+            </w:tcMar>
+            <w:vAlign w:val="center"/>
+            <w:hideMark/>
+          </w:tcPr>
+          <w:p>
+            <w:r>
+              <w:t>Users struggle to understand website permission requests before granting access</w:t>
+            </w:r>
+          </w:p>
+        </w:tc>
+        <w:tc>
+          <w:tcPr>
+            <w:tcW w:w="0" w:type="auto"/>
+            <w:tcBorders>
+              <w:top w:val="single" w:sz="6" w:space="0" w:color="C4C7C5"/>
+              <w:left w:val="single" w:sz="6" w:space="0" w:color="C4C7C5"/>
+              <w:bottom w:val="single" w:sz="6" w:space="0" w:color="C4C7C5"/>
+              <w:right w:val="single" w:sz="6" w:space="0" w:color="C4C7C5"/>
+            </w:tcBorders>
+            <w:tcMar>
+              <w:top w:w="120" w:type="dxa"/>
+              <w:left w:w="180" w:type="dxa"/>
+              <w:bottom w:w="120" w:type="dxa"/>
+              <w:right w:w="180" w:type="dxa"/>
+            </w:tcMar>
+            <w:vAlign w:val="center"/>
+            <w:hideMark/>
+          </w:tcPr>
+          <w:p>
+            <w:r>
+              <w:t>Accepted</w:t>
+            </w:r>
+          </w:p>
+        </w:tc>
+      </w:tr>
+      <w:tr>
+        <w:trPr>
+          <w:tblCellSpacing w:w="15" w:type="dxa"/>
+        </w:trPr>
+        <w:tc>
+          <w:tcPr>
+            <w:tcW w:w="0" w:type="auto"/>
+            <w:tcBorders>
+              <w:top w:val="single" w:sz="6" w:space="0" w:color="C4C7C5"/>
+              <w:left w:val="single" w:sz="6" w:space="0" w:color="C4C7C5"/>
+              <w:bottom w:val="single" w:sz="6" w:space="0" w:color="C4C7C5"/>
+              <w:right w:val="single" w:sz="6" w:space="0" w:color="C4C7C5"/>
+            </w:tcBorders>
+            <w:tcMar>
+              <w:top w:w="120" w:type="dxa"/>
+              <w:left w:w="180" w:type="dxa"/>
+              <w:bottom w:w="120" w:type="dxa"/>
+              <w:right w:w="180" w:type="dxa"/>
+            </w:tcMar>
+            <w:vAlign w:val="center"/>
+            <w:hideMark/>
+          </w:tcPr>
+          <w:p>
+            <w:pPr>
+              <w:rPr>
+                <w:b/>
+                <w:bCs/>
+              </w:rPr>
+            </w:pPr>
+            <w:r>
+              <w:rPr>
+                <w:b/>
+                <w:bCs/>
+              </w:rPr>
+              <w:t>WI-012</w:t>
+            </w:r>
+          </w:p>
+        </w:tc>
+        <w:tc>
+          <w:tcPr>
+            <w:tcW w:w="0" w:type="auto"/>
+            <w:tcBorders>
+              <w:top w:val="single" w:sz="6" w:space="0" w:color="C4C7C5"/>
+              <w:left w:val="single" w:sz="6" w:space="0" w:color="C4C7C5"/>
+              <w:bottom w:val="single" w:sz="6" w:space="0" w:color="C4C7C5"/>
+              <w:right w:val="single" w:sz="6" w:space="0" w:color="C4C7C5"/>
+            </w:tcBorders>
+            <w:tcMar>
+              <w:top w:w="120" w:type="dxa"/>
+              <w:left w:w="180" w:type="dxa"/>
+              <w:bottom w:w="120" w:type="dxa"/>
+              <w:right w:w="180" w:type="dxa"/>
+            </w:tcMar>
+            <w:vAlign w:val="center"/>
+            <w:hideMark/>
+          </w:tcPr>
+          <w:p>
+            <w:r>
+              <w:t>Users struggle to determine whether downloaded content from a website is safe</w:t>
+            </w:r>
+          </w:p>
+        </w:tc>
+        <w:tc>
+          <w:tcPr>
+            <w:tcW w:w="0" w:type="auto"/>
+            <w:tcBorders>
+              <w:top w:val="single" w:sz="6" w:space="0" w:color="C4C7C5"/>
+              <w:left w:val="single" w:sz="6" w:space="0" w:color="C4C7C5"/>
+              <w:bottom w:val="single" w:sz="6" w:space="0" w:color="C4C7C5"/>
+              <w:right w:val="single" w:sz="6" w:space="0" w:color="C4C7C5"/>
+            </w:tcBorders>
+            <w:tcMar>
+              <w:top w:w="120" w:type="dxa"/>
+              <w:left w:w="180" w:type="dxa"/>
+              <w:bottom w:w="120" w:type="dxa"/>
+              <w:right w:w="180" w:type="dxa"/>
+            </w:tcMar>
+            <w:vAlign w:val="center"/>
+            <w:hideMark/>
+          </w:tcPr>
+          <w:p>
+            <w:r>
+              <w:t>Accepted</w:t>
+            </w:r>
+          </w:p>
+        </w:tc>
+      </w:tr>
+      <w:tr>
+        <w:trPr>
+          <w:tblCellSpacing w:w="15" w:type="dxa"/>
+        </w:trPr>
+        <w:tc>
+          <w:tcPr>
+            <w:tcW w:w="0" w:type="auto"/>
+            <w:tcBorders>
+              <w:top w:val="single" w:sz="6" w:space="0" w:color="C4C7C5"/>
+              <w:left w:val="single" w:sz="6" w:space="0" w:color="C4C7C5"/>
+              <w:bottom w:val="single" w:sz="6" w:space="0" w:color="C4C7C5"/>
+              <w:right w:val="single" w:sz="6" w:space="0" w:color="C4C7C5"/>
+            </w:tcBorders>
+            <w:tcMar>
+              <w:top w:w="120" w:type="dxa"/>
+              <w:left w:w="180" w:type="dxa"/>
+              <w:bottom w:w="120" w:type="dxa"/>
+              <w:right w:w="180" w:type="dxa"/>
+            </w:tcMar>
+            <w:vAlign w:val="center"/>
+            <w:hideMark/>
+          </w:tcPr>
+          <w:p>
+            <w:pPr>
+              <w:rPr>
+                <w:b/>
+                <w:bCs/>
+              </w:rPr>
+            </w:pPr>
+            <w:r>
+              <w:rPr>
+                <w:b/>
+                <w:bCs/>
+              </w:rPr>
+              <w:t>WI-013</w:t>
+            </w:r>
+          </w:p>
+        </w:tc>
+        <w:tc>
+          <w:tcPr>
+            <w:tcW w:w="0" w:type="auto"/>
+            <w:tcBorders>
+              <w:top w:val="single" w:sz="6" w:space="0" w:color="C4C7C5"/>
+              <w:left w:val="single" w:sz="6" w:space="0" w:color="C4C7C5"/>
+              <w:bottom w:val="single" w:sz="6" w:space="0" w:color="C4C7C5"/>
+              <w:right w:val="single" w:sz="6" w:space="0" w:color="C4C7C5"/>
+            </w:tcBorders>
+            <w:tcMar>
+              <w:top w:w="120" w:type="dxa"/>
+              <w:left w:w="180" w:type="dxa"/>
+              <w:bottom w:w="120" w:type="dxa"/>
+              <w:right w:w="180" w:type="dxa"/>
+            </w:tcMar>
+            <w:vAlign w:val="center"/>
+            <w:hideMark/>
+          </w:tcPr>
+          <w:p>
+            <w:r>
+              <w:t>Users struggle to identify official websites among similarly named websites</w:t>
+            </w:r>
+          </w:p>
+        </w:tc>
+        <w:tc>
+          <w:tcPr>
+            <w:tcW w:w="0" w:type="auto"/>
+            <w:tcBorders>
+              <w:top w:val="single" w:sz="6" w:space="0" w:color="C4C7C5"/>
+              <w:left w:val="single" w:sz="6" w:space="0" w:color="C4C7C5"/>
+              <w:bottom w:val="single" w:sz="6" w:space="0" w:color="C4C7C5"/>
+              <w:right w:val="single" w:sz="6" w:space="0" w:color="C4C7C5"/>
+            </w:tcBorders>
+            <w:tcMar>
+              <w:top w:w="120" w:type="dxa"/>
+              <w:left w:w="180" w:type="dxa"/>
+              <w:bottom w:w="120" w:type="dxa"/>
+              <w:right w:w="180" w:type="dxa"/>
+            </w:tcMar>
+            <w:vAlign w:val="center"/>
+            <w:hideMark/>
+          </w:tcPr>
+          <w:p>
+            <w:r>
+              <w:t>Accepted</w:t>
+            </w:r>
+          </w:p>
+        </w:tc>
+      </w:tr>
+      <w:tr>
+        <w:trPr>
+          <w:tblCellSpacing w:w="15" w:type="dxa"/>
+        </w:trPr>
+        <w:tc>
+          <w:tcPr>
+            <w:tcW w:w="0" w:type="auto"/>
+            <w:tcBorders>
+              <w:top w:val="single" w:sz="6" w:space="0" w:color="C4C7C5"/>
+              <w:left w:val="single" w:sz="6" w:space="0" w:color="C4C7C5"/>
+              <w:bottom w:val="single" w:sz="6" w:space="0" w:color="C4C7C5"/>
+              <w:right w:val="single" w:sz="6" w:space="0" w:color="C4C7C5"/>
+            </w:tcBorders>
+            <w:tcMar>
+              <w:top w:w="120" w:type="dxa"/>
+              <w:left w:w="180" w:type="dxa"/>
+              <w:bottom w:w="120" w:type="dxa"/>
+              <w:right w:w="180" w:type="dxa"/>
+            </w:tcMar>
+            <w:vAlign w:val="center"/>
+            <w:hideMark/>
+          </w:tcPr>
+          <w:p>
+            <w:pPr>
+              <w:rPr>
+                <w:b/>
+                <w:bCs/>
+              </w:rPr>
+            </w:pPr>
+            <w:r>
+              <w:rPr>
+                <w:b/>
+                <w:bCs/>
+              </w:rPr>
+              <w:t>WI-014</w:t>
+            </w:r>
+          </w:p>
+        </w:tc>
+        <w:tc>
+          <w:tcPr>
+            <w:tcW w:w="0" w:type="auto"/>
+            <w:tcBorders>
+              <w:top w:val="single" w:sz="6" w:space="0" w:color="C4C7C5"/>
+              <w:left w:val="single" w:sz="6" w:space="0" w:color="C4C7C5"/>
+              <w:bottom w:val="single" w:sz="6" w:space="0" w:color="C4C7C5"/>
+              <w:right w:val="single" w:sz="6" w:space="0" w:color="C4C7C5"/>
+            </w:tcBorders>
+            <w:tcMar>
+              <w:top w:w="120" w:type="dxa"/>
+              <w:left w:w="180" w:type="dxa"/>
+              <w:bottom w:w="120" w:type="dxa"/>
+              <w:right w:w="180" w:type="dxa"/>
+            </w:tcMar>
+            <w:vAlign w:val="center"/>
+            <w:hideMark/>
+          </w:tcPr>
+          <w:p>
+            <w:r>
+              <w:t>Users struggle when websites require different account creation and sign-in processes</w:t>
+            </w:r>
+          </w:p>
+        </w:tc>
+        <w:tc>
+          <w:tcPr>
+            <w:tcW w:w="0" w:type="auto"/>
+            <w:tcBorders>
+              <w:top w:val="single" w:sz="6" w:space="0" w:color="C4C7C5"/>
+              <w:left w:val="single" w:sz="6" w:space="0" w:color="C4C7C5"/>
+              <w:bottom w:val="single" w:sz="6" w:space="0" w:color="C4C7C5"/>
+              <w:right w:val="single" w:sz="6" w:space="0" w:color="C4C7C5"/>
+            </w:tcBorders>
+            <w:tcMar>
+              <w:top w:w="120" w:type="dxa"/>
+              <w:left w:w="180" w:type="dxa"/>
+              <w:bottom w:w="120" w:type="dxa"/>
+              <w:right w:w="180" w:type="dxa"/>
+            </w:tcMar>
+            <w:vAlign w:val="center"/>
+            <w:hideMark/>
+          </w:tcPr>
+          <w:p>
+            <w:r>
+              <w:t>Accepted</w:t>
+            </w:r>
+          </w:p>
+        </w:tc>
+      </w:tr>
+      <w:tr>
+        <w:trPr>
+          <w:tblCellSpacing w:w="15" w:type="dxa"/>
+        </w:trPr>
+        <w:tc>
+          <w:tcPr>
+            <w:tcW w:w="0" w:type="auto"/>
+            <w:tcBorders>
+              <w:top w:val="single" w:sz="6" w:space="0" w:color="C4C7C5"/>
+              <w:left w:val="single" w:sz="6" w:space="0" w:color="C4C7C5"/>
+              <w:bottom w:val="single" w:sz="6" w:space="0" w:color="C4C7C5"/>
+              <w:right w:val="single" w:sz="6" w:space="0" w:color="C4C7C5"/>
+            </w:tcBorders>
+            <w:tcMar>
+              <w:top w:w="120" w:type="dxa"/>
+              <w:left w:w="180" w:type="dxa"/>
+              <w:bottom w:w="120" w:type="dxa"/>
+              <w:right w:w="180" w:type="dxa"/>
+            </w:tcMar>
+            <w:vAlign w:val="center"/>
+            <w:hideMark/>
+          </w:tcPr>
+          <w:p>
+            <w:pPr>
+              <w:rPr>
+                <w:b/>
+                <w:bCs/>
+              </w:rPr>
+            </w:pPr>
+            <w:r>
+              <w:rPr>
+                <w:b/>
+                <w:bCs/>
+              </w:rPr>
+              <w:t>WI-015</w:t>
+            </w:r>
+          </w:p>
+        </w:tc>
+        <w:tc>
+          <w:tcPr>
+            <w:tcW w:w="0" w:type="auto"/>
+            <w:tcBorders>
+              <w:top w:val="single" w:sz="6" w:space="0" w:color="C4C7C5"/>
+              <w:left w:val="single" w:sz="6" w:space="0" w:color="C4C7C5"/>
+              <w:bottom w:val="single" w:sz="6" w:space="0" w:color="C4C7C5"/>
+              <w:right w:val="single" w:sz="6" w:space="0" w:color="C4C7C5"/>
+            </w:tcBorders>
+            <w:tcMar>
+              <w:top w:w="120" w:type="dxa"/>
+              <w:left w:w="180" w:type="dxa"/>
+              <w:bottom w:w="120" w:type="dxa"/>
+              <w:right w:w="180" w:type="dxa"/>
+            </w:tcMar>
+            <w:vAlign w:val="center"/>
+            <w:hideMark/>
+          </w:tcPr>
+          <w:p>
+            <w:r>
+              <w:t>Users struggle to recover from navigation mistakes after moving through multiple webpages</w:t>
+            </w:r>
+          </w:p>
+        </w:tc>
+        <w:tc>
+          <w:tcPr>
+            <w:tcW w:w="0" w:type="auto"/>
+            <w:tcBorders>
+              <w:top w:val="single" w:sz="6" w:space="0" w:color="C4C7C5"/>
+              <w:left w:val="single" w:sz="6" w:space="0" w:color="C4C7C5"/>
+              <w:bottom w:val="single" w:sz="6" w:space="0" w:color="C4C7C5"/>
+              <w:right w:val="single" w:sz="6" w:space="0" w:color="C4C7C5"/>
+            </w:tcBorders>
+            <w:tcMar>
+              <w:top w:w="120" w:type="dxa"/>
+              <w:left w:w="180" w:type="dxa"/>
+              <w:bottom w:w="120" w:type="dxa"/>
+              <w:right w:w="180" w:type="dxa"/>
+            </w:tcMar>
+            <w:vAlign w:val="center"/>
+            <w:hideMark/>
+          </w:tcPr>
+          <w:p>
+            <w:r>
+              <w:t>Accepted</w:t>
+            </w:r>
+          </w:p>
+        </w:tc>
+      </w:tr>
+      <w:tr>
+        <w:trPr>
+          <w:tblCellSpacing w:w="15" w:type="dxa"/>
+        </w:trPr>
+        <w:tc>
+          <w:tcPr>
+            <w:tcW w:w="0" w:type="auto"/>
+            <w:tcBorders>
+              <w:top w:val="single" w:sz="6" w:space="0" w:color="C4C7C5"/>
+              <w:left w:val="single" w:sz="6" w:space="0" w:color="C4C7C5"/>
+              <w:bottom w:val="single" w:sz="6" w:space="0" w:color="C4C7C5"/>
+              <w:right w:val="single" w:sz="6" w:space="0" w:color="C4C7C5"/>
+            </w:tcBorders>
+            <w:tcMar>
+              <w:top w:w="120" w:type="dxa"/>
+              <w:left w:w="180" w:type="dxa"/>
+              <w:bottom w:w="120" w:type="dxa"/>
+              <w:right w:w="180" w:type="dxa"/>
+            </w:tcMar>
+            <w:vAlign w:val="center"/>
+            <w:hideMark/>
+          </w:tcPr>
+          <w:p>
+            <w:pPr>
+              <w:rPr>
+                <w:b/>
+                <w:bCs/>
+              </w:rPr>
+            </w:pPr>
+            <w:r>
+              <w:rPr>
+                <w:b/>
+                <w:bCs/>
+              </w:rPr>
+              <w:t>WI-016</w:t>
+            </w:r>
+          </w:p>
+        </w:tc>
+        <w:tc>
+          <w:tcPr>
+            <w:tcW w:w="0" w:type="auto"/>
+            <w:tcBorders>
+              <w:top w:val="single" w:sz="6" w:space="0" w:color="C4C7C5"/>
+              <w:left w:val="single" w:sz="6" w:space="0" w:color="C4C7C5"/>
+              <w:bottom w:val="single" w:sz="6" w:space="0" w:color="C4C7C5"/>
+              <w:right w:val="single" w:sz="6" w:space="0" w:color="C4C7C5"/>
+            </w:tcBorders>
+            <w:tcMar>
+              <w:top w:w="120" w:type="dxa"/>
+              <w:left w:w="180" w:type="dxa"/>
+              <w:bottom w:w="120" w:type="dxa"/>
+              <w:right w:w="180" w:type="dxa"/>
+            </w:tcMar>
+            <w:vAlign w:val="center"/>
+            <w:hideMark/>
+          </w:tcPr>
+          <w:p>
+            <w:r>
+              <w:t>Users struggle to understand why the same website behaves differently across devices and browsers</w:t>
+            </w:r>
+          </w:p>
+        </w:tc>
+        <w:tc>
+          <w:tcPr>
+            <w:tcW w:w="0" w:type="auto"/>
+            <w:tcBorders>
+              <w:top w:val="single" w:sz="6" w:space="0" w:color="C4C7C5"/>
+              <w:left w:val="single" w:sz="6" w:space="0" w:color="C4C7C5"/>
+              <w:bottom w:val="single" w:sz="6" w:space="0" w:color="C4C7C5"/>
+              <w:right w:val="single" w:sz="6" w:space="0" w:color="C4C7C5"/>
+            </w:tcBorders>
+            <w:tcMar>
+              <w:top w:w="120" w:type="dxa"/>
+              <w:left w:w="180" w:type="dxa"/>
+              <w:bottom w:w="120" w:type="dxa"/>
+              <w:right w:w="180" w:type="dxa"/>
+            </w:tcMar>
+            <w:vAlign w:val="center"/>
+            <w:hideMark/>
+          </w:tcPr>
+          <w:p>
+            <w:r>
+              <w:t>Accepted</w:t>
+            </w:r>
+          </w:p>
+        </w:tc>
+      </w:tr>
+      <w:tr>
+        <w:trPr>
+          <w:tblCellSpacing w:w="15" w:type="dxa"/>
+        </w:trPr>
+        <w:tc>
+          <w:tcPr>
+            <w:tcW w:w="0" w:type="auto"/>
+            <w:tcBorders>
+              <w:top w:val="single" w:sz="6" w:space="0" w:color="C4C7C5"/>
+              <w:left w:val="single" w:sz="6" w:space="0" w:color="C4C7C5"/>
+              <w:bottom w:val="single" w:sz="6" w:space="0" w:color="C4C7C5"/>
+              <w:right w:val="single" w:sz="6" w:space="0" w:color="C4C7C5"/>
+            </w:tcBorders>
+            <w:tcMar>
+              <w:top w:w="120" w:type="dxa"/>
+              <w:left w:w="180" w:type="dxa"/>
+              <w:bottom w:w="120" w:type="dxa"/>
+              <w:right w:w="180" w:type="dxa"/>
+            </w:tcMar>
+            <w:vAlign w:val="center"/>
+            <w:hideMark/>
+          </w:tcPr>
+          <w:p>
+            <w:pPr>
+              <w:rPr>
+                <w:b/>
+                <w:bCs/>
+              </w:rPr>
+            </w:pPr>
+            <w:r>
+              <w:rPr>
+                <w:b/>
+                <w:bCs/>
+              </w:rPr>
+              <w:t>WI-017</w:t>
+            </w:r>
+          </w:p>
+        </w:tc>
+        <w:tc>
+          <w:tcPr>
+            <w:tcW w:w="0" w:type="auto"/>
+            <w:tcBorders>
+              <w:top w:val="single" w:sz="6" w:space="0" w:color="C4C7C5"/>
+              <w:left w:val="single" w:sz="6" w:space="0" w:color="C4C7C5"/>
+              <w:bottom w:val="single" w:sz="6" w:space="0" w:color="C4C7C5"/>
+              <w:right w:val="single" w:sz="6" w:space="0" w:color="C4C7C5"/>
+            </w:tcBorders>
+            <w:tcMar>
+              <w:top w:w="120" w:type="dxa"/>
+              <w:left w:w="180" w:type="dxa"/>
+              <w:bottom w:w="120" w:type="dxa"/>
+              <w:right w:w="180" w:type="dxa"/>
+            </w:tcMar>
+            <w:vAlign w:val="center"/>
+            <w:hideMark/>
+          </w:tcPr>
+          <w:p>
+            <w:r>
+              <w:t>Users struggle when websites unexpectedly change their interface or functionality</w:t>
+            </w:r>
+          </w:p>
+        </w:tc>
+        <w:tc>
+          <w:tcPr>
+            <w:tcW w:w="0" w:type="auto"/>
+            <w:tcBorders>
+              <w:top w:val="single" w:sz="6" w:space="0" w:color="C4C7C5"/>
+              <w:left w:val="single" w:sz="6" w:space="0" w:color="C4C7C5"/>
+              <w:bottom w:val="single" w:sz="6" w:space="0" w:color="C4C7C5"/>
+              <w:right w:val="single" w:sz="6" w:space="0" w:color="C4C7C5"/>
+            </w:tcBorders>
+            <w:tcMar>
+              <w:top w:w="120" w:type="dxa"/>
+              <w:left w:w="180" w:type="dxa"/>
+              <w:bottom w:w="120" w:type="dxa"/>
+              <w:right w:w="180" w:type="dxa"/>
+            </w:tcMar>
+            <w:vAlign w:val="center"/>
+            <w:hideMark/>
+          </w:tcPr>
+          <w:p>
+            <w:r>
+              <w:t>Accepted</w:t>
+            </w:r>
+          </w:p>
+        </w:tc>
+      </w:tr>
+      <w:tr>
+        <w:trPr>
+          <w:tblCellSpacing w:w="15" w:type="dxa"/>
+        </w:trPr>
+        <w:tc>
+          <w:tcPr>
+            <w:tcW w:w="0" w:type="auto"/>
+            <w:tcBorders>
+              <w:top w:val="single" w:sz="6" w:space="0" w:color="C4C7C5"/>
+              <w:left w:val="single" w:sz="6" w:space="0" w:color="C4C7C5"/>
+              <w:bottom w:val="single" w:sz="6" w:space="0" w:color="C4C7C5"/>
+              <w:right w:val="single" w:sz="6" w:space="0" w:color="C4C7C5"/>
+            </w:tcBorders>
+            <w:tcMar>
+              <w:top w:w="120" w:type="dxa"/>
+              <w:left w:w="180" w:type="dxa"/>
+              <w:bottom w:w="120" w:type="dxa"/>
+              <w:right w:w="180" w:type="dxa"/>
+            </w:tcMar>
+            <w:vAlign w:val="center"/>
+            <w:hideMark/>
+          </w:tcPr>
+          <w:p>
+            <w:pPr>
+              <w:rPr>
+                <w:b/>
+                <w:bCs/>
+              </w:rPr>
+            </w:pPr>
+            <w:r>
+              <w:rPr>
+                <w:b/>
+                <w:bCs/>
+              </w:rPr>
+              <w:t>WI-018</w:t>
+            </w:r>
+          </w:p>
+        </w:tc>
+        <w:tc>
+          <w:tcPr>
+            <w:tcW w:w="0" w:type="auto"/>
+            <w:tcBorders>
+              <w:top w:val="single" w:sz="6" w:space="0" w:color="C4C7C5"/>
+              <w:left w:val="single" w:sz="6" w:space="0" w:color="C4C7C5"/>
+              <w:bottom w:val="single" w:sz="6" w:space="0" w:color="C4C7C5"/>
+              <w:right w:val="single" w:sz="6" w:space="0" w:color="C4C7C5"/>
+            </w:tcBorders>
+            <w:tcMar>
+              <w:top w:w="120" w:type="dxa"/>
+              <w:left w:w="180" w:type="dxa"/>
+              <w:bottom w:w="120" w:type="dxa"/>
+              <w:right w:w="180" w:type="dxa"/>
+            </w:tcMar>
+            <w:vAlign w:val="center"/>
+            <w:hideMark/>
+          </w:tcPr>
+          <w:p>
+            <w:r>
+              <w:t>Users struggle to understand why web pages load slowly or fail to load</w:t>
+            </w:r>
+          </w:p>
+        </w:tc>
+        <w:tc>
+          <w:tcPr>
+            <w:tcW w:w="0" w:type="auto"/>
+            <w:tcBorders>
+              <w:top w:val="single" w:sz="6" w:space="0" w:color="C4C7C5"/>
+              <w:left w:val="single" w:sz="6" w:space="0" w:color="C4C7C5"/>
+              <w:bottom w:val="single" w:sz="6" w:space="0" w:color="C4C7C5"/>
+              <w:right w:val="single" w:sz="6" w:space="0" w:color="C4C7C5"/>
+            </w:tcBorders>
+            <w:tcMar>
+              <w:top w:w="120" w:type="dxa"/>
+              <w:left w:w="180" w:type="dxa"/>
+              <w:bottom w:w="120" w:type="dxa"/>
+              <w:right w:w="180" w:type="dxa"/>
+            </w:tcMar>
+            <w:vAlign w:val="center"/>
+            <w:hideMark/>
+          </w:tcPr>
+          <w:p>
+            <w:r>
+              <w:t>Accepted</w:t>
+            </w:r>
+          </w:p>
+        </w:tc>
+      </w:tr>
+      <w:tr>
+        <w:trPr>
+          <w:tblCellSpacing w:w="15" w:type="dxa"/>
+        </w:trPr>
+        <w:tc>
+          <w:tcPr>
+            <w:tcW w:w="0" w:type="auto"/>
+            <w:tcBorders>
+              <w:top w:val="single" w:sz="6" w:space="0" w:color="C4C7C5"/>
+              <w:left w:val="single" w:sz="6" w:space="0" w:color="C4C7C5"/>
+              <w:bottom w:val="single" w:sz="6" w:space="0" w:color="C4C7C5"/>
+              <w:right w:val="single" w:sz="6" w:space="0" w:color="C4C7C5"/>
+            </w:tcBorders>
+            <w:tcMar>
+              <w:top w:w="120" w:type="dxa"/>
+              <w:left w:w="180" w:type="dxa"/>
+              <w:bottom w:w="120" w:type="dxa"/>
+              <w:right w:w="180" w:type="dxa"/>
+            </w:tcMar>
+            <w:vAlign w:val="center"/>
+            <w:hideMark/>
+          </w:tcPr>
+          <w:p>
+            <w:pPr>
+              <w:rPr>
+                <w:b/>
+                <w:bCs/>
+              </w:rPr>
+            </w:pPr>
+            <w:r>
+              <w:rPr>
+                <w:b/>
+                <w:bCs/>
+              </w:rPr>
+              <w:lastRenderedPageBreak/>
+              <w:t>WI-019</w:t>
+            </w:r>
+          </w:p>
+        </w:tc>
+        <w:tc>
+          <w:tcPr>
+            <w:tcW w:w="0" w:type="auto"/>
+            <w:tcBorders>
+              <w:top w:val="single" w:sz="6" w:space="0" w:color="C4C7C5"/>
+              <w:left w:val="single" w:sz="6" w:space="0" w:color="C4C7C5"/>
+              <w:bottom w:val="single" w:sz="6" w:space="0" w:color="C4C7C5"/>
+              <w:right w:val="single" w:sz="6" w:space="0" w:color="C4C7C5"/>
+            </w:tcBorders>
+            <w:tcMar>
+              <w:top w:w="120" w:type="dxa"/>
+              <w:left w:w="180" w:type="dxa"/>
+              <w:bottom w:w="120" w:type="dxa"/>
+              <w:right w:w="180" w:type="dxa"/>
+            </w:tcMar>
+            <w:vAlign w:val="center"/>
+            <w:hideMark/>
+          </w:tcPr>
+          <w:p>
+            <w:r>
+              <w:t>Users struggle to understand web error messages and failure pages</w:t>
+            </w:r>
+          </w:p>
+        </w:tc>
+        <w:tc>
+          <w:tcPr>
+            <w:tcW w:w="0" w:type="auto"/>
+            <w:tcBorders>
+              <w:top w:val="single" w:sz="6" w:space="0" w:color="C4C7C5"/>
+              <w:left w:val="single" w:sz="6" w:space="0" w:color="C4C7C5"/>
+              <w:bottom w:val="single" w:sz="6" w:space="0" w:color="C4C7C5"/>
+              <w:right w:val="single" w:sz="6" w:space="0" w:color="C4C7C5"/>
+            </w:tcBorders>
+            <w:tcMar>
+              <w:top w:w="120" w:type="dxa"/>
+              <w:left w:w="180" w:type="dxa"/>
+              <w:bottom w:w="120" w:type="dxa"/>
+              <w:right w:w="180" w:type="dxa"/>
+            </w:tcMar>
+            <w:vAlign w:val="center"/>
+            <w:hideMark/>
+          </w:tcPr>
+          <w:p>
+            <w:r>
+              <w:t>Accepted</w:t>
+            </w:r>
+          </w:p>
+        </w:tc>
+      </w:tr>
+      <w:tr>
+        <w:trPr>
+          <w:tblCellSpacing w:w="15" w:type="dxa"/>
+        </w:trPr>
+        <w:tc>
+          <w:tcPr>
+            <w:tcW w:w="0" w:type="auto"/>
+            <w:tcBorders>
+              <w:top w:val="single" w:sz="6" w:space="0" w:color="C4C7C5"/>
+              <w:left w:val="single" w:sz="6" w:space="0" w:color="C4C7C5"/>
+              <w:bottom w:val="single" w:sz="6" w:space="0" w:color="C4C7C5"/>
+              <w:right w:val="single" w:sz="6" w:space="0" w:color="C4C7C5"/>
+            </w:tcBorders>
+            <w:tcMar>
+              <w:top w:w="120" w:type="dxa"/>
+              <w:left w:w="180" w:type="dxa"/>
+              <w:bottom w:w="120" w:type="dxa"/>
+              <w:right w:w="180" w:type="dxa"/>
+            </w:tcMar>
+            <w:vAlign w:val="center"/>
+            <w:hideMark/>
+          </w:tcPr>
+          <w:p>
+            <w:pPr>
+              <w:rPr>
+                <w:b/>
+                <w:bCs/>
+              </w:rPr>
+            </w:pPr>
+            <w:r>
+              <w:rPr>
+                <w:b/>
+                <w:bCs/>
+              </w:rPr>
+              <w:t>WI-020</w:t>
+            </w:r>
+          </w:p>
+        </w:tc>
+        <w:tc>
+          <w:tcPr>
+            <w:tcW w:w="0" w:type="auto"/>
+            <w:tcBorders>
+              <w:top w:val="single" w:sz="6" w:space="0" w:color="C4C7C5"/>
+              <w:left w:val="single" w:sz="6" w:space="0" w:color="C4C7C5"/>
+              <w:bottom w:val="single" w:sz="6" w:space="0" w:color="C4C7C5"/>
+              <w:right w:val="single" w:sz="6" w:space="0" w:color="C4C7C5"/>
+            </w:tcBorders>
+            <w:tcMar>
+              <w:top w:w="120" w:type="dxa"/>
+              <w:left w:w="180" w:type="dxa"/>
+              <w:bottom w:w="120" w:type="dxa"/>
+              <w:right w:w="180" w:type="dxa"/>
+            </w:tcMar>
+            <w:vAlign w:val="center"/>
+            <w:hideMark/>
+          </w:tcPr>
+          <w:p>
+            <w:r>
+              <w:t>Users struggle to complete tasks because information and actions are distributed across multiple websites</w:t>
+            </w:r>
+          </w:p>
+        </w:tc>
+        <w:tc>
+          <w:tcPr>
+            <w:tcW w:w="0" w:type="auto"/>
+            <w:tcBorders>
+              <w:top w:val="single" w:sz="6" w:space="0" w:color="C4C7C5"/>
+              <w:left w:val="single" w:sz="6" w:space="0" w:color="C4C7C5"/>
+              <w:bottom w:val="single" w:sz="6" w:space="0" w:color="C4C7C5"/>
+              <w:right w:val="single" w:sz="6" w:space="0" w:color="C4C7C5"/>
+            </w:tcBorders>
+            <w:tcMar>
+              <w:top w:w="120" w:type="dxa"/>
+              <w:left w:w="180" w:type="dxa"/>
+              <w:bottom w:w="120" w:type="dxa"/>
+              <w:right w:w="180" w:type="dxa"/>
+            </w:tcMar>
+            <w:vAlign w:val="center"/>
+            <w:hideMark/>
+          </w:tcPr>
+          <w:p>
+            <w:r>
+              <w:t>Accepted</w:t>
+            </w:r>
+          </w:p>
+        </w:tc>
+      </w:tr>
+      <w:tr>
+        <w:trPr>
+          <w:tblCellSpacing w:w="15" w:type="dxa"/>
+        </w:trPr>
+        <w:tc>
+          <w:tcPr>
+            <w:tcW w:w="0" w:type="auto"/>
+            <w:tcBorders>
+              <w:top w:val="single" w:sz="6" w:space="0" w:color="C4C7C5"/>
+              <w:left w:val="single" w:sz="6" w:space="0" w:color="C4C7C5"/>
+              <w:bottom w:val="single" w:sz="6" w:space="0" w:color="C4C7C5"/>
+              <w:right w:val="single" w:sz="6" w:space="0" w:color="C4C7C5"/>
+            </w:tcBorders>
+            <w:tcMar>
+              <w:top w:w="120" w:type="dxa"/>
+              <w:left w:w="180" w:type="dxa"/>
+              <w:bottom w:w="120" w:type="dxa"/>
+              <w:right w:w="180" w:type="dxa"/>
+            </w:tcMar>
+            <w:vAlign w:val="center"/>
+            <w:hideMark/>
+          </w:tcPr>
+          <w:p>
+            <w:pPr>
+              <w:rPr>
+                <w:b/>
+                <w:bCs/>
+              </w:rPr>
+            </w:pPr>
+            <w:r>
+              <w:rPr>
+                <w:b/>
+                <w:bCs/>
+              </w:rPr>
+              <w:t>WI-021</w:t>
+            </w:r>
+          </w:p>
+        </w:tc>
+        <w:tc>
+          <w:tcPr>
+            <w:tcW w:w="0" w:type="auto"/>
+            <w:tcBorders>
+              <w:top w:val="single" w:sz="6" w:space="0" w:color="C4C7C5"/>
+              <w:left w:val="single" w:sz="6" w:space="0" w:color="C4C7C5"/>
+              <w:bottom w:val="single" w:sz="6" w:space="0" w:color="C4C7C5"/>
+              <w:right w:val="single" w:sz="6" w:space="0" w:color="C4C7C5"/>
+            </w:tcBorders>
+            <w:tcMar>
+              <w:top w:w="120" w:type="dxa"/>
+              <w:left w:w="180" w:type="dxa"/>
+              <w:bottom w:w="120" w:type="dxa"/>
+              <w:right w:w="180" w:type="dxa"/>
+            </w:tcMar>
+            <w:vAlign w:val="center"/>
+            <w:hideMark/>
+          </w:tcPr>
+          <w:p>
+            <w:r>
+              <w:t>Users struggle to manage multiple browser tabs while performing a single task</w:t>
+            </w:r>
+          </w:p>
+        </w:tc>
+        <w:tc>
+          <w:tcPr>
+            <w:tcW w:w="0" w:type="auto"/>
+            <w:tcBorders>
+              <w:top w:val="single" w:sz="6" w:space="0" w:color="C4C7C5"/>
+              <w:left w:val="single" w:sz="6" w:space="0" w:color="C4C7C5"/>
+              <w:bottom w:val="single" w:sz="6" w:space="0" w:color="C4C7C5"/>
+              <w:right w:val="single" w:sz="6" w:space="0" w:color="C4C7C5"/>
+            </w:tcBorders>
+            <w:tcMar>
+              <w:top w:w="120" w:type="dxa"/>
+              <w:left w:w="180" w:type="dxa"/>
+              <w:bottom w:w="120" w:type="dxa"/>
+              <w:right w:w="180" w:type="dxa"/>
+            </w:tcMar>
+            <w:vAlign w:val="center"/>
+            <w:hideMark/>
+          </w:tcPr>
+          <w:p>
+            <w:r>
+              <w:t>Accepted</w:t>
+            </w:r>
+          </w:p>
+        </w:tc>
+      </w:tr>
+      <w:tr>
+        <w:trPr>
+          <w:tblCellSpacing w:w="15" w:type="dxa"/>
+        </w:trPr>
+        <w:tc>
+          <w:tcPr>
+            <w:tcW w:w="0" w:type="auto"/>
+            <w:tcBorders>
+              <w:top w:val="single" w:sz="6" w:space="0" w:color="C4C7C5"/>
+              <w:left w:val="single" w:sz="6" w:space="0" w:color="C4C7C5"/>
+              <w:bottom w:val="single" w:sz="6" w:space="0" w:color="C4C7C5"/>
+              <w:right w:val="single" w:sz="6" w:space="0" w:color="C4C7C5"/>
+            </w:tcBorders>
+            <w:tcMar>
+              <w:top w:w="120" w:type="dxa"/>
+              <w:left w:w="180" w:type="dxa"/>
+              <w:bottom w:w="120" w:type="dxa"/>
+              <w:right w:w="180" w:type="dxa"/>
+            </w:tcMar>
+            <w:vAlign w:val="center"/>
+            <w:hideMark/>
+          </w:tcPr>
+          <w:p>
+            <w:pPr>
+              <w:rPr>
+                <w:b/>
+                <w:bCs/>
+              </w:rPr>
+            </w:pPr>
+            <w:r>
+              <w:rPr>
+                <w:b/>
+                <w:bCs/>
+              </w:rPr>
+              <w:t>WI-022</w:t>
+            </w:r>
+          </w:p>
+        </w:tc>
+        <w:tc>
+          <w:tcPr>
+            <w:tcW w:w="0" w:type="auto"/>
+            <w:tcBorders>
+              <w:top w:val="single" w:sz="6" w:space="0" w:color="C4C7C5"/>
+              <w:left w:val="single" w:sz="6" w:space="0" w:color="C4C7C5"/>
+              <w:bottom w:val="single" w:sz="6" w:space="0" w:color="C4C7C5"/>
+              <w:right w:val="single" w:sz="6" w:space="0" w:color="C4C7C5"/>
+            </w:tcBorders>
+            <w:tcMar>
+              <w:top w:w="120" w:type="dxa"/>
+              <w:left w:w="180" w:type="dxa"/>
+              <w:bottom w:w="120" w:type="dxa"/>
+              <w:right w:w="180" w:type="dxa"/>
+            </w:tcMar>
+            <w:vAlign w:val="center"/>
+            <w:hideMark/>
+          </w:tcPr>
+          <w:p>
+            <w:r>
+              <w:t>Users struggle to resume unfinished work after leaving and returning to a website</w:t>
+            </w:r>
+          </w:p>
+        </w:tc>
+        <w:tc>
+          <w:tcPr>
+            <w:tcW w:w="0" w:type="auto"/>
+            <w:tcBorders>
+              <w:top w:val="single" w:sz="6" w:space="0" w:color="C4C7C5"/>
+              <w:left w:val="single" w:sz="6" w:space="0" w:color="C4C7C5"/>
+              <w:bottom w:val="single" w:sz="6" w:space="0" w:color="C4C7C5"/>
+              <w:right w:val="single" w:sz="6" w:space="0" w:color="C4C7C5"/>
+            </w:tcBorders>
+            <w:tcMar>
+              <w:top w:w="120" w:type="dxa"/>
+              <w:left w:w="180" w:type="dxa"/>
+              <w:bottom w:w="120" w:type="dxa"/>
+              <w:right w:w="180" w:type="dxa"/>
+            </w:tcMar>
+            <w:vAlign w:val="center"/>
+            <w:hideMark/>
+          </w:tcPr>
+          <w:p>
+            <w:r>
+              <w:t>Accepted</w:t>
+            </w:r>
+          </w:p>
+        </w:tc>
+      </w:tr>
+      <w:tr>
+        <w:trPr>
+          <w:tblCellSpacing w:w="15" w:type="dxa"/>
+        </w:trPr>
+        <w:tc>
+          <w:tcPr>
+            <w:tcW w:w="0" w:type="auto"/>
+            <w:tcBorders>
+              <w:top w:val="single" w:sz="6" w:space="0" w:color="C4C7C5"/>
+              <w:left w:val="single" w:sz="6" w:space="0" w:color="C4C7C5"/>
+              <w:bottom w:val="single" w:sz="6" w:space="0" w:color="C4C7C5"/>
+              <w:right w:val="single" w:sz="6" w:space="0" w:color="C4C7C5"/>
+            </w:tcBorders>
+            <w:tcMar>
+              <w:top w:w="120" w:type="dxa"/>
+              <w:left w:w="180" w:type="dxa"/>
+              <w:bottom w:w="120" w:type="dxa"/>
+              <w:right w:w="180" w:type="dxa"/>
+            </w:tcMar>
+            <w:vAlign w:val="center"/>
+            <w:hideMark/>
+          </w:tcPr>
+          <w:p>
+            <w:pPr>
+              <w:rPr>
+                <w:b/>
+                <w:bCs/>
+              </w:rPr>
+            </w:pPr>
+            <w:r>
+              <w:rPr>
+                <w:b/>
+                <w:bCs/>
+              </w:rPr>
+              <w:t>WI-023</w:t>
+            </w:r>
+          </w:p>
+        </w:tc>
+        <w:tc>
+          <w:tcPr>
+            <w:tcW w:w="0" w:type="auto"/>
+            <w:tcBorders>
+              <w:top w:val="single" w:sz="6" w:space="0" w:color="C4C7C5"/>
+              <w:left w:val="single" w:sz="6" w:space="0" w:color="C4C7C5"/>
+              <w:bottom w:val="single" w:sz="6" w:space="0" w:color="C4C7C5"/>
+              <w:right w:val="single" w:sz="6" w:space="0" w:color="C4C7C5"/>
+            </w:tcBorders>
+            <w:tcMar>
+              <w:top w:w="120" w:type="dxa"/>
+              <w:left w:w="180" w:type="dxa"/>
+              <w:bottom w:w="120" w:type="dxa"/>
+              <w:right w:w="180" w:type="dxa"/>
+            </w:tcMar>
+            <w:vAlign w:val="center"/>
+            <w:hideMark/>
+          </w:tcPr>
+          <w:p>
+            <w:r>
+              <w:t>Users struggle to understand how personal data is collected, stored, and used by websites</w:t>
+            </w:r>
+          </w:p>
+        </w:tc>
+        <w:tc>
+          <w:tcPr>
+            <w:tcW w:w="0" w:type="auto"/>
+            <w:tcBorders>
+              <w:top w:val="single" w:sz="6" w:space="0" w:color="C4C7C5"/>
+              <w:left w:val="single" w:sz="6" w:space="0" w:color="C4C7C5"/>
+              <w:bottom w:val="single" w:sz="6" w:space="0" w:color="C4C7C5"/>
+              <w:right w:val="single" w:sz="6" w:space="0" w:color="C4C7C5"/>
+            </w:tcBorders>
+            <w:tcMar>
+              <w:top w:w="120" w:type="dxa"/>
+              <w:left w:w="180" w:type="dxa"/>
+              <w:bottom w:w="120" w:type="dxa"/>
+              <w:right w:w="180" w:type="dxa"/>
+            </w:tcMar>
+            <w:vAlign w:val="center"/>
+            <w:hideMark/>
+          </w:tcPr>
+          <w:p>
+            <w:r>
+              <w:t>Accepted</w:t>
+            </w:r>
+          </w:p>
+        </w:tc>
+      </w:tr>
+      <w:tr>
+        <w:trPr>
+          <w:tblCellSpacing w:w="15" w:type="dxa"/>
+        </w:trPr>
+        <w:tc>
+          <w:tcPr>
+            <w:tcW w:w="0" w:type="auto"/>
+            <w:tcBorders>
+              <w:top w:val="single" w:sz="6" w:space="0" w:color="C4C7C5"/>
+              <w:left w:val="single" w:sz="6" w:space="0" w:color="C4C7C5"/>
+              <w:bottom w:val="single" w:sz="6" w:space="0" w:color="C4C7C5"/>
+              <w:right w:val="single" w:sz="6" w:space="0" w:color="C4C7C5"/>
+            </w:tcBorders>
+            <w:tcMar>
+              <w:top w:w="120" w:type="dxa"/>
+              <w:left w:w="180" w:type="dxa"/>
+              <w:bottom w:w="120" w:type="dxa"/>
+              <w:right w:w="180" w:type="dxa"/>
+            </w:tcMar>
+            <w:vAlign w:val="center"/>
+            <w:hideMark/>
+          </w:tcPr>
+          <w:p>
+            <w:pPr>
+              <w:rPr>
+                <w:b/>
+                <w:bCs/>
+              </w:rPr>
+            </w:pPr>
+            <w:r>
+              <w:rPr>
+                <w:b/>
+                <w:bCs/>
+              </w:rPr>
+              <w:t>WI-024</w:t>
+            </w:r>
+          </w:p>
+        </w:tc>
+        <w:tc>
+          <w:tcPr>
+            <w:tcW w:w="0" w:type="auto"/>
+            <w:tcBorders>
+              <w:top w:val="single" w:sz="6" w:space="0" w:color="C4C7C5"/>
+              <w:left w:val="single" w:sz="6" w:space="0" w:color="C4C7C5"/>
+              <w:bottom w:val="single" w:sz="6" w:space="0" w:color="C4C7C5"/>
+              <w:right w:val="single" w:sz="6" w:space="0" w:color="C4C7C5"/>
+            </w:tcBorders>
+            <w:tcMar>
+              <w:top w:w="120" w:type="dxa"/>
+              <w:left w:w="180" w:type="dxa"/>
+              <w:bottom w:w="120" w:type="dxa"/>
+              <w:right w:w="180" w:type="dxa"/>
+            </w:tcMar>
+            <w:vAlign w:val="center"/>
+            <w:hideMark/>
+          </w:tcPr>
+          <w:p>
+            <w:r>
+              <w:t>Users struggle to maintain context while switching between multiple websites during a single task</w:t>
+            </w:r>
+          </w:p>
+        </w:tc>
+        <w:tc>
+          <w:tcPr>
+            <w:tcW w:w="0" w:type="auto"/>
+            <w:tcBorders>
+              <w:top w:val="single" w:sz="6" w:space="0" w:color="C4C7C5"/>
+              <w:left w:val="single" w:sz="6" w:space="0" w:color="C4C7C5"/>
+              <w:bottom w:val="single" w:sz="6" w:space="0" w:color="C4C7C5"/>
+              <w:right w:val="single" w:sz="6" w:space="0" w:color="C4C7C5"/>
+            </w:tcBorders>
+            <w:tcMar>
+              <w:top w:w="120" w:type="dxa"/>
+              <w:left w:w="180" w:type="dxa"/>
+              <w:bottom w:w="120" w:type="dxa"/>
+              <w:right w:w="180" w:type="dxa"/>
+            </w:tcMar>
+            <w:vAlign w:val="center"/>
+            <w:hideMark/>
+          </w:tcPr>
+          <w:p>
+            <w:r>
+              <w:t>Accepted</w:t>
+            </w:r>
+          </w:p>
+        </w:tc>
+      </w:tr>
+      <w:tr>
+        <w:trPr>
+          <w:tblCellSpacing w:w="15" w:type="dxa"/>
+        </w:trPr>
+        <w:tc>
+          <w:tcPr>
+            <w:tcW w:w="0" w:type="auto"/>
+            <w:tcBorders>
+              <w:top w:val="single" w:sz="6" w:space="0" w:color="C4C7C5"/>
+              <w:left w:val="single" w:sz="6" w:space="0" w:color="C4C7C5"/>
+              <w:bottom w:val="single" w:sz="6" w:space="0" w:color="C4C7C5"/>
+              <w:right w:val="single" w:sz="6" w:space="0" w:color="C4C7C5"/>
+            </w:tcBorders>
+            <w:tcMar>
+              <w:top w:w="120" w:type="dxa"/>
+              <w:left w:w="180" w:type="dxa"/>
+              <w:bottom w:w="120" w:type="dxa"/>
+              <w:right w:w="180" w:type="dxa"/>
+            </w:tcMar>
+            <w:vAlign w:val="center"/>
+            <w:hideMark/>
+          </w:tcPr>
+          <w:p>
+            <w:pPr>
+              <w:rPr>
+                <w:b/>
+                <w:bCs/>
+              </w:rPr>
+            </w:pPr>
+            <w:r>
+              <w:rPr>
+                <w:b/>
+                <w:bCs/>
+              </w:rPr>
+              <w:t>WI-025</w:t>
+            </w:r>
+          </w:p>
+        </w:tc>
+        <w:tc>
+          <w:tcPr>
+            <w:tcW w:w="0" w:type="auto"/>
+            <w:tcBorders>
+              <w:top w:val="single" w:sz="6" w:space="0" w:color="C4C7C5"/>
+              <w:left w:val="single" w:sz="6" w:space="0" w:color="C4C7C5"/>
+              <w:bottom w:val="single" w:sz="6" w:space="0" w:color="C4C7C5"/>
+              <w:right w:val="single" w:sz="6" w:space="0" w:color="C4C7C5"/>
+            </w:tcBorders>
+            <w:tcMar>
+              <w:top w:w="120" w:type="dxa"/>
+              <w:left w:w="180" w:type="dxa"/>
+              <w:bottom w:w="120" w:type="dxa"/>
+              <w:right w:w="180" w:type="dxa"/>
+            </w:tcMar>
+            <w:vAlign w:val="center"/>
+            <w:hideMark/>
+          </w:tcPr>
+          <w:p>
+            <w:r>
+              <w:t>Users gradually lose understanding of the web ecosystem as websites become increasingly interconnected and complex</w:t>
+            </w:r>
+          </w:p>
+        </w:tc>
+        <w:tc>
+          <w:tcPr>
+            <w:tcW w:w="0" w:type="auto"/>
+            <w:tcBorders>
+              <w:top w:val="single" w:sz="6" w:space="0" w:color="C4C7C5"/>
+              <w:left w:val="single" w:sz="6" w:space="0" w:color="C4C7C5"/>
+              <w:bottom w:val="single" w:sz="6" w:space="0" w:color="C4C7C5"/>
+              <w:right w:val="single" w:sz="6" w:space="0" w:color="C4C7C5"/>
+            </w:tcBorders>
+            <w:tcMar>
+              <w:top w:w="120" w:type="dxa"/>
+              <w:left w:w="180" w:type="dxa"/>
+              <w:bottom w:w="120" w:type="dxa"/>
+              <w:right w:w="180" w:type="dxa"/>
+            </w:tcMar>
+            <w:vAlign w:val="center"/>
+            <w:hideMark/>
+          </w:tcPr>
+          <w:p>
+            <w:r>
+              <w:t>Accepted</w:t>
+            </w:r>
+          </w:p>
+        </w:tc>
+      </w:tr>
+    </w:tbl>
+    <w:p>
+      <w:pPr>
+        <w:rPr>
+          <w:b/>
+          <w:bCs/>
+        </w:rPr>
+      </w:pPr>
+    </w:p>
+    <w:p>
+      <w:pPr>
+        <w:rPr>
+          <w:b/>
+          <w:bCs/>
+        </w:rPr>
+      </w:pPr>
     </w:p>
     <w:p>
       <w:pPr>
@@ -10871,7 +13197,7 @@
           </w:tcPr>
           <w:p>
             <w:r>
-              <w:t>2</w:t>
+              <w:t>3</w:t>
             </w:r>
           </w:p>
         </w:tc>
@@ -10928,7 +13254,10 @@
           </w:tcPr>
           <w:p>
             <w:r>
-              <w:t>125</w:t>
+              <w:t>1</w:t>
+            </w:r>
+            <w:r>
+              <w:t>50</w:t>
             </w:r>
           </w:p>
         </w:tc>
@@ -10985,39 +13314,43 @@
           </w:tcPr>
           <w:p>
             <w:r>
-              <w:t>125</w:t>
-            </w:r>
-          </w:p>
-        </w:tc>
-      </w:tr>
-      <w:tr>
-        <w:trPr>
-          <w:tblCellSpacing w:w="15" w:type="dxa"/>
-        </w:trPr>
-        <w:tc>
-          <w:tcPr>
-            <w:tcW w:w="0" w:type="auto"/>
-            <w:tcBorders>
-              <w:top w:val="single" w:sz="6" w:space="0" w:color="C4C7C5"/>
-              <w:left w:val="single" w:sz="6" w:space="0" w:color="C4C7C5"/>
-              <w:bottom w:val="single" w:sz="6" w:space="0" w:color="C4C7C5"/>
-              <w:right w:val="single" w:sz="6" w:space="0" w:color="C4C7C5"/>
-            </w:tcBorders>
-            <w:tcMar>
-              <w:top w:w="120" w:type="dxa"/>
-              <w:left w:w="180" w:type="dxa"/>
-              <w:bottom w:w="120" w:type="dxa"/>
-              <w:right w:w="180" w:type="dxa"/>
-            </w:tcMar>
-            <w:vAlign w:val="center"/>
-            <w:hideMark/>
-          </w:tcPr>
-          <w:p>
-            <w:r>
-              <w:rPr>
-                <w:b/>
-                <w:bCs/>
-              </w:rPr>
+              <w:t>1</w:t>
+            </w:r>
+            <w:r>
+              <w:t>50</w:t>
+            </w:r>
+          </w:p>
+        </w:tc>
+      </w:tr>
+      <w:tr>
+        <w:trPr>
+          <w:tblCellSpacing w:w="15" w:type="dxa"/>
+        </w:trPr>
+        <w:tc>
+          <w:tcPr>
+            <w:tcW w:w="0" w:type="auto"/>
+            <w:tcBorders>
+              <w:top w:val="single" w:sz="6" w:space="0" w:color="C4C7C5"/>
+              <w:left w:val="single" w:sz="6" w:space="0" w:color="C4C7C5"/>
+              <w:bottom w:val="single" w:sz="6" w:space="0" w:color="C4C7C5"/>
+              <w:right w:val="single" w:sz="6" w:space="0" w:color="C4C7C5"/>
+            </w:tcBorders>
+            <w:tcMar>
+              <w:top w:w="120" w:type="dxa"/>
+              <w:left w:w="180" w:type="dxa"/>
+              <w:bottom w:w="120" w:type="dxa"/>
+              <w:right w:w="180" w:type="dxa"/>
+            </w:tcMar>
+            <w:vAlign w:val="center"/>
+            <w:hideMark/>
+          </w:tcPr>
+          <w:p>
+            <w:r>
+              <w:rPr>
+                <w:b/>
+                <w:bCs/>
+              </w:rPr>
+              <w:lastRenderedPageBreak/>
               <w:t>Candidate</w:t>
             </w:r>
           </w:p>
@@ -11229,7 +13562,6 @@
         </w:numPr>
       </w:pPr>
       <w:r>
-        <w:lastRenderedPageBreak/>
         <w:t>Detailed metadata—including category, subcategory, version history, evidence, research notes, and revision history—shall be maintained within the corresponding Human Friction document.</w:t>
       </w:r>
     </w:p>
@@ -11455,6 +13787,7 @@
                 <w:b/>
                 <w:bCs/>
               </w:rPr>
+              <w:lastRenderedPageBreak/>
               <w:t>Repository</w:t>
             </w:r>
           </w:p>

</xml_diff>

<commit_message>
Add pattern docs and update registries/metrics
Add new pattern documents PAT-034 through PAT-043 under atlas/Patterns and a Web & Internet Human Frictions volume (WI-026–WI-050) under atlas/Human-Frictions. Update atlas/Registries/APID-Registry.docx and atlas/Registries/Pattern-Registry.docx, and refresh atlas/metrics/Human Friction Metrics.docx and atlas/metrics/Pattern Metrics.docx to reflect the new additions.

Co-Authored-By: Project UIL <309146262+researchprojectuil-prog@users.noreply.github.com>
Co-Authored-By: jothish-blip <215570346+jothish-blip@users.noreply.github.com>
</commit_message>
<xml_diff>
--- a/atlas/Registries/APID-Registry.docx
+++ b/atlas/Registries/APID-Registry.docx
@@ -10730,6 +10730,21 @@
           <w:b/>
           <w:bCs/>
         </w:rPr>
+        <w:t>Here is the complete, consolidated registry table for WI-001 through WI-050:</w:t>
+      </w:r>
+    </w:p>
+    <w:p>
+      <w:pPr>
+        <w:rPr>
+          <w:b/>
+          <w:bCs/>
+        </w:rPr>
+      </w:pPr>
+      <w:r>
+        <w:rPr>
+          <w:b/>
+          <w:bCs/>
+        </w:rPr>
         <w:t>Category: Web &amp; Internet (WI)</w:t>
       </w:r>
     </w:p>
@@ -10746,8 +10761,8 @@
         <w:tblLook w:val="04A0" w:firstRow="1" w:lastRow="0" w:firstColumn="1" w:lastColumn="0" w:noHBand="0" w:noVBand="1"/>
       </w:tblPr>
       <w:tblGrid>
-        <w:gridCol w:w="1064"/>
-        <w:gridCol w:w="6519"/>
+        <w:gridCol w:w="1063"/>
+        <w:gridCol w:w="6520"/>
         <w:gridCol w:w="1427"/>
       </w:tblGrid>
       <w:tr>
@@ -13035,7 +13050,2192 @@
           </w:p>
         </w:tc>
       </w:tr>
+      <w:tr>
+        <w:trPr>
+          <w:tblCellSpacing w:w="15" w:type="dxa"/>
+        </w:trPr>
+        <w:tc>
+          <w:tcPr>
+            <w:tcW w:w="0" w:type="auto"/>
+            <w:tcBorders>
+              <w:top w:val="single" w:sz="6" w:space="0" w:color="C4C7C5"/>
+              <w:left w:val="single" w:sz="6" w:space="0" w:color="C4C7C5"/>
+              <w:bottom w:val="single" w:sz="6" w:space="0" w:color="C4C7C5"/>
+              <w:right w:val="single" w:sz="6" w:space="0" w:color="C4C7C5"/>
+            </w:tcBorders>
+            <w:tcMar>
+              <w:top w:w="120" w:type="dxa"/>
+              <w:left w:w="180" w:type="dxa"/>
+              <w:bottom w:w="120" w:type="dxa"/>
+              <w:right w:w="180" w:type="dxa"/>
+            </w:tcMar>
+            <w:vAlign w:val="center"/>
+            <w:hideMark/>
+          </w:tcPr>
+          <w:p>
+            <w:pPr>
+              <w:rPr>
+                <w:b/>
+                <w:bCs/>
+              </w:rPr>
+            </w:pPr>
+            <w:r>
+              <w:rPr>
+                <w:b/>
+                <w:bCs/>
+              </w:rPr>
+              <w:t>WI-026</w:t>
+            </w:r>
+          </w:p>
+        </w:tc>
+        <w:tc>
+          <w:tcPr>
+            <w:tcW w:w="0" w:type="auto"/>
+            <w:tcBorders>
+              <w:top w:val="single" w:sz="6" w:space="0" w:color="C4C7C5"/>
+              <w:left w:val="single" w:sz="6" w:space="0" w:color="C4C7C5"/>
+              <w:bottom w:val="single" w:sz="6" w:space="0" w:color="C4C7C5"/>
+              <w:right w:val="single" w:sz="6" w:space="0" w:color="C4C7C5"/>
+            </w:tcBorders>
+            <w:tcMar>
+              <w:top w:w="120" w:type="dxa"/>
+              <w:left w:w="180" w:type="dxa"/>
+              <w:bottom w:w="120" w:type="dxa"/>
+              <w:right w:w="180" w:type="dxa"/>
+            </w:tcMar>
+            <w:vAlign w:val="center"/>
+            <w:hideMark/>
+          </w:tcPr>
+          <w:p>
+            <w:r>
+              <w:t>Users struggle to remember which website they previously used for a specific task</w:t>
+            </w:r>
+          </w:p>
+        </w:tc>
+        <w:tc>
+          <w:tcPr>
+            <w:tcW w:w="0" w:type="auto"/>
+            <w:tcBorders>
+              <w:top w:val="single" w:sz="6" w:space="0" w:color="C4C7C5"/>
+              <w:left w:val="single" w:sz="6" w:space="0" w:color="C4C7C5"/>
+              <w:bottom w:val="single" w:sz="6" w:space="0" w:color="C4C7C5"/>
+              <w:right w:val="single" w:sz="6" w:space="0" w:color="C4C7C5"/>
+            </w:tcBorders>
+            <w:tcMar>
+              <w:top w:w="120" w:type="dxa"/>
+              <w:left w:w="180" w:type="dxa"/>
+              <w:bottom w:w="120" w:type="dxa"/>
+              <w:right w:w="180" w:type="dxa"/>
+            </w:tcMar>
+            <w:vAlign w:val="center"/>
+            <w:hideMark/>
+          </w:tcPr>
+          <w:p>
+            <w:r>
+              <w:t>Accepted</w:t>
+            </w:r>
+          </w:p>
+        </w:tc>
+      </w:tr>
+      <w:tr>
+        <w:trPr>
+          <w:tblCellSpacing w:w="15" w:type="dxa"/>
+        </w:trPr>
+        <w:tc>
+          <w:tcPr>
+            <w:tcW w:w="0" w:type="auto"/>
+            <w:tcBorders>
+              <w:top w:val="single" w:sz="6" w:space="0" w:color="C4C7C5"/>
+              <w:left w:val="single" w:sz="6" w:space="0" w:color="C4C7C5"/>
+              <w:bottom w:val="single" w:sz="6" w:space="0" w:color="C4C7C5"/>
+              <w:right w:val="single" w:sz="6" w:space="0" w:color="C4C7C5"/>
+            </w:tcBorders>
+            <w:tcMar>
+              <w:top w:w="120" w:type="dxa"/>
+              <w:left w:w="180" w:type="dxa"/>
+              <w:bottom w:w="120" w:type="dxa"/>
+              <w:right w:w="180" w:type="dxa"/>
+            </w:tcMar>
+            <w:vAlign w:val="center"/>
+            <w:hideMark/>
+          </w:tcPr>
+          <w:p>
+            <w:pPr>
+              <w:rPr>
+                <w:b/>
+                <w:bCs/>
+              </w:rPr>
+            </w:pPr>
+            <w:r>
+              <w:rPr>
+                <w:b/>
+                <w:bCs/>
+              </w:rPr>
+              <w:t>WI-027</w:t>
+            </w:r>
+          </w:p>
+        </w:tc>
+        <w:tc>
+          <w:tcPr>
+            <w:tcW w:w="0" w:type="auto"/>
+            <w:tcBorders>
+              <w:top w:val="single" w:sz="6" w:space="0" w:color="C4C7C5"/>
+              <w:left w:val="single" w:sz="6" w:space="0" w:color="C4C7C5"/>
+              <w:bottom w:val="single" w:sz="6" w:space="0" w:color="C4C7C5"/>
+              <w:right w:val="single" w:sz="6" w:space="0" w:color="C4C7C5"/>
+            </w:tcBorders>
+            <w:tcMar>
+              <w:top w:w="120" w:type="dxa"/>
+              <w:left w:w="180" w:type="dxa"/>
+              <w:bottom w:w="120" w:type="dxa"/>
+              <w:right w:w="180" w:type="dxa"/>
+            </w:tcMar>
+            <w:vAlign w:val="center"/>
+            <w:hideMark/>
+          </w:tcPr>
+          <w:p>
+            <w:r>
+              <w:t>Users struggle to remember which account they created for different websites</w:t>
+            </w:r>
+          </w:p>
+        </w:tc>
+        <w:tc>
+          <w:tcPr>
+            <w:tcW w:w="0" w:type="auto"/>
+            <w:tcBorders>
+              <w:top w:val="single" w:sz="6" w:space="0" w:color="C4C7C5"/>
+              <w:left w:val="single" w:sz="6" w:space="0" w:color="C4C7C5"/>
+              <w:bottom w:val="single" w:sz="6" w:space="0" w:color="C4C7C5"/>
+              <w:right w:val="single" w:sz="6" w:space="0" w:color="C4C7C5"/>
+            </w:tcBorders>
+            <w:tcMar>
+              <w:top w:w="120" w:type="dxa"/>
+              <w:left w:w="180" w:type="dxa"/>
+              <w:bottom w:w="120" w:type="dxa"/>
+              <w:right w:w="180" w:type="dxa"/>
+            </w:tcMar>
+            <w:vAlign w:val="center"/>
+            <w:hideMark/>
+          </w:tcPr>
+          <w:p>
+            <w:r>
+              <w:t>Accepted</w:t>
+            </w:r>
+          </w:p>
+        </w:tc>
+      </w:tr>
+      <w:tr>
+        <w:trPr>
+          <w:tblCellSpacing w:w="15" w:type="dxa"/>
+        </w:trPr>
+        <w:tc>
+          <w:tcPr>
+            <w:tcW w:w="0" w:type="auto"/>
+            <w:tcBorders>
+              <w:top w:val="single" w:sz="6" w:space="0" w:color="C4C7C5"/>
+              <w:left w:val="single" w:sz="6" w:space="0" w:color="C4C7C5"/>
+              <w:bottom w:val="single" w:sz="6" w:space="0" w:color="C4C7C5"/>
+              <w:right w:val="single" w:sz="6" w:space="0" w:color="C4C7C5"/>
+            </w:tcBorders>
+            <w:tcMar>
+              <w:top w:w="120" w:type="dxa"/>
+              <w:left w:w="180" w:type="dxa"/>
+              <w:bottom w:w="120" w:type="dxa"/>
+              <w:right w:w="180" w:type="dxa"/>
+            </w:tcMar>
+            <w:vAlign w:val="center"/>
+            <w:hideMark/>
+          </w:tcPr>
+          <w:p>
+            <w:pPr>
+              <w:rPr>
+                <w:b/>
+                <w:bCs/>
+              </w:rPr>
+            </w:pPr>
+            <w:r>
+              <w:rPr>
+                <w:b/>
+                <w:bCs/>
+              </w:rPr>
+              <w:t>WI-028</w:t>
+            </w:r>
+          </w:p>
+        </w:tc>
+        <w:tc>
+          <w:tcPr>
+            <w:tcW w:w="0" w:type="auto"/>
+            <w:tcBorders>
+              <w:top w:val="single" w:sz="6" w:space="0" w:color="C4C7C5"/>
+              <w:left w:val="single" w:sz="6" w:space="0" w:color="C4C7C5"/>
+              <w:bottom w:val="single" w:sz="6" w:space="0" w:color="C4C7C5"/>
+              <w:right w:val="single" w:sz="6" w:space="0" w:color="C4C7C5"/>
+            </w:tcBorders>
+            <w:tcMar>
+              <w:top w:w="120" w:type="dxa"/>
+              <w:left w:w="180" w:type="dxa"/>
+              <w:bottom w:w="120" w:type="dxa"/>
+              <w:right w:w="180" w:type="dxa"/>
+            </w:tcMar>
+            <w:vAlign w:val="center"/>
+            <w:hideMark/>
+          </w:tcPr>
+          <w:p>
+            <w:r>
+              <w:t>Users struggle to determine whether they are currently signed in to a website</w:t>
+            </w:r>
+          </w:p>
+        </w:tc>
+        <w:tc>
+          <w:tcPr>
+            <w:tcW w:w="0" w:type="auto"/>
+            <w:tcBorders>
+              <w:top w:val="single" w:sz="6" w:space="0" w:color="C4C7C5"/>
+              <w:left w:val="single" w:sz="6" w:space="0" w:color="C4C7C5"/>
+              <w:bottom w:val="single" w:sz="6" w:space="0" w:color="C4C7C5"/>
+              <w:right w:val="single" w:sz="6" w:space="0" w:color="C4C7C5"/>
+            </w:tcBorders>
+            <w:tcMar>
+              <w:top w:w="120" w:type="dxa"/>
+              <w:left w:w="180" w:type="dxa"/>
+              <w:bottom w:w="120" w:type="dxa"/>
+              <w:right w:w="180" w:type="dxa"/>
+            </w:tcMar>
+            <w:vAlign w:val="center"/>
+            <w:hideMark/>
+          </w:tcPr>
+          <w:p>
+            <w:r>
+              <w:t>Accepted</w:t>
+            </w:r>
+          </w:p>
+        </w:tc>
+      </w:tr>
+      <w:tr>
+        <w:trPr>
+          <w:tblCellSpacing w:w="15" w:type="dxa"/>
+        </w:trPr>
+        <w:tc>
+          <w:tcPr>
+            <w:tcW w:w="0" w:type="auto"/>
+            <w:tcBorders>
+              <w:top w:val="single" w:sz="6" w:space="0" w:color="C4C7C5"/>
+              <w:left w:val="single" w:sz="6" w:space="0" w:color="C4C7C5"/>
+              <w:bottom w:val="single" w:sz="6" w:space="0" w:color="C4C7C5"/>
+              <w:right w:val="single" w:sz="6" w:space="0" w:color="C4C7C5"/>
+            </w:tcBorders>
+            <w:tcMar>
+              <w:top w:w="120" w:type="dxa"/>
+              <w:left w:w="180" w:type="dxa"/>
+              <w:bottom w:w="120" w:type="dxa"/>
+              <w:right w:w="180" w:type="dxa"/>
+            </w:tcMar>
+            <w:vAlign w:val="center"/>
+            <w:hideMark/>
+          </w:tcPr>
+          <w:p>
+            <w:pPr>
+              <w:rPr>
+                <w:b/>
+                <w:bCs/>
+              </w:rPr>
+            </w:pPr>
+            <w:r>
+              <w:rPr>
+                <w:b/>
+                <w:bCs/>
+              </w:rPr>
+              <w:t>WI-029</w:t>
+            </w:r>
+          </w:p>
+        </w:tc>
+        <w:tc>
+          <w:tcPr>
+            <w:tcW w:w="0" w:type="auto"/>
+            <w:tcBorders>
+              <w:top w:val="single" w:sz="6" w:space="0" w:color="C4C7C5"/>
+              <w:left w:val="single" w:sz="6" w:space="0" w:color="C4C7C5"/>
+              <w:bottom w:val="single" w:sz="6" w:space="0" w:color="C4C7C5"/>
+              <w:right w:val="single" w:sz="6" w:space="0" w:color="C4C7C5"/>
+            </w:tcBorders>
+            <w:tcMar>
+              <w:top w:w="120" w:type="dxa"/>
+              <w:left w:w="180" w:type="dxa"/>
+              <w:bottom w:w="120" w:type="dxa"/>
+              <w:right w:w="180" w:type="dxa"/>
+            </w:tcMar>
+            <w:vAlign w:val="center"/>
+            <w:hideMark/>
+          </w:tcPr>
+          <w:p>
+            <w:r>
+              <w:t>Users struggle to understand why websites automatically sign them out</w:t>
+            </w:r>
+          </w:p>
+        </w:tc>
+        <w:tc>
+          <w:tcPr>
+            <w:tcW w:w="0" w:type="auto"/>
+            <w:tcBorders>
+              <w:top w:val="single" w:sz="6" w:space="0" w:color="C4C7C5"/>
+              <w:left w:val="single" w:sz="6" w:space="0" w:color="C4C7C5"/>
+              <w:bottom w:val="single" w:sz="6" w:space="0" w:color="C4C7C5"/>
+              <w:right w:val="single" w:sz="6" w:space="0" w:color="C4C7C5"/>
+            </w:tcBorders>
+            <w:tcMar>
+              <w:top w:w="120" w:type="dxa"/>
+              <w:left w:w="180" w:type="dxa"/>
+              <w:bottom w:w="120" w:type="dxa"/>
+              <w:right w:w="180" w:type="dxa"/>
+            </w:tcMar>
+            <w:vAlign w:val="center"/>
+            <w:hideMark/>
+          </w:tcPr>
+          <w:p>
+            <w:r>
+              <w:t>Accepted</w:t>
+            </w:r>
+          </w:p>
+        </w:tc>
+      </w:tr>
+      <w:tr>
+        <w:trPr>
+          <w:tblCellSpacing w:w="15" w:type="dxa"/>
+        </w:trPr>
+        <w:tc>
+          <w:tcPr>
+            <w:tcW w:w="0" w:type="auto"/>
+            <w:tcBorders>
+              <w:top w:val="single" w:sz="6" w:space="0" w:color="C4C7C5"/>
+              <w:left w:val="single" w:sz="6" w:space="0" w:color="C4C7C5"/>
+              <w:bottom w:val="single" w:sz="6" w:space="0" w:color="C4C7C5"/>
+              <w:right w:val="single" w:sz="6" w:space="0" w:color="C4C7C5"/>
+            </w:tcBorders>
+            <w:tcMar>
+              <w:top w:w="120" w:type="dxa"/>
+              <w:left w:w="180" w:type="dxa"/>
+              <w:bottom w:w="120" w:type="dxa"/>
+              <w:right w:w="180" w:type="dxa"/>
+            </w:tcMar>
+            <w:vAlign w:val="center"/>
+            <w:hideMark/>
+          </w:tcPr>
+          <w:p>
+            <w:pPr>
+              <w:rPr>
+                <w:b/>
+                <w:bCs/>
+              </w:rPr>
+            </w:pPr>
+            <w:r>
+              <w:rPr>
+                <w:b/>
+                <w:bCs/>
+              </w:rPr>
+              <w:lastRenderedPageBreak/>
+              <w:t>WI-030</w:t>
+            </w:r>
+          </w:p>
+        </w:tc>
+        <w:tc>
+          <w:tcPr>
+            <w:tcW w:w="0" w:type="auto"/>
+            <w:tcBorders>
+              <w:top w:val="single" w:sz="6" w:space="0" w:color="C4C7C5"/>
+              <w:left w:val="single" w:sz="6" w:space="0" w:color="C4C7C5"/>
+              <w:bottom w:val="single" w:sz="6" w:space="0" w:color="C4C7C5"/>
+              <w:right w:val="single" w:sz="6" w:space="0" w:color="C4C7C5"/>
+            </w:tcBorders>
+            <w:tcMar>
+              <w:top w:w="120" w:type="dxa"/>
+              <w:left w:w="180" w:type="dxa"/>
+              <w:bottom w:w="120" w:type="dxa"/>
+              <w:right w:w="180" w:type="dxa"/>
+            </w:tcMar>
+            <w:vAlign w:val="center"/>
+            <w:hideMark/>
+          </w:tcPr>
+          <w:p>
+            <w:r>
+              <w:t>Users struggle to understand why the same website displays different content for different users</w:t>
+            </w:r>
+          </w:p>
+        </w:tc>
+        <w:tc>
+          <w:tcPr>
+            <w:tcW w:w="0" w:type="auto"/>
+            <w:tcBorders>
+              <w:top w:val="single" w:sz="6" w:space="0" w:color="C4C7C5"/>
+              <w:left w:val="single" w:sz="6" w:space="0" w:color="C4C7C5"/>
+              <w:bottom w:val="single" w:sz="6" w:space="0" w:color="C4C7C5"/>
+              <w:right w:val="single" w:sz="6" w:space="0" w:color="C4C7C5"/>
+            </w:tcBorders>
+            <w:tcMar>
+              <w:top w:w="120" w:type="dxa"/>
+              <w:left w:w="180" w:type="dxa"/>
+              <w:bottom w:w="120" w:type="dxa"/>
+              <w:right w:w="180" w:type="dxa"/>
+            </w:tcMar>
+            <w:vAlign w:val="center"/>
+            <w:hideMark/>
+          </w:tcPr>
+          <w:p>
+            <w:r>
+              <w:t>Accepted</w:t>
+            </w:r>
+          </w:p>
+        </w:tc>
+      </w:tr>
+      <w:tr>
+        <w:trPr>
+          <w:tblCellSpacing w:w="15" w:type="dxa"/>
+        </w:trPr>
+        <w:tc>
+          <w:tcPr>
+            <w:tcW w:w="0" w:type="auto"/>
+            <w:tcBorders>
+              <w:top w:val="single" w:sz="6" w:space="0" w:color="C4C7C5"/>
+              <w:left w:val="single" w:sz="6" w:space="0" w:color="C4C7C5"/>
+              <w:bottom w:val="single" w:sz="6" w:space="0" w:color="C4C7C5"/>
+              <w:right w:val="single" w:sz="6" w:space="0" w:color="C4C7C5"/>
+            </w:tcBorders>
+            <w:tcMar>
+              <w:top w:w="120" w:type="dxa"/>
+              <w:left w:w="180" w:type="dxa"/>
+              <w:bottom w:w="120" w:type="dxa"/>
+              <w:right w:w="180" w:type="dxa"/>
+            </w:tcMar>
+            <w:vAlign w:val="center"/>
+            <w:hideMark/>
+          </w:tcPr>
+          <w:p>
+            <w:pPr>
+              <w:rPr>
+                <w:b/>
+                <w:bCs/>
+              </w:rPr>
+            </w:pPr>
+            <w:r>
+              <w:rPr>
+                <w:b/>
+                <w:bCs/>
+              </w:rPr>
+              <w:t>WI-031</w:t>
+            </w:r>
+          </w:p>
+        </w:tc>
+        <w:tc>
+          <w:tcPr>
+            <w:tcW w:w="0" w:type="auto"/>
+            <w:tcBorders>
+              <w:top w:val="single" w:sz="6" w:space="0" w:color="C4C7C5"/>
+              <w:left w:val="single" w:sz="6" w:space="0" w:color="C4C7C5"/>
+              <w:bottom w:val="single" w:sz="6" w:space="0" w:color="C4C7C5"/>
+              <w:right w:val="single" w:sz="6" w:space="0" w:color="C4C7C5"/>
+            </w:tcBorders>
+            <w:tcMar>
+              <w:top w:w="120" w:type="dxa"/>
+              <w:left w:w="180" w:type="dxa"/>
+              <w:bottom w:w="120" w:type="dxa"/>
+              <w:right w:w="180" w:type="dxa"/>
+            </w:tcMar>
+            <w:vAlign w:val="center"/>
+            <w:hideMark/>
+          </w:tcPr>
+          <w:p>
+            <w:r>
+              <w:t>Users struggle to manage multiple online accounts across different websites</w:t>
+            </w:r>
+          </w:p>
+        </w:tc>
+        <w:tc>
+          <w:tcPr>
+            <w:tcW w:w="0" w:type="auto"/>
+            <w:tcBorders>
+              <w:top w:val="single" w:sz="6" w:space="0" w:color="C4C7C5"/>
+              <w:left w:val="single" w:sz="6" w:space="0" w:color="C4C7C5"/>
+              <w:bottom w:val="single" w:sz="6" w:space="0" w:color="C4C7C5"/>
+              <w:right w:val="single" w:sz="6" w:space="0" w:color="C4C7C5"/>
+            </w:tcBorders>
+            <w:tcMar>
+              <w:top w:w="120" w:type="dxa"/>
+              <w:left w:w="180" w:type="dxa"/>
+              <w:bottom w:w="120" w:type="dxa"/>
+              <w:right w:w="180" w:type="dxa"/>
+            </w:tcMar>
+            <w:vAlign w:val="center"/>
+            <w:hideMark/>
+          </w:tcPr>
+          <w:p>
+            <w:r>
+              <w:t>Accepted</w:t>
+            </w:r>
+          </w:p>
+        </w:tc>
+      </w:tr>
+      <w:tr>
+        <w:trPr>
+          <w:tblCellSpacing w:w="15" w:type="dxa"/>
+        </w:trPr>
+        <w:tc>
+          <w:tcPr>
+            <w:tcW w:w="0" w:type="auto"/>
+            <w:tcBorders>
+              <w:top w:val="single" w:sz="6" w:space="0" w:color="C4C7C5"/>
+              <w:left w:val="single" w:sz="6" w:space="0" w:color="C4C7C5"/>
+              <w:bottom w:val="single" w:sz="6" w:space="0" w:color="C4C7C5"/>
+              <w:right w:val="single" w:sz="6" w:space="0" w:color="C4C7C5"/>
+            </w:tcBorders>
+            <w:tcMar>
+              <w:top w:w="120" w:type="dxa"/>
+              <w:left w:w="180" w:type="dxa"/>
+              <w:bottom w:w="120" w:type="dxa"/>
+              <w:right w:w="180" w:type="dxa"/>
+            </w:tcMar>
+            <w:vAlign w:val="center"/>
+            <w:hideMark/>
+          </w:tcPr>
+          <w:p>
+            <w:pPr>
+              <w:rPr>
+                <w:b/>
+                <w:bCs/>
+              </w:rPr>
+            </w:pPr>
+            <w:r>
+              <w:rPr>
+                <w:b/>
+                <w:bCs/>
+              </w:rPr>
+              <w:t>WI-032</w:t>
+            </w:r>
+          </w:p>
+        </w:tc>
+        <w:tc>
+          <w:tcPr>
+            <w:tcW w:w="0" w:type="auto"/>
+            <w:tcBorders>
+              <w:top w:val="single" w:sz="6" w:space="0" w:color="C4C7C5"/>
+              <w:left w:val="single" w:sz="6" w:space="0" w:color="C4C7C5"/>
+              <w:bottom w:val="single" w:sz="6" w:space="0" w:color="C4C7C5"/>
+              <w:right w:val="single" w:sz="6" w:space="0" w:color="C4C7C5"/>
+            </w:tcBorders>
+            <w:tcMar>
+              <w:top w:w="120" w:type="dxa"/>
+              <w:left w:w="180" w:type="dxa"/>
+              <w:bottom w:w="120" w:type="dxa"/>
+              <w:right w:w="180" w:type="dxa"/>
+            </w:tcMar>
+            <w:vAlign w:val="center"/>
+            <w:hideMark/>
+          </w:tcPr>
+          <w:p>
+            <w:r>
+              <w:t>Users struggle to recover access to online accounts after forgetting login credentials</w:t>
+            </w:r>
+          </w:p>
+        </w:tc>
+        <w:tc>
+          <w:tcPr>
+            <w:tcW w:w="0" w:type="auto"/>
+            <w:tcBorders>
+              <w:top w:val="single" w:sz="6" w:space="0" w:color="C4C7C5"/>
+              <w:left w:val="single" w:sz="6" w:space="0" w:color="C4C7C5"/>
+              <w:bottom w:val="single" w:sz="6" w:space="0" w:color="C4C7C5"/>
+              <w:right w:val="single" w:sz="6" w:space="0" w:color="C4C7C5"/>
+            </w:tcBorders>
+            <w:tcMar>
+              <w:top w:w="120" w:type="dxa"/>
+              <w:left w:w="180" w:type="dxa"/>
+              <w:bottom w:w="120" w:type="dxa"/>
+              <w:right w:w="180" w:type="dxa"/>
+            </w:tcMar>
+            <w:vAlign w:val="center"/>
+            <w:hideMark/>
+          </w:tcPr>
+          <w:p>
+            <w:r>
+              <w:t>Accepted</w:t>
+            </w:r>
+          </w:p>
+        </w:tc>
+      </w:tr>
+      <w:tr>
+        <w:trPr>
+          <w:tblCellSpacing w:w="15" w:type="dxa"/>
+        </w:trPr>
+        <w:tc>
+          <w:tcPr>
+            <w:tcW w:w="0" w:type="auto"/>
+            <w:tcBorders>
+              <w:top w:val="single" w:sz="6" w:space="0" w:color="C4C7C5"/>
+              <w:left w:val="single" w:sz="6" w:space="0" w:color="C4C7C5"/>
+              <w:bottom w:val="single" w:sz="6" w:space="0" w:color="C4C7C5"/>
+              <w:right w:val="single" w:sz="6" w:space="0" w:color="C4C7C5"/>
+            </w:tcBorders>
+            <w:tcMar>
+              <w:top w:w="120" w:type="dxa"/>
+              <w:left w:w="180" w:type="dxa"/>
+              <w:bottom w:w="120" w:type="dxa"/>
+              <w:right w:w="180" w:type="dxa"/>
+            </w:tcMar>
+            <w:vAlign w:val="center"/>
+            <w:hideMark/>
+          </w:tcPr>
+          <w:p>
+            <w:pPr>
+              <w:rPr>
+                <w:b/>
+                <w:bCs/>
+              </w:rPr>
+            </w:pPr>
+            <w:r>
+              <w:rPr>
+                <w:b/>
+                <w:bCs/>
+              </w:rPr>
+              <w:t>WI-033</w:t>
+            </w:r>
+          </w:p>
+        </w:tc>
+        <w:tc>
+          <w:tcPr>
+            <w:tcW w:w="0" w:type="auto"/>
+            <w:tcBorders>
+              <w:top w:val="single" w:sz="6" w:space="0" w:color="C4C7C5"/>
+              <w:left w:val="single" w:sz="6" w:space="0" w:color="C4C7C5"/>
+              <w:bottom w:val="single" w:sz="6" w:space="0" w:color="C4C7C5"/>
+              <w:right w:val="single" w:sz="6" w:space="0" w:color="C4C7C5"/>
+            </w:tcBorders>
+            <w:tcMar>
+              <w:top w:w="120" w:type="dxa"/>
+              <w:left w:w="180" w:type="dxa"/>
+              <w:bottom w:w="120" w:type="dxa"/>
+              <w:right w:w="180" w:type="dxa"/>
+            </w:tcMar>
+            <w:vAlign w:val="center"/>
+            <w:hideMark/>
+          </w:tcPr>
+          <w:p>
+            <w:r>
+              <w:t>Users struggle to understand why websites request personal information before providing services</w:t>
+            </w:r>
+          </w:p>
+        </w:tc>
+        <w:tc>
+          <w:tcPr>
+            <w:tcW w:w="0" w:type="auto"/>
+            <w:tcBorders>
+              <w:top w:val="single" w:sz="6" w:space="0" w:color="C4C7C5"/>
+              <w:left w:val="single" w:sz="6" w:space="0" w:color="C4C7C5"/>
+              <w:bottom w:val="single" w:sz="6" w:space="0" w:color="C4C7C5"/>
+              <w:right w:val="single" w:sz="6" w:space="0" w:color="C4C7C5"/>
+            </w:tcBorders>
+            <w:tcMar>
+              <w:top w:w="120" w:type="dxa"/>
+              <w:left w:w="180" w:type="dxa"/>
+              <w:bottom w:w="120" w:type="dxa"/>
+              <w:right w:w="180" w:type="dxa"/>
+            </w:tcMar>
+            <w:vAlign w:val="center"/>
+            <w:hideMark/>
+          </w:tcPr>
+          <w:p>
+            <w:r>
+              <w:t>Accepted</w:t>
+            </w:r>
+          </w:p>
+        </w:tc>
+      </w:tr>
+      <w:tr>
+        <w:trPr>
+          <w:tblCellSpacing w:w="15" w:type="dxa"/>
+        </w:trPr>
+        <w:tc>
+          <w:tcPr>
+            <w:tcW w:w="0" w:type="auto"/>
+            <w:tcBorders>
+              <w:top w:val="single" w:sz="6" w:space="0" w:color="C4C7C5"/>
+              <w:left w:val="single" w:sz="6" w:space="0" w:color="C4C7C5"/>
+              <w:bottom w:val="single" w:sz="6" w:space="0" w:color="C4C7C5"/>
+              <w:right w:val="single" w:sz="6" w:space="0" w:color="C4C7C5"/>
+            </w:tcBorders>
+            <w:tcMar>
+              <w:top w:w="120" w:type="dxa"/>
+              <w:left w:w="180" w:type="dxa"/>
+              <w:bottom w:w="120" w:type="dxa"/>
+              <w:right w:w="180" w:type="dxa"/>
+            </w:tcMar>
+            <w:vAlign w:val="center"/>
+            <w:hideMark/>
+          </w:tcPr>
+          <w:p>
+            <w:pPr>
+              <w:rPr>
+                <w:b/>
+                <w:bCs/>
+              </w:rPr>
+            </w:pPr>
+            <w:r>
+              <w:rPr>
+                <w:b/>
+                <w:bCs/>
+              </w:rPr>
+              <w:t>WI-034</w:t>
+            </w:r>
+          </w:p>
+        </w:tc>
+        <w:tc>
+          <w:tcPr>
+            <w:tcW w:w="0" w:type="auto"/>
+            <w:tcBorders>
+              <w:top w:val="single" w:sz="6" w:space="0" w:color="C4C7C5"/>
+              <w:left w:val="single" w:sz="6" w:space="0" w:color="C4C7C5"/>
+              <w:bottom w:val="single" w:sz="6" w:space="0" w:color="C4C7C5"/>
+              <w:right w:val="single" w:sz="6" w:space="0" w:color="C4C7C5"/>
+            </w:tcBorders>
+            <w:tcMar>
+              <w:top w:w="120" w:type="dxa"/>
+              <w:left w:w="180" w:type="dxa"/>
+              <w:bottom w:w="120" w:type="dxa"/>
+              <w:right w:w="180" w:type="dxa"/>
+            </w:tcMar>
+            <w:vAlign w:val="center"/>
+            <w:hideMark/>
+          </w:tcPr>
+          <w:p>
+            <w:r>
+              <w:t>Users struggle to manage website notifications received through browsers, email, and mobile devices</w:t>
+            </w:r>
+          </w:p>
+        </w:tc>
+        <w:tc>
+          <w:tcPr>
+            <w:tcW w:w="0" w:type="auto"/>
+            <w:tcBorders>
+              <w:top w:val="single" w:sz="6" w:space="0" w:color="C4C7C5"/>
+              <w:left w:val="single" w:sz="6" w:space="0" w:color="C4C7C5"/>
+              <w:bottom w:val="single" w:sz="6" w:space="0" w:color="C4C7C5"/>
+              <w:right w:val="single" w:sz="6" w:space="0" w:color="C4C7C5"/>
+            </w:tcBorders>
+            <w:tcMar>
+              <w:top w:w="120" w:type="dxa"/>
+              <w:left w:w="180" w:type="dxa"/>
+              <w:bottom w:w="120" w:type="dxa"/>
+              <w:right w:w="180" w:type="dxa"/>
+            </w:tcMar>
+            <w:vAlign w:val="center"/>
+            <w:hideMark/>
+          </w:tcPr>
+          <w:p>
+            <w:r>
+              <w:t>Accepted</w:t>
+            </w:r>
+          </w:p>
+        </w:tc>
+      </w:tr>
+      <w:tr>
+        <w:trPr>
+          <w:tblCellSpacing w:w="15" w:type="dxa"/>
+        </w:trPr>
+        <w:tc>
+          <w:tcPr>
+            <w:tcW w:w="0" w:type="auto"/>
+            <w:tcBorders>
+              <w:top w:val="single" w:sz="6" w:space="0" w:color="C4C7C5"/>
+              <w:left w:val="single" w:sz="6" w:space="0" w:color="C4C7C5"/>
+              <w:bottom w:val="single" w:sz="6" w:space="0" w:color="C4C7C5"/>
+              <w:right w:val="single" w:sz="6" w:space="0" w:color="C4C7C5"/>
+            </w:tcBorders>
+            <w:tcMar>
+              <w:top w:w="120" w:type="dxa"/>
+              <w:left w:w="180" w:type="dxa"/>
+              <w:bottom w:w="120" w:type="dxa"/>
+              <w:right w:w="180" w:type="dxa"/>
+            </w:tcMar>
+            <w:vAlign w:val="center"/>
+            <w:hideMark/>
+          </w:tcPr>
+          <w:p>
+            <w:pPr>
+              <w:rPr>
+                <w:b/>
+                <w:bCs/>
+              </w:rPr>
+            </w:pPr>
+            <w:r>
+              <w:rPr>
+                <w:b/>
+                <w:bCs/>
+              </w:rPr>
+              <w:t>WI-035</w:t>
+            </w:r>
+          </w:p>
+        </w:tc>
+        <w:tc>
+          <w:tcPr>
+            <w:tcW w:w="0" w:type="auto"/>
+            <w:tcBorders>
+              <w:top w:val="single" w:sz="6" w:space="0" w:color="C4C7C5"/>
+              <w:left w:val="single" w:sz="6" w:space="0" w:color="C4C7C5"/>
+              <w:bottom w:val="single" w:sz="6" w:space="0" w:color="C4C7C5"/>
+              <w:right w:val="single" w:sz="6" w:space="0" w:color="C4C7C5"/>
+            </w:tcBorders>
+            <w:tcMar>
+              <w:top w:w="120" w:type="dxa"/>
+              <w:left w:w="180" w:type="dxa"/>
+              <w:bottom w:w="120" w:type="dxa"/>
+              <w:right w:w="180" w:type="dxa"/>
+            </w:tcMar>
+            <w:vAlign w:val="center"/>
+            <w:hideMark/>
+          </w:tcPr>
+          <w:p>
+            <w:r>
+              <w:t>Users struggle to understand website privacy settings and account preferences</w:t>
+            </w:r>
+          </w:p>
+        </w:tc>
+        <w:tc>
+          <w:tcPr>
+            <w:tcW w:w="0" w:type="auto"/>
+            <w:tcBorders>
+              <w:top w:val="single" w:sz="6" w:space="0" w:color="C4C7C5"/>
+              <w:left w:val="single" w:sz="6" w:space="0" w:color="C4C7C5"/>
+              <w:bottom w:val="single" w:sz="6" w:space="0" w:color="C4C7C5"/>
+              <w:right w:val="single" w:sz="6" w:space="0" w:color="C4C7C5"/>
+            </w:tcBorders>
+            <w:tcMar>
+              <w:top w:w="120" w:type="dxa"/>
+              <w:left w:w="180" w:type="dxa"/>
+              <w:bottom w:w="120" w:type="dxa"/>
+              <w:right w:w="180" w:type="dxa"/>
+            </w:tcMar>
+            <w:vAlign w:val="center"/>
+            <w:hideMark/>
+          </w:tcPr>
+          <w:p>
+            <w:r>
+              <w:t>Accepted</w:t>
+            </w:r>
+          </w:p>
+        </w:tc>
+      </w:tr>
+      <w:tr>
+        <w:trPr>
+          <w:tblCellSpacing w:w="15" w:type="dxa"/>
+        </w:trPr>
+        <w:tc>
+          <w:tcPr>
+            <w:tcW w:w="0" w:type="auto"/>
+            <w:tcBorders>
+              <w:top w:val="single" w:sz="6" w:space="0" w:color="C4C7C5"/>
+              <w:left w:val="single" w:sz="6" w:space="0" w:color="C4C7C5"/>
+              <w:bottom w:val="single" w:sz="6" w:space="0" w:color="C4C7C5"/>
+              <w:right w:val="single" w:sz="6" w:space="0" w:color="C4C7C5"/>
+            </w:tcBorders>
+            <w:tcMar>
+              <w:top w:w="120" w:type="dxa"/>
+              <w:left w:w="180" w:type="dxa"/>
+              <w:bottom w:w="120" w:type="dxa"/>
+              <w:right w:w="180" w:type="dxa"/>
+            </w:tcMar>
+            <w:vAlign w:val="center"/>
+            <w:hideMark/>
+          </w:tcPr>
+          <w:p>
+            <w:pPr>
+              <w:rPr>
+                <w:b/>
+                <w:bCs/>
+              </w:rPr>
+            </w:pPr>
+            <w:r>
+              <w:rPr>
+                <w:b/>
+                <w:bCs/>
+              </w:rPr>
+              <w:t>WI-036</w:t>
+            </w:r>
+          </w:p>
+        </w:tc>
+        <w:tc>
+          <w:tcPr>
+            <w:tcW w:w="0" w:type="auto"/>
+            <w:tcBorders>
+              <w:top w:val="single" w:sz="6" w:space="0" w:color="C4C7C5"/>
+              <w:left w:val="single" w:sz="6" w:space="0" w:color="C4C7C5"/>
+              <w:bottom w:val="single" w:sz="6" w:space="0" w:color="C4C7C5"/>
+              <w:right w:val="single" w:sz="6" w:space="0" w:color="C4C7C5"/>
+            </w:tcBorders>
+            <w:tcMar>
+              <w:top w:w="120" w:type="dxa"/>
+              <w:left w:w="180" w:type="dxa"/>
+              <w:bottom w:w="120" w:type="dxa"/>
+              <w:right w:w="180" w:type="dxa"/>
+            </w:tcMar>
+            <w:vAlign w:val="center"/>
+            <w:hideMark/>
+          </w:tcPr>
+          <w:p>
+            <w:r>
+              <w:t>Users struggle to understand how browser history influences future web experiences</w:t>
+            </w:r>
+          </w:p>
+        </w:tc>
+        <w:tc>
+          <w:tcPr>
+            <w:tcW w:w="0" w:type="auto"/>
+            <w:tcBorders>
+              <w:top w:val="single" w:sz="6" w:space="0" w:color="C4C7C5"/>
+              <w:left w:val="single" w:sz="6" w:space="0" w:color="C4C7C5"/>
+              <w:bottom w:val="single" w:sz="6" w:space="0" w:color="C4C7C5"/>
+              <w:right w:val="single" w:sz="6" w:space="0" w:color="C4C7C5"/>
+            </w:tcBorders>
+            <w:tcMar>
+              <w:top w:w="120" w:type="dxa"/>
+              <w:left w:w="180" w:type="dxa"/>
+              <w:bottom w:w="120" w:type="dxa"/>
+              <w:right w:w="180" w:type="dxa"/>
+            </w:tcMar>
+            <w:vAlign w:val="center"/>
+            <w:hideMark/>
+          </w:tcPr>
+          <w:p>
+            <w:r>
+              <w:t>Accepted</w:t>
+            </w:r>
+          </w:p>
+        </w:tc>
+      </w:tr>
+      <w:tr>
+        <w:trPr>
+          <w:tblCellSpacing w:w="15" w:type="dxa"/>
+        </w:trPr>
+        <w:tc>
+          <w:tcPr>
+            <w:tcW w:w="0" w:type="auto"/>
+            <w:tcBorders>
+              <w:top w:val="single" w:sz="6" w:space="0" w:color="C4C7C5"/>
+              <w:left w:val="single" w:sz="6" w:space="0" w:color="C4C7C5"/>
+              <w:bottom w:val="single" w:sz="6" w:space="0" w:color="C4C7C5"/>
+              <w:right w:val="single" w:sz="6" w:space="0" w:color="C4C7C5"/>
+            </w:tcBorders>
+            <w:tcMar>
+              <w:top w:w="120" w:type="dxa"/>
+              <w:left w:w="180" w:type="dxa"/>
+              <w:bottom w:w="120" w:type="dxa"/>
+              <w:right w:w="180" w:type="dxa"/>
+            </w:tcMar>
+            <w:vAlign w:val="center"/>
+            <w:hideMark/>
+          </w:tcPr>
+          <w:p>
+            <w:pPr>
+              <w:rPr>
+                <w:b/>
+                <w:bCs/>
+              </w:rPr>
+            </w:pPr>
+            <w:r>
+              <w:rPr>
+                <w:b/>
+                <w:bCs/>
+              </w:rPr>
+              <w:t>WI-037</w:t>
+            </w:r>
+          </w:p>
+        </w:tc>
+        <w:tc>
+          <w:tcPr>
+            <w:tcW w:w="0" w:type="auto"/>
+            <w:tcBorders>
+              <w:top w:val="single" w:sz="6" w:space="0" w:color="C4C7C5"/>
+              <w:left w:val="single" w:sz="6" w:space="0" w:color="C4C7C5"/>
+              <w:bottom w:val="single" w:sz="6" w:space="0" w:color="C4C7C5"/>
+              <w:right w:val="single" w:sz="6" w:space="0" w:color="C4C7C5"/>
+            </w:tcBorders>
+            <w:tcMar>
+              <w:top w:w="120" w:type="dxa"/>
+              <w:left w:w="180" w:type="dxa"/>
+              <w:bottom w:w="120" w:type="dxa"/>
+              <w:right w:w="180" w:type="dxa"/>
+            </w:tcMar>
+            <w:vAlign w:val="center"/>
+            <w:hideMark/>
+          </w:tcPr>
+          <w:p>
+            <w:r>
+              <w:t>Users struggle to understand why websites remember previous activity through cookies and stored data</w:t>
+            </w:r>
+          </w:p>
+        </w:tc>
+        <w:tc>
+          <w:tcPr>
+            <w:tcW w:w="0" w:type="auto"/>
+            <w:tcBorders>
+              <w:top w:val="single" w:sz="6" w:space="0" w:color="C4C7C5"/>
+              <w:left w:val="single" w:sz="6" w:space="0" w:color="C4C7C5"/>
+              <w:bottom w:val="single" w:sz="6" w:space="0" w:color="C4C7C5"/>
+              <w:right w:val="single" w:sz="6" w:space="0" w:color="C4C7C5"/>
+            </w:tcBorders>
+            <w:tcMar>
+              <w:top w:w="120" w:type="dxa"/>
+              <w:left w:w="180" w:type="dxa"/>
+              <w:bottom w:w="120" w:type="dxa"/>
+              <w:right w:w="180" w:type="dxa"/>
+            </w:tcMar>
+            <w:vAlign w:val="center"/>
+            <w:hideMark/>
+          </w:tcPr>
+          <w:p>
+            <w:r>
+              <w:t>Accepted</w:t>
+            </w:r>
+          </w:p>
+        </w:tc>
+      </w:tr>
+      <w:tr>
+        <w:trPr>
+          <w:tblCellSpacing w:w="15" w:type="dxa"/>
+        </w:trPr>
+        <w:tc>
+          <w:tcPr>
+            <w:tcW w:w="0" w:type="auto"/>
+            <w:tcBorders>
+              <w:top w:val="single" w:sz="6" w:space="0" w:color="C4C7C5"/>
+              <w:left w:val="single" w:sz="6" w:space="0" w:color="C4C7C5"/>
+              <w:bottom w:val="single" w:sz="6" w:space="0" w:color="C4C7C5"/>
+              <w:right w:val="single" w:sz="6" w:space="0" w:color="C4C7C5"/>
+            </w:tcBorders>
+            <w:tcMar>
+              <w:top w:w="120" w:type="dxa"/>
+              <w:left w:w="180" w:type="dxa"/>
+              <w:bottom w:w="120" w:type="dxa"/>
+              <w:right w:w="180" w:type="dxa"/>
+            </w:tcMar>
+            <w:vAlign w:val="center"/>
+            <w:hideMark/>
+          </w:tcPr>
+          <w:p>
+            <w:pPr>
+              <w:rPr>
+                <w:b/>
+                <w:bCs/>
+              </w:rPr>
+            </w:pPr>
+            <w:r>
+              <w:rPr>
+                <w:b/>
+                <w:bCs/>
+              </w:rPr>
+              <w:t>WI-038</w:t>
+            </w:r>
+          </w:p>
+        </w:tc>
+        <w:tc>
+          <w:tcPr>
+            <w:tcW w:w="0" w:type="auto"/>
+            <w:tcBorders>
+              <w:top w:val="single" w:sz="6" w:space="0" w:color="C4C7C5"/>
+              <w:left w:val="single" w:sz="6" w:space="0" w:color="C4C7C5"/>
+              <w:bottom w:val="single" w:sz="6" w:space="0" w:color="C4C7C5"/>
+              <w:right w:val="single" w:sz="6" w:space="0" w:color="C4C7C5"/>
+            </w:tcBorders>
+            <w:tcMar>
+              <w:top w:w="120" w:type="dxa"/>
+              <w:left w:w="180" w:type="dxa"/>
+              <w:bottom w:w="120" w:type="dxa"/>
+              <w:right w:w="180" w:type="dxa"/>
+            </w:tcMar>
+            <w:vAlign w:val="center"/>
+            <w:hideMark/>
+          </w:tcPr>
+          <w:p>
+            <w:r>
+              <w:t>Users struggle to distinguish between browser problems and website problems</w:t>
+            </w:r>
+          </w:p>
+        </w:tc>
+        <w:tc>
+          <w:tcPr>
+            <w:tcW w:w="0" w:type="auto"/>
+            <w:tcBorders>
+              <w:top w:val="single" w:sz="6" w:space="0" w:color="C4C7C5"/>
+              <w:left w:val="single" w:sz="6" w:space="0" w:color="C4C7C5"/>
+              <w:bottom w:val="single" w:sz="6" w:space="0" w:color="C4C7C5"/>
+              <w:right w:val="single" w:sz="6" w:space="0" w:color="C4C7C5"/>
+            </w:tcBorders>
+            <w:tcMar>
+              <w:top w:w="120" w:type="dxa"/>
+              <w:left w:w="180" w:type="dxa"/>
+              <w:bottom w:w="120" w:type="dxa"/>
+              <w:right w:w="180" w:type="dxa"/>
+            </w:tcMar>
+            <w:vAlign w:val="center"/>
+            <w:hideMark/>
+          </w:tcPr>
+          <w:p>
+            <w:r>
+              <w:t>Accepted</w:t>
+            </w:r>
+          </w:p>
+        </w:tc>
+      </w:tr>
+      <w:tr>
+        <w:trPr>
+          <w:tblCellSpacing w:w="15" w:type="dxa"/>
+        </w:trPr>
+        <w:tc>
+          <w:tcPr>
+            <w:tcW w:w="0" w:type="auto"/>
+            <w:tcBorders>
+              <w:top w:val="single" w:sz="6" w:space="0" w:color="C4C7C5"/>
+              <w:left w:val="single" w:sz="6" w:space="0" w:color="C4C7C5"/>
+              <w:bottom w:val="single" w:sz="6" w:space="0" w:color="C4C7C5"/>
+              <w:right w:val="single" w:sz="6" w:space="0" w:color="C4C7C5"/>
+            </w:tcBorders>
+            <w:tcMar>
+              <w:top w:w="120" w:type="dxa"/>
+              <w:left w:w="180" w:type="dxa"/>
+              <w:bottom w:w="120" w:type="dxa"/>
+              <w:right w:w="180" w:type="dxa"/>
+            </w:tcMar>
+            <w:vAlign w:val="center"/>
+            <w:hideMark/>
+          </w:tcPr>
+          <w:p>
+            <w:pPr>
+              <w:rPr>
+                <w:b/>
+                <w:bCs/>
+              </w:rPr>
+            </w:pPr>
+            <w:r>
+              <w:rPr>
+                <w:b/>
+                <w:bCs/>
+              </w:rPr>
+              <w:t>WI-039</w:t>
+            </w:r>
+          </w:p>
+        </w:tc>
+        <w:tc>
+          <w:tcPr>
+            <w:tcW w:w="0" w:type="auto"/>
+            <w:tcBorders>
+              <w:top w:val="single" w:sz="6" w:space="0" w:color="C4C7C5"/>
+              <w:left w:val="single" w:sz="6" w:space="0" w:color="C4C7C5"/>
+              <w:bottom w:val="single" w:sz="6" w:space="0" w:color="C4C7C5"/>
+              <w:right w:val="single" w:sz="6" w:space="0" w:color="C4C7C5"/>
+            </w:tcBorders>
+            <w:tcMar>
+              <w:top w:w="120" w:type="dxa"/>
+              <w:left w:w="180" w:type="dxa"/>
+              <w:bottom w:w="120" w:type="dxa"/>
+              <w:right w:w="180" w:type="dxa"/>
+            </w:tcMar>
+            <w:vAlign w:val="center"/>
+            <w:hideMark/>
+          </w:tcPr>
+          <w:p>
+            <w:r>
+              <w:t>Users struggle to understand why websites behave differently after clearing browser data</w:t>
+            </w:r>
+          </w:p>
+        </w:tc>
+        <w:tc>
+          <w:tcPr>
+            <w:tcW w:w="0" w:type="auto"/>
+            <w:tcBorders>
+              <w:top w:val="single" w:sz="6" w:space="0" w:color="C4C7C5"/>
+              <w:left w:val="single" w:sz="6" w:space="0" w:color="C4C7C5"/>
+              <w:bottom w:val="single" w:sz="6" w:space="0" w:color="C4C7C5"/>
+              <w:right w:val="single" w:sz="6" w:space="0" w:color="C4C7C5"/>
+            </w:tcBorders>
+            <w:tcMar>
+              <w:top w:w="120" w:type="dxa"/>
+              <w:left w:w="180" w:type="dxa"/>
+              <w:bottom w:w="120" w:type="dxa"/>
+              <w:right w:w="180" w:type="dxa"/>
+            </w:tcMar>
+            <w:vAlign w:val="center"/>
+            <w:hideMark/>
+          </w:tcPr>
+          <w:p>
+            <w:r>
+              <w:t>Accepted</w:t>
+            </w:r>
+          </w:p>
+        </w:tc>
+      </w:tr>
+      <w:tr>
+        <w:trPr>
+          <w:tblCellSpacing w:w="15" w:type="dxa"/>
+        </w:trPr>
+        <w:tc>
+          <w:tcPr>
+            <w:tcW w:w="0" w:type="auto"/>
+            <w:tcBorders>
+              <w:top w:val="single" w:sz="6" w:space="0" w:color="C4C7C5"/>
+              <w:left w:val="single" w:sz="6" w:space="0" w:color="C4C7C5"/>
+              <w:bottom w:val="single" w:sz="6" w:space="0" w:color="C4C7C5"/>
+              <w:right w:val="single" w:sz="6" w:space="0" w:color="C4C7C5"/>
+            </w:tcBorders>
+            <w:tcMar>
+              <w:top w:w="120" w:type="dxa"/>
+              <w:left w:w="180" w:type="dxa"/>
+              <w:bottom w:w="120" w:type="dxa"/>
+              <w:right w:w="180" w:type="dxa"/>
+            </w:tcMar>
+            <w:vAlign w:val="center"/>
+            <w:hideMark/>
+          </w:tcPr>
+          <w:p>
+            <w:pPr>
+              <w:rPr>
+                <w:b/>
+                <w:bCs/>
+              </w:rPr>
+            </w:pPr>
+            <w:r>
+              <w:rPr>
+                <w:b/>
+                <w:bCs/>
+              </w:rPr>
+              <w:t>WI-040</w:t>
+            </w:r>
+          </w:p>
+        </w:tc>
+        <w:tc>
+          <w:tcPr>
+            <w:tcW w:w="0" w:type="auto"/>
+            <w:tcBorders>
+              <w:top w:val="single" w:sz="6" w:space="0" w:color="C4C7C5"/>
+              <w:left w:val="single" w:sz="6" w:space="0" w:color="C4C7C5"/>
+              <w:bottom w:val="single" w:sz="6" w:space="0" w:color="C4C7C5"/>
+              <w:right w:val="single" w:sz="6" w:space="0" w:color="C4C7C5"/>
+            </w:tcBorders>
+            <w:tcMar>
+              <w:top w:w="120" w:type="dxa"/>
+              <w:left w:w="180" w:type="dxa"/>
+              <w:bottom w:w="120" w:type="dxa"/>
+              <w:right w:w="180" w:type="dxa"/>
+            </w:tcMar>
+            <w:vAlign w:val="center"/>
+            <w:hideMark/>
+          </w:tcPr>
+          <w:p>
+            <w:r>
+              <w:t>Users struggle to manage bookmarks and saved webpages as collections grow over time</w:t>
+            </w:r>
+          </w:p>
+        </w:tc>
+        <w:tc>
+          <w:tcPr>
+            <w:tcW w:w="0" w:type="auto"/>
+            <w:tcBorders>
+              <w:top w:val="single" w:sz="6" w:space="0" w:color="C4C7C5"/>
+              <w:left w:val="single" w:sz="6" w:space="0" w:color="C4C7C5"/>
+              <w:bottom w:val="single" w:sz="6" w:space="0" w:color="C4C7C5"/>
+              <w:right w:val="single" w:sz="6" w:space="0" w:color="C4C7C5"/>
+            </w:tcBorders>
+            <w:tcMar>
+              <w:top w:w="120" w:type="dxa"/>
+              <w:left w:w="180" w:type="dxa"/>
+              <w:bottom w:w="120" w:type="dxa"/>
+              <w:right w:w="180" w:type="dxa"/>
+            </w:tcMar>
+            <w:vAlign w:val="center"/>
+            <w:hideMark/>
+          </w:tcPr>
+          <w:p>
+            <w:r>
+              <w:t>Accepted</w:t>
+            </w:r>
+          </w:p>
+        </w:tc>
+      </w:tr>
+      <w:tr>
+        <w:trPr>
+          <w:tblCellSpacing w:w="15" w:type="dxa"/>
+        </w:trPr>
+        <w:tc>
+          <w:tcPr>
+            <w:tcW w:w="0" w:type="auto"/>
+            <w:tcBorders>
+              <w:top w:val="single" w:sz="6" w:space="0" w:color="C4C7C5"/>
+              <w:left w:val="single" w:sz="6" w:space="0" w:color="C4C7C5"/>
+              <w:bottom w:val="single" w:sz="6" w:space="0" w:color="C4C7C5"/>
+              <w:right w:val="single" w:sz="6" w:space="0" w:color="C4C7C5"/>
+            </w:tcBorders>
+            <w:tcMar>
+              <w:top w:w="120" w:type="dxa"/>
+              <w:left w:w="180" w:type="dxa"/>
+              <w:bottom w:w="120" w:type="dxa"/>
+              <w:right w:w="180" w:type="dxa"/>
+            </w:tcMar>
+            <w:vAlign w:val="center"/>
+            <w:hideMark/>
+          </w:tcPr>
+          <w:p>
+            <w:pPr>
+              <w:rPr>
+                <w:b/>
+                <w:bCs/>
+              </w:rPr>
+            </w:pPr>
+            <w:r>
+              <w:rPr>
+                <w:b/>
+                <w:bCs/>
+              </w:rPr>
+              <w:lastRenderedPageBreak/>
+              <w:t>WI-041</w:t>
+            </w:r>
+          </w:p>
+        </w:tc>
+        <w:tc>
+          <w:tcPr>
+            <w:tcW w:w="0" w:type="auto"/>
+            <w:tcBorders>
+              <w:top w:val="single" w:sz="6" w:space="0" w:color="C4C7C5"/>
+              <w:left w:val="single" w:sz="6" w:space="0" w:color="C4C7C5"/>
+              <w:bottom w:val="single" w:sz="6" w:space="0" w:color="C4C7C5"/>
+              <w:right w:val="single" w:sz="6" w:space="0" w:color="C4C7C5"/>
+            </w:tcBorders>
+            <w:tcMar>
+              <w:top w:w="120" w:type="dxa"/>
+              <w:left w:w="180" w:type="dxa"/>
+              <w:bottom w:w="120" w:type="dxa"/>
+              <w:right w:w="180" w:type="dxa"/>
+            </w:tcMar>
+            <w:vAlign w:val="center"/>
+            <w:hideMark/>
+          </w:tcPr>
+          <w:p>
+            <w:r>
+              <w:t>Users struggle to revisit previously viewed webpages after forgetting how they found them</w:t>
+            </w:r>
+          </w:p>
+        </w:tc>
+        <w:tc>
+          <w:tcPr>
+            <w:tcW w:w="0" w:type="auto"/>
+            <w:tcBorders>
+              <w:top w:val="single" w:sz="6" w:space="0" w:color="C4C7C5"/>
+              <w:left w:val="single" w:sz="6" w:space="0" w:color="C4C7C5"/>
+              <w:bottom w:val="single" w:sz="6" w:space="0" w:color="C4C7C5"/>
+              <w:right w:val="single" w:sz="6" w:space="0" w:color="C4C7C5"/>
+            </w:tcBorders>
+            <w:tcMar>
+              <w:top w:w="120" w:type="dxa"/>
+              <w:left w:w="180" w:type="dxa"/>
+              <w:bottom w:w="120" w:type="dxa"/>
+              <w:right w:w="180" w:type="dxa"/>
+            </w:tcMar>
+            <w:vAlign w:val="center"/>
+            <w:hideMark/>
+          </w:tcPr>
+          <w:p>
+            <w:r>
+              <w:t>Accepted</w:t>
+            </w:r>
+          </w:p>
+        </w:tc>
+      </w:tr>
+      <w:tr>
+        <w:trPr>
+          <w:tblCellSpacing w:w="15" w:type="dxa"/>
+        </w:trPr>
+        <w:tc>
+          <w:tcPr>
+            <w:tcW w:w="0" w:type="auto"/>
+            <w:tcBorders>
+              <w:top w:val="single" w:sz="6" w:space="0" w:color="C4C7C5"/>
+              <w:left w:val="single" w:sz="6" w:space="0" w:color="C4C7C5"/>
+              <w:bottom w:val="single" w:sz="6" w:space="0" w:color="C4C7C5"/>
+              <w:right w:val="single" w:sz="6" w:space="0" w:color="C4C7C5"/>
+            </w:tcBorders>
+            <w:tcMar>
+              <w:top w:w="120" w:type="dxa"/>
+              <w:left w:w="180" w:type="dxa"/>
+              <w:bottom w:w="120" w:type="dxa"/>
+              <w:right w:w="180" w:type="dxa"/>
+            </w:tcMar>
+            <w:vAlign w:val="center"/>
+            <w:hideMark/>
+          </w:tcPr>
+          <w:p>
+            <w:pPr>
+              <w:rPr>
+                <w:b/>
+                <w:bCs/>
+              </w:rPr>
+            </w:pPr>
+            <w:r>
+              <w:rPr>
+                <w:b/>
+                <w:bCs/>
+              </w:rPr>
+              <w:t>WI-042</w:t>
+            </w:r>
+          </w:p>
+        </w:tc>
+        <w:tc>
+          <w:tcPr>
+            <w:tcW w:w="0" w:type="auto"/>
+            <w:tcBorders>
+              <w:top w:val="single" w:sz="6" w:space="0" w:color="C4C7C5"/>
+              <w:left w:val="single" w:sz="6" w:space="0" w:color="C4C7C5"/>
+              <w:bottom w:val="single" w:sz="6" w:space="0" w:color="C4C7C5"/>
+              <w:right w:val="single" w:sz="6" w:space="0" w:color="C4C7C5"/>
+            </w:tcBorders>
+            <w:tcMar>
+              <w:top w:w="120" w:type="dxa"/>
+              <w:left w:w="180" w:type="dxa"/>
+              <w:bottom w:w="120" w:type="dxa"/>
+              <w:right w:w="180" w:type="dxa"/>
+            </w:tcMar>
+            <w:vAlign w:val="center"/>
+            <w:hideMark/>
+          </w:tcPr>
+          <w:p>
+            <w:r>
+              <w:t>Users struggle to organize information collected from multiple websites during research</w:t>
+            </w:r>
+          </w:p>
+        </w:tc>
+        <w:tc>
+          <w:tcPr>
+            <w:tcW w:w="0" w:type="auto"/>
+            <w:tcBorders>
+              <w:top w:val="single" w:sz="6" w:space="0" w:color="C4C7C5"/>
+              <w:left w:val="single" w:sz="6" w:space="0" w:color="C4C7C5"/>
+              <w:bottom w:val="single" w:sz="6" w:space="0" w:color="C4C7C5"/>
+              <w:right w:val="single" w:sz="6" w:space="0" w:color="C4C7C5"/>
+            </w:tcBorders>
+            <w:tcMar>
+              <w:top w:w="120" w:type="dxa"/>
+              <w:left w:w="180" w:type="dxa"/>
+              <w:bottom w:w="120" w:type="dxa"/>
+              <w:right w:w="180" w:type="dxa"/>
+            </w:tcMar>
+            <w:vAlign w:val="center"/>
+            <w:hideMark/>
+          </w:tcPr>
+          <w:p>
+            <w:r>
+              <w:t>Accepted</w:t>
+            </w:r>
+          </w:p>
+        </w:tc>
+      </w:tr>
+      <w:tr>
+        <w:trPr>
+          <w:tblCellSpacing w:w="15" w:type="dxa"/>
+        </w:trPr>
+        <w:tc>
+          <w:tcPr>
+            <w:tcW w:w="0" w:type="auto"/>
+            <w:tcBorders>
+              <w:top w:val="single" w:sz="6" w:space="0" w:color="C4C7C5"/>
+              <w:left w:val="single" w:sz="6" w:space="0" w:color="C4C7C5"/>
+              <w:bottom w:val="single" w:sz="6" w:space="0" w:color="C4C7C5"/>
+              <w:right w:val="single" w:sz="6" w:space="0" w:color="C4C7C5"/>
+            </w:tcBorders>
+            <w:tcMar>
+              <w:top w:w="120" w:type="dxa"/>
+              <w:left w:w="180" w:type="dxa"/>
+              <w:bottom w:w="120" w:type="dxa"/>
+              <w:right w:w="180" w:type="dxa"/>
+            </w:tcMar>
+            <w:vAlign w:val="center"/>
+            <w:hideMark/>
+          </w:tcPr>
+          <w:p>
+            <w:pPr>
+              <w:rPr>
+                <w:b/>
+                <w:bCs/>
+              </w:rPr>
+            </w:pPr>
+            <w:r>
+              <w:rPr>
+                <w:b/>
+                <w:bCs/>
+              </w:rPr>
+              <w:t>WI-043</w:t>
+            </w:r>
+          </w:p>
+        </w:tc>
+        <w:tc>
+          <w:tcPr>
+            <w:tcW w:w="0" w:type="auto"/>
+            <w:tcBorders>
+              <w:top w:val="single" w:sz="6" w:space="0" w:color="C4C7C5"/>
+              <w:left w:val="single" w:sz="6" w:space="0" w:color="C4C7C5"/>
+              <w:bottom w:val="single" w:sz="6" w:space="0" w:color="C4C7C5"/>
+              <w:right w:val="single" w:sz="6" w:space="0" w:color="C4C7C5"/>
+            </w:tcBorders>
+            <w:tcMar>
+              <w:top w:w="120" w:type="dxa"/>
+              <w:left w:w="180" w:type="dxa"/>
+              <w:bottom w:w="120" w:type="dxa"/>
+              <w:right w:w="180" w:type="dxa"/>
+            </w:tcMar>
+            <w:vAlign w:val="center"/>
+            <w:hideMark/>
+          </w:tcPr>
+          <w:p>
+            <w:r>
+              <w:t>Users struggle to continue interrupted web tasks across different devices</w:t>
+            </w:r>
+          </w:p>
+        </w:tc>
+        <w:tc>
+          <w:tcPr>
+            <w:tcW w:w="0" w:type="auto"/>
+            <w:tcBorders>
+              <w:top w:val="single" w:sz="6" w:space="0" w:color="C4C7C5"/>
+              <w:left w:val="single" w:sz="6" w:space="0" w:color="C4C7C5"/>
+              <w:bottom w:val="single" w:sz="6" w:space="0" w:color="C4C7C5"/>
+              <w:right w:val="single" w:sz="6" w:space="0" w:color="C4C7C5"/>
+            </w:tcBorders>
+            <w:tcMar>
+              <w:top w:w="120" w:type="dxa"/>
+              <w:left w:w="180" w:type="dxa"/>
+              <w:bottom w:w="120" w:type="dxa"/>
+              <w:right w:w="180" w:type="dxa"/>
+            </w:tcMar>
+            <w:vAlign w:val="center"/>
+            <w:hideMark/>
+          </w:tcPr>
+          <w:p>
+            <w:r>
+              <w:t>Accepted</w:t>
+            </w:r>
+          </w:p>
+        </w:tc>
+      </w:tr>
+      <w:tr>
+        <w:trPr>
+          <w:tblCellSpacing w:w="15" w:type="dxa"/>
+        </w:trPr>
+        <w:tc>
+          <w:tcPr>
+            <w:tcW w:w="0" w:type="auto"/>
+            <w:tcBorders>
+              <w:top w:val="single" w:sz="6" w:space="0" w:color="C4C7C5"/>
+              <w:left w:val="single" w:sz="6" w:space="0" w:color="C4C7C5"/>
+              <w:bottom w:val="single" w:sz="6" w:space="0" w:color="C4C7C5"/>
+              <w:right w:val="single" w:sz="6" w:space="0" w:color="C4C7C5"/>
+            </w:tcBorders>
+            <w:tcMar>
+              <w:top w:w="120" w:type="dxa"/>
+              <w:left w:w="180" w:type="dxa"/>
+              <w:bottom w:w="120" w:type="dxa"/>
+              <w:right w:w="180" w:type="dxa"/>
+            </w:tcMar>
+            <w:vAlign w:val="center"/>
+            <w:hideMark/>
+          </w:tcPr>
+          <w:p>
+            <w:pPr>
+              <w:rPr>
+                <w:b/>
+                <w:bCs/>
+              </w:rPr>
+            </w:pPr>
+            <w:r>
+              <w:rPr>
+                <w:b/>
+                <w:bCs/>
+              </w:rPr>
+              <w:t>WI-044</w:t>
+            </w:r>
+          </w:p>
+        </w:tc>
+        <w:tc>
+          <w:tcPr>
+            <w:tcW w:w="0" w:type="auto"/>
+            <w:tcBorders>
+              <w:top w:val="single" w:sz="6" w:space="0" w:color="C4C7C5"/>
+              <w:left w:val="single" w:sz="6" w:space="0" w:color="C4C7C5"/>
+              <w:bottom w:val="single" w:sz="6" w:space="0" w:color="C4C7C5"/>
+              <w:right w:val="single" w:sz="6" w:space="0" w:color="C4C7C5"/>
+            </w:tcBorders>
+            <w:tcMar>
+              <w:top w:w="120" w:type="dxa"/>
+              <w:left w:w="180" w:type="dxa"/>
+              <w:bottom w:w="120" w:type="dxa"/>
+              <w:right w:w="180" w:type="dxa"/>
+            </w:tcMar>
+            <w:vAlign w:val="center"/>
+            <w:hideMark/>
+          </w:tcPr>
+          <w:p>
+            <w:r>
+              <w:t>Users struggle to understand how websites share information with external services</w:t>
+            </w:r>
+          </w:p>
+        </w:tc>
+        <w:tc>
+          <w:tcPr>
+            <w:tcW w:w="0" w:type="auto"/>
+            <w:tcBorders>
+              <w:top w:val="single" w:sz="6" w:space="0" w:color="C4C7C5"/>
+              <w:left w:val="single" w:sz="6" w:space="0" w:color="C4C7C5"/>
+              <w:bottom w:val="single" w:sz="6" w:space="0" w:color="C4C7C5"/>
+              <w:right w:val="single" w:sz="6" w:space="0" w:color="C4C7C5"/>
+            </w:tcBorders>
+            <w:tcMar>
+              <w:top w:w="120" w:type="dxa"/>
+              <w:left w:w="180" w:type="dxa"/>
+              <w:bottom w:w="120" w:type="dxa"/>
+              <w:right w:w="180" w:type="dxa"/>
+            </w:tcMar>
+            <w:vAlign w:val="center"/>
+            <w:hideMark/>
+          </w:tcPr>
+          <w:p>
+            <w:r>
+              <w:t>Accepted</w:t>
+            </w:r>
+          </w:p>
+        </w:tc>
+      </w:tr>
+      <w:tr>
+        <w:trPr>
+          <w:tblCellSpacing w:w="15" w:type="dxa"/>
+        </w:trPr>
+        <w:tc>
+          <w:tcPr>
+            <w:tcW w:w="0" w:type="auto"/>
+            <w:tcBorders>
+              <w:top w:val="single" w:sz="6" w:space="0" w:color="C4C7C5"/>
+              <w:left w:val="single" w:sz="6" w:space="0" w:color="C4C7C5"/>
+              <w:bottom w:val="single" w:sz="6" w:space="0" w:color="C4C7C5"/>
+              <w:right w:val="single" w:sz="6" w:space="0" w:color="C4C7C5"/>
+            </w:tcBorders>
+            <w:tcMar>
+              <w:top w:w="120" w:type="dxa"/>
+              <w:left w:w="180" w:type="dxa"/>
+              <w:bottom w:w="120" w:type="dxa"/>
+              <w:right w:w="180" w:type="dxa"/>
+            </w:tcMar>
+            <w:vAlign w:val="center"/>
+            <w:hideMark/>
+          </w:tcPr>
+          <w:p>
+            <w:pPr>
+              <w:rPr>
+                <w:b/>
+                <w:bCs/>
+              </w:rPr>
+            </w:pPr>
+            <w:r>
+              <w:rPr>
+                <w:b/>
+                <w:bCs/>
+              </w:rPr>
+              <w:t>WI-045</w:t>
+            </w:r>
+          </w:p>
+        </w:tc>
+        <w:tc>
+          <w:tcPr>
+            <w:tcW w:w="0" w:type="auto"/>
+            <w:tcBorders>
+              <w:top w:val="single" w:sz="6" w:space="0" w:color="C4C7C5"/>
+              <w:left w:val="single" w:sz="6" w:space="0" w:color="C4C7C5"/>
+              <w:bottom w:val="single" w:sz="6" w:space="0" w:color="C4C7C5"/>
+              <w:right w:val="single" w:sz="6" w:space="0" w:color="C4C7C5"/>
+            </w:tcBorders>
+            <w:tcMar>
+              <w:top w:w="120" w:type="dxa"/>
+              <w:left w:w="180" w:type="dxa"/>
+              <w:bottom w:w="120" w:type="dxa"/>
+              <w:right w:w="180" w:type="dxa"/>
+            </w:tcMar>
+            <w:vAlign w:val="center"/>
+            <w:hideMark/>
+          </w:tcPr>
+          <w:p>
+            <w:r>
+              <w:t>Users struggle to understand how third-party services influence website functionality</w:t>
+            </w:r>
+          </w:p>
+        </w:tc>
+        <w:tc>
+          <w:tcPr>
+            <w:tcW w:w="0" w:type="auto"/>
+            <w:tcBorders>
+              <w:top w:val="single" w:sz="6" w:space="0" w:color="C4C7C5"/>
+              <w:left w:val="single" w:sz="6" w:space="0" w:color="C4C7C5"/>
+              <w:bottom w:val="single" w:sz="6" w:space="0" w:color="C4C7C5"/>
+              <w:right w:val="single" w:sz="6" w:space="0" w:color="C4C7C5"/>
+            </w:tcBorders>
+            <w:tcMar>
+              <w:top w:w="120" w:type="dxa"/>
+              <w:left w:w="180" w:type="dxa"/>
+              <w:bottom w:w="120" w:type="dxa"/>
+              <w:right w:w="180" w:type="dxa"/>
+            </w:tcMar>
+            <w:vAlign w:val="center"/>
+            <w:hideMark/>
+          </w:tcPr>
+          <w:p>
+            <w:r>
+              <w:t>Accepted</w:t>
+            </w:r>
+          </w:p>
+        </w:tc>
+      </w:tr>
+      <w:tr>
+        <w:trPr>
+          <w:tblCellSpacing w:w="15" w:type="dxa"/>
+        </w:trPr>
+        <w:tc>
+          <w:tcPr>
+            <w:tcW w:w="0" w:type="auto"/>
+            <w:tcBorders>
+              <w:top w:val="single" w:sz="6" w:space="0" w:color="C4C7C5"/>
+              <w:left w:val="single" w:sz="6" w:space="0" w:color="C4C7C5"/>
+              <w:bottom w:val="single" w:sz="6" w:space="0" w:color="C4C7C5"/>
+              <w:right w:val="single" w:sz="6" w:space="0" w:color="C4C7C5"/>
+            </w:tcBorders>
+            <w:tcMar>
+              <w:top w:w="120" w:type="dxa"/>
+              <w:left w:w="180" w:type="dxa"/>
+              <w:bottom w:w="120" w:type="dxa"/>
+              <w:right w:w="180" w:type="dxa"/>
+            </w:tcMar>
+            <w:vAlign w:val="center"/>
+            <w:hideMark/>
+          </w:tcPr>
+          <w:p>
+            <w:pPr>
+              <w:rPr>
+                <w:b/>
+                <w:bCs/>
+              </w:rPr>
+            </w:pPr>
+            <w:r>
+              <w:rPr>
+                <w:b/>
+                <w:bCs/>
+              </w:rPr>
+              <w:t>WI-046</w:t>
+            </w:r>
+          </w:p>
+        </w:tc>
+        <w:tc>
+          <w:tcPr>
+            <w:tcW w:w="0" w:type="auto"/>
+            <w:tcBorders>
+              <w:top w:val="single" w:sz="6" w:space="0" w:color="C4C7C5"/>
+              <w:left w:val="single" w:sz="6" w:space="0" w:color="C4C7C5"/>
+              <w:bottom w:val="single" w:sz="6" w:space="0" w:color="C4C7C5"/>
+              <w:right w:val="single" w:sz="6" w:space="0" w:color="C4C7C5"/>
+            </w:tcBorders>
+            <w:tcMar>
+              <w:top w:w="120" w:type="dxa"/>
+              <w:left w:w="180" w:type="dxa"/>
+              <w:bottom w:w="120" w:type="dxa"/>
+              <w:right w:w="180" w:type="dxa"/>
+            </w:tcMar>
+            <w:vAlign w:val="center"/>
+            <w:hideMark/>
+          </w:tcPr>
+          <w:p>
+            <w:r>
+              <w:t>Users struggle to understand why websites require browser permissions for location, camera, microphone, or notifications</w:t>
+            </w:r>
+          </w:p>
+        </w:tc>
+        <w:tc>
+          <w:tcPr>
+            <w:tcW w:w="0" w:type="auto"/>
+            <w:tcBorders>
+              <w:top w:val="single" w:sz="6" w:space="0" w:color="C4C7C5"/>
+              <w:left w:val="single" w:sz="6" w:space="0" w:color="C4C7C5"/>
+              <w:bottom w:val="single" w:sz="6" w:space="0" w:color="C4C7C5"/>
+              <w:right w:val="single" w:sz="6" w:space="0" w:color="C4C7C5"/>
+            </w:tcBorders>
+            <w:tcMar>
+              <w:top w:w="120" w:type="dxa"/>
+              <w:left w:w="180" w:type="dxa"/>
+              <w:bottom w:w="120" w:type="dxa"/>
+              <w:right w:w="180" w:type="dxa"/>
+            </w:tcMar>
+            <w:vAlign w:val="center"/>
+            <w:hideMark/>
+          </w:tcPr>
+          <w:p>
+            <w:r>
+              <w:t>Accepted</w:t>
+            </w:r>
+          </w:p>
+        </w:tc>
+      </w:tr>
+      <w:tr>
+        <w:trPr>
+          <w:tblCellSpacing w:w="15" w:type="dxa"/>
+        </w:trPr>
+        <w:tc>
+          <w:tcPr>
+            <w:tcW w:w="0" w:type="auto"/>
+            <w:tcBorders>
+              <w:top w:val="single" w:sz="6" w:space="0" w:color="C4C7C5"/>
+              <w:left w:val="single" w:sz="6" w:space="0" w:color="C4C7C5"/>
+              <w:bottom w:val="single" w:sz="6" w:space="0" w:color="C4C7C5"/>
+              <w:right w:val="single" w:sz="6" w:space="0" w:color="C4C7C5"/>
+            </w:tcBorders>
+            <w:tcMar>
+              <w:top w:w="120" w:type="dxa"/>
+              <w:left w:w="180" w:type="dxa"/>
+              <w:bottom w:w="120" w:type="dxa"/>
+              <w:right w:w="180" w:type="dxa"/>
+            </w:tcMar>
+            <w:vAlign w:val="center"/>
+            <w:hideMark/>
+          </w:tcPr>
+          <w:p>
+            <w:pPr>
+              <w:rPr>
+                <w:b/>
+                <w:bCs/>
+              </w:rPr>
+            </w:pPr>
+            <w:r>
+              <w:rPr>
+                <w:b/>
+                <w:bCs/>
+              </w:rPr>
+              <w:t>WI-047</w:t>
+            </w:r>
+          </w:p>
+        </w:tc>
+        <w:tc>
+          <w:tcPr>
+            <w:tcW w:w="0" w:type="auto"/>
+            <w:tcBorders>
+              <w:top w:val="single" w:sz="6" w:space="0" w:color="C4C7C5"/>
+              <w:left w:val="single" w:sz="6" w:space="0" w:color="C4C7C5"/>
+              <w:bottom w:val="single" w:sz="6" w:space="0" w:color="C4C7C5"/>
+              <w:right w:val="single" w:sz="6" w:space="0" w:color="C4C7C5"/>
+            </w:tcBorders>
+            <w:tcMar>
+              <w:top w:w="120" w:type="dxa"/>
+              <w:left w:w="180" w:type="dxa"/>
+              <w:bottom w:w="120" w:type="dxa"/>
+              <w:right w:w="180" w:type="dxa"/>
+            </w:tcMar>
+            <w:vAlign w:val="center"/>
+            <w:hideMark/>
+          </w:tcPr>
+          <w:p>
+            <w:r>
+              <w:t>Users struggle to understand the relationship between browsers, websites, extensions, and web applications</w:t>
+            </w:r>
+          </w:p>
+        </w:tc>
+        <w:tc>
+          <w:tcPr>
+            <w:tcW w:w="0" w:type="auto"/>
+            <w:tcBorders>
+              <w:top w:val="single" w:sz="6" w:space="0" w:color="C4C7C5"/>
+              <w:left w:val="single" w:sz="6" w:space="0" w:color="C4C7C5"/>
+              <w:bottom w:val="single" w:sz="6" w:space="0" w:color="C4C7C5"/>
+              <w:right w:val="single" w:sz="6" w:space="0" w:color="C4C7C5"/>
+            </w:tcBorders>
+            <w:tcMar>
+              <w:top w:w="120" w:type="dxa"/>
+              <w:left w:w="180" w:type="dxa"/>
+              <w:bottom w:w="120" w:type="dxa"/>
+              <w:right w:w="180" w:type="dxa"/>
+            </w:tcMar>
+            <w:vAlign w:val="center"/>
+            <w:hideMark/>
+          </w:tcPr>
+          <w:p>
+            <w:r>
+              <w:t>Accepted</w:t>
+            </w:r>
+          </w:p>
+        </w:tc>
+      </w:tr>
+      <w:tr>
+        <w:trPr>
+          <w:tblCellSpacing w:w="15" w:type="dxa"/>
+        </w:trPr>
+        <w:tc>
+          <w:tcPr>
+            <w:tcW w:w="0" w:type="auto"/>
+            <w:tcBorders>
+              <w:top w:val="single" w:sz="6" w:space="0" w:color="C4C7C5"/>
+              <w:left w:val="single" w:sz="6" w:space="0" w:color="C4C7C5"/>
+              <w:bottom w:val="single" w:sz="6" w:space="0" w:color="C4C7C5"/>
+              <w:right w:val="single" w:sz="6" w:space="0" w:color="C4C7C5"/>
+            </w:tcBorders>
+            <w:tcMar>
+              <w:top w:w="120" w:type="dxa"/>
+              <w:left w:w="180" w:type="dxa"/>
+              <w:bottom w:w="120" w:type="dxa"/>
+              <w:right w:w="180" w:type="dxa"/>
+            </w:tcMar>
+            <w:vAlign w:val="center"/>
+            <w:hideMark/>
+          </w:tcPr>
+          <w:p>
+            <w:pPr>
+              <w:rPr>
+                <w:b/>
+                <w:bCs/>
+              </w:rPr>
+            </w:pPr>
+            <w:r>
+              <w:rPr>
+                <w:b/>
+                <w:bCs/>
+              </w:rPr>
+              <w:t>WI-048</w:t>
+            </w:r>
+          </w:p>
+        </w:tc>
+        <w:tc>
+          <w:tcPr>
+            <w:tcW w:w="0" w:type="auto"/>
+            <w:tcBorders>
+              <w:top w:val="single" w:sz="6" w:space="0" w:color="C4C7C5"/>
+              <w:left w:val="single" w:sz="6" w:space="0" w:color="C4C7C5"/>
+              <w:bottom w:val="single" w:sz="6" w:space="0" w:color="C4C7C5"/>
+              <w:right w:val="single" w:sz="6" w:space="0" w:color="C4C7C5"/>
+            </w:tcBorders>
+            <w:tcMar>
+              <w:top w:w="120" w:type="dxa"/>
+              <w:left w:w="180" w:type="dxa"/>
+              <w:bottom w:w="120" w:type="dxa"/>
+              <w:right w:w="180" w:type="dxa"/>
+            </w:tcMar>
+            <w:vAlign w:val="center"/>
+            <w:hideMark/>
+          </w:tcPr>
+          <w:p>
+            <w:r>
+              <w:t>Users struggle to maintain privacy while using shared or public computers</w:t>
+            </w:r>
+          </w:p>
+        </w:tc>
+        <w:tc>
+          <w:tcPr>
+            <w:tcW w:w="0" w:type="auto"/>
+            <w:tcBorders>
+              <w:top w:val="single" w:sz="6" w:space="0" w:color="C4C7C5"/>
+              <w:left w:val="single" w:sz="6" w:space="0" w:color="C4C7C5"/>
+              <w:bottom w:val="single" w:sz="6" w:space="0" w:color="C4C7C5"/>
+              <w:right w:val="single" w:sz="6" w:space="0" w:color="C4C7C5"/>
+            </w:tcBorders>
+            <w:tcMar>
+              <w:top w:w="120" w:type="dxa"/>
+              <w:left w:w="180" w:type="dxa"/>
+              <w:bottom w:w="120" w:type="dxa"/>
+              <w:right w:w="180" w:type="dxa"/>
+            </w:tcMar>
+            <w:vAlign w:val="center"/>
+            <w:hideMark/>
+          </w:tcPr>
+          <w:p>
+            <w:r>
+              <w:t>Accepted</w:t>
+            </w:r>
+          </w:p>
+        </w:tc>
+      </w:tr>
+      <w:tr>
+        <w:trPr>
+          <w:tblCellSpacing w:w="15" w:type="dxa"/>
+        </w:trPr>
+        <w:tc>
+          <w:tcPr>
+            <w:tcW w:w="0" w:type="auto"/>
+            <w:tcBorders>
+              <w:top w:val="single" w:sz="6" w:space="0" w:color="C4C7C5"/>
+              <w:left w:val="single" w:sz="6" w:space="0" w:color="C4C7C5"/>
+              <w:bottom w:val="single" w:sz="6" w:space="0" w:color="C4C7C5"/>
+              <w:right w:val="single" w:sz="6" w:space="0" w:color="C4C7C5"/>
+            </w:tcBorders>
+            <w:tcMar>
+              <w:top w:w="120" w:type="dxa"/>
+              <w:left w:w="180" w:type="dxa"/>
+              <w:bottom w:w="120" w:type="dxa"/>
+              <w:right w:w="180" w:type="dxa"/>
+            </w:tcMar>
+            <w:vAlign w:val="center"/>
+            <w:hideMark/>
+          </w:tcPr>
+          <w:p>
+            <w:pPr>
+              <w:rPr>
+                <w:b/>
+                <w:bCs/>
+              </w:rPr>
+            </w:pPr>
+            <w:r>
+              <w:rPr>
+                <w:b/>
+                <w:bCs/>
+              </w:rPr>
+              <w:t>WI-049</w:t>
+            </w:r>
+          </w:p>
+        </w:tc>
+        <w:tc>
+          <w:tcPr>
+            <w:tcW w:w="0" w:type="auto"/>
+            <w:tcBorders>
+              <w:top w:val="single" w:sz="6" w:space="0" w:color="C4C7C5"/>
+              <w:left w:val="single" w:sz="6" w:space="0" w:color="C4C7C5"/>
+              <w:bottom w:val="single" w:sz="6" w:space="0" w:color="C4C7C5"/>
+              <w:right w:val="single" w:sz="6" w:space="0" w:color="C4C7C5"/>
+            </w:tcBorders>
+            <w:tcMar>
+              <w:top w:w="120" w:type="dxa"/>
+              <w:left w:w="180" w:type="dxa"/>
+              <w:bottom w:w="120" w:type="dxa"/>
+              <w:right w:w="180" w:type="dxa"/>
+            </w:tcMar>
+            <w:vAlign w:val="center"/>
+            <w:hideMark/>
+          </w:tcPr>
+          <w:p>
+            <w:r>
+              <w:t>Users struggle to recognize long-term digital footprints created through web activity</w:t>
+            </w:r>
+          </w:p>
+        </w:tc>
+        <w:tc>
+          <w:tcPr>
+            <w:tcW w:w="0" w:type="auto"/>
+            <w:tcBorders>
+              <w:top w:val="single" w:sz="6" w:space="0" w:color="C4C7C5"/>
+              <w:left w:val="single" w:sz="6" w:space="0" w:color="C4C7C5"/>
+              <w:bottom w:val="single" w:sz="6" w:space="0" w:color="C4C7C5"/>
+              <w:right w:val="single" w:sz="6" w:space="0" w:color="C4C7C5"/>
+            </w:tcBorders>
+            <w:tcMar>
+              <w:top w:w="120" w:type="dxa"/>
+              <w:left w:w="180" w:type="dxa"/>
+              <w:bottom w:w="120" w:type="dxa"/>
+              <w:right w:w="180" w:type="dxa"/>
+            </w:tcMar>
+            <w:vAlign w:val="center"/>
+            <w:hideMark/>
+          </w:tcPr>
+          <w:p>
+            <w:r>
+              <w:t>Accepted</w:t>
+            </w:r>
+          </w:p>
+        </w:tc>
+      </w:tr>
+      <w:tr>
+        <w:trPr>
+          <w:tblCellSpacing w:w="15" w:type="dxa"/>
+        </w:trPr>
+        <w:tc>
+          <w:tcPr>
+            <w:tcW w:w="0" w:type="auto"/>
+            <w:tcBorders>
+              <w:top w:val="single" w:sz="6" w:space="0" w:color="C4C7C5"/>
+              <w:left w:val="single" w:sz="6" w:space="0" w:color="C4C7C5"/>
+              <w:bottom w:val="single" w:sz="6" w:space="0" w:color="C4C7C5"/>
+              <w:right w:val="single" w:sz="6" w:space="0" w:color="C4C7C5"/>
+            </w:tcBorders>
+            <w:tcMar>
+              <w:top w:w="120" w:type="dxa"/>
+              <w:left w:w="180" w:type="dxa"/>
+              <w:bottom w:w="120" w:type="dxa"/>
+              <w:right w:w="180" w:type="dxa"/>
+            </w:tcMar>
+            <w:vAlign w:val="center"/>
+            <w:hideMark/>
+          </w:tcPr>
+          <w:p>
+            <w:pPr>
+              <w:rPr>
+                <w:b/>
+                <w:bCs/>
+              </w:rPr>
+            </w:pPr>
+            <w:r>
+              <w:rPr>
+                <w:b/>
+                <w:bCs/>
+              </w:rPr>
+              <w:t>WI-050</w:t>
+            </w:r>
+          </w:p>
+        </w:tc>
+        <w:tc>
+          <w:tcPr>
+            <w:tcW w:w="0" w:type="auto"/>
+            <w:tcBorders>
+              <w:top w:val="single" w:sz="6" w:space="0" w:color="C4C7C5"/>
+              <w:left w:val="single" w:sz="6" w:space="0" w:color="C4C7C5"/>
+              <w:bottom w:val="single" w:sz="6" w:space="0" w:color="C4C7C5"/>
+              <w:right w:val="single" w:sz="6" w:space="0" w:color="C4C7C5"/>
+            </w:tcBorders>
+            <w:tcMar>
+              <w:top w:w="120" w:type="dxa"/>
+              <w:left w:w="180" w:type="dxa"/>
+              <w:bottom w:w="120" w:type="dxa"/>
+              <w:right w:w="180" w:type="dxa"/>
+            </w:tcMar>
+            <w:vAlign w:val="center"/>
+            <w:hideMark/>
+          </w:tcPr>
+          <w:p>
+            <w:r>
+              <w:t>Users gradually lose awareness of how their online identity becomes distributed across interconnected web services</w:t>
+            </w:r>
+          </w:p>
+        </w:tc>
+        <w:tc>
+          <w:tcPr>
+            <w:tcW w:w="0" w:type="auto"/>
+            <w:tcBorders>
+              <w:top w:val="single" w:sz="6" w:space="0" w:color="C4C7C5"/>
+              <w:left w:val="single" w:sz="6" w:space="0" w:color="C4C7C5"/>
+              <w:bottom w:val="single" w:sz="6" w:space="0" w:color="C4C7C5"/>
+              <w:right w:val="single" w:sz="6" w:space="0" w:color="C4C7C5"/>
+            </w:tcBorders>
+            <w:tcMar>
+              <w:top w:w="120" w:type="dxa"/>
+              <w:left w:w="180" w:type="dxa"/>
+              <w:bottom w:w="120" w:type="dxa"/>
+              <w:right w:w="180" w:type="dxa"/>
+            </w:tcMar>
+            <w:vAlign w:val="center"/>
+            <w:hideMark/>
+          </w:tcPr>
+          <w:p>
+            <w:r>
+              <w:t>Accepted</w:t>
+            </w:r>
+          </w:p>
+        </w:tc>
+      </w:tr>
     </w:tbl>
+    <w:p>
+      <w:pPr>
+        <w:rPr>
+          <w:b/>
+          <w:bCs/>
+        </w:rPr>
+      </w:pPr>
+    </w:p>
     <w:p>
       <w:pPr>
         <w:rPr>
@@ -13064,6 +15264,7 @@
           <w:b/>
           <w:bCs/>
         </w:rPr>
+        <w:lastRenderedPageBreak/>
         <w:t>Registry Statistics</w:t>
       </w:r>
     </w:p>
@@ -13317,40 +15518,39 @@
               <w:t>1</w:t>
             </w:r>
             <w:r>
-              <w:t>50</w:t>
-            </w:r>
-          </w:p>
-        </w:tc>
-      </w:tr>
-      <w:tr>
-        <w:trPr>
-          <w:tblCellSpacing w:w="15" w:type="dxa"/>
-        </w:trPr>
-        <w:tc>
-          <w:tcPr>
-            <w:tcW w:w="0" w:type="auto"/>
-            <w:tcBorders>
-              <w:top w:val="single" w:sz="6" w:space="0" w:color="C4C7C5"/>
-              <w:left w:val="single" w:sz="6" w:space="0" w:color="C4C7C5"/>
-              <w:bottom w:val="single" w:sz="6" w:space="0" w:color="C4C7C5"/>
-              <w:right w:val="single" w:sz="6" w:space="0" w:color="C4C7C5"/>
-            </w:tcBorders>
-            <w:tcMar>
-              <w:top w:w="120" w:type="dxa"/>
-              <w:left w:w="180" w:type="dxa"/>
-              <w:bottom w:w="120" w:type="dxa"/>
-              <w:right w:w="180" w:type="dxa"/>
-            </w:tcMar>
-            <w:vAlign w:val="center"/>
-            <w:hideMark/>
-          </w:tcPr>
-          <w:p>
-            <w:r>
-              <w:rPr>
-                <w:b/>
-                <w:bCs/>
-              </w:rPr>
-              <w:lastRenderedPageBreak/>
+              <w:t>75</w:t>
+            </w:r>
+          </w:p>
+        </w:tc>
+      </w:tr>
+      <w:tr>
+        <w:trPr>
+          <w:tblCellSpacing w:w="15" w:type="dxa"/>
+        </w:trPr>
+        <w:tc>
+          <w:tcPr>
+            <w:tcW w:w="0" w:type="auto"/>
+            <w:tcBorders>
+              <w:top w:val="single" w:sz="6" w:space="0" w:color="C4C7C5"/>
+              <w:left w:val="single" w:sz="6" w:space="0" w:color="C4C7C5"/>
+              <w:bottom w:val="single" w:sz="6" w:space="0" w:color="C4C7C5"/>
+              <w:right w:val="single" w:sz="6" w:space="0" w:color="C4C7C5"/>
+            </w:tcBorders>
+            <w:tcMar>
+              <w:top w:w="120" w:type="dxa"/>
+              <w:left w:w="180" w:type="dxa"/>
+              <w:bottom w:w="120" w:type="dxa"/>
+              <w:right w:w="180" w:type="dxa"/>
+            </w:tcMar>
+            <w:vAlign w:val="center"/>
+            <w:hideMark/>
+          </w:tcPr>
+          <w:p>
+            <w:r>
+              <w:rPr>
+                <w:b/>
+                <w:bCs/>
+              </w:rPr>
               <w:t>Candidate</w:t>
             </w:r>
           </w:p>
@@ -13606,6 +15806,7 @@
         </w:numPr>
       </w:pPr>
       <w:r>
+        <w:lastRenderedPageBreak/>
         <w:t>All references to Human Frictions within Patterns, Principles, Research Papers, and other ATLAS artifacts shall use the official APIDs defined in this Registry.</w:t>
       </w:r>
     </w:p>
@@ -13787,7 +15988,6 @@
                 <w:b/>
                 <w:bCs/>
               </w:rPr>
-              <w:lastRenderedPageBreak/>
               <w:t>Repository</w:t>
             </w:r>
           </w:p>

</xml_diff>

<commit_message>
Add DW volumes; reorganize Human-Frictions
Add two DW Desktop Workspace volumes (DW Volume 01–02). Rename/reorganize Human-Frictions subfolders to use shortened prefixes and em-dash separators (FF, OS, WI) and move corresponding volume files. Update binary documents: atlas/Registries/APID-Registry.docx, atlas/Registries/Category-Registry.docx, and atlas/metrics/Human Friction Metrics.docx.
</commit_message>
<xml_diff>
--- a/atlas/Registries/APID-Registry.docx
+++ b/atlas/Registries/APID-Registry.docx
@@ -15265,6 +15265,4582 @@
           <w:bCs/>
         </w:rPr>
         <w:lastRenderedPageBreak/>
+        <w:t>Category: Desktop &amp; Workspace Management (DW)</w:t>
+      </w:r>
+    </w:p>
+    <w:tbl>
+      <w:tblPr>
+        <w:tblW w:w="0" w:type="auto"/>
+        <w:tblCellSpacing w:w="15" w:type="dxa"/>
+        <w:tblCellMar>
+          <w:top w:w="15" w:type="dxa"/>
+          <w:left w:w="15" w:type="dxa"/>
+          <w:bottom w:w="15" w:type="dxa"/>
+          <w:right w:w="15" w:type="dxa"/>
+        </w:tblCellMar>
+        <w:tblLook w:val="04A0" w:firstRow="1" w:lastRow="0" w:firstColumn="1" w:lastColumn="0" w:noHBand="0" w:noVBand="1"/>
+      </w:tblPr>
+      <w:tblGrid>
+        <w:gridCol w:w="1085"/>
+        <w:gridCol w:w="6498"/>
+        <w:gridCol w:w="1427"/>
+      </w:tblGrid>
+      <w:tr>
+        <w:trPr>
+          <w:tblHeader/>
+          <w:tblCellSpacing w:w="15" w:type="dxa"/>
+        </w:trPr>
+        <w:tc>
+          <w:tcPr>
+            <w:tcW w:w="0" w:type="auto"/>
+            <w:tcBorders>
+              <w:top w:val="single" w:sz="6" w:space="0" w:color="C4C7C5"/>
+              <w:left w:val="single" w:sz="6" w:space="0" w:color="C4C7C5"/>
+              <w:bottom w:val="single" w:sz="6" w:space="0" w:color="C4C7C5"/>
+              <w:right w:val="single" w:sz="6" w:space="0" w:color="C4C7C5"/>
+            </w:tcBorders>
+            <w:tcMar>
+              <w:top w:w="120" w:type="dxa"/>
+              <w:left w:w="180" w:type="dxa"/>
+              <w:bottom w:w="120" w:type="dxa"/>
+              <w:right w:w="180" w:type="dxa"/>
+            </w:tcMar>
+            <w:vAlign w:val="center"/>
+            <w:hideMark/>
+          </w:tcPr>
+          <w:p>
+            <w:pPr>
+              <w:rPr>
+                <w:b/>
+                <w:bCs/>
+              </w:rPr>
+            </w:pPr>
+            <w:r>
+              <w:rPr>
+                <w:b/>
+                <w:bCs/>
+              </w:rPr>
+              <w:t>APID</w:t>
+            </w:r>
+          </w:p>
+        </w:tc>
+        <w:tc>
+          <w:tcPr>
+            <w:tcW w:w="0" w:type="auto"/>
+            <w:tcBorders>
+              <w:top w:val="single" w:sz="6" w:space="0" w:color="C4C7C5"/>
+              <w:left w:val="single" w:sz="6" w:space="0" w:color="C4C7C5"/>
+              <w:bottom w:val="single" w:sz="6" w:space="0" w:color="C4C7C5"/>
+              <w:right w:val="single" w:sz="6" w:space="0" w:color="C4C7C5"/>
+            </w:tcBorders>
+            <w:tcMar>
+              <w:top w:w="120" w:type="dxa"/>
+              <w:left w:w="180" w:type="dxa"/>
+              <w:bottom w:w="120" w:type="dxa"/>
+              <w:right w:w="180" w:type="dxa"/>
+            </w:tcMar>
+            <w:vAlign w:val="center"/>
+            <w:hideMark/>
+          </w:tcPr>
+          <w:p>
+            <w:pPr>
+              <w:rPr>
+                <w:b/>
+                <w:bCs/>
+              </w:rPr>
+            </w:pPr>
+            <w:r>
+              <w:rPr>
+                <w:b/>
+                <w:bCs/>
+              </w:rPr>
+              <w:t>Human Friction</w:t>
+            </w:r>
+          </w:p>
+        </w:tc>
+        <w:tc>
+          <w:tcPr>
+            <w:tcW w:w="0" w:type="auto"/>
+            <w:tcBorders>
+              <w:top w:val="single" w:sz="6" w:space="0" w:color="C4C7C5"/>
+              <w:left w:val="single" w:sz="6" w:space="0" w:color="C4C7C5"/>
+              <w:bottom w:val="single" w:sz="6" w:space="0" w:color="C4C7C5"/>
+              <w:right w:val="single" w:sz="6" w:space="0" w:color="C4C7C5"/>
+            </w:tcBorders>
+            <w:tcMar>
+              <w:top w:w="120" w:type="dxa"/>
+              <w:left w:w="180" w:type="dxa"/>
+              <w:bottom w:w="120" w:type="dxa"/>
+              <w:right w:w="180" w:type="dxa"/>
+            </w:tcMar>
+            <w:vAlign w:val="center"/>
+            <w:hideMark/>
+          </w:tcPr>
+          <w:p>
+            <w:pPr>
+              <w:rPr>
+                <w:b/>
+                <w:bCs/>
+              </w:rPr>
+            </w:pPr>
+            <w:r>
+              <w:rPr>
+                <w:b/>
+                <w:bCs/>
+              </w:rPr>
+              <w:t>Status</w:t>
+            </w:r>
+          </w:p>
+        </w:tc>
+      </w:tr>
+      <w:tr>
+        <w:trPr>
+          <w:tblCellSpacing w:w="15" w:type="dxa"/>
+        </w:trPr>
+        <w:tc>
+          <w:tcPr>
+            <w:tcW w:w="0" w:type="auto"/>
+            <w:tcBorders>
+              <w:top w:val="single" w:sz="6" w:space="0" w:color="C4C7C5"/>
+              <w:left w:val="single" w:sz="6" w:space="0" w:color="C4C7C5"/>
+              <w:bottom w:val="single" w:sz="6" w:space="0" w:color="C4C7C5"/>
+              <w:right w:val="single" w:sz="6" w:space="0" w:color="C4C7C5"/>
+            </w:tcBorders>
+            <w:tcMar>
+              <w:top w:w="120" w:type="dxa"/>
+              <w:left w:w="180" w:type="dxa"/>
+              <w:bottom w:w="120" w:type="dxa"/>
+              <w:right w:w="180" w:type="dxa"/>
+            </w:tcMar>
+            <w:vAlign w:val="center"/>
+            <w:hideMark/>
+          </w:tcPr>
+          <w:p>
+            <w:pPr>
+              <w:rPr>
+                <w:b/>
+                <w:bCs/>
+              </w:rPr>
+            </w:pPr>
+            <w:r>
+              <w:rPr>
+                <w:b/>
+                <w:bCs/>
+              </w:rPr>
+              <w:t>DW-001</w:t>
+            </w:r>
+          </w:p>
+        </w:tc>
+        <w:tc>
+          <w:tcPr>
+            <w:tcW w:w="0" w:type="auto"/>
+            <w:tcBorders>
+              <w:top w:val="single" w:sz="6" w:space="0" w:color="C4C7C5"/>
+              <w:left w:val="single" w:sz="6" w:space="0" w:color="C4C7C5"/>
+              <w:bottom w:val="single" w:sz="6" w:space="0" w:color="C4C7C5"/>
+              <w:right w:val="single" w:sz="6" w:space="0" w:color="C4C7C5"/>
+            </w:tcBorders>
+            <w:tcMar>
+              <w:top w:w="120" w:type="dxa"/>
+              <w:left w:w="180" w:type="dxa"/>
+              <w:bottom w:w="120" w:type="dxa"/>
+              <w:right w:w="180" w:type="dxa"/>
+            </w:tcMar>
+            <w:vAlign w:val="center"/>
+            <w:hideMark/>
+          </w:tcPr>
+          <w:p>
+            <w:r>
+              <w:t>Too many applications on one desktop make it difficult to find the required window</w:t>
+            </w:r>
+          </w:p>
+        </w:tc>
+        <w:tc>
+          <w:tcPr>
+            <w:tcW w:w="0" w:type="auto"/>
+            <w:tcBorders>
+              <w:top w:val="single" w:sz="6" w:space="0" w:color="C4C7C5"/>
+              <w:left w:val="single" w:sz="6" w:space="0" w:color="C4C7C5"/>
+              <w:bottom w:val="single" w:sz="6" w:space="0" w:color="C4C7C5"/>
+              <w:right w:val="single" w:sz="6" w:space="0" w:color="C4C7C5"/>
+            </w:tcBorders>
+            <w:tcMar>
+              <w:top w:w="120" w:type="dxa"/>
+              <w:left w:w="180" w:type="dxa"/>
+              <w:bottom w:w="120" w:type="dxa"/>
+              <w:right w:w="180" w:type="dxa"/>
+            </w:tcMar>
+            <w:vAlign w:val="center"/>
+            <w:hideMark/>
+          </w:tcPr>
+          <w:p>
+            <w:r>
+              <w:t>Accepted</w:t>
+            </w:r>
+          </w:p>
+        </w:tc>
+      </w:tr>
+      <w:tr>
+        <w:trPr>
+          <w:tblCellSpacing w:w="15" w:type="dxa"/>
+        </w:trPr>
+        <w:tc>
+          <w:tcPr>
+            <w:tcW w:w="0" w:type="auto"/>
+            <w:tcBorders>
+              <w:top w:val="single" w:sz="6" w:space="0" w:color="C4C7C5"/>
+              <w:left w:val="single" w:sz="6" w:space="0" w:color="C4C7C5"/>
+              <w:bottom w:val="single" w:sz="6" w:space="0" w:color="C4C7C5"/>
+              <w:right w:val="single" w:sz="6" w:space="0" w:color="C4C7C5"/>
+            </w:tcBorders>
+            <w:tcMar>
+              <w:top w:w="120" w:type="dxa"/>
+              <w:left w:w="180" w:type="dxa"/>
+              <w:bottom w:w="120" w:type="dxa"/>
+              <w:right w:w="180" w:type="dxa"/>
+            </w:tcMar>
+            <w:vAlign w:val="center"/>
+            <w:hideMark/>
+          </w:tcPr>
+          <w:p>
+            <w:pPr>
+              <w:rPr>
+                <w:b/>
+                <w:bCs/>
+              </w:rPr>
+            </w:pPr>
+            <w:r>
+              <w:rPr>
+                <w:b/>
+                <w:bCs/>
+              </w:rPr>
+              <w:t>DW-002</w:t>
+            </w:r>
+          </w:p>
+        </w:tc>
+        <w:tc>
+          <w:tcPr>
+            <w:tcW w:w="0" w:type="auto"/>
+            <w:tcBorders>
+              <w:top w:val="single" w:sz="6" w:space="0" w:color="C4C7C5"/>
+              <w:left w:val="single" w:sz="6" w:space="0" w:color="C4C7C5"/>
+              <w:bottom w:val="single" w:sz="6" w:space="0" w:color="C4C7C5"/>
+              <w:right w:val="single" w:sz="6" w:space="0" w:color="C4C7C5"/>
+            </w:tcBorders>
+            <w:tcMar>
+              <w:top w:w="120" w:type="dxa"/>
+              <w:left w:w="180" w:type="dxa"/>
+              <w:bottom w:w="120" w:type="dxa"/>
+              <w:right w:w="180" w:type="dxa"/>
+            </w:tcMar>
+            <w:vAlign w:val="center"/>
+            <w:hideMark/>
+          </w:tcPr>
+          <w:p>
+            <w:r>
+              <w:t>Multiple virtual desktops become confusing over time</w:t>
+            </w:r>
+          </w:p>
+        </w:tc>
+        <w:tc>
+          <w:tcPr>
+            <w:tcW w:w="0" w:type="auto"/>
+            <w:tcBorders>
+              <w:top w:val="single" w:sz="6" w:space="0" w:color="C4C7C5"/>
+              <w:left w:val="single" w:sz="6" w:space="0" w:color="C4C7C5"/>
+              <w:bottom w:val="single" w:sz="6" w:space="0" w:color="C4C7C5"/>
+              <w:right w:val="single" w:sz="6" w:space="0" w:color="C4C7C5"/>
+            </w:tcBorders>
+            <w:tcMar>
+              <w:top w:w="120" w:type="dxa"/>
+              <w:left w:w="180" w:type="dxa"/>
+              <w:bottom w:w="120" w:type="dxa"/>
+              <w:right w:w="180" w:type="dxa"/>
+            </w:tcMar>
+            <w:vAlign w:val="center"/>
+            <w:hideMark/>
+          </w:tcPr>
+          <w:p>
+            <w:r>
+              <w:t>Accepted</w:t>
+            </w:r>
+          </w:p>
+        </w:tc>
+      </w:tr>
+      <w:tr>
+        <w:trPr>
+          <w:tblCellSpacing w:w="15" w:type="dxa"/>
+        </w:trPr>
+        <w:tc>
+          <w:tcPr>
+            <w:tcW w:w="0" w:type="auto"/>
+            <w:tcBorders>
+              <w:top w:val="single" w:sz="6" w:space="0" w:color="C4C7C5"/>
+              <w:left w:val="single" w:sz="6" w:space="0" w:color="C4C7C5"/>
+              <w:bottom w:val="single" w:sz="6" w:space="0" w:color="C4C7C5"/>
+              <w:right w:val="single" w:sz="6" w:space="0" w:color="C4C7C5"/>
+            </w:tcBorders>
+            <w:tcMar>
+              <w:top w:w="120" w:type="dxa"/>
+              <w:left w:w="180" w:type="dxa"/>
+              <w:bottom w:w="120" w:type="dxa"/>
+              <w:right w:w="180" w:type="dxa"/>
+            </w:tcMar>
+            <w:vAlign w:val="center"/>
+            <w:hideMark/>
+          </w:tcPr>
+          <w:p>
+            <w:pPr>
+              <w:rPr>
+                <w:b/>
+                <w:bCs/>
+              </w:rPr>
+            </w:pPr>
+            <w:r>
+              <w:rPr>
+                <w:b/>
+                <w:bCs/>
+              </w:rPr>
+              <w:t>DW-003</w:t>
+            </w:r>
+          </w:p>
+        </w:tc>
+        <w:tc>
+          <w:tcPr>
+            <w:tcW w:w="0" w:type="auto"/>
+            <w:tcBorders>
+              <w:top w:val="single" w:sz="6" w:space="0" w:color="C4C7C5"/>
+              <w:left w:val="single" w:sz="6" w:space="0" w:color="C4C7C5"/>
+              <w:bottom w:val="single" w:sz="6" w:space="0" w:color="C4C7C5"/>
+              <w:right w:val="single" w:sz="6" w:space="0" w:color="C4C7C5"/>
+            </w:tcBorders>
+            <w:tcMar>
+              <w:top w:w="120" w:type="dxa"/>
+              <w:left w:w="180" w:type="dxa"/>
+              <w:bottom w:w="120" w:type="dxa"/>
+              <w:right w:w="180" w:type="dxa"/>
+            </w:tcMar>
+            <w:vAlign w:val="center"/>
+            <w:hideMark/>
+          </w:tcPr>
+          <w:p>
+            <w:r>
+              <w:t>Office workers often need to switch between multiple applications because there is no single workspace for their daily tasks</w:t>
+            </w:r>
+          </w:p>
+        </w:tc>
+        <w:tc>
+          <w:tcPr>
+            <w:tcW w:w="0" w:type="auto"/>
+            <w:tcBorders>
+              <w:top w:val="single" w:sz="6" w:space="0" w:color="C4C7C5"/>
+              <w:left w:val="single" w:sz="6" w:space="0" w:color="C4C7C5"/>
+              <w:bottom w:val="single" w:sz="6" w:space="0" w:color="C4C7C5"/>
+              <w:right w:val="single" w:sz="6" w:space="0" w:color="C4C7C5"/>
+            </w:tcBorders>
+            <w:tcMar>
+              <w:top w:w="120" w:type="dxa"/>
+              <w:left w:w="180" w:type="dxa"/>
+              <w:bottom w:w="120" w:type="dxa"/>
+              <w:right w:w="180" w:type="dxa"/>
+            </w:tcMar>
+            <w:vAlign w:val="center"/>
+            <w:hideMark/>
+          </w:tcPr>
+          <w:p>
+            <w:r>
+              <w:t>Accepted</w:t>
+            </w:r>
+          </w:p>
+        </w:tc>
+      </w:tr>
+      <w:tr>
+        <w:trPr>
+          <w:tblCellSpacing w:w="15" w:type="dxa"/>
+        </w:trPr>
+        <w:tc>
+          <w:tcPr>
+            <w:tcW w:w="0" w:type="auto"/>
+            <w:tcBorders>
+              <w:top w:val="single" w:sz="6" w:space="0" w:color="C4C7C5"/>
+              <w:left w:val="single" w:sz="6" w:space="0" w:color="C4C7C5"/>
+              <w:bottom w:val="single" w:sz="6" w:space="0" w:color="C4C7C5"/>
+              <w:right w:val="single" w:sz="6" w:space="0" w:color="C4C7C5"/>
+            </w:tcBorders>
+            <w:tcMar>
+              <w:top w:w="120" w:type="dxa"/>
+              <w:left w:w="180" w:type="dxa"/>
+              <w:bottom w:w="120" w:type="dxa"/>
+              <w:right w:w="180" w:type="dxa"/>
+            </w:tcMar>
+            <w:vAlign w:val="center"/>
+            <w:hideMark/>
+          </w:tcPr>
+          <w:p>
+            <w:pPr>
+              <w:rPr>
+                <w:b/>
+                <w:bCs/>
+              </w:rPr>
+            </w:pPr>
+            <w:r>
+              <w:rPr>
+                <w:b/>
+                <w:bCs/>
+              </w:rPr>
+              <w:t>DW-004</w:t>
+            </w:r>
+          </w:p>
+        </w:tc>
+        <w:tc>
+          <w:tcPr>
+            <w:tcW w:w="0" w:type="auto"/>
+            <w:tcBorders>
+              <w:top w:val="single" w:sz="6" w:space="0" w:color="C4C7C5"/>
+              <w:left w:val="single" w:sz="6" w:space="0" w:color="C4C7C5"/>
+              <w:bottom w:val="single" w:sz="6" w:space="0" w:color="C4C7C5"/>
+              <w:right w:val="single" w:sz="6" w:space="0" w:color="C4C7C5"/>
+            </w:tcBorders>
+            <w:tcMar>
+              <w:top w:w="120" w:type="dxa"/>
+              <w:left w:w="180" w:type="dxa"/>
+              <w:bottom w:w="120" w:type="dxa"/>
+              <w:right w:w="180" w:type="dxa"/>
+            </w:tcMar>
+            <w:vAlign w:val="center"/>
+            <w:hideMark/>
+          </w:tcPr>
+          <w:p>
+            <w:r>
+              <w:t>Users struggle to arrange application windows efficiently for different tasks</w:t>
+            </w:r>
+          </w:p>
+        </w:tc>
+        <w:tc>
+          <w:tcPr>
+            <w:tcW w:w="0" w:type="auto"/>
+            <w:tcBorders>
+              <w:top w:val="single" w:sz="6" w:space="0" w:color="C4C7C5"/>
+              <w:left w:val="single" w:sz="6" w:space="0" w:color="C4C7C5"/>
+              <w:bottom w:val="single" w:sz="6" w:space="0" w:color="C4C7C5"/>
+              <w:right w:val="single" w:sz="6" w:space="0" w:color="C4C7C5"/>
+            </w:tcBorders>
+            <w:tcMar>
+              <w:top w:w="120" w:type="dxa"/>
+              <w:left w:w="180" w:type="dxa"/>
+              <w:bottom w:w="120" w:type="dxa"/>
+              <w:right w:w="180" w:type="dxa"/>
+            </w:tcMar>
+            <w:vAlign w:val="center"/>
+            <w:hideMark/>
+          </w:tcPr>
+          <w:p>
+            <w:r>
+              <w:t>Accepted</w:t>
+            </w:r>
+          </w:p>
+        </w:tc>
+      </w:tr>
+      <w:tr>
+        <w:trPr>
+          <w:tblCellSpacing w:w="15" w:type="dxa"/>
+        </w:trPr>
+        <w:tc>
+          <w:tcPr>
+            <w:tcW w:w="0" w:type="auto"/>
+            <w:tcBorders>
+              <w:top w:val="single" w:sz="6" w:space="0" w:color="C4C7C5"/>
+              <w:left w:val="single" w:sz="6" w:space="0" w:color="C4C7C5"/>
+              <w:bottom w:val="single" w:sz="6" w:space="0" w:color="C4C7C5"/>
+              <w:right w:val="single" w:sz="6" w:space="0" w:color="C4C7C5"/>
+            </w:tcBorders>
+            <w:tcMar>
+              <w:top w:w="120" w:type="dxa"/>
+              <w:left w:w="180" w:type="dxa"/>
+              <w:bottom w:w="120" w:type="dxa"/>
+              <w:right w:w="180" w:type="dxa"/>
+            </w:tcMar>
+            <w:vAlign w:val="center"/>
+            <w:hideMark/>
+          </w:tcPr>
+          <w:p>
+            <w:pPr>
+              <w:rPr>
+                <w:b/>
+                <w:bCs/>
+              </w:rPr>
+            </w:pPr>
+            <w:r>
+              <w:rPr>
+                <w:b/>
+                <w:bCs/>
+              </w:rPr>
+              <w:t>DW-005</w:t>
+            </w:r>
+          </w:p>
+        </w:tc>
+        <w:tc>
+          <w:tcPr>
+            <w:tcW w:w="0" w:type="auto"/>
+            <w:tcBorders>
+              <w:top w:val="single" w:sz="6" w:space="0" w:color="C4C7C5"/>
+              <w:left w:val="single" w:sz="6" w:space="0" w:color="C4C7C5"/>
+              <w:bottom w:val="single" w:sz="6" w:space="0" w:color="C4C7C5"/>
+              <w:right w:val="single" w:sz="6" w:space="0" w:color="C4C7C5"/>
+            </w:tcBorders>
+            <w:tcMar>
+              <w:top w:w="120" w:type="dxa"/>
+              <w:left w:w="180" w:type="dxa"/>
+              <w:bottom w:w="120" w:type="dxa"/>
+              <w:right w:w="180" w:type="dxa"/>
+            </w:tcMar>
+            <w:vAlign w:val="center"/>
+            <w:hideMark/>
+          </w:tcPr>
+          <w:p>
+            <w:r>
+              <w:t>Users frequently lose important application windows behind other open windows</w:t>
+            </w:r>
+          </w:p>
+        </w:tc>
+        <w:tc>
+          <w:tcPr>
+            <w:tcW w:w="0" w:type="auto"/>
+            <w:tcBorders>
+              <w:top w:val="single" w:sz="6" w:space="0" w:color="C4C7C5"/>
+              <w:left w:val="single" w:sz="6" w:space="0" w:color="C4C7C5"/>
+              <w:bottom w:val="single" w:sz="6" w:space="0" w:color="C4C7C5"/>
+              <w:right w:val="single" w:sz="6" w:space="0" w:color="C4C7C5"/>
+            </w:tcBorders>
+            <w:tcMar>
+              <w:top w:w="120" w:type="dxa"/>
+              <w:left w:w="180" w:type="dxa"/>
+              <w:bottom w:w="120" w:type="dxa"/>
+              <w:right w:w="180" w:type="dxa"/>
+            </w:tcMar>
+            <w:vAlign w:val="center"/>
+            <w:hideMark/>
+          </w:tcPr>
+          <w:p>
+            <w:r>
+              <w:t>Accepted</w:t>
+            </w:r>
+          </w:p>
+        </w:tc>
+      </w:tr>
+      <w:tr>
+        <w:trPr>
+          <w:tblCellSpacing w:w="15" w:type="dxa"/>
+        </w:trPr>
+        <w:tc>
+          <w:tcPr>
+            <w:tcW w:w="0" w:type="auto"/>
+            <w:tcBorders>
+              <w:top w:val="single" w:sz="6" w:space="0" w:color="C4C7C5"/>
+              <w:left w:val="single" w:sz="6" w:space="0" w:color="C4C7C5"/>
+              <w:bottom w:val="single" w:sz="6" w:space="0" w:color="C4C7C5"/>
+              <w:right w:val="single" w:sz="6" w:space="0" w:color="C4C7C5"/>
+            </w:tcBorders>
+            <w:tcMar>
+              <w:top w:w="120" w:type="dxa"/>
+              <w:left w:w="180" w:type="dxa"/>
+              <w:bottom w:w="120" w:type="dxa"/>
+              <w:right w:w="180" w:type="dxa"/>
+            </w:tcMar>
+            <w:vAlign w:val="center"/>
+            <w:hideMark/>
+          </w:tcPr>
+          <w:p>
+            <w:pPr>
+              <w:rPr>
+                <w:b/>
+                <w:bCs/>
+              </w:rPr>
+            </w:pPr>
+            <w:r>
+              <w:rPr>
+                <w:b/>
+                <w:bCs/>
+              </w:rPr>
+              <w:t>DW-006</w:t>
+            </w:r>
+          </w:p>
+        </w:tc>
+        <w:tc>
+          <w:tcPr>
+            <w:tcW w:w="0" w:type="auto"/>
+            <w:tcBorders>
+              <w:top w:val="single" w:sz="6" w:space="0" w:color="C4C7C5"/>
+              <w:left w:val="single" w:sz="6" w:space="0" w:color="C4C7C5"/>
+              <w:bottom w:val="single" w:sz="6" w:space="0" w:color="C4C7C5"/>
+              <w:right w:val="single" w:sz="6" w:space="0" w:color="C4C7C5"/>
+            </w:tcBorders>
+            <w:tcMar>
+              <w:top w:w="120" w:type="dxa"/>
+              <w:left w:w="180" w:type="dxa"/>
+              <w:bottom w:w="120" w:type="dxa"/>
+              <w:right w:w="180" w:type="dxa"/>
+            </w:tcMar>
+            <w:vAlign w:val="center"/>
+            <w:hideMark/>
+          </w:tcPr>
+          <w:p>
+            <w:r>
+              <w:t>Users struggle to remember which application contains the information they need</w:t>
+            </w:r>
+          </w:p>
+        </w:tc>
+        <w:tc>
+          <w:tcPr>
+            <w:tcW w:w="0" w:type="auto"/>
+            <w:tcBorders>
+              <w:top w:val="single" w:sz="6" w:space="0" w:color="C4C7C5"/>
+              <w:left w:val="single" w:sz="6" w:space="0" w:color="C4C7C5"/>
+              <w:bottom w:val="single" w:sz="6" w:space="0" w:color="C4C7C5"/>
+              <w:right w:val="single" w:sz="6" w:space="0" w:color="C4C7C5"/>
+            </w:tcBorders>
+            <w:tcMar>
+              <w:top w:w="120" w:type="dxa"/>
+              <w:left w:w="180" w:type="dxa"/>
+              <w:bottom w:w="120" w:type="dxa"/>
+              <w:right w:w="180" w:type="dxa"/>
+            </w:tcMar>
+            <w:vAlign w:val="center"/>
+            <w:hideMark/>
+          </w:tcPr>
+          <w:p>
+            <w:r>
+              <w:t>Accepted</w:t>
+            </w:r>
+          </w:p>
+        </w:tc>
+      </w:tr>
+      <w:tr>
+        <w:trPr>
+          <w:tblCellSpacing w:w="15" w:type="dxa"/>
+        </w:trPr>
+        <w:tc>
+          <w:tcPr>
+            <w:tcW w:w="0" w:type="auto"/>
+            <w:tcBorders>
+              <w:top w:val="single" w:sz="6" w:space="0" w:color="C4C7C5"/>
+              <w:left w:val="single" w:sz="6" w:space="0" w:color="C4C7C5"/>
+              <w:bottom w:val="single" w:sz="6" w:space="0" w:color="C4C7C5"/>
+              <w:right w:val="single" w:sz="6" w:space="0" w:color="C4C7C5"/>
+            </w:tcBorders>
+            <w:tcMar>
+              <w:top w:w="120" w:type="dxa"/>
+              <w:left w:w="180" w:type="dxa"/>
+              <w:bottom w:w="120" w:type="dxa"/>
+              <w:right w:w="180" w:type="dxa"/>
+            </w:tcMar>
+            <w:vAlign w:val="center"/>
+            <w:hideMark/>
+          </w:tcPr>
+          <w:p>
+            <w:pPr>
+              <w:rPr>
+                <w:b/>
+                <w:bCs/>
+              </w:rPr>
+            </w:pPr>
+            <w:r>
+              <w:rPr>
+                <w:b/>
+                <w:bCs/>
+              </w:rPr>
+              <w:t>DW-007</w:t>
+            </w:r>
+          </w:p>
+        </w:tc>
+        <w:tc>
+          <w:tcPr>
+            <w:tcW w:w="0" w:type="auto"/>
+            <w:tcBorders>
+              <w:top w:val="single" w:sz="6" w:space="0" w:color="C4C7C5"/>
+              <w:left w:val="single" w:sz="6" w:space="0" w:color="C4C7C5"/>
+              <w:bottom w:val="single" w:sz="6" w:space="0" w:color="C4C7C5"/>
+              <w:right w:val="single" w:sz="6" w:space="0" w:color="C4C7C5"/>
+            </w:tcBorders>
+            <w:tcMar>
+              <w:top w:w="120" w:type="dxa"/>
+              <w:left w:w="180" w:type="dxa"/>
+              <w:bottom w:w="120" w:type="dxa"/>
+              <w:right w:w="180" w:type="dxa"/>
+            </w:tcMar>
+            <w:vAlign w:val="center"/>
+            <w:hideMark/>
+          </w:tcPr>
+          <w:p>
+            <w:r>
+              <w:t>Users repeatedly resize and reposition windows to fit their workflow</w:t>
+            </w:r>
+          </w:p>
+        </w:tc>
+        <w:tc>
+          <w:tcPr>
+            <w:tcW w:w="0" w:type="auto"/>
+            <w:tcBorders>
+              <w:top w:val="single" w:sz="6" w:space="0" w:color="C4C7C5"/>
+              <w:left w:val="single" w:sz="6" w:space="0" w:color="C4C7C5"/>
+              <w:bottom w:val="single" w:sz="6" w:space="0" w:color="C4C7C5"/>
+              <w:right w:val="single" w:sz="6" w:space="0" w:color="C4C7C5"/>
+            </w:tcBorders>
+            <w:tcMar>
+              <w:top w:w="120" w:type="dxa"/>
+              <w:left w:w="180" w:type="dxa"/>
+              <w:bottom w:w="120" w:type="dxa"/>
+              <w:right w:w="180" w:type="dxa"/>
+            </w:tcMar>
+            <w:vAlign w:val="center"/>
+            <w:hideMark/>
+          </w:tcPr>
+          <w:p>
+            <w:r>
+              <w:t>Accepted</w:t>
+            </w:r>
+          </w:p>
+        </w:tc>
+      </w:tr>
+      <w:tr>
+        <w:trPr>
+          <w:tblCellSpacing w:w="15" w:type="dxa"/>
+        </w:trPr>
+        <w:tc>
+          <w:tcPr>
+            <w:tcW w:w="0" w:type="auto"/>
+            <w:tcBorders>
+              <w:top w:val="single" w:sz="6" w:space="0" w:color="C4C7C5"/>
+              <w:left w:val="single" w:sz="6" w:space="0" w:color="C4C7C5"/>
+              <w:bottom w:val="single" w:sz="6" w:space="0" w:color="C4C7C5"/>
+              <w:right w:val="single" w:sz="6" w:space="0" w:color="C4C7C5"/>
+            </w:tcBorders>
+            <w:tcMar>
+              <w:top w:w="120" w:type="dxa"/>
+              <w:left w:w="180" w:type="dxa"/>
+              <w:bottom w:w="120" w:type="dxa"/>
+              <w:right w:w="180" w:type="dxa"/>
+            </w:tcMar>
+            <w:vAlign w:val="center"/>
+            <w:hideMark/>
+          </w:tcPr>
+          <w:p>
+            <w:pPr>
+              <w:rPr>
+                <w:b/>
+                <w:bCs/>
+              </w:rPr>
+            </w:pPr>
+            <w:r>
+              <w:rPr>
+                <w:b/>
+                <w:bCs/>
+              </w:rPr>
+              <w:t>DW-008</w:t>
+            </w:r>
+          </w:p>
+        </w:tc>
+        <w:tc>
+          <w:tcPr>
+            <w:tcW w:w="0" w:type="auto"/>
+            <w:tcBorders>
+              <w:top w:val="single" w:sz="6" w:space="0" w:color="C4C7C5"/>
+              <w:left w:val="single" w:sz="6" w:space="0" w:color="C4C7C5"/>
+              <w:bottom w:val="single" w:sz="6" w:space="0" w:color="C4C7C5"/>
+              <w:right w:val="single" w:sz="6" w:space="0" w:color="C4C7C5"/>
+            </w:tcBorders>
+            <w:tcMar>
+              <w:top w:w="120" w:type="dxa"/>
+              <w:left w:w="180" w:type="dxa"/>
+              <w:bottom w:w="120" w:type="dxa"/>
+              <w:right w:w="180" w:type="dxa"/>
+            </w:tcMar>
+            <w:vAlign w:val="center"/>
+            <w:hideMark/>
+          </w:tcPr>
+          <w:p>
+            <w:r>
+              <w:t>Users struggle to maintain a consistent desktop workspace after restarting their computer</w:t>
+            </w:r>
+          </w:p>
+        </w:tc>
+        <w:tc>
+          <w:tcPr>
+            <w:tcW w:w="0" w:type="auto"/>
+            <w:tcBorders>
+              <w:top w:val="single" w:sz="6" w:space="0" w:color="C4C7C5"/>
+              <w:left w:val="single" w:sz="6" w:space="0" w:color="C4C7C5"/>
+              <w:bottom w:val="single" w:sz="6" w:space="0" w:color="C4C7C5"/>
+              <w:right w:val="single" w:sz="6" w:space="0" w:color="C4C7C5"/>
+            </w:tcBorders>
+            <w:tcMar>
+              <w:top w:w="120" w:type="dxa"/>
+              <w:left w:w="180" w:type="dxa"/>
+              <w:bottom w:w="120" w:type="dxa"/>
+              <w:right w:w="180" w:type="dxa"/>
+            </w:tcMar>
+            <w:vAlign w:val="center"/>
+            <w:hideMark/>
+          </w:tcPr>
+          <w:p>
+            <w:r>
+              <w:t>Accepted</w:t>
+            </w:r>
+          </w:p>
+        </w:tc>
+      </w:tr>
+      <w:tr>
+        <w:trPr>
+          <w:tblCellSpacing w:w="15" w:type="dxa"/>
+        </w:trPr>
+        <w:tc>
+          <w:tcPr>
+            <w:tcW w:w="0" w:type="auto"/>
+            <w:tcBorders>
+              <w:top w:val="single" w:sz="6" w:space="0" w:color="C4C7C5"/>
+              <w:left w:val="single" w:sz="6" w:space="0" w:color="C4C7C5"/>
+              <w:bottom w:val="single" w:sz="6" w:space="0" w:color="C4C7C5"/>
+              <w:right w:val="single" w:sz="6" w:space="0" w:color="C4C7C5"/>
+            </w:tcBorders>
+            <w:tcMar>
+              <w:top w:w="120" w:type="dxa"/>
+              <w:left w:w="180" w:type="dxa"/>
+              <w:bottom w:w="120" w:type="dxa"/>
+              <w:right w:w="180" w:type="dxa"/>
+            </w:tcMar>
+            <w:vAlign w:val="center"/>
+            <w:hideMark/>
+          </w:tcPr>
+          <w:p>
+            <w:pPr>
+              <w:rPr>
+                <w:b/>
+                <w:bCs/>
+              </w:rPr>
+            </w:pPr>
+            <w:r>
+              <w:rPr>
+                <w:b/>
+                <w:bCs/>
+              </w:rPr>
+              <w:t>DW-009</w:t>
+            </w:r>
+          </w:p>
+        </w:tc>
+        <w:tc>
+          <w:tcPr>
+            <w:tcW w:w="0" w:type="auto"/>
+            <w:tcBorders>
+              <w:top w:val="single" w:sz="6" w:space="0" w:color="C4C7C5"/>
+              <w:left w:val="single" w:sz="6" w:space="0" w:color="C4C7C5"/>
+              <w:bottom w:val="single" w:sz="6" w:space="0" w:color="C4C7C5"/>
+              <w:right w:val="single" w:sz="6" w:space="0" w:color="C4C7C5"/>
+            </w:tcBorders>
+            <w:tcMar>
+              <w:top w:w="120" w:type="dxa"/>
+              <w:left w:w="180" w:type="dxa"/>
+              <w:bottom w:w="120" w:type="dxa"/>
+              <w:right w:w="180" w:type="dxa"/>
+            </w:tcMar>
+            <w:vAlign w:val="center"/>
+            <w:hideMark/>
+          </w:tcPr>
+          <w:p>
+            <w:r>
+              <w:t>Users struggle to distinguish active workspaces from temporary workspaces</w:t>
+            </w:r>
+          </w:p>
+        </w:tc>
+        <w:tc>
+          <w:tcPr>
+            <w:tcW w:w="0" w:type="auto"/>
+            <w:tcBorders>
+              <w:top w:val="single" w:sz="6" w:space="0" w:color="C4C7C5"/>
+              <w:left w:val="single" w:sz="6" w:space="0" w:color="C4C7C5"/>
+              <w:bottom w:val="single" w:sz="6" w:space="0" w:color="C4C7C5"/>
+              <w:right w:val="single" w:sz="6" w:space="0" w:color="C4C7C5"/>
+            </w:tcBorders>
+            <w:tcMar>
+              <w:top w:w="120" w:type="dxa"/>
+              <w:left w:w="180" w:type="dxa"/>
+              <w:bottom w:w="120" w:type="dxa"/>
+              <w:right w:w="180" w:type="dxa"/>
+            </w:tcMar>
+            <w:vAlign w:val="center"/>
+            <w:hideMark/>
+          </w:tcPr>
+          <w:p>
+            <w:r>
+              <w:t>Accepted</w:t>
+            </w:r>
+          </w:p>
+        </w:tc>
+      </w:tr>
+      <w:tr>
+        <w:trPr>
+          <w:tblCellSpacing w:w="15" w:type="dxa"/>
+        </w:trPr>
+        <w:tc>
+          <w:tcPr>
+            <w:tcW w:w="0" w:type="auto"/>
+            <w:tcBorders>
+              <w:top w:val="single" w:sz="6" w:space="0" w:color="C4C7C5"/>
+              <w:left w:val="single" w:sz="6" w:space="0" w:color="C4C7C5"/>
+              <w:bottom w:val="single" w:sz="6" w:space="0" w:color="C4C7C5"/>
+              <w:right w:val="single" w:sz="6" w:space="0" w:color="C4C7C5"/>
+            </w:tcBorders>
+            <w:tcMar>
+              <w:top w:w="120" w:type="dxa"/>
+              <w:left w:w="180" w:type="dxa"/>
+              <w:bottom w:w="120" w:type="dxa"/>
+              <w:right w:w="180" w:type="dxa"/>
+            </w:tcMar>
+            <w:vAlign w:val="center"/>
+            <w:hideMark/>
+          </w:tcPr>
+          <w:p>
+            <w:pPr>
+              <w:rPr>
+                <w:b/>
+                <w:bCs/>
+              </w:rPr>
+            </w:pPr>
+            <w:r>
+              <w:rPr>
+                <w:b/>
+                <w:bCs/>
+              </w:rPr>
+              <w:t>DW-010</w:t>
+            </w:r>
+          </w:p>
+        </w:tc>
+        <w:tc>
+          <w:tcPr>
+            <w:tcW w:w="0" w:type="auto"/>
+            <w:tcBorders>
+              <w:top w:val="single" w:sz="6" w:space="0" w:color="C4C7C5"/>
+              <w:left w:val="single" w:sz="6" w:space="0" w:color="C4C7C5"/>
+              <w:bottom w:val="single" w:sz="6" w:space="0" w:color="C4C7C5"/>
+              <w:right w:val="single" w:sz="6" w:space="0" w:color="C4C7C5"/>
+            </w:tcBorders>
+            <w:tcMar>
+              <w:top w:w="120" w:type="dxa"/>
+              <w:left w:w="180" w:type="dxa"/>
+              <w:bottom w:w="120" w:type="dxa"/>
+              <w:right w:w="180" w:type="dxa"/>
+            </w:tcMar>
+            <w:vAlign w:val="center"/>
+            <w:hideMark/>
+          </w:tcPr>
+          <w:p>
+            <w:r>
+              <w:t>Users struggle to manage multiple monitors as a single unified workspace</w:t>
+            </w:r>
+          </w:p>
+        </w:tc>
+        <w:tc>
+          <w:tcPr>
+            <w:tcW w:w="0" w:type="auto"/>
+            <w:tcBorders>
+              <w:top w:val="single" w:sz="6" w:space="0" w:color="C4C7C5"/>
+              <w:left w:val="single" w:sz="6" w:space="0" w:color="C4C7C5"/>
+              <w:bottom w:val="single" w:sz="6" w:space="0" w:color="C4C7C5"/>
+              <w:right w:val="single" w:sz="6" w:space="0" w:color="C4C7C5"/>
+            </w:tcBorders>
+            <w:tcMar>
+              <w:top w:w="120" w:type="dxa"/>
+              <w:left w:w="180" w:type="dxa"/>
+              <w:bottom w:w="120" w:type="dxa"/>
+              <w:right w:w="180" w:type="dxa"/>
+            </w:tcMar>
+            <w:vAlign w:val="center"/>
+            <w:hideMark/>
+          </w:tcPr>
+          <w:p>
+            <w:r>
+              <w:t>Accepted</w:t>
+            </w:r>
+          </w:p>
+        </w:tc>
+      </w:tr>
+      <w:tr>
+        <w:trPr>
+          <w:tblCellSpacing w:w="15" w:type="dxa"/>
+        </w:trPr>
+        <w:tc>
+          <w:tcPr>
+            <w:tcW w:w="0" w:type="auto"/>
+            <w:tcBorders>
+              <w:top w:val="single" w:sz="6" w:space="0" w:color="C4C7C5"/>
+              <w:left w:val="single" w:sz="6" w:space="0" w:color="C4C7C5"/>
+              <w:bottom w:val="single" w:sz="6" w:space="0" w:color="C4C7C5"/>
+              <w:right w:val="single" w:sz="6" w:space="0" w:color="C4C7C5"/>
+            </w:tcBorders>
+            <w:tcMar>
+              <w:top w:w="120" w:type="dxa"/>
+              <w:left w:w="180" w:type="dxa"/>
+              <w:bottom w:w="120" w:type="dxa"/>
+              <w:right w:w="180" w:type="dxa"/>
+            </w:tcMar>
+            <w:vAlign w:val="center"/>
+            <w:hideMark/>
+          </w:tcPr>
+          <w:p>
+            <w:pPr>
+              <w:rPr>
+                <w:b/>
+                <w:bCs/>
+              </w:rPr>
+            </w:pPr>
+            <w:r>
+              <w:rPr>
+                <w:b/>
+                <w:bCs/>
+              </w:rPr>
+              <w:lastRenderedPageBreak/>
+              <w:t>DW-011</w:t>
+            </w:r>
+          </w:p>
+        </w:tc>
+        <w:tc>
+          <w:tcPr>
+            <w:tcW w:w="0" w:type="auto"/>
+            <w:tcBorders>
+              <w:top w:val="single" w:sz="6" w:space="0" w:color="C4C7C5"/>
+              <w:left w:val="single" w:sz="6" w:space="0" w:color="C4C7C5"/>
+              <w:bottom w:val="single" w:sz="6" w:space="0" w:color="C4C7C5"/>
+              <w:right w:val="single" w:sz="6" w:space="0" w:color="C4C7C5"/>
+            </w:tcBorders>
+            <w:tcMar>
+              <w:top w:w="120" w:type="dxa"/>
+              <w:left w:w="180" w:type="dxa"/>
+              <w:bottom w:w="120" w:type="dxa"/>
+              <w:right w:w="180" w:type="dxa"/>
+            </w:tcMar>
+            <w:vAlign w:val="center"/>
+            <w:hideMark/>
+          </w:tcPr>
+          <w:p>
+            <w:r>
+              <w:t>Users struggle to relocate windows that open on unexpected displays or workspaces</w:t>
+            </w:r>
+          </w:p>
+        </w:tc>
+        <w:tc>
+          <w:tcPr>
+            <w:tcW w:w="0" w:type="auto"/>
+            <w:tcBorders>
+              <w:top w:val="single" w:sz="6" w:space="0" w:color="C4C7C5"/>
+              <w:left w:val="single" w:sz="6" w:space="0" w:color="C4C7C5"/>
+              <w:bottom w:val="single" w:sz="6" w:space="0" w:color="C4C7C5"/>
+              <w:right w:val="single" w:sz="6" w:space="0" w:color="C4C7C5"/>
+            </w:tcBorders>
+            <w:tcMar>
+              <w:top w:w="120" w:type="dxa"/>
+              <w:left w:w="180" w:type="dxa"/>
+              <w:bottom w:w="120" w:type="dxa"/>
+              <w:right w:w="180" w:type="dxa"/>
+            </w:tcMar>
+            <w:vAlign w:val="center"/>
+            <w:hideMark/>
+          </w:tcPr>
+          <w:p>
+            <w:r>
+              <w:t>Accepted</w:t>
+            </w:r>
+          </w:p>
+        </w:tc>
+      </w:tr>
+      <w:tr>
+        <w:trPr>
+          <w:tblCellSpacing w:w="15" w:type="dxa"/>
+        </w:trPr>
+        <w:tc>
+          <w:tcPr>
+            <w:tcW w:w="0" w:type="auto"/>
+            <w:tcBorders>
+              <w:top w:val="single" w:sz="6" w:space="0" w:color="C4C7C5"/>
+              <w:left w:val="single" w:sz="6" w:space="0" w:color="C4C7C5"/>
+              <w:bottom w:val="single" w:sz="6" w:space="0" w:color="C4C7C5"/>
+              <w:right w:val="single" w:sz="6" w:space="0" w:color="C4C7C5"/>
+            </w:tcBorders>
+            <w:tcMar>
+              <w:top w:w="120" w:type="dxa"/>
+              <w:left w:w="180" w:type="dxa"/>
+              <w:bottom w:w="120" w:type="dxa"/>
+              <w:right w:w="180" w:type="dxa"/>
+            </w:tcMar>
+            <w:vAlign w:val="center"/>
+            <w:hideMark/>
+          </w:tcPr>
+          <w:p>
+            <w:pPr>
+              <w:rPr>
+                <w:b/>
+                <w:bCs/>
+              </w:rPr>
+            </w:pPr>
+            <w:r>
+              <w:rPr>
+                <w:b/>
+                <w:bCs/>
+              </w:rPr>
+              <w:t>DW-012</w:t>
+            </w:r>
+          </w:p>
+        </w:tc>
+        <w:tc>
+          <w:tcPr>
+            <w:tcW w:w="0" w:type="auto"/>
+            <w:tcBorders>
+              <w:top w:val="single" w:sz="6" w:space="0" w:color="C4C7C5"/>
+              <w:left w:val="single" w:sz="6" w:space="0" w:color="C4C7C5"/>
+              <w:bottom w:val="single" w:sz="6" w:space="0" w:color="C4C7C5"/>
+              <w:right w:val="single" w:sz="6" w:space="0" w:color="C4C7C5"/>
+            </w:tcBorders>
+            <w:tcMar>
+              <w:top w:w="120" w:type="dxa"/>
+              <w:left w:w="180" w:type="dxa"/>
+              <w:bottom w:w="120" w:type="dxa"/>
+              <w:right w:w="180" w:type="dxa"/>
+            </w:tcMar>
+            <w:vAlign w:val="center"/>
+            <w:hideMark/>
+          </w:tcPr>
+          <w:p>
+            <w:r>
+              <w:t>Users struggle to organize applications according to the task they are performing</w:t>
+            </w:r>
+          </w:p>
+        </w:tc>
+        <w:tc>
+          <w:tcPr>
+            <w:tcW w:w="0" w:type="auto"/>
+            <w:tcBorders>
+              <w:top w:val="single" w:sz="6" w:space="0" w:color="C4C7C5"/>
+              <w:left w:val="single" w:sz="6" w:space="0" w:color="C4C7C5"/>
+              <w:bottom w:val="single" w:sz="6" w:space="0" w:color="C4C7C5"/>
+              <w:right w:val="single" w:sz="6" w:space="0" w:color="C4C7C5"/>
+            </w:tcBorders>
+            <w:tcMar>
+              <w:top w:w="120" w:type="dxa"/>
+              <w:left w:w="180" w:type="dxa"/>
+              <w:bottom w:w="120" w:type="dxa"/>
+              <w:right w:w="180" w:type="dxa"/>
+            </w:tcMar>
+            <w:vAlign w:val="center"/>
+            <w:hideMark/>
+          </w:tcPr>
+          <w:p>
+            <w:r>
+              <w:t>Accepted</w:t>
+            </w:r>
+          </w:p>
+        </w:tc>
+      </w:tr>
+      <w:tr>
+        <w:trPr>
+          <w:tblCellSpacing w:w="15" w:type="dxa"/>
+        </w:trPr>
+        <w:tc>
+          <w:tcPr>
+            <w:tcW w:w="0" w:type="auto"/>
+            <w:tcBorders>
+              <w:top w:val="single" w:sz="6" w:space="0" w:color="C4C7C5"/>
+              <w:left w:val="single" w:sz="6" w:space="0" w:color="C4C7C5"/>
+              <w:bottom w:val="single" w:sz="6" w:space="0" w:color="C4C7C5"/>
+              <w:right w:val="single" w:sz="6" w:space="0" w:color="C4C7C5"/>
+            </w:tcBorders>
+            <w:tcMar>
+              <w:top w:w="120" w:type="dxa"/>
+              <w:left w:w="180" w:type="dxa"/>
+              <w:bottom w:w="120" w:type="dxa"/>
+              <w:right w:w="180" w:type="dxa"/>
+            </w:tcMar>
+            <w:vAlign w:val="center"/>
+            <w:hideMark/>
+          </w:tcPr>
+          <w:p>
+            <w:pPr>
+              <w:rPr>
+                <w:b/>
+                <w:bCs/>
+              </w:rPr>
+            </w:pPr>
+            <w:r>
+              <w:rPr>
+                <w:b/>
+                <w:bCs/>
+              </w:rPr>
+              <w:t>DW-013</w:t>
+            </w:r>
+          </w:p>
+        </w:tc>
+        <w:tc>
+          <w:tcPr>
+            <w:tcW w:w="0" w:type="auto"/>
+            <w:tcBorders>
+              <w:top w:val="single" w:sz="6" w:space="0" w:color="C4C7C5"/>
+              <w:left w:val="single" w:sz="6" w:space="0" w:color="C4C7C5"/>
+              <w:bottom w:val="single" w:sz="6" w:space="0" w:color="C4C7C5"/>
+              <w:right w:val="single" w:sz="6" w:space="0" w:color="C4C7C5"/>
+            </w:tcBorders>
+            <w:tcMar>
+              <w:top w:w="120" w:type="dxa"/>
+              <w:left w:w="180" w:type="dxa"/>
+              <w:bottom w:w="120" w:type="dxa"/>
+              <w:right w:w="180" w:type="dxa"/>
+            </w:tcMar>
+            <w:vAlign w:val="center"/>
+            <w:hideMark/>
+          </w:tcPr>
+          <w:p>
+            <w:r>
+              <w:t>Users struggle to keep related applications grouped together during long workflows</w:t>
+            </w:r>
+          </w:p>
+        </w:tc>
+        <w:tc>
+          <w:tcPr>
+            <w:tcW w:w="0" w:type="auto"/>
+            <w:tcBorders>
+              <w:top w:val="single" w:sz="6" w:space="0" w:color="C4C7C5"/>
+              <w:left w:val="single" w:sz="6" w:space="0" w:color="C4C7C5"/>
+              <w:bottom w:val="single" w:sz="6" w:space="0" w:color="C4C7C5"/>
+              <w:right w:val="single" w:sz="6" w:space="0" w:color="C4C7C5"/>
+            </w:tcBorders>
+            <w:tcMar>
+              <w:top w:w="120" w:type="dxa"/>
+              <w:left w:w="180" w:type="dxa"/>
+              <w:bottom w:w="120" w:type="dxa"/>
+              <w:right w:w="180" w:type="dxa"/>
+            </w:tcMar>
+            <w:vAlign w:val="center"/>
+            <w:hideMark/>
+          </w:tcPr>
+          <w:p>
+            <w:r>
+              <w:t>Accepted</w:t>
+            </w:r>
+          </w:p>
+        </w:tc>
+      </w:tr>
+      <w:tr>
+        <w:trPr>
+          <w:tblCellSpacing w:w="15" w:type="dxa"/>
+        </w:trPr>
+        <w:tc>
+          <w:tcPr>
+            <w:tcW w:w="0" w:type="auto"/>
+            <w:tcBorders>
+              <w:top w:val="single" w:sz="6" w:space="0" w:color="C4C7C5"/>
+              <w:left w:val="single" w:sz="6" w:space="0" w:color="C4C7C5"/>
+              <w:bottom w:val="single" w:sz="6" w:space="0" w:color="C4C7C5"/>
+              <w:right w:val="single" w:sz="6" w:space="0" w:color="C4C7C5"/>
+            </w:tcBorders>
+            <w:tcMar>
+              <w:top w:w="120" w:type="dxa"/>
+              <w:left w:w="180" w:type="dxa"/>
+              <w:bottom w:w="120" w:type="dxa"/>
+              <w:right w:w="180" w:type="dxa"/>
+            </w:tcMar>
+            <w:vAlign w:val="center"/>
+            <w:hideMark/>
+          </w:tcPr>
+          <w:p>
+            <w:pPr>
+              <w:rPr>
+                <w:b/>
+                <w:bCs/>
+              </w:rPr>
+            </w:pPr>
+            <w:r>
+              <w:rPr>
+                <w:b/>
+                <w:bCs/>
+              </w:rPr>
+              <w:t>DW-014</w:t>
+            </w:r>
+          </w:p>
+        </w:tc>
+        <w:tc>
+          <w:tcPr>
+            <w:tcW w:w="0" w:type="auto"/>
+            <w:tcBorders>
+              <w:top w:val="single" w:sz="6" w:space="0" w:color="C4C7C5"/>
+              <w:left w:val="single" w:sz="6" w:space="0" w:color="C4C7C5"/>
+              <w:bottom w:val="single" w:sz="6" w:space="0" w:color="C4C7C5"/>
+              <w:right w:val="single" w:sz="6" w:space="0" w:color="C4C7C5"/>
+            </w:tcBorders>
+            <w:tcMar>
+              <w:top w:w="120" w:type="dxa"/>
+              <w:left w:w="180" w:type="dxa"/>
+              <w:bottom w:w="120" w:type="dxa"/>
+              <w:right w:w="180" w:type="dxa"/>
+            </w:tcMar>
+            <w:vAlign w:val="center"/>
+            <w:hideMark/>
+          </w:tcPr>
+          <w:p>
+            <w:r>
+              <w:t>Users frequently interrupt their work to locate hidden or minimized windows</w:t>
+            </w:r>
+          </w:p>
+        </w:tc>
+        <w:tc>
+          <w:tcPr>
+            <w:tcW w:w="0" w:type="auto"/>
+            <w:tcBorders>
+              <w:top w:val="single" w:sz="6" w:space="0" w:color="C4C7C5"/>
+              <w:left w:val="single" w:sz="6" w:space="0" w:color="C4C7C5"/>
+              <w:bottom w:val="single" w:sz="6" w:space="0" w:color="C4C7C5"/>
+              <w:right w:val="single" w:sz="6" w:space="0" w:color="C4C7C5"/>
+            </w:tcBorders>
+            <w:tcMar>
+              <w:top w:w="120" w:type="dxa"/>
+              <w:left w:w="180" w:type="dxa"/>
+              <w:bottom w:w="120" w:type="dxa"/>
+              <w:right w:w="180" w:type="dxa"/>
+            </w:tcMar>
+            <w:vAlign w:val="center"/>
+            <w:hideMark/>
+          </w:tcPr>
+          <w:p>
+            <w:r>
+              <w:t>Accepted</w:t>
+            </w:r>
+          </w:p>
+        </w:tc>
+      </w:tr>
+      <w:tr>
+        <w:trPr>
+          <w:tblCellSpacing w:w="15" w:type="dxa"/>
+        </w:trPr>
+        <w:tc>
+          <w:tcPr>
+            <w:tcW w:w="0" w:type="auto"/>
+            <w:tcBorders>
+              <w:top w:val="single" w:sz="6" w:space="0" w:color="C4C7C5"/>
+              <w:left w:val="single" w:sz="6" w:space="0" w:color="C4C7C5"/>
+              <w:bottom w:val="single" w:sz="6" w:space="0" w:color="C4C7C5"/>
+              <w:right w:val="single" w:sz="6" w:space="0" w:color="C4C7C5"/>
+            </w:tcBorders>
+            <w:tcMar>
+              <w:top w:w="120" w:type="dxa"/>
+              <w:left w:w="180" w:type="dxa"/>
+              <w:bottom w:w="120" w:type="dxa"/>
+              <w:right w:w="180" w:type="dxa"/>
+            </w:tcMar>
+            <w:vAlign w:val="center"/>
+            <w:hideMark/>
+          </w:tcPr>
+          <w:p>
+            <w:pPr>
+              <w:rPr>
+                <w:b/>
+                <w:bCs/>
+              </w:rPr>
+            </w:pPr>
+            <w:r>
+              <w:rPr>
+                <w:b/>
+                <w:bCs/>
+              </w:rPr>
+              <w:t>DW-015</w:t>
+            </w:r>
+          </w:p>
+        </w:tc>
+        <w:tc>
+          <w:tcPr>
+            <w:tcW w:w="0" w:type="auto"/>
+            <w:tcBorders>
+              <w:top w:val="single" w:sz="6" w:space="0" w:color="C4C7C5"/>
+              <w:left w:val="single" w:sz="6" w:space="0" w:color="C4C7C5"/>
+              <w:bottom w:val="single" w:sz="6" w:space="0" w:color="C4C7C5"/>
+              <w:right w:val="single" w:sz="6" w:space="0" w:color="C4C7C5"/>
+            </w:tcBorders>
+            <w:tcMar>
+              <w:top w:w="120" w:type="dxa"/>
+              <w:left w:w="180" w:type="dxa"/>
+              <w:bottom w:w="120" w:type="dxa"/>
+              <w:right w:w="180" w:type="dxa"/>
+            </w:tcMar>
+            <w:vAlign w:val="center"/>
+            <w:hideMark/>
+          </w:tcPr>
+          <w:p>
+            <w:r>
+              <w:t>Users struggle to maintain visual focus when numerous windows compete for attention</w:t>
+            </w:r>
+          </w:p>
+        </w:tc>
+        <w:tc>
+          <w:tcPr>
+            <w:tcW w:w="0" w:type="auto"/>
+            <w:tcBorders>
+              <w:top w:val="single" w:sz="6" w:space="0" w:color="C4C7C5"/>
+              <w:left w:val="single" w:sz="6" w:space="0" w:color="C4C7C5"/>
+              <w:bottom w:val="single" w:sz="6" w:space="0" w:color="C4C7C5"/>
+              <w:right w:val="single" w:sz="6" w:space="0" w:color="C4C7C5"/>
+            </w:tcBorders>
+            <w:tcMar>
+              <w:top w:w="120" w:type="dxa"/>
+              <w:left w:w="180" w:type="dxa"/>
+              <w:bottom w:w="120" w:type="dxa"/>
+              <w:right w:w="180" w:type="dxa"/>
+            </w:tcMar>
+            <w:vAlign w:val="center"/>
+            <w:hideMark/>
+          </w:tcPr>
+          <w:p>
+            <w:r>
+              <w:t>Accepted</w:t>
+            </w:r>
+          </w:p>
+        </w:tc>
+      </w:tr>
+      <w:tr>
+        <w:trPr>
+          <w:tblCellSpacing w:w="15" w:type="dxa"/>
+        </w:trPr>
+        <w:tc>
+          <w:tcPr>
+            <w:tcW w:w="0" w:type="auto"/>
+            <w:tcBorders>
+              <w:top w:val="single" w:sz="6" w:space="0" w:color="C4C7C5"/>
+              <w:left w:val="single" w:sz="6" w:space="0" w:color="C4C7C5"/>
+              <w:bottom w:val="single" w:sz="6" w:space="0" w:color="C4C7C5"/>
+              <w:right w:val="single" w:sz="6" w:space="0" w:color="C4C7C5"/>
+            </w:tcBorders>
+            <w:tcMar>
+              <w:top w:w="120" w:type="dxa"/>
+              <w:left w:w="180" w:type="dxa"/>
+              <w:bottom w:w="120" w:type="dxa"/>
+              <w:right w:w="180" w:type="dxa"/>
+            </w:tcMar>
+            <w:vAlign w:val="center"/>
+            <w:hideMark/>
+          </w:tcPr>
+          <w:p>
+            <w:pPr>
+              <w:rPr>
+                <w:b/>
+                <w:bCs/>
+              </w:rPr>
+            </w:pPr>
+            <w:r>
+              <w:rPr>
+                <w:b/>
+                <w:bCs/>
+              </w:rPr>
+              <w:t>DW-016</w:t>
+            </w:r>
+          </w:p>
+        </w:tc>
+        <w:tc>
+          <w:tcPr>
+            <w:tcW w:w="0" w:type="auto"/>
+            <w:tcBorders>
+              <w:top w:val="single" w:sz="6" w:space="0" w:color="C4C7C5"/>
+              <w:left w:val="single" w:sz="6" w:space="0" w:color="C4C7C5"/>
+              <w:bottom w:val="single" w:sz="6" w:space="0" w:color="C4C7C5"/>
+              <w:right w:val="single" w:sz="6" w:space="0" w:color="C4C7C5"/>
+            </w:tcBorders>
+            <w:tcMar>
+              <w:top w:w="120" w:type="dxa"/>
+              <w:left w:w="180" w:type="dxa"/>
+              <w:bottom w:w="120" w:type="dxa"/>
+              <w:right w:w="180" w:type="dxa"/>
+            </w:tcMar>
+            <w:vAlign w:val="center"/>
+            <w:hideMark/>
+          </w:tcPr>
+          <w:p>
+            <w:r>
+              <w:t>Users struggle to return to a previous workspace configuration after interruptions</w:t>
+            </w:r>
+          </w:p>
+        </w:tc>
+        <w:tc>
+          <w:tcPr>
+            <w:tcW w:w="0" w:type="auto"/>
+            <w:tcBorders>
+              <w:top w:val="single" w:sz="6" w:space="0" w:color="C4C7C5"/>
+              <w:left w:val="single" w:sz="6" w:space="0" w:color="C4C7C5"/>
+              <w:bottom w:val="single" w:sz="6" w:space="0" w:color="C4C7C5"/>
+              <w:right w:val="single" w:sz="6" w:space="0" w:color="C4C7C5"/>
+            </w:tcBorders>
+            <w:tcMar>
+              <w:top w:w="120" w:type="dxa"/>
+              <w:left w:w="180" w:type="dxa"/>
+              <w:bottom w:w="120" w:type="dxa"/>
+              <w:right w:w="180" w:type="dxa"/>
+            </w:tcMar>
+            <w:vAlign w:val="center"/>
+            <w:hideMark/>
+          </w:tcPr>
+          <w:p>
+            <w:r>
+              <w:t>Accepted</w:t>
+            </w:r>
+          </w:p>
+        </w:tc>
+      </w:tr>
+      <w:tr>
+        <w:trPr>
+          <w:tblCellSpacing w:w="15" w:type="dxa"/>
+        </w:trPr>
+        <w:tc>
+          <w:tcPr>
+            <w:tcW w:w="0" w:type="auto"/>
+            <w:tcBorders>
+              <w:top w:val="single" w:sz="6" w:space="0" w:color="C4C7C5"/>
+              <w:left w:val="single" w:sz="6" w:space="0" w:color="C4C7C5"/>
+              <w:bottom w:val="single" w:sz="6" w:space="0" w:color="C4C7C5"/>
+              <w:right w:val="single" w:sz="6" w:space="0" w:color="C4C7C5"/>
+            </w:tcBorders>
+            <w:tcMar>
+              <w:top w:w="120" w:type="dxa"/>
+              <w:left w:w="180" w:type="dxa"/>
+              <w:bottom w:w="120" w:type="dxa"/>
+              <w:right w:w="180" w:type="dxa"/>
+            </w:tcMar>
+            <w:vAlign w:val="center"/>
+            <w:hideMark/>
+          </w:tcPr>
+          <w:p>
+            <w:pPr>
+              <w:rPr>
+                <w:b/>
+                <w:bCs/>
+              </w:rPr>
+            </w:pPr>
+            <w:r>
+              <w:rPr>
+                <w:b/>
+                <w:bCs/>
+              </w:rPr>
+              <w:t>DW-017</w:t>
+            </w:r>
+          </w:p>
+        </w:tc>
+        <w:tc>
+          <w:tcPr>
+            <w:tcW w:w="0" w:type="auto"/>
+            <w:tcBorders>
+              <w:top w:val="single" w:sz="6" w:space="0" w:color="C4C7C5"/>
+              <w:left w:val="single" w:sz="6" w:space="0" w:color="C4C7C5"/>
+              <w:bottom w:val="single" w:sz="6" w:space="0" w:color="C4C7C5"/>
+              <w:right w:val="single" w:sz="6" w:space="0" w:color="C4C7C5"/>
+            </w:tcBorders>
+            <w:tcMar>
+              <w:top w:w="120" w:type="dxa"/>
+              <w:left w:w="180" w:type="dxa"/>
+              <w:bottom w:w="120" w:type="dxa"/>
+              <w:right w:w="180" w:type="dxa"/>
+            </w:tcMar>
+            <w:vAlign w:val="center"/>
+            <w:hideMark/>
+          </w:tcPr>
+          <w:p>
+            <w:r>
+              <w:t>Users struggle to balance available screen space among multiple simultaneously active applications</w:t>
+            </w:r>
+          </w:p>
+        </w:tc>
+        <w:tc>
+          <w:tcPr>
+            <w:tcW w:w="0" w:type="auto"/>
+            <w:tcBorders>
+              <w:top w:val="single" w:sz="6" w:space="0" w:color="C4C7C5"/>
+              <w:left w:val="single" w:sz="6" w:space="0" w:color="C4C7C5"/>
+              <w:bottom w:val="single" w:sz="6" w:space="0" w:color="C4C7C5"/>
+              <w:right w:val="single" w:sz="6" w:space="0" w:color="C4C7C5"/>
+            </w:tcBorders>
+            <w:tcMar>
+              <w:top w:w="120" w:type="dxa"/>
+              <w:left w:w="180" w:type="dxa"/>
+              <w:bottom w:w="120" w:type="dxa"/>
+              <w:right w:w="180" w:type="dxa"/>
+            </w:tcMar>
+            <w:vAlign w:val="center"/>
+            <w:hideMark/>
+          </w:tcPr>
+          <w:p>
+            <w:r>
+              <w:t>Accepted</w:t>
+            </w:r>
+          </w:p>
+        </w:tc>
+      </w:tr>
+      <w:tr>
+        <w:trPr>
+          <w:tblCellSpacing w:w="15" w:type="dxa"/>
+        </w:trPr>
+        <w:tc>
+          <w:tcPr>
+            <w:tcW w:w="0" w:type="auto"/>
+            <w:tcBorders>
+              <w:top w:val="single" w:sz="6" w:space="0" w:color="C4C7C5"/>
+              <w:left w:val="single" w:sz="6" w:space="0" w:color="C4C7C5"/>
+              <w:bottom w:val="single" w:sz="6" w:space="0" w:color="C4C7C5"/>
+              <w:right w:val="single" w:sz="6" w:space="0" w:color="C4C7C5"/>
+            </w:tcBorders>
+            <w:tcMar>
+              <w:top w:w="120" w:type="dxa"/>
+              <w:left w:w="180" w:type="dxa"/>
+              <w:bottom w:w="120" w:type="dxa"/>
+              <w:right w:w="180" w:type="dxa"/>
+            </w:tcMar>
+            <w:vAlign w:val="center"/>
+            <w:hideMark/>
+          </w:tcPr>
+          <w:p>
+            <w:pPr>
+              <w:rPr>
+                <w:b/>
+                <w:bCs/>
+              </w:rPr>
+            </w:pPr>
+            <w:r>
+              <w:rPr>
+                <w:b/>
+                <w:bCs/>
+              </w:rPr>
+              <w:t>DW-018</w:t>
+            </w:r>
+          </w:p>
+        </w:tc>
+        <w:tc>
+          <w:tcPr>
+            <w:tcW w:w="0" w:type="auto"/>
+            <w:tcBorders>
+              <w:top w:val="single" w:sz="6" w:space="0" w:color="C4C7C5"/>
+              <w:left w:val="single" w:sz="6" w:space="0" w:color="C4C7C5"/>
+              <w:bottom w:val="single" w:sz="6" w:space="0" w:color="C4C7C5"/>
+              <w:right w:val="single" w:sz="6" w:space="0" w:color="C4C7C5"/>
+            </w:tcBorders>
+            <w:tcMar>
+              <w:top w:w="120" w:type="dxa"/>
+              <w:left w:w="180" w:type="dxa"/>
+              <w:bottom w:w="120" w:type="dxa"/>
+              <w:right w:w="180" w:type="dxa"/>
+            </w:tcMar>
+            <w:vAlign w:val="center"/>
+            <w:hideMark/>
+          </w:tcPr>
+          <w:p>
+            <w:r>
+              <w:t>Users struggle to understand which application currently has input focus</w:t>
+            </w:r>
+          </w:p>
+        </w:tc>
+        <w:tc>
+          <w:tcPr>
+            <w:tcW w:w="0" w:type="auto"/>
+            <w:tcBorders>
+              <w:top w:val="single" w:sz="6" w:space="0" w:color="C4C7C5"/>
+              <w:left w:val="single" w:sz="6" w:space="0" w:color="C4C7C5"/>
+              <w:bottom w:val="single" w:sz="6" w:space="0" w:color="C4C7C5"/>
+              <w:right w:val="single" w:sz="6" w:space="0" w:color="C4C7C5"/>
+            </w:tcBorders>
+            <w:tcMar>
+              <w:top w:w="120" w:type="dxa"/>
+              <w:left w:w="180" w:type="dxa"/>
+              <w:bottom w:w="120" w:type="dxa"/>
+              <w:right w:w="180" w:type="dxa"/>
+            </w:tcMar>
+            <w:vAlign w:val="center"/>
+            <w:hideMark/>
+          </w:tcPr>
+          <w:p>
+            <w:r>
+              <w:t>Accepted</w:t>
+            </w:r>
+          </w:p>
+        </w:tc>
+      </w:tr>
+      <w:tr>
+        <w:trPr>
+          <w:tblCellSpacing w:w="15" w:type="dxa"/>
+        </w:trPr>
+        <w:tc>
+          <w:tcPr>
+            <w:tcW w:w="0" w:type="auto"/>
+            <w:tcBorders>
+              <w:top w:val="single" w:sz="6" w:space="0" w:color="C4C7C5"/>
+              <w:left w:val="single" w:sz="6" w:space="0" w:color="C4C7C5"/>
+              <w:bottom w:val="single" w:sz="6" w:space="0" w:color="C4C7C5"/>
+              <w:right w:val="single" w:sz="6" w:space="0" w:color="C4C7C5"/>
+            </w:tcBorders>
+            <w:tcMar>
+              <w:top w:w="120" w:type="dxa"/>
+              <w:left w:w="180" w:type="dxa"/>
+              <w:bottom w:w="120" w:type="dxa"/>
+              <w:right w:w="180" w:type="dxa"/>
+            </w:tcMar>
+            <w:vAlign w:val="center"/>
+            <w:hideMark/>
+          </w:tcPr>
+          <w:p>
+            <w:pPr>
+              <w:rPr>
+                <w:b/>
+                <w:bCs/>
+              </w:rPr>
+            </w:pPr>
+            <w:r>
+              <w:rPr>
+                <w:b/>
+                <w:bCs/>
+              </w:rPr>
+              <w:t>DW-019</w:t>
+            </w:r>
+          </w:p>
+        </w:tc>
+        <w:tc>
+          <w:tcPr>
+            <w:tcW w:w="0" w:type="auto"/>
+            <w:tcBorders>
+              <w:top w:val="single" w:sz="6" w:space="0" w:color="C4C7C5"/>
+              <w:left w:val="single" w:sz="6" w:space="0" w:color="C4C7C5"/>
+              <w:bottom w:val="single" w:sz="6" w:space="0" w:color="C4C7C5"/>
+              <w:right w:val="single" w:sz="6" w:space="0" w:color="C4C7C5"/>
+            </w:tcBorders>
+            <w:tcMar>
+              <w:top w:w="120" w:type="dxa"/>
+              <w:left w:w="180" w:type="dxa"/>
+              <w:bottom w:w="120" w:type="dxa"/>
+              <w:right w:w="180" w:type="dxa"/>
+            </w:tcMar>
+            <w:vAlign w:val="center"/>
+            <w:hideMark/>
+          </w:tcPr>
+          <w:p>
+            <w:r>
+              <w:t>Users struggle to separate personal and professional desktop workspaces</w:t>
+            </w:r>
+          </w:p>
+        </w:tc>
+        <w:tc>
+          <w:tcPr>
+            <w:tcW w:w="0" w:type="auto"/>
+            <w:tcBorders>
+              <w:top w:val="single" w:sz="6" w:space="0" w:color="C4C7C5"/>
+              <w:left w:val="single" w:sz="6" w:space="0" w:color="C4C7C5"/>
+              <w:bottom w:val="single" w:sz="6" w:space="0" w:color="C4C7C5"/>
+              <w:right w:val="single" w:sz="6" w:space="0" w:color="C4C7C5"/>
+            </w:tcBorders>
+            <w:tcMar>
+              <w:top w:w="120" w:type="dxa"/>
+              <w:left w:w="180" w:type="dxa"/>
+              <w:bottom w:w="120" w:type="dxa"/>
+              <w:right w:w="180" w:type="dxa"/>
+            </w:tcMar>
+            <w:vAlign w:val="center"/>
+            <w:hideMark/>
+          </w:tcPr>
+          <w:p>
+            <w:r>
+              <w:t>Accepted</w:t>
+            </w:r>
+          </w:p>
+        </w:tc>
+      </w:tr>
+      <w:tr>
+        <w:trPr>
+          <w:tblCellSpacing w:w="15" w:type="dxa"/>
+        </w:trPr>
+        <w:tc>
+          <w:tcPr>
+            <w:tcW w:w="0" w:type="auto"/>
+            <w:tcBorders>
+              <w:top w:val="single" w:sz="6" w:space="0" w:color="C4C7C5"/>
+              <w:left w:val="single" w:sz="6" w:space="0" w:color="C4C7C5"/>
+              <w:bottom w:val="single" w:sz="6" w:space="0" w:color="C4C7C5"/>
+              <w:right w:val="single" w:sz="6" w:space="0" w:color="C4C7C5"/>
+            </w:tcBorders>
+            <w:tcMar>
+              <w:top w:w="120" w:type="dxa"/>
+              <w:left w:w="180" w:type="dxa"/>
+              <w:bottom w:w="120" w:type="dxa"/>
+              <w:right w:w="180" w:type="dxa"/>
+            </w:tcMar>
+            <w:vAlign w:val="center"/>
+            <w:hideMark/>
+          </w:tcPr>
+          <w:p>
+            <w:pPr>
+              <w:rPr>
+                <w:b/>
+                <w:bCs/>
+              </w:rPr>
+            </w:pPr>
+            <w:r>
+              <w:rPr>
+                <w:b/>
+                <w:bCs/>
+              </w:rPr>
+              <w:t>DW-020</w:t>
+            </w:r>
+          </w:p>
+        </w:tc>
+        <w:tc>
+          <w:tcPr>
+            <w:tcW w:w="0" w:type="auto"/>
+            <w:tcBorders>
+              <w:top w:val="single" w:sz="6" w:space="0" w:color="C4C7C5"/>
+              <w:left w:val="single" w:sz="6" w:space="0" w:color="C4C7C5"/>
+              <w:bottom w:val="single" w:sz="6" w:space="0" w:color="C4C7C5"/>
+              <w:right w:val="single" w:sz="6" w:space="0" w:color="C4C7C5"/>
+            </w:tcBorders>
+            <w:tcMar>
+              <w:top w:w="120" w:type="dxa"/>
+              <w:left w:w="180" w:type="dxa"/>
+              <w:bottom w:w="120" w:type="dxa"/>
+              <w:right w:w="180" w:type="dxa"/>
+            </w:tcMar>
+            <w:vAlign w:val="center"/>
+            <w:hideMark/>
+          </w:tcPr>
+          <w:p>
+            <w:r>
+              <w:t>Users struggle to maintain workspace organization as the number of running applications increases</w:t>
+            </w:r>
+          </w:p>
+        </w:tc>
+        <w:tc>
+          <w:tcPr>
+            <w:tcW w:w="0" w:type="auto"/>
+            <w:tcBorders>
+              <w:top w:val="single" w:sz="6" w:space="0" w:color="C4C7C5"/>
+              <w:left w:val="single" w:sz="6" w:space="0" w:color="C4C7C5"/>
+              <w:bottom w:val="single" w:sz="6" w:space="0" w:color="C4C7C5"/>
+              <w:right w:val="single" w:sz="6" w:space="0" w:color="C4C7C5"/>
+            </w:tcBorders>
+            <w:tcMar>
+              <w:top w:w="120" w:type="dxa"/>
+              <w:left w:w="180" w:type="dxa"/>
+              <w:bottom w:w="120" w:type="dxa"/>
+              <w:right w:w="180" w:type="dxa"/>
+            </w:tcMar>
+            <w:vAlign w:val="center"/>
+            <w:hideMark/>
+          </w:tcPr>
+          <w:p>
+            <w:r>
+              <w:t>Accepted</w:t>
+            </w:r>
+          </w:p>
+        </w:tc>
+      </w:tr>
+      <w:tr>
+        <w:trPr>
+          <w:tblCellSpacing w:w="15" w:type="dxa"/>
+        </w:trPr>
+        <w:tc>
+          <w:tcPr>
+            <w:tcW w:w="0" w:type="auto"/>
+            <w:tcBorders>
+              <w:top w:val="single" w:sz="6" w:space="0" w:color="C4C7C5"/>
+              <w:left w:val="single" w:sz="6" w:space="0" w:color="C4C7C5"/>
+              <w:bottom w:val="single" w:sz="6" w:space="0" w:color="C4C7C5"/>
+              <w:right w:val="single" w:sz="6" w:space="0" w:color="C4C7C5"/>
+            </w:tcBorders>
+            <w:tcMar>
+              <w:top w:w="120" w:type="dxa"/>
+              <w:left w:w="180" w:type="dxa"/>
+              <w:bottom w:w="120" w:type="dxa"/>
+              <w:right w:w="180" w:type="dxa"/>
+            </w:tcMar>
+            <w:vAlign w:val="center"/>
+            <w:hideMark/>
+          </w:tcPr>
+          <w:p>
+            <w:pPr>
+              <w:rPr>
+                <w:b/>
+                <w:bCs/>
+              </w:rPr>
+            </w:pPr>
+            <w:r>
+              <w:rPr>
+                <w:b/>
+                <w:bCs/>
+              </w:rPr>
+              <w:t>DW-021</w:t>
+            </w:r>
+          </w:p>
+        </w:tc>
+        <w:tc>
+          <w:tcPr>
+            <w:tcW w:w="0" w:type="auto"/>
+            <w:tcBorders>
+              <w:top w:val="single" w:sz="6" w:space="0" w:color="C4C7C5"/>
+              <w:left w:val="single" w:sz="6" w:space="0" w:color="C4C7C5"/>
+              <w:bottom w:val="single" w:sz="6" w:space="0" w:color="C4C7C5"/>
+              <w:right w:val="single" w:sz="6" w:space="0" w:color="C4C7C5"/>
+            </w:tcBorders>
+            <w:tcMar>
+              <w:top w:w="120" w:type="dxa"/>
+              <w:left w:w="180" w:type="dxa"/>
+              <w:bottom w:w="120" w:type="dxa"/>
+              <w:right w:w="180" w:type="dxa"/>
+            </w:tcMar>
+            <w:vAlign w:val="center"/>
+            <w:hideMark/>
+          </w:tcPr>
+          <w:p>
+            <w:r>
+              <w:t>Users struggle to continue unfinished work after accidentally closing application windows</w:t>
+            </w:r>
+          </w:p>
+        </w:tc>
+        <w:tc>
+          <w:tcPr>
+            <w:tcW w:w="0" w:type="auto"/>
+            <w:tcBorders>
+              <w:top w:val="single" w:sz="6" w:space="0" w:color="C4C7C5"/>
+              <w:left w:val="single" w:sz="6" w:space="0" w:color="C4C7C5"/>
+              <w:bottom w:val="single" w:sz="6" w:space="0" w:color="C4C7C5"/>
+              <w:right w:val="single" w:sz="6" w:space="0" w:color="C4C7C5"/>
+            </w:tcBorders>
+            <w:tcMar>
+              <w:top w:w="120" w:type="dxa"/>
+              <w:left w:w="180" w:type="dxa"/>
+              <w:bottom w:w="120" w:type="dxa"/>
+              <w:right w:w="180" w:type="dxa"/>
+            </w:tcMar>
+            <w:vAlign w:val="center"/>
+            <w:hideMark/>
+          </w:tcPr>
+          <w:p>
+            <w:r>
+              <w:t>Accepted</w:t>
+            </w:r>
+          </w:p>
+        </w:tc>
+      </w:tr>
+      <w:tr>
+        <w:trPr>
+          <w:tblCellSpacing w:w="15" w:type="dxa"/>
+        </w:trPr>
+        <w:tc>
+          <w:tcPr>
+            <w:tcW w:w="0" w:type="auto"/>
+            <w:tcBorders>
+              <w:top w:val="single" w:sz="6" w:space="0" w:color="C4C7C5"/>
+              <w:left w:val="single" w:sz="6" w:space="0" w:color="C4C7C5"/>
+              <w:bottom w:val="single" w:sz="6" w:space="0" w:color="C4C7C5"/>
+              <w:right w:val="single" w:sz="6" w:space="0" w:color="C4C7C5"/>
+            </w:tcBorders>
+            <w:tcMar>
+              <w:top w:w="120" w:type="dxa"/>
+              <w:left w:w="180" w:type="dxa"/>
+              <w:bottom w:w="120" w:type="dxa"/>
+              <w:right w:w="180" w:type="dxa"/>
+            </w:tcMar>
+            <w:vAlign w:val="center"/>
+            <w:hideMark/>
+          </w:tcPr>
+          <w:p>
+            <w:pPr>
+              <w:rPr>
+                <w:b/>
+                <w:bCs/>
+              </w:rPr>
+            </w:pPr>
+            <w:r>
+              <w:rPr>
+                <w:b/>
+                <w:bCs/>
+              </w:rPr>
+              <w:lastRenderedPageBreak/>
+              <w:t>DW-022</w:t>
+            </w:r>
+          </w:p>
+        </w:tc>
+        <w:tc>
+          <w:tcPr>
+            <w:tcW w:w="0" w:type="auto"/>
+            <w:tcBorders>
+              <w:top w:val="single" w:sz="6" w:space="0" w:color="C4C7C5"/>
+              <w:left w:val="single" w:sz="6" w:space="0" w:color="C4C7C5"/>
+              <w:bottom w:val="single" w:sz="6" w:space="0" w:color="C4C7C5"/>
+              <w:right w:val="single" w:sz="6" w:space="0" w:color="C4C7C5"/>
+            </w:tcBorders>
+            <w:tcMar>
+              <w:top w:w="120" w:type="dxa"/>
+              <w:left w:w="180" w:type="dxa"/>
+              <w:bottom w:w="120" w:type="dxa"/>
+              <w:right w:w="180" w:type="dxa"/>
+            </w:tcMar>
+            <w:vAlign w:val="center"/>
+            <w:hideMark/>
+          </w:tcPr>
+          <w:p>
+            <w:r>
+              <w:t>Users struggle to coordinate information across multiple simultaneously open applications</w:t>
+            </w:r>
+          </w:p>
+        </w:tc>
+        <w:tc>
+          <w:tcPr>
+            <w:tcW w:w="0" w:type="auto"/>
+            <w:tcBorders>
+              <w:top w:val="single" w:sz="6" w:space="0" w:color="C4C7C5"/>
+              <w:left w:val="single" w:sz="6" w:space="0" w:color="C4C7C5"/>
+              <w:bottom w:val="single" w:sz="6" w:space="0" w:color="C4C7C5"/>
+              <w:right w:val="single" w:sz="6" w:space="0" w:color="C4C7C5"/>
+            </w:tcBorders>
+            <w:tcMar>
+              <w:top w:w="120" w:type="dxa"/>
+              <w:left w:w="180" w:type="dxa"/>
+              <w:bottom w:w="120" w:type="dxa"/>
+              <w:right w:w="180" w:type="dxa"/>
+            </w:tcMar>
+            <w:vAlign w:val="center"/>
+            <w:hideMark/>
+          </w:tcPr>
+          <w:p>
+            <w:r>
+              <w:t>Accepted</w:t>
+            </w:r>
+          </w:p>
+        </w:tc>
+      </w:tr>
+      <w:tr>
+        <w:trPr>
+          <w:tblCellSpacing w:w="15" w:type="dxa"/>
+        </w:trPr>
+        <w:tc>
+          <w:tcPr>
+            <w:tcW w:w="0" w:type="auto"/>
+            <w:tcBorders>
+              <w:top w:val="single" w:sz="6" w:space="0" w:color="C4C7C5"/>
+              <w:left w:val="single" w:sz="6" w:space="0" w:color="C4C7C5"/>
+              <w:bottom w:val="single" w:sz="6" w:space="0" w:color="C4C7C5"/>
+              <w:right w:val="single" w:sz="6" w:space="0" w:color="C4C7C5"/>
+            </w:tcBorders>
+            <w:tcMar>
+              <w:top w:w="120" w:type="dxa"/>
+              <w:left w:w="180" w:type="dxa"/>
+              <w:bottom w:w="120" w:type="dxa"/>
+              <w:right w:w="180" w:type="dxa"/>
+            </w:tcMar>
+            <w:vAlign w:val="center"/>
+            <w:hideMark/>
+          </w:tcPr>
+          <w:p>
+            <w:pPr>
+              <w:rPr>
+                <w:b/>
+                <w:bCs/>
+              </w:rPr>
+            </w:pPr>
+            <w:r>
+              <w:rPr>
+                <w:b/>
+                <w:bCs/>
+              </w:rPr>
+              <w:t>DW-023</w:t>
+            </w:r>
+          </w:p>
+        </w:tc>
+        <w:tc>
+          <w:tcPr>
+            <w:tcW w:w="0" w:type="auto"/>
+            <w:tcBorders>
+              <w:top w:val="single" w:sz="6" w:space="0" w:color="C4C7C5"/>
+              <w:left w:val="single" w:sz="6" w:space="0" w:color="C4C7C5"/>
+              <w:bottom w:val="single" w:sz="6" w:space="0" w:color="C4C7C5"/>
+              <w:right w:val="single" w:sz="6" w:space="0" w:color="C4C7C5"/>
+            </w:tcBorders>
+            <w:tcMar>
+              <w:top w:w="120" w:type="dxa"/>
+              <w:left w:w="180" w:type="dxa"/>
+              <w:bottom w:w="120" w:type="dxa"/>
+              <w:right w:w="180" w:type="dxa"/>
+            </w:tcMar>
+            <w:vAlign w:val="center"/>
+            <w:hideMark/>
+          </w:tcPr>
+          <w:p>
+            <w:r>
+              <w:t>Users struggle to create reusable workspace layouts for recurring tasks</w:t>
+            </w:r>
+          </w:p>
+        </w:tc>
+        <w:tc>
+          <w:tcPr>
+            <w:tcW w:w="0" w:type="auto"/>
+            <w:tcBorders>
+              <w:top w:val="single" w:sz="6" w:space="0" w:color="C4C7C5"/>
+              <w:left w:val="single" w:sz="6" w:space="0" w:color="C4C7C5"/>
+              <w:bottom w:val="single" w:sz="6" w:space="0" w:color="C4C7C5"/>
+              <w:right w:val="single" w:sz="6" w:space="0" w:color="C4C7C5"/>
+            </w:tcBorders>
+            <w:tcMar>
+              <w:top w:w="120" w:type="dxa"/>
+              <w:left w:w="180" w:type="dxa"/>
+              <w:bottom w:w="120" w:type="dxa"/>
+              <w:right w:w="180" w:type="dxa"/>
+            </w:tcMar>
+            <w:vAlign w:val="center"/>
+            <w:hideMark/>
+          </w:tcPr>
+          <w:p>
+            <w:r>
+              <w:t>Accepted</w:t>
+            </w:r>
+          </w:p>
+        </w:tc>
+      </w:tr>
+      <w:tr>
+        <w:trPr>
+          <w:tblCellSpacing w:w="15" w:type="dxa"/>
+        </w:trPr>
+        <w:tc>
+          <w:tcPr>
+            <w:tcW w:w="0" w:type="auto"/>
+            <w:tcBorders>
+              <w:top w:val="single" w:sz="6" w:space="0" w:color="C4C7C5"/>
+              <w:left w:val="single" w:sz="6" w:space="0" w:color="C4C7C5"/>
+              <w:bottom w:val="single" w:sz="6" w:space="0" w:color="C4C7C5"/>
+              <w:right w:val="single" w:sz="6" w:space="0" w:color="C4C7C5"/>
+            </w:tcBorders>
+            <w:tcMar>
+              <w:top w:w="120" w:type="dxa"/>
+              <w:left w:w="180" w:type="dxa"/>
+              <w:bottom w:w="120" w:type="dxa"/>
+              <w:right w:w="180" w:type="dxa"/>
+            </w:tcMar>
+            <w:vAlign w:val="center"/>
+            <w:hideMark/>
+          </w:tcPr>
+          <w:p>
+            <w:pPr>
+              <w:rPr>
+                <w:b/>
+                <w:bCs/>
+              </w:rPr>
+            </w:pPr>
+            <w:r>
+              <w:rPr>
+                <w:b/>
+                <w:bCs/>
+              </w:rPr>
+              <w:t>DW-024</w:t>
+            </w:r>
+          </w:p>
+        </w:tc>
+        <w:tc>
+          <w:tcPr>
+            <w:tcW w:w="0" w:type="auto"/>
+            <w:tcBorders>
+              <w:top w:val="single" w:sz="6" w:space="0" w:color="C4C7C5"/>
+              <w:left w:val="single" w:sz="6" w:space="0" w:color="C4C7C5"/>
+              <w:bottom w:val="single" w:sz="6" w:space="0" w:color="C4C7C5"/>
+              <w:right w:val="single" w:sz="6" w:space="0" w:color="C4C7C5"/>
+            </w:tcBorders>
+            <w:tcMar>
+              <w:top w:w="120" w:type="dxa"/>
+              <w:left w:w="180" w:type="dxa"/>
+              <w:bottom w:w="120" w:type="dxa"/>
+              <w:right w:w="180" w:type="dxa"/>
+            </w:tcMar>
+            <w:vAlign w:val="center"/>
+            <w:hideMark/>
+          </w:tcPr>
+          <w:p>
+            <w:r>
+              <w:t>Users struggle to manage desktop clutter created by long-running work sessions</w:t>
+            </w:r>
+          </w:p>
+        </w:tc>
+        <w:tc>
+          <w:tcPr>
+            <w:tcW w:w="0" w:type="auto"/>
+            <w:tcBorders>
+              <w:top w:val="single" w:sz="6" w:space="0" w:color="C4C7C5"/>
+              <w:left w:val="single" w:sz="6" w:space="0" w:color="C4C7C5"/>
+              <w:bottom w:val="single" w:sz="6" w:space="0" w:color="C4C7C5"/>
+              <w:right w:val="single" w:sz="6" w:space="0" w:color="C4C7C5"/>
+            </w:tcBorders>
+            <w:tcMar>
+              <w:top w:w="120" w:type="dxa"/>
+              <w:left w:w="180" w:type="dxa"/>
+              <w:bottom w:w="120" w:type="dxa"/>
+              <w:right w:w="180" w:type="dxa"/>
+            </w:tcMar>
+            <w:vAlign w:val="center"/>
+            <w:hideMark/>
+          </w:tcPr>
+          <w:p>
+            <w:r>
+              <w:t>Accepted</w:t>
+            </w:r>
+          </w:p>
+        </w:tc>
+      </w:tr>
+      <w:tr>
+        <w:trPr>
+          <w:tblCellSpacing w:w="15" w:type="dxa"/>
+        </w:trPr>
+        <w:tc>
+          <w:tcPr>
+            <w:tcW w:w="0" w:type="auto"/>
+            <w:tcBorders>
+              <w:top w:val="single" w:sz="6" w:space="0" w:color="C4C7C5"/>
+              <w:left w:val="single" w:sz="6" w:space="0" w:color="C4C7C5"/>
+              <w:bottom w:val="single" w:sz="6" w:space="0" w:color="C4C7C5"/>
+              <w:right w:val="single" w:sz="6" w:space="0" w:color="C4C7C5"/>
+            </w:tcBorders>
+            <w:tcMar>
+              <w:top w:w="120" w:type="dxa"/>
+              <w:left w:w="180" w:type="dxa"/>
+              <w:bottom w:w="120" w:type="dxa"/>
+              <w:right w:w="180" w:type="dxa"/>
+            </w:tcMar>
+            <w:vAlign w:val="center"/>
+            <w:hideMark/>
+          </w:tcPr>
+          <w:p>
+            <w:pPr>
+              <w:rPr>
+                <w:b/>
+                <w:bCs/>
+              </w:rPr>
+            </w:pPr>
+            <w:r>
+              <w:rPr>
+                <w:b/>
+                <w:bCs/>
+              </w:rPr>
+              <w:t>DW-025</w:t>
+            </w:r>
+          </w:p>
+        </w:tc>
+        <w:tc>
+          <w:tcPr>
+            <w:tcW w:w="0" w:type="auto"/>
+            <w:tcBorders>
+              <w:top w:val="single" w:sz="6" w:space="0" w:color="C4C7C5"/>
+              <w:left w:val="single" w:sz="6" w:space="0" w:color="C4C7C5"/>
+              <w:bottom w:val="single" w:sz="6" w:space="0" w:color="C4C7C5"/>
+              <w:right w:val="single" w:sz="6" w:space="0" w:color="C4C7C5"/>
+            </w:tcBorders>
+            <w:tcMar>
+              <w:top w:w="120" w:type="dxa"/>
+              <w:left w:w="180" w:type="dxa"/>
+              <w:bottom w:w="120" w:type="dxa"/>
+              <w:right w:w="180" w:type="dxa"/>
+            </w:tcMar>
+            <w:vAlign w:val="center"/>
+            <w:hideMark/>
+          </w:tcPr>
+          <w:p>
+            <w:r>
+              <w:t>Users gradually lose awareness of their desktop workspace organization as active applications and tasks continuously accumulate</w:t>
+            </w:r>
+          </w:p>
+        </w:tc>
+        <w:tc>
+          <w:tcPr>
+            <w:tcW w:w="0" w:type="auto"/>
+            <w:tcBorders>
+              <w:top w:val="single" w:sz="6" w:space="0" w:color="C4C7C5"/>
+              <w:left w:val="single" w:sz="6" w:space="0" w:color="C4C7C5"/>
+              <w:bottom w:val="single" w:sz="6" w:space="0" w:color="C4C7C5"/>
+              <w:right w:val="single" w:sz="6" w:space="0" w:color="C4C7C5"/>
+            </w:tcBorders>
+            <w:tcMar>
+              <w:top w:w="120" w:type="dxa"/>
+              <w:left w:w="180" w:type="dxa"/>
+              <w:bottom w:w="120" w:type="dxa"/>
+              <w:right w:w="180" w:type="dxa"/>
+            </w:tcMar>
+            <w:vAlign w:val="center"/>
+            <w:hideMark/>
+          </w:tcPr>
+          <w:p>
+            <w:r>
+              <w:t>Accepted</w:t>
+            </w:r>
+          </w:p>
+        </w:tc>
+      </w:tr>
+      <w:tr>
+        <w:trPr>
+          <w:tblCellSpacing w:w="15" w:type="dxa"/>
+        </w:trPr>
+        <w:tc>
+          <w:tcPr>
+            <w:tcW w:w="0" w:type="auto"/>
+            <w:tcBorders>
+              <w:top w:val="single" w:sz="6" w:space="0" w:color="C4C7C5"/>
+              <w:left w:val="single" w:sz="6" w:space="0" w:color="C4C7C5"/>
+              <w:bottom w:val="single" w:sz="6" w:space="0" w:color="C4C7C5"/>
+              <w:right w:val="single" w:sz="6" w:space="0" w:color="C4C7C5"/>
+            </w:tcBorders>
+            <w:tcMar>
+              <w:top w:w="120" w:type="dxa"/>
+              <w:left w:w="180" w:type="dxa"/>
+              <w:bottom w:w="120" w:type="dxa"/>
+              <w:right w:w="180" w:type="dxa"/>
+            </w:tcMar>
+            <w:vAlign w:val="center"/>
+            <w:hideMark/>
+          </w:tcPr>
+          <w:p>
+            <w:pPr>
+              <w:rPr>
+                <w:b/>
+                <w:bCs/>
+              </w:rPr>
+            </w:pPr>
+            <w:r>
+              <w:rPr>
+                <w:b/>
+                <w:bCs/>
+              </w:rPr>
+              <w:t>DW-026</w:t>
+            </w:r>
+          </w:p>
+        </w:tc>
+        <w:tc>
+          <w:tcPr>
+            <w:tcW w:w="0" w:type="auto"/>
+            <w:tcBorders>
+              <w:top w:val="single" w:sz="6" w:space="0" w:color="C4C7C5"/>
+              <w:left w:val="single" w:sz="6" w:space="0" w:color="C4C7C5"/>
+              <w:bottom w:val="single" w:sz="6" w:space="0" w:color="C4C7C5"/>
+              <w:right w:val="single" w:sz="6" w:space="0" w:color="C4C7C5"/>
+            </w:tcBorders>
+            <w:tcMar>
+              <w:top w:w="120" w:type="dxa"/>
+              <w:left w:w="180" w:type="dxa"/>
+              <w:bottom w:w="120" w:type="dxa"/>
+              <w:right w:w="180" w:type="dxa"/>
+            </w:tcMar>
+            <w:vAlign w:val="center"/>
+            <w:hideMark/>
+          </w:tcPr>
+          <w:p>
+            <w:r>
+              <w:t>Users struggle to decide which applications should remain permanently open during work</w:t>
+            </w:r>
+          </w:p>
+        </w:tc>
+        <w:tc>
+          <w:tcPr>
+            <w:tcW w:w="0" w:type="auto"/>
+            <w:tcBorders>
+              <w:top w:val="single" w:sz="6" w:space="0" w:color="C4C7C5"/>
+              <w:left w:val="single" w:sz="6" w:space="0" w:color="C4C7C5"/>
+              <w:bottom w:val="single" w:sz="6" w:space="0" w:color="C4C7C5"/>
+              <w:right w:val="single" w:sz="6" w:space="0" w:color="C4C7C5"/>
+            </w:tcBorders>
+            <w:tcMar>
+              <w:top w:w="120" w:type="dxa"/>
+              <w:left w:w="180" w:type="dxa"/>
+              <w:bottom w:w="120" w:type="dxa"/>
+              <w:right w:w="180" w:type="dxa"/>
+            </w:tcMar>
+            <w:vAlign w:val="center"/>
+            <w:hideMark/>
+          </w:tcPr>
+          <w:p>
+            <w:r>
+              <w:t>Accepted</w:t>
+            </w:r>
+          </w:p>
+        </w:tc>
+      </w:tr>
+      <w:tr>
+        <w:trPr>
+          <w:tblCellSpacing w:w="15" w:type="dxa"/>
+        </w:trPr>
+        <w:tc>
+          <w:tcPr>
+            <w:tcW w:w="0" w:type="auto"/>
+            <w:tcBorders>
+              <w:top w:val="single" w:sz="6" w:space="0" w:color="C4C7C5"/>
+              <w:left w:val="single" w:sz="6" w:space="0" w:color="C4C7C5"/>
+              <w:bottom w:val="single" w:sz="6" w:space="0" w:color="C4C7C5"/>
+              <w:right w:val="single" w:sz="6" w:space="0" w:color="C4C7C5"/>
+            </w:tcBorders>
+            <w:tcMar>
+              <w:top w:w="120" w:type="dxa"/>
+              <w:left w:w="180" w:type="dxa"/>
+              <w:bottom w:w="120" w:type="dxa"/>
+              <w:right w:w="180" w:type="dxa"/>
+            </w:tcMar>
+            <w:vAlign w:val="center"/>
+            <w:hideMark/>
+          </w:tcPr>
+          <w:p>
+            <w:pPr>
+              <w:rPr>
+                <w:b/>
+                <w:bCs/>
+              </w:rPr>
+            </w:pPr>
+            <w:r>
+              <w:rPr>
+                <w:b/>
+                <w:bCs/>
+              </w:rPr>
+              <w:t>DW-027</w:t>
+            </w:r>
+          </w:p>
+        </w:tc>
+        <w:tc>
+          <w:tcPr>
+            <w:tcW w:w="0" w:type="auto"/>
+            <w:tcBorders>
+              <w:top w:val="single" w:sz="6" w:space="0" w:color="C4C7C5"/>
+              <w:left w:val="single" w:sz="6" w:space="0" w:color="C4C7C5"/>
+              <w:bottom w:val="single" w:sz="6" w:space="0" w:color="C4C7C5"/>
+              <w:right w:val="single" w:sz="6" w:space="0" w:color="C4C7C5"/>
+            </w:tcBorders>
+            <w:tcMar>
+              <w:top w:w="120" w:type="dxa"/>
+              <w:left w:w="180" w:type="dxa"/>
+              <w:bottom w:w="120" w:type="dxa"/>
+              <w:right w:w="180" w:type="dxa"/>
+            </w:tcMar>
+            <w:vAlign w:val="center"/>
+            <w:hideMark/>
+          </w:tcPr>
+          <w:p>
+            <w:r>
+              <w:t>Users repeatedly open and close the same applications throughout the day</w:t>
+            </w:r>
+          </w:p>
+        </w:tc>
+        <w:tc>
+          <w:tcPr>
+            <w:tcW w:w="0" w:type="auto"/>
+            <w:tcBorders>
+              <w:top w:val="single" w:sz="6" w:space="0" w:color="C4C7C5"/>
+              <w:left w:val="single" w:sz="6" w:space="0" w:color="C4C7C5"/>
+              <w:bottom w:val="single" w:sz="6" w:space="0" w:color="C4C7C5"/>
+              <w:right w:val="single" w:sz="6" w:space="0" w:color="C4C7C5"/>
+            </w:tcBorders>
+            <w:tcMar>
+              <w:top w:w="120" w:type="dxa"/>
+              <w:left w:w="180" w:type="dxa"/>
+              <w:bottom w:w="120" w:type="dxa"/>
+              <w:right w:w="180" w:type="dxa"/>
+            </w:tcMar>
+            <w:vAlign w:val="center"/>
+            <w:hideMark/>
+          </w:tcPr>
+          <w:p>
+            <w:r>
+              <w:t>Accepted</w:t>
+            </w:r>
+          </w:p>
+        </w:tc>
+      </w:tr>
+      <w:tr>
+        <w:trPr>
+          <w:tblCellSpacing w:w="15" w:type="dxa"/>
+        </w:trPr>
+        <w:tc>
+          <w:tcPr>
+            <w:tcW w:w="0" w:type="auto"/>
+            <w:tcBorders>
+              <w:top w:val="single" w:sz="6" w:space="0" w:color="C4C7C5"/>
+              <w:left w:val="single" w:sz="6" w:space="0" w:color="C4C7C5"/>
+              <w:bottom w:val="single" w:sz="6" w:space="0" w:color="C4C7C5"/>
+              <w:right w:val="single" w:sz="6" w:space="0" w:color="C4C7C5"/>
+            </w:tcBorders>
+            <w:tcMar>
+              <w:top w:w="120" w:type="dxa"/>
+              <w:left w:w="180" w:type="dxa"/>
+              <w:bottom w:w="120" w:type="dxa"/>
+              <w:right w:w="180" w:type="dxa"/>
+            </w:tcMar>
+            <w:vAlign w:val="center"/>
+            <w:hideMark/>
+          </w:tcPr>
+          <w:p>
+            <w:pPr>
+              <w:rPr>
+                <w:b/>
+                <w:bCs/>
+              </w:rPr>
+            </w:pPr>
+            <w:r>
+              <w:rPr>
+                <w:b/>
+                <w:bCs/>
+              </w:rPr>
+              <w:t>DW-028</w:t>
+            </w:r>
+          </w:p>
+        </w:tc>
+        <w:tc>
+          <w:tcPr>
+            <w:tcW w:w="0" w:type="auto"/>
+            <w:tcBorders>
+              <w:top w:val="single" w:sz="6" w:space="0" w:color="C4C7C5"/>
+              <w:left w:val="single" w:sz="6" w:space="0" w:color="C4C7C5"/>
+              <w:bottom w:val="single" w:sz="6" w:space="0" w:color="C4C7C5"/>
+              <w:right w:val="single" w:sz="6" w:space="0" w:color="C4C7C5"/>
+            </w:tcBorders>
+            <w:tcMar>
+              <w:top w:w="120" w:type="dxa"/>
+              <w:left w:w="180" w:type="dxa"/>
+              <w:bottom w:w="120" w:type="dxa"/>
+              <w:right w:w="180" w:type="dxa"/>
+            </w:tcMar>
+            <w:vAlign w:val="center"/>
+            <w:hideMark/>
+          </w:tcPr>
+          <w:p>
+            <w:r>
+              <w:t>Users struggle to maintain separate desktop workspaces for different projects</w:t>
+            </w:r>
+          </w:p>
+        </w:tc>
+        <w:tc>
+          <w:tcPr>
+            <w:tcW w:w="0" w:type="auto"/>
+            <w:tcBorders>
+              <w:top w:val="single" w:sz="6" w:space="0" w:color="C4C7C5"/>
+              <w:left w:val="single" w:sz="6" w:space="0" w:color="C4C7C5"/>
+              <w:bottom w:val="single" w:sz="6" w:space="0" w:color="C4C7C5"/>
+              <w:right w:val="single" w:sz="6" w:space="0" w:color="C4C7C5"/>
+            </w:tcBorders>
+            <w:tcMar>
+              <w:top w:w="120" w:type="dxa"/>
+              <w:left w:w="180" w:type="dxa"/>
+              <w:bottom w:w="120" w:type="dxa"/>
+              <w:right w:w="180" w:type="dxa"/>
+            </w:tcMar>
+            <w:vAlign w:val="center"/>
+            <w:hideMark/>
+          </w:tcPr>
+          <w:p>
+            <w:r>
+              <w:t>Accepted</w:t>
+            </w:r>
+          </w:p>
+        </w:tc>
+      </w:tr>
+      <w:tr>
+        <w:trPr>
+          <w:tblCellSpacing w:w="15" w:type="dxa"/>
+        </w:trPr>
+        <w:tc>
+          <w:tcPr>
+            <w:tcW w:w="0" w:type="auto"/>
+            <w:tcBorders>
+              <w:top w:val="single" w:sz="6" w:space="0" w:color="C4C7C5"/>
+              <w:left w:val="single" w:sz="6" w:space="0" w:color="C4C7C5"/>
+              <w:bottom w:val="single" w:sz="6" w:space="0" w:color="C4C7C5"/>
+              <w:right w:val="single" w:sz="6" w:space="0" w:color="C4C7C5"/>
+            </w:tcBorders>
+            <w:tcMar>
+              <w:top w:w="120" w:type="dxa"/>
+              <w:left w:w="180" w:type="dxa"/>
+              <w:bottom w:w="120" w:type="dxa"/>
+              <w:right w:w="180" w:type="dxa"/>
+            </w:tcMar>
+            <w:vAlign w:val="center"/>
+            <w:hideMark/>
+          </w:tcPr>
+          <w:p>
+            <w:pPr>
+              <w:rPr>
+                <w:b/>
+                <w:bCs/>
+              </w:rPr>
+            </w:pPr>
+            <w:r>
+              <w:rPr>
+                <w:b/>
+                <w:bCs/>
+              </w:rPr>
+              <w:t>DW-029</w:t>
+            </w:r>
+          </w:p>
+        </w:tc>
+        <w:tc>
+          <w:tcPr>
+            <w:tcW w:w="0" w:type="auto"/>
+            <w:tcBorders>
+              <w:top w:val="single" w:sz="6" w:space="0" w:color="C4C7C5"/>
+              <w:left w:val="single" w:sz="6" w:space="0" w:color="C4C7C5"/>
+              <w:bottom w:val="single" w:sz="6" w:space="0" w:color="C4C7C5"/>
+              <w:right w:val="single" w:sz="6" w:space="0" w:color="C4C7C5"/>
+            </w:tcBorders>
+            <w:tcMar>
+              <w:top w:w="120" w:type="dxa"/>
+              <w:left w:w="180" w:type="dxa"/>
+              <w:bottom w:w="120" w:type="dxa"/>
+              <w:right w:w="180" w:type="dxa"/>
+            </w:tcMar>
+            <w:vAlign w:val="center"/>
+            <w:hideMark/>
+          </w:tcPr>
+          <w:p>
+            <w:r>
+              <w:t>Users struggle to restore their workspace after unexpected system shutdowns or restarts</w:t>
+            </w:r>
+          </w:p>
+        </w:tc>
+        <w:tc>
+          <w:tcPr>
+            <w:tcW w:w="0" w:type="auto"/>
+            <w:tcBorders>
+              <w:top w:val="single" w:sz="6" w:space="0" w:color="C4C7C5"/>
+              <w:left w:val="single" w:sz="6" w:space="0" w:color="C4C7C5"/>
+              <w:bottom w:val="single" w:sz="6" w:space="0" w:color="C4C7C5"/>
+              <w:right w:val="single" w:sz="6" w:space="0" w:color="C4C7C5"/>
+            </w:tcBorders>
+            <w:tcMar>
+              <w:top w:w="120" w:type="dxa"/>
+              <w:left w:w="180" w:type="dxa"/>
+              <w:bottom w:w="120" w:type="dxa"/>
+              <w:right w:w="180" w:type="dxa"/>
+            </w:tcMar>
+            <w:vAlign w:val="center"/>
+            <w:hideMark/>
+          </w:tcPr>
+          <w:p>
+            <w:r>
+              <w:t>Accepted</w:t>
+            </w:r>
+          </w:p>
+        </w:tc>
+      </w:tr>
+      <w:tr>
+        <w:trPr>
+          <w:tblCellSpacing w:w="15" w:type="dxa"/>
+        </w:trPr>
+        <w:tc>
+          <w:tcPr>
+            <w:tcW w:w="0" w:type="auto"/>
+            <w:tcBorders>
+              <w:top w:val="single" w:sz="6" w:space="0" w:color="C4C7C5"/>
+              <w:left w:val="single" w:sz="6" w:space="0" w:color="C4C7C5"/>
+              <w:bottom w:val="single" w:sz="6" w:space="0" w:color="C4C7C5"/>
+              <w:right w:val="single" w:sz="6" w:space="0" w:color="C4C7C5"/>
+            </w:tcBorders>
+            <w:tcMar>
+              <w:top w:w="120" w:type="dxa"/>
+              <w:left w:w="180" w:type="dxa"/>
+              <w:bottom w:w="120" w:type="dxa"/>
+              <w:right w:w="180" w:type="dxa"/>
+            </w:tcMar>
+            <w:vAlign w:val="center"/>
+            <w:hideMark/>
+          </w:tcPr>
+          <w:p>
+            <w:pPr>
+              <w:rPr>
+                <w:b/>
+                <w:bCs/>
+              </w:rPr>
+            </w:pPr>
+            <w:r>
+              <w:rPr>
+                <w:b/>
+                <w:bCs/>
+              </w:rPr>
+              <w:t>DW-030</w:t>
+            </w:r>
+          </w:p>
+        </w:tc>
+        <w:tc>
+          <w:tcPr>
+            <w:tcW w:w="0" w:type="auto"/>
+            <w:tcBorders>
+              <w:top w:val="single" w:sz="6" w:space="0" w:color="C4C7C5"/>
+              <w:left w:val="single" w:sz="6" w:space="0" w:color="C4C7C5"/>
+              <w:bottom w:val="single" w:sz="6" w:space="0" w:color="C4C7C5"/>
+              <w:right w:val="single" w:sz="6" w:space="0" w:color="C4C7C5"/>
+            </w:tcBorders>
+            <w:tcMar>
+              <w:top w:w="120" w:type="dxa"/>
+              <w:left w:w="180" w:type="dxa"/>
+              <w:bottom w:w="120" w:type="dxa"/>
+              <w:right w:w="180" w:type="dxa"/>
+            </w:tcMar>
+            <w:vAlign w:val="center"/>
+            <w:hideMark/>
+          </w:tcPr>
+          <w:p>
+            <w:r>
+              <w:t>Users struggle to remember why specific application windows were left open</w:t>
+            </w:r>
+          </w:p>
+        </w:tc>
+        <w:tc>
+          <w:tcPr>
+            <w:tcW w:w="0" w:type="auto"/>
+            <w:tcBorders>
+              <w:top w:val="single" w:sz="6" w:space="0" w:color="C4C7C5"/>
+              <w:left w:val="single" w:sz="6" w:space="0" w:color="C4C7C5"/>
+              <w:bottom w:val="single" w:sz="6" w:space="0" w:color="C4C7C5"/>
+              <w:right w:val="single" w:sz="6" w:space="0" w:color="C4C7C5"/>
+            </w:tcBorders>
+            <w:tcMar>
+              <w:top w:w="120" w:type="dxa"/>
+              <w:left w:w="180" w:type="dxa"/>
+              <w:bottom w:w="120" w:type="dxa"/>
+              <w:right w:w="180" w:type="dxa"/>
+            </w:tcMar>
+            <w:vAlign w:val="center"/>
+            <w:hideMark/>
+          </w:tcPr>
+          <w:p>
+            <w:r>
+              <w:t>Accepted</w:t>
+            </w:r>
+          </w:p>
+        </w:tc>
+      </w:tr>
+      <w:tr>
+        <w:trPr>
+          <w:tblCellSpacing w:w="15" w:type="dxa"/>
+        </w:trPr>
+        <w:tc>
+          <w:tcPr>
+            <w:tcW w:w="0" w:type="auto"/>
+            <w:tcBorders>
+              <w:top w:val="single" w:sz="6" w:space="0" w:color="C4C7C5"/>
+              <w:left w:val="single" w:sz="6" w:space="0" w:color="C4C7C5"/>
+              <w:bottom w:val="single" w:sz="6" w:space="0" w:color="C4C7C5"/>
+              <w:right w:val="single" w:sz="6" w:space="0" w:color="C4C7C5"/>
+            </w:tcBorders>
+            <w:tcMar>
+              <w:top w:w="120" w:type="dxa"/>
+              <w:left w:w="180" w:type="dxa"/>
+              <w:bottom w:w="120" w:type="dxa"/>
+              <w:right w:w="180" w:type="dxa"/>
+            </w:tcMar>
+            <w:vAlign w:val="center"/>
+            <w:hideMark/>
+          </w:tcPr>
+          <w:p>
+            <w:pPr>
+              <w:rPr>
+                <w:b/>
+                <w:bCs/>
+              </w:rPr>
+            </w:pPr>
+            <w:r>
+              <w:rPr>
+                <w:b/>
+                <w:bCs/>
+              </w:rPr>
+              <w:t>DW-031</w:t>
+            </w:r>
+          </w:p>
+        </w:tc>
+        <w:tc>
+          <w:tcPr>
+            <w:tcW w:w="0" w:type="auto"/>
+            <w:tcBorders>
+              <w:top w:val="single" w:sz="6" w:space="0" w:color="C4C7C5"/>
+              <w:left w:val="single" w:sz="6" w:space="0" w:color="C4C7C5"/>
+              <w:bottom w:val="single" w:sz="6" w:space="0" w:color="C4C7C5"/>
+              <w:right w:val="single" w:sz="6" w:space="0" w:color="C4C7C5"/>
+            </w:tcBorders>
+            <w:tcMar>
+              <w:top w:w="120" w:type="dxa"/>
+              <w:left w:w="180" w:type="dxa"/>
+              <w:bottom w:w="120" w:type="dxa"/>
+              <w:right w:w="180" w:type="dxa"/>
+            </w:tcMar>
+            <w:vAlign w:val="center"/>
+            <w:hideMark/>
+          </w:tcPr>
+          <w:p>
+            <w:r>
+              <w:t>Users struggle to prioritize important windows when many applications demand attention simultaneously</w:t>
+            </w:r>
+          </w:p>
+        </w:tc>
+        <w:tc>
+          <w:tcPr>
+            <w:tcW w:w="0" w:type="auto"/>
+            <w:tcBorders>
+              <w:top w:val="single" w:sz="6" w:space="0" w:color="C4C7C5"/>
+              <w:left w:val="single" w:sz="6" w:space="0" w:color="C4C7C5"/>
+              <w:bottom w:val="single" w:sz="6" w:space="0" w:color="C4C7C5"/>
+              <w:right w:val="single" w:sz="6" w:space="0" w:color="C4C7C5"/>
+            </w:tcBorders>
+            <w:tcMar>
+              <w:top w:w="120" w:type="dxa"/>
+              <w:left w:w="180" w:type="dxa"/>
+              <w:bottom w:w="120" w:type="dxa"/>
+              <w:right w:w="180" w:type="dxa"/>
+            </w:tcMar>
+            <w:vAlign w:val="center"/>
+            <w:hideMark/>
+          </w:tcPr>
+          <w:p>
+            <w:r>
+              <w:t>Accepted</w:t>
+            </w:r>
+          </w:p>
+        </w:tc>
+      </w:tr>
+      <w:tr>
+        <w:trPr>
+          <w:tblCellSpacing w:w="15" w:type="dxa"/>
+        </w:trPr>
+        <w:tc>
+          <w:tcPr>
+            <w:tcW w:w="0" w:type="auto"/>
+            <w:tcBorders>
+              <w:top w:val="single" w:sz="6" w:space="0" w:color="C4C7C5"/>
+              <w:left w:val="single" w:sz="6" w:space="0" w:color="C4C7C5"/>
+              <w:bottom w:val="single" w:sz="6" w:space="0" w:color="C4C7C5"/>
+              <w:right w:val="single" w:sz="6" w:space="0" w:color="C4C7C5"/>
+            </w:tcBorders>
+            <w:tcMar>
+              <w:top w:w="120" w:type="dxa"/>
+              <w:left w:w="180" w:type="dxa"/>
+              <w:bottom w:w="120" w:type="dxa"/>
+              <w:right w:w="180" w:type="dxa"/>
+            </w:tcMar>
+            <w:vAlign w:val="center"/>
+            <w:hideMark/>
+          </w:tcPr>
+          <w:p>
+            <w:pPr>
+              <w:rPr>
+                <w:b/>
+                <w:bCs/>
+              </w:rPr>
+            </w:pPr>
+            <w:r>
+              <w:rPr>
+                <w:b/>
+                <w:bCs/>
+              </w:rPr>
+              <w:t>DW-032</w:t>
+            </w:r>
+          </w:p>
+        </w:tc>
+        <w:tc>
+          <w:tcPr>
+            <w:tcW w:w="0" w:type="auto"/>
+            <w:tcBorders>
+              <w:top w:val="single" w:sz="6" w:space="0" w:color="C4C7C5"/>
+              <w:left w:val="single" w:sz="6" w:space="0" w:color="C4C7C5"/>
+              <w:bottom w:val="single" w:sz="6" w:space="0" w:color="C4C7C5"/>
+              <w:right w:val="single" w:sz="6" w:space="0" w:color="C4C7C5"/>
+            </w:tcBorders>
+            <w:tcMar>
+              <w:top w:w="120" w:type="dxa"/>
+              <w:left w:w="180" w:type="dxa"/>
+              <w:bottom w:w="120" w:type="dxa"/>
+              <w:right w:w="180" w:type="dxa"/>
+            </w:tcMar>
+            <w:vAlign w:val="center"/>
+            <w:hideMark/>
+          </w:tcPr>
+          <w:p>
+            <w:r>
+              <w:t>Users struggle to locate recently used windows after switching between multiple tasks</w:t>
+            </w:r>
+          </w:p>
+        </w:tc>
+        <w:tc>
+          <w:tcPr>
+            <w:tcW w:w="0" w:type="auto"/>
+            <w:tcBorders>
+              <w:top w:val="single" w:sz="6" w:space="0" w:color="C4C7C5"/>
+              <w:left w:val="single" w:sz="6" w:space="0" w:color="C4C7C5"/>
+              <w:bottom w:val="single" w:sz="6" w:space="0" w:color="C4C7C5"/>
+              <w:right w:val="single" w:sz="6" w:space="0" w:color="C4C7C5"/>
+            </w:tcBorders>
+            <w:tcMar>
+              <w:top w:w="120" w:type="dxa"/>
+              <w:left w:w="180" w:type="dxa"/>
+              <w:bottom w:w="120" w:type="dxa"/>
+              <w:right w:w="180" w:type="dxa"/>
+            </w:tcMar>
+            <w:vAlign w:val="center"/>
+            <w:hideMark/>
+          </w:tcPr>
+          <w:p>
+            <w:r>
+              <w:t>Accepted</w:t>
+            </w:r>
+          </w:p>
+        </w:tc>
+      </w:tr>
+      <w:tr>
+        <w:trPr>
+          <w:tblCellSpacing w:w="15" w:type="dxa"/>
+        </w:trPr>
+        <w:tc>
+          <w:tcPr>
+            <w:tcW w:w="0" w:type="auto"/>
+            <w:tcBorders>
+              <w:top w:val="single" w:sz="6" w:space="0" w:color="C4C7C5"/>
+              <w:left w:val="single" w:sz="6" w:space="0" w:color="C4C7C5"/>
+              <w:bottom w:val="single" w:sz="6" w:space="0" w:color="C4C7C5"/>
+              <w:right w:val="single" w:sz="6" w:space="0" w:color="C4C7C5"/>
+            </w:tcBorders>
+            <w:tcMar>
+              <w:top w:w="120" w:type="dxa"/>
+              <w:left w:w="180" w:type="dxa"/>
+              <w:bottom w:w="120" w:type="dxa"/>
+              <w:right w:w="180" w:type="dxa"/>
+            </w:tcMar>
+            <w:vAlign w:val="center"/>
+            <w:hideMark/>
+          </w:tcPr>
+          <w:p>
+            <w:pPr>
+              <w:rPr>
+                <w:b/>
+                <w:bCs/>
+              </w:rPr>
+            </w:pPr>
+            <w:r>
+              <w:rPr>
+                <w:b/>
+                <w:bCs/>
+              </w:rPr>
+              <w:lastRenderedPageBreak/>
+              <w:t>DW-033</w:t>
+            </w:r>
+          </w:p>
+        </w:tc>
+        <w:tc>
+          <w:tcPr>
+            <w:tcW w:w="0" w:type="auto"/>
+            <w:tcBorders>
+              <w:top w:val="single" w:sz="6" w:space="0" w:color="C4C7C5"/>
+              <w:left w:val="single" w:sz="6" w:space="0" w:color="C4C7C5"/>
+              <w:bottom w:val="single" w:sz="6" w:space="0" w:color="C4C7C5"/>
+              <w:right w:val="single" w:sz="6" w:space="0" w:color="C4C7C5"/>
+            </w:tcBorders>
+            <w:tcMar>
+              <w:top w:w="120" w:type="dxa"/>
+              <w:left w:w="180" w:type="dxa"/>
+              <w:bottom w:w="120" w:type="dxa"/>
+              <w:right w:w="180" w:type="dxa"/>
+            </w:tcMar>
+            <w:vAlign w:val="center"/>
+            <w:hideMark/>
+          </w:tcPr>
+          <w:p>
+            <w:r>
+              <w:t>Users struggle to maintain productivity while continuously switching between windows</w:t>
+            </w:r>
+          </w:p>
+        </w:tc>
+        <w:tc>
+          <w:tcPr>
+            <w:tcW w:w="0" w:type="auto"/>
+            <w:tcBorders>
+              <w:top w:val="single" w:sz="6" w:space="0" w:color="C4C7C5"/>
+              <w:left w:val="single" w:sz="6" w:space="0" w:color="C4C7C5"/>
+              <w:bottom w:val="single" w:sz="6" w:space="0" w:color="C4C7C5"/>
+              <w:right w:val="single" w:sz="6" w:space="0" w:color="C4C7C5"/>
+            </w:tcBorders>
+            <w:tcMar>
+              <w:top w:w="120" w:type="dxa"/>
+              <w:left w:w="180" w:type="dxa"/>
+              <w:bottom w:w="120" w:type="dxa"/>
+              <w:right w:w="180" w:type="dxa"/>
+            </w:tcMar>
+            <w:vAlign w:val="center"/>
+            <w:hideMark/>
+          </w:tcPr>
+          <w:p>
+            <w:r>
+              <w:t>Accepted</w:t>
+            </w:r>
+          </w:p>
+        </w:tc>
+      </w:tr>
+      <w:tr>
+        <w:trPr>
+          <w:tblCellSpacing w:w="15" w:type="dxa"/>
+        </w:trPr>
+        <w:tc>
+          <w:tcPr>
+            <w:tcW w:w="0" w:type="auto"/>
+            <w:tcBorders>
+              <w:top w:val="single" w:sz="6" w:space="0" w:color="C4C7C5"/>
+              <w:left w:val="single" w:sz="6" w:space="0" w:color="C4C7C5"/>
+              <w:bottom w:val="single" w:sz="6" w:space="0" w:color="C4C7C5"/>
+              <w:right w:val="single" w:sz="6" w:space="0" w:color="C4C7C5"/>
+            </w:tcBorders>
+            <w:tcMar>
+              <w:top w:w="120" w:type="dxa"/>
+              <w:left w:w="180" w:type="dxa"/>
+              <w:bottom w:w="120" w:type="dxa"/>
+              <w:right w:w="180" w:type="dxa"/>
+            </w:tcMar>
+            <w:vAlign w:val="center"/>
+            <w:hideMark/>
+          </w:tcPr>
+          <w:p>
+            <w:pPr>
+              <w:rPr>
+                <w:b/>
+                <w:bCs/>
+              </w:rPr>
+            </w:pPr>
+            <w:r>
+              <w:rPr>
+                <w:b/>
+                <w:bCs/>
+              </w:rPr>
+              <w:t>DW-034</w:t>
+            </w:r>
+          </w:p>
+        </w:tc>
+        <w:tc>
+          <w:tcPr>
+            <w:tcW w:w="0" w:type="auto"/>
+            <w:tcBorders>
+              <w:top w:val="single" w:sz="6" w:space="0" w:color="C4C7C5"/>
+              <w:left w:val="single" w:sz="6" w:space="0" w:color="C4C7C5"/>
+              <w:bottom w:val="single" w:sz="6" w:space="0" w:color="C4C7C5"/>
+              <w:right w:val="single" w:sz="6" w:space="0" w:color="C4C7C5"/>
+            </w:tcBorders>
+            <w:tcMar>
+              <w:top w:w="120" w:type="dxa"/>
+              <w:left w:w="180" w:type="dxa"/>
+              <w:bottom w:w="120" w:type="dxa"/>
+              <w:right w:w="180" w:type="dxa"/>
+            </w:tcMar>
+            <w:vAlign w:val="center"/>
+            <w:hideMark/>
+          </w:tcPr>
+          <w:p>
+            <w:r>
+              <w:t>Users struggle to organize supporting reference materials alongside their primary workspace</w:t>
+            </w:r>
+          </w:p>
+        </w:tc>
+        <w:tc>
+          <w:tcPr>
+            <w:tcW w:w="0" w:type="auto"/>
+            <w:tcBorders>
+              <w:top w:val="single" w:sz="6" w:space="0" w:color="C4C7C5"/>
+              <w:left w:val="single" w:sz="6" w:space="0" w:color="C4C7C5"/>
+              <w:bottom w:val="single" w:sz="6" w:space="0" w:color="C4C7C5"/>
+              <w:right w:val="single" w:sz="6" w:space="0" w:color="C4C7C5"/>
+            </w:tcBorders>
+            <w:tcMar>
+              <w:top w:w="120" w:type="dxa"/>
+              <w:left w:w="180" w:type="dxa"/>
+              <w:bottom w:w="120" w:type="dxa"/>
+              <w:right w:w="180" w:type="dxa"/>
+            </w:tcMar>
+            <w:vAlign w:val="center"/>
+            <w:hideMark/>
+          </w:tcPr>
+          <w:p>
+            <w:r>
+              <w:t>Accepted</w:t>
+            </w:r>
+          </w:p>
+        </w:tc>
+      </w:tr>
+      <w:tr>
+        <w:trPr>
+          <w:tblCellSpacing w:w="15" w:type="dxa"/>
+        </w:trPr>
+        <w:tc>
+          <w:tcPr>
+            <w:tcW w:w="0" w:type="auto"/>
+            <w:tcBorders>
+              <w:top w:val="single" w:sz="6" w:space="0" w:color="C4C7C5"/>
+              <w:left w:val="single" w:sz="6" w:space="0" w:color="C4C7C5"/>
+              <w:bottom w:val="single" w:sz="6" w:space="0" w:color="C4C7C5"/>
+              <w:right w:val="single" w:sz="6" w:space="0" w:color="C4C7C5"/>
+            </w:tcBorders>
+            <w:tcMar>
+              <w:top w:w="120" w:type="dxa"/>
+              <w:left w:w="180" w:type="dxa"/>
+              <w:bottom w:w="120" w:type="dxa"/>
+              <w:right w:w="180" w:type="dxa"/>
+            </w:tcMar>
+            <w:vAlign w:val="center"/>
+            <w:hideMark/>
+          </w:tcPr>
+          <w:p>
+            <w:pPr>
+              <w:rPr>
+                <w:b/>
+                <w:bCs/>
+              </w:rPr>
+            </w:pPr>
+            <w:r>
+              <w:rPr>
+                <w:b/>
+                <w:bCs/>
+              </w:rPr>
+              <w:t>DW-035</w:t>
+            </w:r>
+          </w:p>
+        </w:tc>
+        <w:tc>
+          <w:tcPr>
+            <w:tcW w:w="0" w:type="auto"/>
+            <w:tcBorders>
+              <w:top w:val="single" w:sz="6" w:space="0" w:color="C4C7C5"/>
+              <w:left w:val="single" w:sz="6" w:space="0" w:color="C4C7C5"/>
+              <w:bottom w:val="single" w:sz="6" w:space="0" w:color="C4C7C5"/>
+              <w:right w:val="single" w:sz="6" w:space="0" w:color="C4C7C5"/>
+            </w:tcBorders>
+            <w:tcMar>
+              <w:top w:w="120" w:type="dxa"/>
+              <w:left w:w="180" w:type="dxa"/>
+              <w:bottom w:w="120" w:type="dxa"/>
+              <w:right w:w="180" w:type="dxa"/>
+            </w:tcMar>
+            <w:vAlign w:val="center"/>
+            <w:hideMark/>
+          </w:tcPr>
+          <w:p>
+            <w:r>
+              <w:t>Users struggle to compare information displayed in different application windows simultaneously</w:t>
+            </w:r>
+          </w:p>
+        </w:tc>
+        <w:tc>
+          <w:tcPr>
+            <w:tcW w:w="0" w:type="auto"/>
+            <w:tcBorders>
+              <w:top w:val="single" w:sz="6" w:space="0" w:color="C4C7C5"/>
+              <w:left w:val="single" w:sz="6" w:space="0" w:color="C4C7C5"/>
+              <w:bottom w:val="single" w:sz="6" w:space="0" w:color="C4C7C5"/>
+              <w:right w:val="single" w:sz="6" w:space="0" w:color="C4C7C5"/>
+            </w:tcBorders>
+            <w:tcMar>
+              <w:top w:w="120" w:type="dxa"/>
+              <w:left w:w="180" w:type="dxa"/>
+              <w:bottom w:w="120" w:type="dxa"/>
+              <w:right w:w="180" w:type="dxa"/>
+            </w:tcMar>
+            <w:vAlign w:val="center"/>
+            <w:hideMark/>
+          </w:tcPr>
+          <w:p>
+            <w:r>
+              <w:t>Accepted</w:t>
+            </w:r>
+          </w:p>
+        </w:tc>
+      </w:tr>
+      <w:tr>
+        <w:trPr>
+          <w:tblCellSpacing w:w="15" w:type="dxa"/>
+        </w:trPr>
+        <w:tc>
+          <w:tcPr>
+            <w:tcW w:w="0" w:type="auto"/>
+            <w:tcBorders>
+              <w:top w:val="single" w:sz="6" w:space="0" w:color="C4C7C5"/>
+              <w:left w:val="single" w:sz="6" w:space="0" w:color="C4C7C5"/>
+              <w:bottom w:val="single" w:sz="6" w:space="0" w:color="C4C7C5"/>
+              <w:right w:val="single" w:sz="6" w:space="0" w:color="C4C7C5"/>
+            </w:tcBorders>
+            <w:tcMar>
+              <w:top w:w="120" w:type="dxa"/>
+              <w:left w:w="180" w:type="dxa"/>
+              <w:bottom w:w="120" w:type="dxa"/>
+              <w:right w:w="180" w:type="dxa"/>
+            </w:tcMar>
+            <w:vAlign w:val="center"/>
+            <w:hideMark/>
+          </w:tcPr>
+          <w:p>
+            <w:pPr>
+              <w:rPr>
+                <w:b/>
+                <w:bCs/>
+              </w:rPr>
+            </w:pPr>
+            <w:r>
+              <w:rPr>
+                <w:b/>
+                <w:bCs/>
+              </w:rPr>
+              <w:t>DW-036</w:t>
+            </w:r>
+          </w:p>
+        </w:tc>
+        <w:tc>
+          <w:tcPr>
+            <w:tcW w:w="0" w:type="auto"/>
+            <w:tcBorders>
+              <w:top w:val="single" w:sz="6" w:space="0" w:color="C4C7C5"/>
+              <w:left w:val="single" w:sz="6" w:space="0" w:color="C4C7C5"/>
+              <w:bottom w:val="single" w:sz="6" w:space="0" w:color="C4C7C5"/>
+              <w:right w:val="single" w:sz="6" w:space="0" w:color="C4C7C5"/>
+            </w:tcBorders>
+            <w:tcMar>
+              <w:top w:w="120" w:type="dxa"/>
+              <w:left w:w="180" w:type="dxa"/>
+              <w:bottom w:w="120" w:type="dxa"/>
+              <w:right w:w="180" w:type="dxa"/>
+            </w:tcMar>
+            <w:vAlign w:val="center"/>
+            <w:hideMark/>
+          </w:tcPr>
+          <w:p>
+            <w:r>
+              <w:t>Users struggle to keep communication applications from interrupting focused work</w:t>
+            </w:r>
+          </w:p>
+        </w:tc>
+        <w:tc>
+          <w:tcPr>
+            <w:tcW w:w="0" w:type="auto"/>
+            <w:tcBorders>
+              <w:top w:val="single" w:sz="6" w:space="0" w:color="C4C7C5"/>
+              <w:left w:val="single" w:sz="6" w:space="0" w:color="C4C7C5"/>
+              <w:bottom w:val="single" w:sz="6" w:space="0" w:color="C4C7C5"/>
+              <w:right w:val="single" w:sz="6" w:space="0" w:color="C4C7C5"/>
+            </w:tcBorders>
+            <w:tcMar>
+              <w:top w:w="120" w:type="dxa"/>
+              <w:left w:w="180" w:type="dxa"/>
+              <w:bottom w:w="120" w:type="dxa"/>
+              <w:right w:w="180" w:type="dxa"/>
+            </w:tcMar>
+            <w:vAlign w:val="center"/>
+            <w:hideMark/>
+          </w:tcPr>
+          <w:p>
+            <w:r>
+              <w:t>Accepted</w:t>
+            </w:r>
+          </w:p>
+        </w:tc>
+      </w:tr>
+      <w:tr>
+        <w:trPr>
+          <w:tblCellSpacing w:w="15" w:type="dxa"/>
+        </w:trPr>
+        <w:tc>
+          <w:tcPr>
+            <w:tcW w:w="0" w:type="auto"/>
+            <w:tcBorders>
+              <w:top w:val="single" w:sz="6" w:space="0" w:color="C4C7C5"/>
+              <w:left w:val="single" w:sz="6" w:space="0" w:color="C4C7C5"/>
+              <w:bottom w:val="single" w:sz="6" w:space="0" w:color="C4C7C5"/>
+              <w:right w:val="single" w:sz="6" w:space="0" w:color="C4C7C5"/>
+            </w:tcBorders>
+            <w:tcMar>
+              <w:top w:w="120" w:type="dxa"/>
+              <w:left w:w="180" w:type="dxa"/>
+              <w:bottom w:w="120" w:type="dxa"/>
+              <w:right w:w="180" w:type="dxa"/>
+            </w:tcMar>
+            <w:vAlign w:val="center"/>
+            <w:hideMark/>
+          </w:tcPr>
+          <w:p>
+            <w:pPr>
+              <w:rPr>
+                <w:b/>
+                <w:bCs/>
+              </w:rPr>
+            </w:pPr>
+            <w:r>
+              <w:rPr>
+                <w:b/>
+                <w:bCs/>
+              </w:rPr>
+              <w:t>DW-037</w:t>
+            </w:r>
+          </w:p>
+        </w:tc>
+        <w:tc>
+          <w:tcPr>
+            <w:tcW w:w="0" w:type="auto"/>
+            <w:tcBorders>
+              <w:top w:val="single" w:sz="6" w:space="0" w:color="C4C7C5"/>
+              <w:left w:val="single" w:sz="6" w:space="0" w:color="C4C7C5"/>
+              <w:bottom w:val="single" w:sz="6" w:space="0" w:color="C4C7C5"/>
+              <w:right w:val="single" w:sz="6" w:space="0" w:color="C4C7C5"/>
+            </w:tcBorders>
+            <w:tcMar>
+              <w:top w:w="120" w:type="dxa"/>
+              <w:left w:w="180" w:type="dxa"/>
+              <w:bottom w:w="120" w:type="dxa"/>
+              <w:right w:w="180" w:type="dxa"/>
+            </w:tcMar>
+            <w:vAlign w:val="center"/>
+            <w:hideMark/>
+          </w:tcPr>
+          <w:p>
+            <w:r>
+              <w:t>Users struggle to identify which applications are actively contributing to the current task</w:t>
+            </w:r>
+          </w:p>
+        </w:tc>
+        <w:tc>
+          <w:tcPr>
+            <w:tcW w:w="0" w:type="auto"/>
+            <w:tcBorders>
+              <w:top w:val="single" w:sz="6" w:space="0" w:color="C4C7C5"/>
+              <w:left w:val="single" w:sz="6" w:space="0" w:color="C4C7C5"/>
+              <w:bottom w:val="single" w:sz="6" w:space="0" w:color="C4C7C5"/>
+              <w:right w:val="single" w:sz="6" w:space="0" w:color="C4C7C5"/>
+            </w:tcBorders>
+            <w:tcMar>
+              <w:top w:w="120" w:type="dxa"/>
+              <w:left w:w="180" w:type="dxa"/>
+              <w:bottom w:w="120" w:type="dxa"/>
+              <w:right w:w="180" w:type="dxa"/>
+            </w:tcMar>
+            <w:vAlign w:val="center"/>
+            <w:hideMark/>
+          </w:tcPr>
+          <w:p>
+            <w:r>
+              <w:t>Accepted</w:t>
+            </w:r>
+          </w:p>
+        </w:tc>
+      </w:tr>
+      <w:tr>
+        <w:trPr>
+          <w:tblCellSpacing w:w="15" w:type="dxa"/>
+        </w:trPr>
+        <w:tc>
+          <w:tcPr>
+            <w:tcW w:w="0" w:type="auto"/>
+            <w:tcBorders>
+              <w:top w:val="single" w:sz="6" w:space="0" w:color="C4C7C5"/>
+              <w:left w:val="single" w:sz="6" w:space="0" w:color="C4C7C5"/>
+              <w:bottom w:val="single" w:sz="6" w:space="0" w:color="C4C7C5"/>
+              <w:right w:val="single" w:sz="6" w:space="0" w:color="C4C7C5"/>
+            </w:tcBorders>
+            <w:tcMar>
+              <w:top w:w="120" w:type="dxa"/>
+              <w:left w:w="180" w:type="dxa"/>
+              <w:bottom w:w="120" w:type="dxa"/>
+              <w:right w:w="180" w:type="dxa"/>
+            </w:tcMar>
+            <w:vAlign w:val="center"/>
+            <w:hideMark/>
+          </w:tcPr>
+          <w:p>
+            <w:pPr>
+              <w:rPr>
+                <w:b/>
+                <w:bCs/>
+              </w:rPr>
+            </w:pPr>
+            <w:r>
+              <w:rPr>
+                <w:b/>
+                <w:bCs/>
+              </w:rPr>
+              <w:t>DW-038</w:t>
+            </w:r>
+          </w:p>
+        </w:tc>
+        <w:tc>
+          <w:tcPr>
+            <w:tcW w:w="0" w:type="auto"/>
+            <w:tcBorders>
+              <w:top w:val="single" w:sz="6" w:space="0" w:color="C4C7C5"/>
+              <w:left w:val="single" w:sz="6" w:space="0" w:color="C4C7C5"/>
+              <w:bottom w:val="single" w:sz="6" w:space="0" w:color="C4C7C5"/>
+              <w:right w:val="single" w:sz="6" w:space="0" w:color="C4C7C5"/>
+            </w:tcBorders>
+            <w:tcMar>
+              <w:top w:w="120" w:type="dxa"/>
+              <w:left w:w="180" w:type="dxa"/>
+              <w:bottom w:w="120" w:type="dxa"/>
+              <w:right w:w="180" w:type="dxa"/>
+            </w:tcMar>
+            <w:vAlign w:val="center"/>
+            <w:hideMark/>
+          </w:tcPr>
+          <w:p>
+            <w:r>
+              <w:t>Users struggle to distinguish completed workspaces from active workspaces</w:t>
+            </w:r>
+          </w:p>
+        </w:tc>
+        <w:tc>
+          <w:tcPr>
+            <w:tcW w:w="0" w:type="auto"/>
+            <w:tcBorders>
+              <w:top w:val="single" w:sz="6" w:space="0" w:color="C4C7C5"/>
+              <w:left w:val="single" w:sz="6" w:space="0" w:color="C4C7C5"/>
+              <w:bottom w:val="single" w:sz="6" w:space="0" w:color="C4C7C5"/>
+              <w:right w:val="single" w:sz="6" w:space="0" w:color="C4C7C5"/>
+            </w:tcBorders>
+            <w:tcMar>
+              <w:top w:w="120" w:type="dxa"/>
+              <w:left w:w="180" w:type="dxa"/>
+              <w:bottom w:w="120" w:type="dxa"/>
+              <w:right w:w="180" w:type="dxa"/>
+            </w:tcMar>
+            <w:vAlign w:val="center"/>
+            <w:hideMark/>
+          </w:tcPr>
+          <w:p>
+            <w:r>
+              <w:t>Accepted</w:t>
+            </w:r>
+          </w:p>
+        </w:tc>
+      </w:tr>
+      <w:tr>
+        <w:trPr>
+          <w:tblCellSpacing w:w="15" w:type="dxa"/>
+        </w:trPr>
+        <w:tc>
+          <w:tcPr>
+            <w:tcW w:w="0" w:type="auto"/>
+            <w:tcBorders>
+              <w:top w:val="single" w:sz="6" w:space="0" w:color="C4C7C5"/>
+              <w:left w:val="single" w:sz="6" w:space="0" w:color="C4C7C5"/>
+              <w:bottom w:val="single" w:sz="6" w:space="0" w:color="C4C7C5"/>
+              <w:right w:val="single" w:sz="6" w:space="0" w:color="C4C7C5"/>
+            </w:tcBorders>
+            <w:tcMar>
+              <w:top w:w="120" w:type="dxa"/>
+              <w:left w:w="180" w:type="dxa"/>
+              <w:bottom w:w="120" w:type="dxa"/>
+              <w:right w:w="180" w:type="dxa"/>
+            </w:tcMar>
+            <w:vAlign w:val="center"/>
+            <w:hideMark/>
+          </w:tcPr>
+          <w:p>
+            <w:pPr>
+              <w:rPr>
+                <w:b/>
+                <w:bCs/>
+              </w:rPr>
+            </w:pPr>
+            <w:r>
+              <w:rPr>
+                <w:b/>
+                <w:bCs/>
+              </w:rPr>
+              <w:t>DW-039</w:t>
+            </w:r>
+          </w:p>
+        </w:tc>
+        <w:tc>
+          <w:tcPr>
+            <w:tcW w:w="0" w:type="auto"/>
+            <w:tcBorders>
+              <w:top w:val="single" w:sz="6" w:space="0" w:color="C4C7C5"/>
+              <w:left w:val="single" w:sz="6" w:space="0" w:color="C4C7C5"/>
+              <w:bottom w:val="single" w:sz="6" w:space="0" w:color="C4C7C5"/>
+              <w:right w:val="single" w:sz="6" w:space="0" w:color="C4C7C5"/>
+            </w:tcBorders>
+            <w:tcMar>
+              <w:top w:w="120" w:type="dxa"/>
+              <w:left w:w="180" w:type="dxa"/>
+              <w:bottom w:w="120" w:type="dxa"/>
+              <w:right w:w="180" w:type="dxa"/>
+            </w:tcMar>
+            <w:vAlign w:val="center"/>
+            <w:hideMark/>
+          </w:tcPr>
+          <w:p>
+            <w:r>
+              <w:t>Users struggle to transition efficiently between different work contexts during the day</w:t>
+            </w:r>
+          </w:p>
+        </w:tc>
+        <w:tc>
+          <w:tcPr>
+            <w:tcW w:w="0" w:type="auto"/>
+            <w:tcBorders>
+              <w:top w:val="single" w:sz="6" w:space="0" w:color="C4C7C5"/>
+              <w:left w:val="single" w:sz="6" w:space="0" w:color="C4C7C5"/>
+              <w:bottom w:val="single" w:sz="6" w:space="0" w:color="C4C7C5"/>
+              <w:right w:val="single" w:sz="6" w:space="0" w:color="C4C7C5"/>
+            </w:tcBorders>
+            <w:tcMar>
+              <w:top w:w="120" w:type="dxa"/>
+              <w:left w:w="180" w:type="dxa"/>
+              <w:bottom w:w="120" w:type="dxa"/>
+              <w:right w:w="180" w:type="dxa"/>
+            </w:tcMar>
+            <w:vAlign w:val="center"/>
+            <w:hideMark/>
+          </w:tcPr>
+          <w:p>
+            <w:r>
+              <w:t>Accepted</w:t>
+            </w:r>
+          </w:p>
+        </w:tc>
+      </w:tr>
+      <w:tr>
+        <w:trPr>
+          <w:tblCellSpacing w:w="15" w:type="dxa"/>
+        </w:trPr>
+        <w:tc>
+          <w:tcPr>
+            <w:tcW w:w="0" w:type="auto"/>
+            <w:tcBorders>
+              <w:top w:val="single" w:sz="6" w:space="0" w:color="C4C7C5"/>
+              <w:left w:val="single" w:sz="6" w:space="0" w:color="C4C7C5"/>
+              <w:bottom w:val="single" w:sz="6" w:space="0" w:color="C4C7C5"/>
+              <w:right w:val="single" w:sz="6" w:space="0" w:color="C4C7C5"/>
+            </w:tcBorders>
+            <w:tcMar>
+              <w:top w:w="120" w:type="dxa"/>
+              <w:left w:w="180" w:type="dxa"/>
+              <w:bottom w:w="120" w:type="dxa"/>
+              <w:right w:w="180" w:type="dxa"/>
+            </w:tcMar>
+            <w:vAlign w:val="center"/>
+            <w:hideMark/>
+          </w:tcPr>
+          <w:p>
+            <w:pPr>
+              <w:rPr>
+                <w:b/>
+                <w:bCs/>
+              </w:rPr>
+            </w:pPr>
+            <w:r>
+              <w:rPr>
+                <w:b/>
+                <w:bCs/>
+              </w:rPr>
+              <w:t>DW-040</w:t>
+            </w:r>
+          </w:p>
+        </w:tc>
+        <w:tc>
+          <w:tcPr>
+            <w:tcW w:w="0" w:type="auto"/>
+            <w:tcBorders>
+              <w:top w:val="single" w:sz="6" w:space="0" w:color="C4C7C5"/>
+              <w:left w:val="single" w:sz="6" w:space="0" w:color="C4C7C5"/>
+              <w:bottom w:val="single" w:sz="6" w:space="0" w:color="C4C7C5"/>
+              <w:right w:val="single" w:sz="6" w:space="0" w:color="C4C7C5"/>
+            </w:tcBorders>
+            <w:tcMar>
+              <w:top w:w="120" w:type="dxa"/>
+              <w:left w:w="180" w:type="dxa"/>
+              <w:bottom w:w="120" w:type="dxa"/>
+              <w:right w:w="180" w:type="dxa"/>
+            </w:tcMar>
+            <w:vAlign w:val="center"/>
+            <w:hideMark/>
+          </w:tcPr>
+          <w:p>
+            <w:r>
+              <w:t>Users struggle to recreate personalized workspace layouts on another computer</w:t>
+            </w:r>
+          </w:p>
+        </w:tc>
+        <w:tc>
+          <w:tcPr>
+            <w:tcW w:w="0" w:type="auto"/>
+            <w:tcBorders>
+              <w:top w:val="single" w:sz="6" w:space="0" w:color="C4C7C5"/>
+              <w:left w:val="single" w:sz="6" w:space="0" w:color="C4C7C5"/>
+              <w:bottom w:val="single" w:sz="6" w:space="0" w:color="C4C7C5"/>
+              <w:right w:val="single" w:sz="6" w:space="0" w:color="C4C7C5"/>
+            </w:tcBorders>
+            <w:tcMar>
+              <w:top w:w="120" w:type="dxa"/>
+              <w:left w:w="180" w:type="dxa"/>
+              <w:bottom w:w="120" w:type="dxa"/>
+              <w:right w:w="180" w:type="dxa"/>
+            </w:tcMar>
+            <w:vAlign w:val="center"/>
+            <w:hideMark/>
+          </w:tcPr>
+          <w:p>
+            <w:r>
+              <w:t>Accepted</w:t>
+            </w:r>
+          </w:p>
+        </w:tc>
+      </w:tr>
+      <w:tr>
+        <w:trPr>
+          <w:tblCellSpacing w:w="15" w:type="dxa"/>
+        </w:trPr>
+        <w:tc>
+          <w:tcPr>
+            <w:tcW w:w="0" w:type="auto"/>
+            <w:tcBorders>
+              <w:top w:val="single" w:sz="6" w:space="0" w:color="C4C7C5"/>
+              <w:left w:val="single" w:sz="6" w:space="0" w:color="C4C7C5"/>
+              <w:bottom w:val="single" w:sz="6" w:space="0" w:color="C4C7C5"/>
+              <w:right w:val="single" w:sz="6" w:space="0" w:color="C4C7C5"/>
+            </w:tcBorders>
+            <w:tcMar>
+              <w:top w:w="120" w:type="dxa"/>
+              <w:left w:w="180" w:type="dxa"/>
+              <w:bottom w:w="120" w:type="dxa"/>
+              <w:right w:w="180" w:type="dxa"/>
+            </w:tcMar>
+            <w:vAlign w:val="center"/>
+            <w:hideMark/>
+          </w:tcPr>
+          <w:p>
+            <w:pPr>
+              <w:rPr>
+                <w:b/>
+                <w:bCs/>
+              </w:rPr>
+            </w:pPr>
+            <w:r>
+              <w:rPr>
+                <w:b/>
+                <w:bCs/>
+              </w:rPr>
+              <w:t>DW-041</w:t>
+            </w:r>
+          </w:p>
+        </w:tc>
+        <w:tc>
+          <w:tcPr>
+            <w:tcW w:w="0" w:type="auto"/>
+            <w:tcBorders>
+              <w:top w:val="single" w:sz="6" w:space="0" w:color="C4C7C5"/>
+              <w:left w:val="single" w:sz="6" w:space="0" w:color="C4C7C5"/>
+              <w:bottom w:val="single" w:sz="6" w:space="0" w:color="C4C7C5"/>
+              <w:right w:val="single" w:sz="6" w:space="0" w:color="C4C7C5"/>
+            </w:tcBorders>
+            <w:tcMar>
+              <w:top w:w="120" w:type="dxa"/>
+              <w:left w:w="180" w:type="dxa"/>
+              <w:bottom w:w="120" w:type="dxa"/>
+              <w:right w:w="180" w:type="dxa"/>
+            </w:tcMar>
+            <w:vAlign w:val="center"/>
+            <w:hideMark/>
+          </w:tcPr>
+          <w:p>
+            <w:r>
+              <w:t>Users struggle to maintain consistent desktop organization across multiple devices</w:t>
+            </w:r>
+          </w:p>
+        </w:tc>
+        <w:tc>
+          <w:tcPr>
+            <w:tcW w:w="0" w:type="auto"/>
+            <w:tcBorders>
+              <w:top w:val="single" w:sz="6" w:space="0" w:color="C4C7C5"/>
+              <w:left w:val="single" w:sz="6" w:space="0" w:color="C4C7C5"/>
+              <w:bottom w:val="single" w:sz="6" w:space="0" w:color="C4C7C5"/>
+              <w:right w:val="single" w:sz="6" w:space="0" w:color="C4C7C5"/>
+            </w:tcBorders>
+            <w:tcMar>
+              <w:top w:w="120" w:type="dxa"/>
+              <w:left w:w="180" w:type="dxa"/>
+              <w:bottom w:w="120" w:type="dxa"/>
+              <w:right w:w="180" w:type="dxa"/>
+            </w:tcMar>
+            <w:vAlign w:val="center"/>
+            <w:hideMark/>
+          </w:tcPr>
+          <w:p>
+            <w:r>
+              <w:t>Accepted</w:t>
+            </w:r>
+          </w:p>
+        </w:tc>
+      </w:tr>
+      <w:tr>
+        <w:trPr>
+          <w:tblCellSpacing w:w="15" w:type="dxa"/>
+        </w:trPr>
+        <w:tc>
+          <w:tcPr>
+            <w:tcW w:w="0" w:type="auto"/>
+            <w:tcBorders>
+              <w:top w:val="single" w:sz="6" w:space="0" w:color="C4C7C5"/>
+              <w:left w:val="single" w:sz="6" w:space="0" w:color="C4C7C5"/>
+              <w:bottom w:val="single" w:sz="6" w:space="0" w:color="C4C7C5"/>
+              <w:right w:val="single" w:sz="6" w:space="0" w:color="C4C7C5"/>
+            </w:tcBorders>
+            <w:tcMar>
+              <w:top w:w="120" w:type="dxa"/>
+              <w:left w:w="180" w:type="dxa"/>
+              <w:bottom w:w="120" w:type="dxa"/>
+              <w:right w:w="180" w:type="dxa"/>
+            </w:tcMar>
+            <w:vAlign w:val="center"/>
+            <w:hideMark/>
+          </w:tcPr>
+          <w:p>
+            <w:pPr>
+              <w:rPr>
+                <w:b/>
+                <w:bCs/>
+              </w:rPr>
+            </w:pPr>
+            <w:r>
+              <w:rPr>
+                <w:b/>
+                <w:bCs/>
+              </w:rPr>
+              <w:t>DW-042</w:t>
+            </w:r>
+          </w:p>
+        </w:tc>
+        <w:tc>
+          <w:tcPr>
+            <w:tcW w:w="0" w:type="auto"/>
+            <w:tcBorders>
+              <w:top w:val="single" w:sz="6" w:space="0" w:color="C4C7C5"/>
+              <w:left w:val="single" w:sz="6" w:space="0" w:color="C4C7C5"/>
+              <w:bottom w:val="single" w:sz="6" w:space="0" w:color="C4C7C5"/>
+              <w:right w:val="single" w:sz="6" w:space="0" w:color="C4C7C5"/>
+            </w:tcBorders>
+            <w:tcMar>
+              <w:top w:w="120" w:type="dxa"/>
+              <w:left w:w="180" w:type="dxa"/>
+              <w:bottom w:w="120" w:type="dxa"/>
+              <w:right w:w="180" w:type="dxa"/>
+            </w:tcMar>
+            <w:vAlign w:val="center"/>
+            <w:hideMark/>
+          </w:tcPr>
+          <w:p>
+            <w:r>
+              <w:t>Users struggle to determine when desktop organization no longer supports productivity</w:t>
+            </w:r>
+          </w:p>
+        </w:tc>
+        <w:tc>
+          <w:tcPr>
+            <w:tcW w:w="0" w:type="auto"/>
+            <w:tcBorders>
+              <w:top w:val="single" w:sz="6" w:space="0" w:color="C4C7C5"/>
+              <w:left w:val="single" w:sz="6" w:space="0" w:color="C4C7C5"/>
+              <w:bottom w:val="single" w:sz="6" w:space="0" w:color="C4C7C5"/>
+              <w:right w:val="single" w:sz="6" w:space="0" w:color="C4C7C5"/>
+            </w:tcBorders>
+            <w:tcMar>
+              <w:top w:w="120" w:type="dxa"/>
+              <w:left w:w="180" w:type="dxa"/>
+              <w:bottom w:w="120" w:type="dxa"/>
+              <w:right w:w="180" w:type="dxa"/>
+            </w:tcMar>
+            <w:vAlign w:val="center"/>
+            <w:hideMark/>
+          </w:tcPr>
+          <w:p>
+            <w:r>
+              <w:t>Accepted</w:t>
+            </w:r>
+          </w:p>
+        </w:tc>
+      </w:tr>
+      <w:tr>
+        <w:trPr>
+          <w:tblCellSpacing w:w="15" w:type="dxa"/>
+        </w:trPr>
+        <w:tc>
+          <w:tcPr>
+            <w:tcW w:w="0" w:type="auto"/>
+            <w:tcBorders>
+              <w:top w:val="single" w:sz="6" w:space="0" w:color="C4C7C5"/>
+              <w:left w:val="single" w:sz="6" w:space="0" w:color="C4C7C5"/>
+              <w:bottom w:val="single" w:sz="6" w:space="0" w:color="C4C7C5"/>
+              <w:right w:val="single" w:sz="6" w:space="0" w:color="C4C7C5"/>
+            </w:tcBorders>
+            <w:tcMar>
+              <w:top w:w="120" w:type="dxa"/>
+              <w:left w:w="180" w:type="dxa"/>
+              <w:bottom w:w="120" w:type="dxa"/>
+              <w:right w:w="180" w:type="dxa"/>
+            </w:tcMar>
+            <w:vAlign w:val="center"/>
+            <w:hideMark/>
+          </w:tcPr>
+          <w:p>
+            <w:pPr>
+              <w:rPr>
+                <w:b/>
+                <w:bCs/>
+              </w:rPr>
+            </w:pPr>
+            <w:r>
+              <w:rPr>
+                <w:b/>
+                <w:bCs/>
+              </w:rPr>
+              <w:t>DW-043</w:t>
+            </w:r>
+          </w:p>
+        </w:tc>
+        <w:tc>
+          <w:tcPr>
+            <w:tcW w:w="0" w:type="auto"/>
+            <w:tcBorders>
+              <w:top w:val="single" w:sz="6" w:space="0" w:color="C4C7C5"/>
+              <w:left w:val="single" w:sz="6" w:space="0" w:color="C4C7C5"/>
+              <w:bottom w:val="single" w:sz="6" w:space="0" w:color="C4C7C5"/>
+              <w:right w:val="single" w:sz="6" w:space="0" w:color="C4C7C5"/>
+            </w:tcBorders>
+            <w:tcMar>
+              <w:top w:w="120" w:type="dxa"/>
+              <w:left w:w="180" w:type="dxa"/>
+              <w:bottom w:w="120" w:type="dxa"/>
+              <w:right w:w="180" w:type="dxa"/>
+            </w:tcMar>
+            <w:vAlign w:val="center"/>
+            <w:hideMark/>
+          </w:tcPr>
+          <w:p>
+            <w:r>
+              <w:t>Users struggle to archive completed workspace states without losing future accessibility</w:t>
+            </w:r>
+          </w:p>
+        </w:tc>
+        <w:tc>
+          <w:tcPr>
+            <w:tcW w:w="0" w:type="auto"/>
+            <w:tcBorders>
+              <w:top w:val="single" w:sz="6" w:space="0" w:color="C4C7C5"/>
+              <w:left w:val="single" w:sz="6" w:space="0" w:color="C4C7C5"/>
+              <w:bottom w:val="single" w:sz="6" w:space="0" w:color="C4C7C5"/>
+              <w:right w:val="single" w:sz="6" w:space="0" w:color="C4C7C5"/>
+            </w:tcBorders>
+            <w:tcMar>
+              <w:top w:w="120" w:type="dxa"/>
+              <w:left w:w="180" w:type="dxa"/>
+              <w:bottom w:w="120" w:type="dxa"/>
+              <w:right w:w="180" w:type="dxa"/>
+            </w:tcMar>
+            <w:vAlign w:val="center"/>
+            <w:hideMark/>
+          </w:tcPr>
+          <w:p>
+            <w:r>
+              <w:t>Accepted</w:t>
+            </w:r>
+          </w:p>
+        </w:tc>
+      </w:tr>
+      <w:tr>
+        <w:trPr>
+          <w:tblCellSpacing w:w="15" w:type="dxa"/>
+        </w:trPr>
+        <w:tc>
+          <w:tcPr>
+            <w:tcW w:w="0" w:type="auto"/>
+            <w:tcBorders>
+              <w:top w:val="single" w:sz="6" w:space="0" w:color="C4C7C5"/>
+              <w:left w:val="single" w:sz="6" w:space="0" w:color="C4C7C5"/>
+              <w:bottom w:val="single" w:sz="6" w:space="0" w:color="C4C7C5"/>
+              <w:right w:val="single" w:sz="6" w:space="0" w:color="C4C7C5"/>
+            </w:tcBorders>
+            <w:tcMar>
+              <w:top w:w="120" w:type="dxa"/>
+              <w:left w:w="180" w:type="dxa"/>
+              <w:bottom w:w="120" w:type="dxa"/>
+              <w:right w:w="180" w:type="dxa"/>
+            </w:tcMar>
+            <w:vAlign w:val="center"/>
+            <w:hideMark/>
+          </w:tcPr>
+          <w:p>
+            <w:pPr>
+              <w:rPr>
+                <w:b/>
+                <w:bCs/>
+              </w:rPr>
+            </w:pPr>
+            <w:r>
+              <w:rPr>
+                <w:b/>
+                <w:bCs/>
+              </w:rPr>
+              <w:lastRenderedPageBreak/>
+              <w:t>DW-044</w:t>
+            </w:r>
+          </w:p>
+        </w:tc>
+        <w:tc>
+          <w:tcPr>
+            <w:tcW w:w="0" w:type="auto"/>
+            <w:tcBorders>
+              <w:top w:val="single" w:sz="6" w:space="0" w:color="C4C7C5"/>
+              <w:left w:val="single" w:sz="6" w:space="0" w:color="C4C7C5"/>
+              <w:bottom w:val="single" w:sz="6" w:space="0" w:color="C4C7C5"/>
+              <w:right w:val="single" w:sz="6" w:space="0" w:color="C4C7C5"/>
+            </w:tcBorders>
+            <w:tcMar>
+              <w:top w:w="120" w:type="dxa"/>
+              <w:left w:w="180" w:type="dxa"/>
+              <w:bottom w:w="120" w:type="dxa"/>
+              <w:right w:w="180" w:type="dxa"/>
+            </w:tcMar>
+            <w:vAlign w:val="center"/>
+            <w:hideMark/>
+          </w:tcPr>
+          <w:p>
+            <w:r>
+              <w:t>Users struggle to balance flexibility and consistency while organizing desktop workspaces</w:t>
+            </w:r>
+          </w:p>
+        </w:tc>
+        <w:tc>
+          <w:tcPr>
+            <w:tcW w:w="0" w:type="auto"/>
+            <w:tcBorders>
+              <w:top w:val="single" w:sz="6" w:space="0" w:color="C4C7C5"/>
+              <w:left w:val="single" w:sz="6" w:space="0" w:color="C4C7C5"/>
+              <w:bottom w:val="single" w:sz="6" w:space="0" w:color="C4C7C5"/>
+              <w:right w:val="single" w:sz="6" w:space="0" w:color="C4C7C5"/>
+            </w:tcBorders>
+            <w:tcMar>
+              <w:top w:w="120" w:type="dxa"/>
+              <w:left w:w="180" w:type="dxa"/>
+              <w:bottom w:w="120" w:type="dxa"/>
+              <w:right w:w="180" w:type="dxa"/>
+            </w:tcMar>
+            <w:vAlign w:val="center"/>
+            <w:hideMark/>
+          </w:tcPr>
+          <w:p>
+            <w:r>
+              <w:t>Accepted</w:t>
+            </w:r>
+          </w:p>
+        </w:tc>
+      </w:tr>
+      <w:tr>
+        <w:trPr>
+          <w:tblCellSpacing w:w="15" w:type="dxa"/>
+        </w:trPr>
+        <w:tc>
+          <w:tcPr>
+            <w:tcW w:w="0" w:type="auto"/>
+            <w:tcBorders>
+              <w:top w:val="single" w:sz="6" w:space="0" w:color="C4C7C5"/>
+              <w:left w:val="single" w:sz="6" w:space="0" w:color="C4C7C5"/>
+              <w:bottom w:val="single" w:sz="6" w:space="0" w:color="C4C7C5"/>
+              <w:right w:val="single" w:sz="6" w:space="0" w:color="C4C7C5"/>
+            </w:tcBorders>
+            <w:tcMar>
+              <w:top w:w="120" w:type="dxa"/>
+              <w:left w:w="180" w:type="dxa"/>
+              <w:bottom w:w="120" w:type="dxa"/>
+              <w:right w:w="180" w:type="dxa"/>
+            </w:tcMar>
+            <w:vAlign w:val="center"/>
+            <w:hideMark/>
+          </w:tcPr>
+          <w:p>
+            <w:pPr>
+              <w:rPr>
+                <w:b/>
+                <w:bCs/>
+              </w:rPr>
+            </w:pPr>
+            <w:r>
+              <w:rPr>
+                <w:b/>
+                <w:bCs/>
+              </w:rPr>
+              <w:t>DW-045</w:t>
+            </w:r>
+          </w:p>
+        </w:tc>
+        <w:tc>
+          <w:tcPr>
+            <w:tcW w:w="0" w:type="auto"/>
+            <w:tcBorders>
+              <w:top w:val="single" w:sz="6" w:space="0" w:color="C4C7C5"/>
+              <w:left w:val="single" w:sz="6" w:space="0" w:color="C4C7C5"/>
+              <w:bottom w:val="single" w:sz="6" w:space="0" w:color="C4C7C5"/>
+              <w:right w:val="single" w:sz="6" w:space="0" w:color="C4C7C5"/>
+            </w:tcBorders>
+            <w:tcMar>
+              <w:top w:w="120" w:type="dxa"/>
+              <w:left w:w="180" w:type="dxa"/>
+              <w:bottom w:w="120" w:type="dxa"/>
+              <w:right w:w="180" w:type="dxa"/>
+            </w:tcMar>
+            <w:vAlign w:val="center"/>
+            <w:hideMark/>
+          </w:tcPr>
+          <w:p>
+            <w:r>
+              <w:t>Users struggle to recover task context after prolonged interruptions</w:t>
+            </w:r>
+          </w:p>
+        </w:tc>
+        <w:tc>
+          <w:tcPr>
+            <w:tcW w:w="0" w:type="auto"/>
+            <w:tcBorders>
+              <w:top w:val="single" w:sz="6" w:space="0" w:color="C4C7C5"/>
+              <w:left w:val="single" w:sz="6" w:space="0" w:color="C4C7C5"/>
+              <w:bottom w:val="single" w:sz="6" w:space="0" w:color="C4C7C5"/>
+              <w:right w:val="single" w:sz="6" w:space="0" w:color="C4C7C5"/>
+            </w:tcBorders>
+            <w:tcMar>
+              <w:top w:w="120" w:type="dxa"/>
+              <w:left w:w="180" w:type="dxa"/>
+              <w:bottom w:w="120" w:type="dxa"/>
+              <w:right w:w="180" w:type="dxa"/>
+            </w:tcMar>
+            <w:vAlign w:val="center"/>
+            <w:hideMark/>
+          </w:tcPr>
+          <w:p>
+            <w:r>
+              <w:t>Accepted</w:t>
+            </w:r>
+          </w:p>
+        </w:tc>
+      </w:tr>
+      <w:tr>
+        <w:trPr>
+          <w:tblCellSpacing w:w="15" w:type="dxa"/>
+        </w:trPr>
+        <w:tc>
+          <w:tcPr>
+            <w:tcW w:w="0" w:type="auto"/>
+            <w:tcBorders>
+              <w:top w:val="single" w:sz="6" w:space="0" w:color="C4C7C5"/>
+              <w:left w:val="single" w:sz="6" w:space="0" w:color="C4C7C5"/>
+              <w:bottom w:val="single" w:sz="6" w:space="0" w:color="C4C7C5"/>
+              <w:right w:val="single" w:sz="6" w:space="0" w:color="C4C7C5"/>
+            </w:tcBorders>
+            <w:tcMar>
+              <w:top w:w="120" w:type="dxa"/>
+              <w:left w:w="180" w:type="dxa"/>
+              <w:bottom w:w="120" w:type="dxa"/>
+              <w:right w:w="180" w:type="dxa"/>
+            </w:tcMar>
+            <w:vAlign w:val="center"/>
+            <w:hideMark/>
+          </w:tcPr>
+          <w:p>
+            <w:pPr>
+              <w:rPr>
+                <w:b/>
+                <w:bCs/>
+              </w:rPr>
+            </w:pPr>
+            <w:r>
+              <w:rPr>
+                <w:b/>
+                <w:bCs/>
+              </w:rPr>
+              <w:t>DW-046</w:t>
+            </w:r>
+          </w:p>
+        </w:tc>
+        <w:tc>
+          <w:tcPr>
+            <w:tcW w:w="0" w:type="auto"/>
+            <w:tcBorders>
+              <w:top w:val="single" w:sz="6" w:space="0" w:color="C4C7C5"/>
+              <w:left w:val="single" w:sz="6" w:space="0" w:color="C4C7C5"/>
+              <w:bottom w:val="single" w:sz="6" w:space="0" w:color="C4C7C5"/>
+              <w:right w:val="single" w:sz="6" w:space="0" w:color="C4C7C5"/>
+            </w:tcBorders>
+            <w:tcMar>
+              <w:top w:w="120" w:type="dxa"/>
+              <w:left w:w="180" w:type="dxa"/>
+              <w:bottom w:w="120" w:type="dxa"/>
+              <w:right w:w="180" w:type="dxa"/>
+            </w:tcMar>
+            <w:vAlign w:val="center"/>
+            <w:hideMark/>
+          </w:tcPr>
+          <w:p>
+            <w:r>
+              <w:t>Users struggle to maintain awareness of relationships between simultaneously open tasks</w:t>
+            </w:r>
+          </w:p>
+        </w:tc>
+        <w:tc>
+          <w:tcPr>
+            <w:tcW w:w="0" w:type="auto"/>
+            <w:tcBorders>
+              <w:top w:val="single" w:sz="6" w:space="0" w:color="C4C7C5"/>
+              <w:left w:val="single" w:sz="6" w:space="0" w:color="C4C7C5"/>
+              <w:bottom w:val="single" w:sz="6" w:space="0" w:color="C4C7C5"/>
+              <w:right w:val="single" w:sz="6" w:space="0" w:color="C4C7C5"/>
+            </w:tcBorders>
+            <w:tcMar>
+              <w:top w:w="120" w:type="dxa"/>
+              <w:left w:w="180" w:type="dxa"/>
+              <w:bottom w:w="120" w:type="dxa"/>
+              <w:right w:w="180" w:type="dxa"/>
+            </w:tcMar>
+            <w:vAlign w:val="center"/>
+            <w:hideMark/>
+          </w:tcPr>
+          <w:p>
+            <w:r>
+              <w:t>Accepted</w:t>
+            </w:r>
+          </w:p>
+        </w:tc>
+      </w:tr>
+      <w:tr>
+        <w:trPr>
+          <w:tblCellSpacing w:w="15" w:type="dxa"/>
+        </w:trPr>
+        <w:tc>
+          <w:tcPr>
+            <w:tcW w:w="0" w:type="auto"/>
+            <w:tcBorders>
+              <w:top w:val="single" w:sz="6" w:space="0" w:color="C4C7C5"/>
+              <w:left w:val="single" w:sz="6" w:space="0" w:color="C4C7C5"/>
+              <w:bottom w:val="single" w:sz="6" w:space="0" w:color="C4C7C5"/>
+              <w:right w:val="single" w:sz="6" w:space="0" w:color="C4C7C5"/>
+            </w:tcBorders>
+            <w:tcMar>
+              <w:top w:w="120" w:type="dxa"/>
+              <w:left w:w="180" w:type="dxa"/>
+              <w:bottom w:w="120" w:type="dxa"/>
+              <w:right w:w="180" w:type="dxa"/>
+            </w:tcMar>
+            <w:vAlign w:val="center"/>
+            <w:hideMark/>
+          </w:tcPr>
+          <w:p>
+            <w:pPr>
+              <w:rPr>
+                <w:b/>
+                <w:bCs/>
+              </w:rPr>
+            </w:pPr>
+            <w:r>
+              <w:rPr>
+                <w:b/>
+                <w:bCs/>
+              </w:rPr>
+              <w:t>DW-047</w:t>
+            </w:r>
+          </w:p>
+        </w:tc>
+        <w:tc>
+          <w:tcPr>
+            <w:tcW w:w="0" w:type="auto"/>
+            <w:tcBorders>
+              <w:top w:val="single" w:sz="6" w:space="0" w:color="C4C7C5"/>
+              <w:left w:val="single" w:sz="6" w:space="0" w:color="C4C7C5"/>
+              <w:bottom w:val="single" w:sz="6" w:space="0" w:color="C4C7C5"/>
+              <w:right w:val="single" w:sz="6" w:space="0" w:color="C4C7C5"/>
+            </w:tcBorders>
+            <w:tcMar>
+              <w:top w:w="120" w:type="dxa"/>
+              <w:left w:w="180" w:type="dxa"/>
+              <w:bottom w:w="120" w:type="dxa"/>
+              <w:right w:w="180" w:type="dxa"/>
+            </w:tcMar>
+            <w:vAlign w:val="center"/>
+            <w:hideMark/>
+          </w:tcPr>
+          <w:p>
+            <w:r>
+              <w:t>Users struggle to coordinate desktop workspaces with cloud-based applications and services</w:t>
+            </w:r>
+          </w:p>
+        </w:tc>
+        <w:tc>
+          <w:tcPr>
+            <w:tcW w:w="0" w:type="auto"/>
+            <w:tcBorders>
+              <w:top w:val="single" w:sz="6" w:space="0" w:color="C4C7C5"/>
+              <w:left w:val="single" w:sz="6" w:space="0" w:color="C4C7C5"/>
+              <w:bottom w:val="single" w:sz="6" w:space="0" w:color="C4C7C5"/>
+              <w:right w:val="single" w:sz="6" w:space="0" w:color="C4C7C5"/>
+            </w:tcBorders>
+            <w:tcMar>
+              <w:top w:w="120" w:type="dxa"/>
+              <w:left w:w="180" w:type="dxa"/>
+              <w:bottom w:w="120" w:type="dxa"/>
+              <w:right w:w="180" w:type="dxa"/>
+            </w:tcMar>
+            <w:vAlign w:val="center"/>
+            <w:hideMark/>
+          </w:tcPr>
+          <w:p>
+            <w:r>
+              <w:t>Accepted</w:t>
+            </w:r>
+          </w:p>
+        </w:tc>
+      </w:tr>
+      <w:tr>
+        <w:trPr>
+          <w:tblCellSpacing w:w="15" w:type="dxa"/>
+        </w:trPr>
+        <w:tc>
+          <w:tcPr>
+            <w:tcW w:w="0" w:type="auto"/>
+            <w:tcBorders>
+              <w:top w:val="single" w:sz="6" w:space="0" w:color="C4C7C5"/>
+              <w:left w:val="single" w:sz="6" w:space="0" w:color="C4C7C5"/>
+              <w:bottom w:val="single" w:sz="6" w:space="0" w:color="C4C7C5"/>
+              <w:right w:val="single" w:sz="6" w:space="0" w:color="C4C7C5"/>
+            </w:tcBorders>
+            <w:tcMar>
+              <w:top w:w="120" w:type="dxa"/>
+              <w:left w:w="180" w:type="dxa"/>
+              <w:bottom w:w="120" w:type="dxa"/>
+              <w:right w:w="180" w:type="dxa"/>
+            </w:tcMar>
+            <w:vAlign w:val="center"/>
+            <w:hideMark/>
+          </w:tcPr>
+          <w:p>
+            <w:pPr>
+              <w:rPr>
+                <w:b/>
+                <w:bCs/>
+              </w:rPr>
+            </w:pPr>
+            <w:r>
+              <w:rPr>
+                <w:b/>
+                <w:bCs/>
+              </w:rPr>
+              <w:t>DW-048</w:t>
+            </w:r>
+          </w:p>
+        </w:tc>
+        <w:tc>
+          <w:tcPr>
+            <w:tcW w:w="0" w:type="auto"/>
+            <w:tcBorders>
+              <w:top w:val="single" w:sz="6" w:space="0" w:color="C4C7C5"/>
+              <w:left w:val="single" w:sz="6" w:space="0" w:color="C4C7C5"/>
+              <w:bottom w:val="single" w:sz="6" w:space="0" w:color="C4C7C5"/>
+              <w:right w:val="single" w:sz="6" w:space="0" w:color="C4C7C5"/>
+            </w:tcBorders>
+            <w:tcMar>
+              <w:top w:w="120" w:type="dxa"/>
+              <w:left w:w="180" w:type="dxa"/>
+              <w:bottom w:w="120" w:type="dxa"/>
+              <w:right w:w="180" w:type="dxa"/>
+            </w:tcMar>
+            <w:vAlign w:val="center"/>
+            <w:hideMark/>
+          </w:tcPr>
+          <w:p>
+            <w:r>
+              <w:t>Users struggle to preserve workspace continuity across operating system updates and application changes</w:t>
+            </w:r>
+          </w:p>
+        </w:tc>
+        <w:tc>
+          <w:tcPr>
+            <w:tcW w:w="0" w:type="auto"/>
+            <w:tcBorders>
+              <w:top w:val="single" w:sz="6" w:space="0" w:color="C4C7C5"/>
+              <w:left w:val="single" w:sz="6" w:space="0" w:color="C4C7C5"/>
+              <w:bottom w:val="single" w:sz="6" w:space="0" w:color="C4C7C5"/>
+              <w:right w:val="single" w:sz="6" w:space="0" w:color="C4C7C5"/>
+            </w:tcBorders>
+            <w:tcMar>
+              <w:top w:w="120" w:type="dxa"/>
+              <w:left w:w="180" w:type="dxa"/>
+              <w:bottom w:w="120" w:type="dxa"/>
+              <w:right w:w="180" w:type="dxa"/>
+            </w:tcMar>
+            <w:vAlign w:val="center"/>
+            <w:hideMark/>
+          </w:tcPr>
+          <w:p>
+            <w:r>
+              <w:t>Accepted</w:t>
+            </w:r>
+          </w:p>
+        </w:tc>
+      </w:tr>
+      <w:tr>
+        <w:trPr>
+          <w:tblCellSpacing w:w="15" w:type="dxa"/>
+        </w:trPr>
+        <w:tc>
+          <w:tcPr>
+            <w:tcW w:w="0" w:type="auto"/>
+            <w:tcBorders>
+              <w:top w:val="single" w:sz="6" w:space="0" w:color="C4C7C5"/>
+              <w:left w:val="single" w:sz="6" w:space="0" w:color="C4C7C5"/>
+              <w:bottom w:val="single" w:sz="6" w:space="0" w:color="C4C7C5"/>
+              <w:right w:val="single" w:sz="6" w:space="0" w:color="C4C7C5"/>
+            </w:tcBorders>
+            <w:tcMar>
+              <w:top w:w="120" w:type="dxa"/>
+              <w:left w:w="180" w:type="dxa"/>
+              <w:bottom w:w="120" w:type="dxa"/>
+              <w:right w:w="180" w:type="dxa"/>
+            </w:tcMar>
+            <w:vAlign w:val="center"/>
+            <w:hideMark/>
+          </w:tcPr>
+          <w:p>
+            <w:pPr>
+              <w:rPr>
+                <w:b/>
+                <w:bCs/>
+              </w:rPr>
+            </w:pPr>
+            <w:r>
+              <w:rPr>
+                <w:b/>
+                <w:bCs/>
+              </w:rPr>
+              <w:t>DW-049</w:t>
+            </w:r>
+          </w:p>
+        </w:tc>
+        <w:tc>
+          <w:tcPr>
+            <w:tcW w:w="0" w:type="auto"/>
+            <w:tcBorders>
+              <w:top w:val="single" w:sz="6" w:space="0" w:color="C4C7C5"/>
+              <w:left w:val="single" w:sz="6" w:space="0" w:color="C4C7C5"/>
+              <w:bottom w:val="single" w:sz="6" w:space="0" w:color="C4C7C5"/>
+              <w:right w:val="single" w:sz="6" w:space="0" w:color="C4C7C5"/>
+            </w:tcBorders>
+            <w:tcMar>
+              <w:top w:w="120" w:type="dxa"/>
+              <w:left w:w="180" w:type="dxa"/>
+              <w:bottom w:w="120" w:type="dxa"/>
+              <w:right w:w="180" w:type="dxa"/>
+            </w:tcMar>
+            <w:vAlign w:val="center"/>
+            <w:hideMark/>
+          </w:tcPr>
+          <w:p>
+            <w:r>
+              <w:t>Users struggle to adapt existing desktop organizations to changing work requirements</w:t>
+            </w:r>
+          </w:p>
+        </w:tc>
+        <w:tc>
+          <w:tcPr>
+            <w:tcW w:w="0" w:type="auto"/>
+            <w:tcBorders>
+              <w:top w:val="single" w:sz="6" w:space="0" w:color="C4C7C5"/>
+              <w:left w:val="single" w:sz="6" w:space="0" w:color="C4C7C5"/>
+              <w:bottom w:val="single" w:sz="6" w:space="0" w:color="C4C7C5"/>
+              <w:right w:val="single" w:sz="6" w:space="0" w:color="C4C7C5"/>
+            </w:tcBorders>
+            <w:tcMar>
+              <w:top w:w="120" w:type="dxa"/>
+              <w:left w:w="180" w:type="dxa"/>
+              <w:bottom w:w="120" w:type="dxa"/>
+              <w:right w:w="180" w:type="dxa"/>
+            </w:tcMar>
+            <w:vAlign w:val="center"/>
+            <w:hideMark/>
+          </w:tcPr>
+          <w:p>
+            <w:r>
+              <w:t>Accepted</w:t>
+            </w:r>
+          </w:p>
+        </w:tc>
+      </w:tr>
+      <w:tr>
+        <w:trPr>
+          <w:tblCellSpacing w:w="15" w:type="dxa"/>
+        </w:trPr>
+        <w:tc>
+          <w:tcPr>
+            <w:tcW w:w="0" w:type="auto"/>
+            <w:tcBorders>
+              <w:top w:val="single" w:sz="6" w:space="0" w:color="C4C7C5"/>
+              <w:left w:val="single" w:sz="6" w:space="0" w:color="C4C7C5"/>
+              <w:bottom w:val="single" w:sz="6" w:space="0" w:color="C4C7C5"/>
+              <w:right w:val="single" w:sz="6" w:space="0" w:color="C4C7C5"/>
+            </w:tcBorders>
+            <w:tcMar>
+              <w:top w:w="120" w:type="dxa"/>
+              <w:left w:w="180" w:type="dxa"/>
+              <w:bottom w:w="120" w:type="dxa"/>
+              <w:right w:w="180" w:type="dxa"/>
+            </w:tcMar>
+            <w:vAlign w:val="center"/>
+            <w:hideMark/>
+          </w:tcPr>
+          <w:p>
+            <w:pPr>
+              <w:rPr>
+                <w:b/>
+                <w:bCs/>
+              </w:rPr>
+            </w:pPr>
+            <w:r>
+              <w:rPr>
+                <w:b/>
+                <w:bCs/>
+              </w:rPr>
+              <w:t>DW-050</w:t>
+            </w:r>
+          </w:p>
+        </w:tc>
+        <w:tc>
+          <w:tcPr>
+            <w:tcW w:w="0" w:type="auto"/>
+            <w:tcBorders>
+              <w:top w:val="single" w:sz="6" w:space="0" w:color="C4C7C5"/>
+              <w:left w:val="single" w:sz="6" w:space="0" w:color="C4C7C5"/>
+              <w:bottom w:val="single" w:sz="6" w:space="0" w:color="C4C7C5"/>
+              <w:right w:val="single" w:sz="6" w:space="0" w:color="C4C7C5"/>
+            </w:tcBorders>
+            <w:tcMar>
+              <w:top w:w="120" w:type="dxa"/>
+              <w:left w:w="180" w:type="dxa"/>
+              <w:bottom w:w="120" w:type="dxa"/>
+              <w:right w:w="180" w:type="dxa"/>
+            </w:tcMar>
+            <w:vAlign w:val="center"/>
+            <w:hideMark/>
+          </w:tcPr>
+          <w:p>
+            <w:r>
+              <w:t>Users gradually lose the ability to maintain an effective desktop workspace as tasks, applications, and information continuously expand</w:t>
+            </w:r>
+          </w:p>
+        </w:tc>
+        <w:tc>
+          <w:tcPr>
+            <w:tcW w:w="0" w:type="auto"/>
+            <w:tcBorders>
+              <w:top w:val="single" w:sz="6" w:space="0" w:color="C4C7C5"/>
+              <w:left w:val="single" w:sz="6" w:space="0" w:color="C4C7C5"/>
+              <w:bottom w:val="single" w:sz="6" w:space="0" w:color="C4C7C5"/>
+              <w:right w:val="single" w:sz="6" w:space="0" w:color="C4C7C5"/>
+            </w:tcBorders>
+            <w:tcMar>
+              <w:top w:w="120" w:type="dxa"/>
+              <w:left w:w="180" w:type="dxa"/>
+              <w:bottom w:w="120" w:type="dxa"/>
+              <w:right w:w="180" w:type="dxa"/>
+            </w:tcMar>
+            <w:vAlign w:val="center"/>
+            <w:hideMark/>
+          </w:tcPr>
+          <w:p>
+            <w:r>
+              <w:t>Accepted</w:t>
+            </w:r>
+          </w:p>
+        </w:tc>
+      </w:tr>
+    </w:tbl>
+    <w:p>
+      <w:pPr>
+        <w:rPr>
+          <w:b/>
+          <w:bCs/>
+        </w:rPr>
+      </w:pPr>
+    </w:p>
+    <w:p>
+      <w:pPr>
+        <w:rPr>
+          <w:b/>
+          <w:bCs/>
+        </w:rPr>
+      </w:pPr>
+    </w:p>
+    <w:p>
+      <w:pPr>
+        <w:rPr>
+          <w:b/>
+          <w:bCs/>
+        </w:rPr>
+      </w:pPr>
+    </w:p>
+    <w:p>
+      <w:pPr>
+        <w:rPr>
+          <w:b/>
+          <w:bCs/>
+        </w:rPr>
+      </w:pPr>
+    </w:p>
+    <w:p>
+      <w:pPr>
+        <w:rPr>
+          <w:b/>
+          <w:bCs/>
+        </w:rPr>
+      </w:pPr>
+    </w:p>
+    <w:p>
+      <w:pPr>
+        <w:rPr>
+          <w:b/>
+          <w:bCs/>
+        </w:rPr>
+      </w:pPr>
+    </w:p>
+    <w:p>
+      <w:pPr>
+        <w:rPr>
+          <w:b/>
+          <w:bCs/>
+        </w:rPr>
+      </w:pPr>
+    </w:p>
+    <w:p>
+      <w:pPr>
+        <w:rPr>
+          <w:b/>
+          <w:bCs/>
+        </w:rPr>
+      </w:pPr>
+    </w:p>
+    <w:p>
+      <w:pPr>
+        <w:rPr>
+          <w:b/>
+          <w:bCs/>
+        </w:rPr>
+      </w:pPr>
+    </w:p>
+    <w:p>
+      <w:pPr>
+        <w:rPr>
+          <w:b/>
+          <w:bCs/>
+        </w:rPr>
+      </w:pPr>
+    </w:p>
+    <w:p>
+      <w:pPr>
+        <w:rPr>
+          <w:b/>
+          <w:bCs/>
+        </w:rPr>
+      </w:pPr>
+      <w:r>
+        <w:rPr>
+          <w:b/>
+          <w:bCs/>
+        </w:rPr>
+        <w:lastRenderedPageBreak/>
         <w:t>Registry Statistics</w:t>
       </w:r>
     </w:p>
@@ -15398,7 +19974,7 @@
           </w:tcPr>
           <w:p>
             <w:r>
-              <w:t>3</w:t>
+              <w:t>4</w:t>
             </w:r>
           </w:p>
         </w:tc>
@@ -15455,10 +20031,7 @@
           </w:tcPr>
           <w:p>
             <w:r>
-              <w:t>1</w:t>
-            </w:r>
-            <w:r>
-              <w:t>50</w:t>
+              <w:t>200</w:t>
             </w:r>
           </w:p>
         </w:tc>
@@ -15515,10 +20088,7 @@
           </w:tcPr>
           <w:p>
             <w:r>
-              <w:t>1</w:t>
-            </w:r>
-            <w:r>
-              <w:t>75</w:t>
+              <w:t>200</w:t>
             </w:r>
           </w:p>
         </w:tc>
@@ -17388,6 +21958,7 @@
   <w:style w:type="character" w:default="1" w:styleId="DefaultParagraphFont">
     <w:name w:val="Default Paragraph Font"/>
     <w:uiPriority w:val="1"/>
+    <w:semiHidden/>
     <w:unhideWhenUsed/>
   </w:style>
   <w:style w:type="table" w:default="1" w:styleId="TableNormal">

</xml_diff>

<commit_message>
Add keyboard/input patterns and update registries
Add multiple DOCX pattern files for Keyboard & Input (KI Volume 01 & 02) and PAT-047 through PAT-052 across Volumes 01 and 03. Update Pattern Volume Registry document and modify APID-Registry, Category-Registry, Pattern-Registry, Human Friction Metrics, and Pattern Metrics documents to reflect the new content. New patterns cover keyboard knowledge acquisition, shortcut acquisition & retention, motor input adaptation, input error recovery, keyboard workflow optimization, and input behaviour evolution.
</commit_message>
<xml_diff>
--- a/atlas/Registries/APID-Registry.docx
+++ b/atlas/Registries/APID-Registry.docx
@@ -8080,13 +8080,8 @@
           </w:tcPr>
           <w:p>
             <w:r>
-              <w:t xml:space="preserve">Users struggle to understand startup applications and boot </w:t>
-            </w:r>
-            <w:proofErr w:type="spellStart"/>
-            <w:r>
-              <w:t>behavior</w:t>
-            </w:r>
-            <w:proofErr w:type="spellEnd"/>
+              <w:t>Users struggle to understand startup applications and boot behavior</w:t>
+            </w:r>
           </w:p>
         </w:tc>
         <w:tc>
@@ -19748,6 +19743,4549 @@
         </w:tc>
       </w:tr>
     </w:tbl>
+    <w:p>
+      <w:pPr>
+        <w:rPr>
+          <w:b/>
+          <w:bCs/>
+        </w:rPr>
+      </w:pPr>
+    </w:p>
+    <w:p>
+      <w:pPr>
+        <w:rPr>
+          <w:b/>
+          <w:bCs/>
+        </w:rPr>
+      </w:pPr>
+    </w:p>
+    <w:p>
+      <w:pPr>
+        <w:rPr>
+          <w:b/>
+          <w:bCs/>
+        </w:rPr>
+      </w:pPr>
+      <w:r>
+        <w:rPr>
+          <w:b/>
+          <w:bCs/>
+        </w:rPr>
+        <w:t xml:space="preserve">Category: </w:t>
+      </w:r>
+      <w:r>
+        <w:rPr>
+          <w:b/>
+          <w:bCs/>
+        </w:rPr>
+        <w:t>Keyboard &amp; Input (KI)</w:t>
+      </w:r>
+    </w:p>
+    <w:tbl>
+      <w:tblPr>
+        <w:tblW w:w="0" w:type="auto"/>
+        <w:tblCellSpacing w:w="15" w:type="dxa"/>
+        <w:tblCellMar>
+          <w:top w:w="15" w:type="dxa"/>
+          <w:left w:w="15" w:type="dxa"/>
+          <w:bottom w:w="15" w:type="dxa"/>
+          <w:right w:w="15" w:type="dxa"/>
+        </w:tblCellMar>
+        <w:tblLook w:val="04A0" w:firstRow="1" w:lastRow="0" w:firstColumn="1" w:lastColumn="0" w:noHBand="0" w:noVBand="1"/>
+      </w:tblPr>
+      <w:tblGrid>
+        <w:gridCol w:w="1026"/>
+        <w:gridCol w:w="6557"/>
+        <w:gridCol w:w="1427"/>
+      </w:tblGrid>
+      <w:tr>
+        <w:trPr>
+          <w:tblHeader/>
+          <w:tblCellSpacing w:w="15" w:type="dxa"/>
+        </w:trPr>
+        <w:tc>
+          <w:tcPr>
+            <w:tcW w:w="0" w:type="auto"/>
+            <w:tcBorders>
+              <w:top w:val="single" w:sz="6" w:space="0" w:color="C4C7C5"/>
+              <w:left w:val="single" w:sz="6" w:space="0" w:color="C4C7C5"/>
+              <w:bottom w:val="single" w:sz="6" w:space="0" w:color="C4C7C5"/>
+              <w:right w:val="single" w:sz="6" w:space="0" w:color="C4C7C5"/>
+            </w:tcBorders>
+            <w:tcMar>
+              <w:top w:w="120" w:type="dxa"/>
+              <w:left w:w="180" w:type="dxa"/>
+              <w:bottom w:w="120" w:type="dxa"/>
+              <w:right w:w="180" w:type="dxa"/>
+            </w:tcMar>
+            <w:vAlign w:val="center"/>
+            <w:hideMark/>
+          </w:tcPr>
+          <w:p>
+            <w:pPr>
+              <w:rPr>
+                <w:b/>
+                <w:bCs/>
+              </w:rPr>
+            </w:pPr>
+            <w:r>
+              <w:rPr>
+                <w:b/>
+                <w:bCs/>
+              </w:rPr>
+              <w:t>APID</w:t>
+            </w:r>
+          </w:p>
+        </w:tc>
+        <w:tc>
+          <w:tcPr>
+            <w:tcW w:w="0" w:type="auto"/>
+            <w:tcBorders>
+              <w:top w:val="single" w:sz="6" w:space="0" w:color="C4C7C5"/>
+              <w:left w:val="single" w:sz="6" w:space="0" w:color="C4C7C5"/>
+              <w:bottom w:val="single" w:sz="6" w:space="0" w:color="C4C7C5"/>
+              <w:right w:val="single" w:sz="6" w:space="0" w:color="C4C7C5"/>
+            </w:tcBorders>
+            <w:tcMar>
+              <w:top w:w="120" w:type="dxa"/>
+              <w:left w:w="180" w:type="dxa"/>
+              <w:bottom w:w="120" w:type="dxa"/>
+              <w:right w:w="180" w:type="dxa"/>
+            </w:tcMar>
+            <w:vAlign w:val="center"/>
+            <w:hideMark/>
+          </w:tcPr>
+          <w:p>
+            <w:pPr>
+              <w:rPr>
+                <w:b/>
+                <w:bCs/>
+              </w:rPr>
+            </w:pPr>
+            <w:r>
+              <w:rPr>
+                <w:b/>
+                <w:bCs/>
+              </w:rPr>
+              <w:t>Human Friction</w:t>
+            </w:r>
+          </w:p>
+        </w:tc>
+        <w:tc>
+          <w:tcPr>
+            <w:tcW w:w="0" w:type="auto"/>
+            <w:tcBorders>
+              <w:top w:val="single" w:sz="6" w:space="0" w:color="C4C7C5"/>
+              <w:left w:val="single" w:sz="6" w:space="0" w:color="C4C7C5"/>
+              <w:bottom w:val="single" w:sz="6" w:space="0" w:color="C4C7C5"/>
+              <w:right w:val="single" w:sz="6" w:space="0" w:color="C4C7C5"/>
+            </w:tcBorders>
+            <w:tcMar>
+              <w:top w:w="120" w:type="dxa"/>
+              <w:left w:w="180" w:type="dxa"/>
+              <w:bottom w:w="120" w:type="dxa"/>
+              <w:right w:w="180" w:type="dxa"/>
+            </w:tcMar>
+            <w:vAlign w:val="center"/>
+            <w:hideMark/>
+          </w:tcPr>
+          <w:p>
+            <w:pPr>
+              <w:rPr>
+                <w:b/>
+                <w:bCs/>
+              </w:rPr>
+            </w:pPr>
+            <w:r>
+              <w:rPr>
+                <w:b/>
+                <w:bCs/>
+              </w:rPr>
+              <w:t>Status</w:t>
+            </w:r>
+          </w:p>
+        </w:tc>
+      </w:tr>
+      <w:tr>
+        <w:trPr>
+          <w:tblCellSpacing w:w="15" w:type="dxa"/>
+        </w:trPr>
+        <w:tc>
+          <w:tcPr>
+            <w:tcW w:w="0" w:type="auto"/>
+            <w:tcBorders>
+              <w:top w:val="single" w:sz="6" w:space="0" w:color="C4C7C5"/>
+              <w:left w:val="single" w:sz="6" w:space="0" w:color="C4C7C5"/>
+              <w:bottom w:val="single" w:sz="6" w:space="0" w:color="C4C7C5"/>
+              <w:right w:val="single" w:sz="6" w:space="0" w:color="C4C7C5"/>
+            </w:tcBorders>
+            <w:tcMar>
+              <w:top w:w="120" w:type="dxa"/>
+              <w:left w:w="180" w:type="dxa"/>
+              <w:bottom w:w="120" w:type="dxa"/>
+              <w:right w:w="180" w:type="dxa"/>
+            </w:tcMar>
+            <w:vAlign w:val="center"/>
+            <w:hideMark/>
+          </w:tcPr>
+          <w:p>
+            <w:pPr>
+              <w:rPr>
+                <w:b/>
+                <w:bCs/>
+              </w:rPr>
+            </w:pPr>
+            <w:r>
+              <w:rPr>
+                <w:b/>
+                <w:bCs/>
+              </w:rPr>
+              <w:t>KI-001</w:t>
+            </w:r>
+          </w:p>
+        </w:tc>
+        <w:tc>
+          <w:tcPr>
+            <w:tcW w:w="0" w:type="auto"/>
+            <w:tcBorders>
+              <w:top w:val="single" w:sz="6" w:space="0" w:color="C4C7C5"/>
+              <w:left w:val="single" w:sz="6" w:space="0" w:color="C4C7C5"/>
+              <w:bottom w:val="single" w:sz="6" w:space="0" w:color="C4C7C5"/>
+              <w:right w:val="single" w:sz="6" w:space="0" w:color="C4C7C5"/>
+            </w:tcBorders>
+            <w:tcMar>
+              <w:top w:w="120" w:type="dxa"/>
+              <w:left w:w="180" w:type="dxa"/>
+              <w:bottom w:w="120" w:type="dxa"/>
+              <w:right w:w="180" w:type="dxa"/>
+            </w:tcMar>
+            <w:vAlign w:val="center"/>
+            <w:hideMark/>
+          </w:tcPr>
+          <w:p>
+            <w:r>
+              <w:t>Developers forget command-line commands even when they know the task.</w:t>
+            </w:r>
+          </w:p>
+        </w:tc>
+        <w:tc>
+          <w:tcPr>
+            <w:tcW w:w="0" w:type="auto"/>
+            <w:tcBorders>
+              <w:top w:val="single" w:sz="6" w:space="0" w:color="C4C7C5"/>
+              <w:left w:val="single" w:sz="6" w:space="0" w:color="C4C7C5"/>
+              <w:bottom w:val="single" w:sz="6" w:space="0" w:color="C4C7C5"/>
+              <w:right w:val="single" w:sz="6" w:space="0" w:color="C4C7C5"/>
+            </w:tcBorders>
+            <w:tcMar>
+              <w:top w:w="120" w:type="dxa"/>
+              <w:left w:w="180" w:type="dxa"/>
+              <w:bottom w:w="120" w:type="dxa"/>
+              <w:right w:w="180" w:type="dxa"/>
+            </w:tcMar>
+            <w:vAlign w:val="center"/>
+            <w:hideMark/>
+          </w:tcPr>
+          <w:p>
+            <w:r>
+              <w:t>Accepted</w:t>
+            </w:r>
+          </w:p>
+        </w:tc>
+      </w:tr>
+      <w:tr>
+        <w:trPr>
+          <w:tblCellSpacing w:w="15" w:type="dxa"/>
+        </w:trPr>
+        <w:tc>
+          <w:tcPr>
+            <w:tcW w:w="0" w:type="auto"/>
+            <w:tcBorders>
+              <w:top w:val="single" w:sz="6" w:space="0" w:color="C4C7C5"/>
+              <w:left w:val="single" w:sz="6" w:space="0" w:color="C4C7C5"/>
+              <w:bottom w:val="single" w:sz="6" w:space="0" w:color="C4C7C5"/>
+              <w:right w:val="single" w:sz="6" w:space="0" w:color="C4C7C5"/>
+            </w:tcBorders>
+            <w:tcMar>
+              <w:top w:w="120" w:type="dxa"/>
+              <w:left w:w="180" w:type="dxa"/>
+              <w:bottom w:w="120" w:type="dxa"/>
+              <w:right w:w="180" w:type="dxa"/>
+            </w:tcMar>
+            <w:vAlign w:val="center"/>
+            <w:hideMark/>
+          </w:tcPr>
+          <w:p>
+            <w:pPr>
+              <w:rPr>
+                <w:b/>
+                <w:bCs/>
+              </w:rPr>
+            </w:pPr>
+            <w:r>
+              <w:rPr>
+                <w:b/>
+                <w:bCs/>
+              </w:rPr>
+              <w:t>KI-002</w:t>
+            </w:r>
+          </w:p>
+        </w:tc>
+        <w:tc>
+          <w:tcPr>
+            <w:tcW w:w="0" w:type="auto"/>
+            <w:tcBorders>
+              <w:top w:val="single" w:sz="6" w:space="0" w:color="C4C7C5"/>
+              <w:left w:val="single" w:sz="6" w:space="0" w:color="C4C7C5"/>
+              <w:bottom w:val="single" w:sz="6" w:space="0" w:color="C4C7C5"/>
+              <w:right w:val="single" w:sz="6" w:space="0" w:color="C4C7C5"/>
+            </w:tcBorders>
+            <w:tcMar>
+              <w:top w:w="120" w:type="dxa"/>
+              <w:left w:w="180" w:type="dxa"/>
+              <w:bottom w:w="120" w:type="dxa"/>
+              <w:right w:w="180" w:type="dxa"/>
+            </w:tcMar>
+            <w:vAlign w:val="center"/>
+            <w:hideMark/>
+          </w:tcPr>
+          <w:p>
+            <w:r>
+              <w:t>Users don't understand why many keyboard keys exist.</w:t>
+            </w:r>
+          </w:p>
+        </w:tc>
+        <w:tc>
+          <w:tcPr>
+            <w:tcW w:w="0" w:type="auto"/>
+            <w:tcBorders>
+              <w:top w:val="single" w:sz="6" w:space="0" w:color="C4C7C5"/>
+              <w:left w:val="single" w:sz="6" w:space="0" w:color="C4C7C5"/>
+              <w:bottom w:val="single" w:sz="6" w:space="0" w:color="C4C7C5"/>
+              <w:right w:val="single" w:sz="6" w:space="0" w:color="C4C7C5"/>
+            </w:tcBorders>
+            <w:tcMar>
+              <w:top w:w="120" w:type="dxa"/>
+              <w:left w:w="180" w:type="dxa"/>
+              <w:bottom w:w="120" w:type="dxa"/>
+              <w:right w:w="180" w:type="dxa"/>
+            </w:tcMar>
+            <w:vAlign w:val="center"/>
+            <w:hideMark/>
+          </w:tcPr>
+          <w:p>
+            <w:r>
+              <w:t>Accepted</w:t>
+            </w:r>
+          </w:p>
+        </w:tc>
+      </w:tr>
+      <w:tr>
+        <w:trPr>
+          <w:tblCellSpacing w:w="15" w:type="dxa"/>
+        </w:trPr>
+        <w:tc>
+          <w:tcPr>
+            <w:tcW w:w="0" w:type="auto"/>
+            <w:tcBorders>
+              <w:top w:val="single" w:sz="6" w:space="0" w:color="C4C7C5"/>
+              <w:left w:val="single" w:sz="6" w:space="0" w:color="C4C7C5"/>
+              <w:bottom w:val="single" w:sz="6" w:space="0" w:color="C4C7C5"/>
+              <w:right w:val="single" w:sz="6" w:space="0" w:color="C4C7C5"/>
+            </w:tcBorders>
+            <w:tcMar>
+              <w:top w:w="120" w:type="dxa"/>
+              <w:left w:w="180" w:type="dxa"/>
+              <w:bottom w:w="120" w:type="dxa"/>
+              <w:right w:w="180" w:type="dxa"/>
+            </w:tcMar>
+            <w:vAlign w:val="center"/>
+            <w:hideMark/>
+          </w:tcPr>
+          <w:p>
+            <w:pPr>
+              <w:rPr>
+                <w:b/>
+                <w:bCs/>
+              </w:rPr>
+            </w:pPr>
+            <w:r>
+              <w:rPr>
+                <w:b/>
+                <w:bCs/>
+              </w:rPr>
+              <w:lastRenderedPageBreak/>
+              <w:t>KI-003</w:t>
+            </w:r>
+          </w:p>
+        </w:tc>
+        <w:tc>
+          <w:tcPr>
+            <w:tcW w:w="0" w:type="auto"/>
+            <w:tcBorders>
+              <w:top w:val="single" w:sz="6" w:space="0" w:color="C4C7C5"/>
+              <w:left w:val="single" w:sz="6" w:space="0" w:color="C4C7C5"/>
+              <w:bottom w:val="single" w:sz="6" w:space="0" w:color="C4C7C5"/>
+              <w:right w:val="single" w:sz="6" w:space="0" w:color="C4C7C5"/>
+            </w:tcBorders>
+            <w:tcMar>
+              <w:top w:w="120" w:type="dxa"/>
+              <w:left w:w="180" w:type="dxa"/>
+              <w:bottom w:w="120" w:type="dxa"/>
+              <w:right w:w="180" w:type="dxa"/>
+            </w:tcMar>
+            <w:vAlign w:val="center"/>
+            <w:hideMark/>
+          </w:tcPr>
+          <w:p>
+            <w:r>
+              <w:t>Users forget keyboard shortcuts.</w:t>
+            </w:r>
+          </w:p>
+        </w:tc>
+        <w:tc>
+          <w:tcPr>
+            <w:tcW w:w="0" w:type="auto"/>
+            <w:tcBorders>
+              <w:top w:val="single" w:sz="6" w:space="0" w:color="C4C7C5"/>
+              <w:left w:val="single" w:sz="6" w:space="0" w:color="C4C7C5"/>
+              <w:bottom w:val="single" w:sz="6" w:space="0" w:color="C4C7C5"/>
+              <w:right w:val="single" w:sz="6" w:space="0" w:color="C4C7C5"/>
+            </w:tcBorders>
+            <w:tcMar>
+              <w:top w:w="120" w:type="dxa"/>
+              <w:left w:w="180" w:type="dxa"/>
+              <w:bottom w:w="120" w:type="dxa"/>
+              <w:right w:w="180" w:type="dxa"/>
+            </w:tcMar>
+            <w:vAlign w:val="center"/>
+            <w:hideMark/>
+          </w:tcPr>
+          <w:p>
+            <w:r>
+              <w:t>Accepted</w:t>
+            </w:r>
+          </w:p>
+        </w:tc>
+      </w:tr>
+      <w:tr>
+        <w:trPr>
+          <w:tblCellSpacing w:w="15" w:type="dxa"/>
+        </w:trPr>
+        <w:tc>
+          <w:tcPr>
+            <w:tcW w:w="0" w:type="auto"/>
+            <w:tcBorders>
+              <w:top w:val="single" w:sz="6" w:space="0" w:color="C4C7C5"/>
+              <w:left w:val="single" w:sz="6" w:space="0" w:color="C4C7C5"/>
+              <w:bottom w:val="single" w:sz="6" w:space="0" w:color="C4C7C5"/>
+              <w:right w:val="single" w:sz="6" w:space="0" w:color="C4C7C5"/>
+            </w:tcBorders>
+            <w:tcMar>
+              <w:top w:w="120" w:type="dxa"/>
+              <w:left w:w="180" w:type="dxa"/>
+              <w:bottom w:w="120" w:type="dxa"/>
+              <w:right w:w="180" w:type="dxa"/>
+            </w:tcMar>
+            <w:vAlign w:val="center"/>
+            <w:hideMark/>
+          </w:tcPr>
+          <w:p>
+            <w:pPr>
+              <w:rPr>
+                <w:b/>
+                <w:bCs/>
+              </w:rPr>
+            </w:pPr>
+            <w:r>
+              <w:rPr>
+                <w:b/>
+                <w:bCs/>
+              </w:rPr>
+              <w:t>KI-004</w:t>
+            </w:r>
+          </w:p>
+        </w:tc>
+        <w:tc>
+          <w:tcPr>
+            <w:tcW w:w="0" w:type="auto"/>
+            <w:tcBorders>
+              <w:top w:val="single" w:sz="6" w:space="0" w:color="C4C7C5"/>
+              <w:left w:val="single" w:sz="6" w:space="0" w:color="C4C7C5"/>
+              <w:bottom w:val="single" w:sz="6" w:space="0" w:color="C4C7C5"/>
+              <w:right w:val="single" w:sz="6" w:space="0" w:color="C4C7C5"/>
+            </w:tcBorders>
+            <w:tcMar>
+              <w:top w:w="120" w:type="dxa"/>
+              <w:left w:w="180" w:type="dxa"/>
+              <w:bottom w:w="120" w:type="dxa"/>
+              <w:right w:w="180" w:type="dxa"/>
+            </w:tcMar>
+            <w:vAlign w:val="center"/>
+            <w:hideMark/>
+          </w:tcPr>
+          <w:p>
+            <w:r>
+              <w:t>Many people still struggle to locate keys while typing.</w:t>
+            </w:r>
+          </w:p>
+        </w:tc>
+        <w:tc>
+          <w:tcPr>
+            <w:tcW w:w="0" w:type="auto"/>
+            <w:tcBorders>
+              <w:top w:val="single" w:sz="6" w:space="0" w:color="C4C7C5"/>
+              <w:left w:val="single" w:sz="6" w:space="0" w:color="C4C7C5"/>
+              <w:bottom w:val="single" w:sz="6" w:space="0" w:color="C4C7C5"/>
+              <w:right w:val="single" w:sz="6" w:space="0" w:color="C4C7C5"/>
+            </w:tcBorders>
+            <w:tcMar>
+              <w:top w:w="120" w:type="dxa"/>
+              <w:left w:w="180" w:type="dxa"/>
+              <w:bottom w:w="120" w:type="dxa"/>
+              <w:right w:w="180" w:type="dxa"/>
+            </w:tcMar>
+            <w:vAlign w:val="center"/>
+            <w:hideMark/>
+          </w:tcPr>
+          <w:p>
+            <w:r>
+              <w:t>Accepted</w:t>
+            </w:r>
+          </w:p>
+        </w:tc>
+      </w:tr>
+      <w:tr>
+        <w:trPr>
+          <w:tblCellSpacing w:w="15" w:type="dxa"/>
+        </w:trPr>
+        <w:tc>
+          <w:tcPr>
+            <w:tcW w:w="0" w:type="auto"/>
+            <w:tcBorders>
+              <w:top w:val="single" w:sz="6" w:space="0" w:color="C4C7C5"/>
+              <w:left w:val="single" w:sz="6" w:space="0" w:color="C4C7C5"/>
+              <w:bottom w:val="single" w:sz="6" w:space="0" w:color="C4C7C5"/>
+              <w:right w:val="single" w:sz="6" w:space="0" w:color="C4C7C5"/>
+            </w:tcBorders>
+            <w:tcMar>
+              <w:top w:w="120" w:type="dxa"/>
+              <w:left w:w="180" w:type="dxa"/>
+              <w:bottom w:w="120" w:type="dxa"/>
+              <w:right w:w="180" w:type="dxa"/>
+            </w:tcMar>
+            <w:vAlign w:val="center"/>
+            <w:hideMark/>
+          </w:tcPr>
+          <w:p>
+            <w:pPr>
+              <w:rPr>
+                <w:b/>
+                <w:bCs/>
+              </w:rPr>
+            </w:pPr>
+            <w:r>
+              <w:rPr>
+                <w:b/>
+                <w:bCs/>
+              </w:rPr>
+              <w:t>KI-005</w:t>
+            </w:r>
+          </w:p>
+        </w:tc>
+        <w:tc>
+          <w:tcPr>
+            <w:tcW w:w="0" w:type="auto"/>
+            <w:tcBorders>
+              <w:top w:val="single" w:sz="6" w:space="0" w:color="C4C7C5"/>
+              <w:left w:val="single" w:sz="6" w:space="0" w:color="C4C7C5"/>
+              <w:bottom w:val="single" w:sz="6" w:space="0" w:color="C4C7C5"/>
+              <w:right w:val="single" w:sz="6" w:space="0" w:color="C4C7C5"/>
+            </w:tcBorders>
+            <w:tcMar>
+              <w:top w:w="120" w:type="dxa"/>
+              <w:left w:w="180" w:type="dxa"/>
+              <w:bottom w:w="120" w:type="dxa"/>
+              <w:right w:w="180" w:type="dxa"/>
+            </w:tcMar>
+            <w:vAlign w:val="center"/>
+            <w:hideMark/>
+          </w:tcPr>
+          <w:p>
+            <w:r>
+              <w:t>Spelling mistakes interrupt typing.</w:t>
+            </w:r>
+          </w:p>
+        </w:tc>
+        <w:tc>
+          <w:tcPr>
+            <w:tcW w:w="0" w:type="auto"/>
+            <w:tcBorders>
+              <w:top w:val="single" w:sz="6" w:space="0" w:color="C4C7C5"/>
+              <w:left w:val="single" w:sz="6" w:space="0" w:color="C4C7C5"/>
+              <w:bottom w:val="single" w:sz="6" w:space="0" w:color="C4C7C5"/>
+              <w:right w:val="single" w:sz="6" w:space="0" w:color="C4C7C5"/>
+            </w:tcBorders>
+            <w:tcMar>
+              <w:top w:w="120" w:type="dxa"/>
+              <w:left w:w="180" w:type="dxa"/>
+              <w:bottom w:w="120" w:type="dxa"/>
+              <w:right w:w="180" w:type="dxa"/>
+            </w:tcMar>
+            <w:vAlign w:val="center"/>
+            <w:hideMark/>
+          </w:tcPr>
+          <w:p>
+            <w:r>
+              <w:t>Accepted</w:t>
+            </w:r>
+          </w:p>
+        </w:tc>
+      </w:tr>
+      <w:tr>
+        <w:trPr>
+          <w:tblCellSpacing w:w="15" w:type="dxa"/>
+        </w:trPr>
+        <w:tc>
+          <w:tcPr>
+            <w:tcW w:w="0" w:type="auto"/>
+            <w:tcBorders>
+              <w:top w:val="single" w:sz="6" w:space="0" w:color="C4C7C5"/>
+              <w:left w:val="single" w:sz="6" w:space="0" w:color="C4C7C5"/>
+              <w:bottom w:val="single" w:sz="6" w:space="0" w:color="C4C7C5"/>
+              <w:right w:val="single" w:sz="6" w:space="0" w:color="C4C7C5"/>
+            </w:tcBorders>
+            <w:tcMar>
+              <w:top w:w="120" w:type="dxa"/>
+              <w:left w:w="180" w:type="dxa"/>
+              <w:bottom w:w="120" w:type="dxa"/>
+              <w:right w:w="180" w:type="dxa"/>
+            </w:tcMar>
+            <w:vAlign w:val="center"/>
+            <w:hideMark/>
+          </w:tcPr>
+          <w:p>
+            <w:pPr>
+              <w:rPr>
+                <w:b/>
+                <w:bCs/>
+              </w:rPr>
+            </w:pPr>
+            <w:r>
+              <w:rPr>
+                <w:b/>
+                <w:bCs/>
+              </w:rPr>
+              <w:t>KI-006</w:t>
+            </w:r>
+          </w:p>
+        </w:tc>
+        <w:tc>
+          <w:tcPr>
+            <w:tcW w:w="0" w:type="auto"/>
+            <w:tcBorders>
+              <w:top w:val="single" w:sz="6" w:space="0" w:color="C4C7C5"/>
+              <w:left w:val="single" w:sz="6" w:space="0" w:color="C4C7C5"/>
+              <w:bottom w:val="single" w:sz="6" w:space="0" w:color="C4C7C5"/>
+              <w:right w:val="single" w:sz="6" w:space="0" w:color="C4C7C5"/>
+            </w:tcBorders>
+            <w:tcMar>
+              <w:top w:w="120" w:type="dxa"/>
+              <w:left w:w="180" w:type="dxa"/>
+              <w:bottom w:w="120" w:type="dxa"/>
+              <w:right w:w="180" w:type="dxa"/>
+            </w:tcMar>
+            <w:vAlign w:val="center"/>
+            <w:hideMark/>
+          </w:tcPr>
+          <w:p>
+            <w:r>
+              <w:t>Users know the keyboard layout but struggle to quickly locate special symbols and punctuation keys.</w:t>
+            </w:r>
+          </w:p>
+        </w:tc>
+        <w:tc>
+          <w:tcPr>
+            <w:tcW w:w="0" w:type="auto"/>
+            <w:tcBorders>
+              <w:top w:val="single" w:sz="6" w:space="0" w:color="C4C7C5"/>
+              <w:left w:val="single" w:sz="6" w:space="0" w:color="C4C7C5"/>
+              <w:bottom w:val="single" w:sz="6" w:space="0" w:color="C4C7C5"/>
+              <w:right w:val="single" w:sz="6" w:space="0" w:color="C4C7C5"/>
+            </w:tcBorders>
+            <w:tcMar>
+              <w:top w:w="120" w:type="dxa"/>
+              <w:left w:w="180" w:type="dxa"/>
+              <w:bottom w:w="120" w:type="dxa"/>
+              <w:right w:w="180" w:type="dxa"/>
+            </w:tcMar>
+            <w:vAlign w:val="center"/>
+            <w:hideMark/>
+          </w:tcPr>
+          <w:p>
+            <w:r>
+              <w:t>Accepted</w:t>
+            </w:r>
+          </w:p>
+        </w:tc>
+      </w:tr>
+      <w:tr>
+        <w:trPr>
+          <w:tblCellSpacing w:w="15" w:type="dxa"/>
+        </w:trPr>
+        <w:tc>
+          <w:tcPr>
+            <w:tcW w:w="0" w:type="auto"/>
+            <w:tcBorders>
+              <w:top w:val="single" w:sz="6" w:space="0" w:color="C4C7C5"/>
+              <w:left w:val="single" w:sz="6" w:space="0" w:color="C4C7C5"/>
+              <w:bottom w:val="single" w:sz="6" w:space="0" w:color="C4C7C5"/>
+              <w:right w:val="single" w:sz="6" w:space="0" w:color="C4C7C5"/>
+            </w:tcBorders>
+            <w:tcMar>
+              <w:top w:w="120" w:type="dxa"/>
+              <w:left w:w="180" w:type="dxa"/>
+              <w:bottom w:w="120" w:type="dxa"/>
+              <w:right w:w="180" w:type="dxa"/>
+            </w:tcMar>
+            <w:vAlign w:val="center"/>
+            <w:hideMark/>
+          </w:tcPr>
+          <w:p>
+            <w:pPr>
+              <w:rPr>
+                <w:b/>
+                <w:bCs/>
+              </w:rPr>
+            </w:pPr>
+            <w:r>
+              <w:rPr>
+                <w:b/>
+                <w:bCs/>
+              </w:rPr>
+              <w:t>KI-007</w:t>
+            </w:r>
+          </w:p>
+        </w:tc>
+        <w:tc>
+          <w:tcPr>
+            <w:tcW w:w="0" w:type="auto"/>
+            <w:tcBorders>
+              <w:top w:val="single" w:sz="6" w:space="0" w:color="C4C7C5"/>
+              <w:left w:val="single" w:sz="6" w:space="0" w:color="C4C7C5"/>
+              <w:bottom w:val="single" w:sz="6" w:space="0" w:color="C4C7C5"/>
+              <w:right w:val="single" w:sz="6" w:space="0" w:color="C4C7C5"/>
+            </w:tcBorders>
+            <w:tcMar>
+              <w:top w:w="120" w:type="dxa"/>
+              <w:left w:w="180" w:type="dxa"/>
+              <w:bottom w:w="120" w:type="dxa"/>
+              <w:right w:w="180" w:type="dxa"/>
+            </w:tcMar>
+            <w:vAlign w:val="center"/>
+            <w:hideMark/>
+          </w:tcPr>
+          <w:p>
+            <w:r>
+              <w:t>Users struggle to remember keyboard shortcuts that are rarely used.</w:t>
+            </w:r>
+          </w:p>
+        </w:tc>
+        <w:tc>
+          <w:tcPr>
+            <w:tcW w:w="0" w:type="auto"/>
+            <w:tcBorders>
+              <w:top w:val="single" w:sz="6" w:space="0" w:color="C4C7C5"/>
+              <w:left w:val="single" w:sz="6" w:space="0" w:color="C4C7C5"/>
+              <w:bottom w:val="single" w:sz="6" w:space="0" w:color="C4C7C5"/>
+              <w:right w:val="single" w:sz="6" w:space="0" w:color="C4C7C5"/>
+            </w:tcBorders>
+            <w:tcMar>
+              <w:top w:w="120" w:type="dxa"/>
+              <w:left w:w="180" w:type="dxa"/>
+              <w:bottom w:w="120" w:type="dxa"/>
+              <w:right w:w="180" w:type="dxa"/>
+            </w:tcMar>
+            <w:vAlign w:val="center"/>
+            <w:hideMark/>
+          </w:tcPr>
+          <w:p>
+            <w:r>
+              <w:t>Accepted</w:t>
+            </w:r>
+          </w:p>
+        </w:tc>
+      </w:tr>
+      <w:tr>
+        <w:trPr>
+          <w:tblCellSpacing w:w="15" w:type="dxa"/>
+        </w:trPr>
+        <w:tc>
+          <w:tcPr>
+            <w:tcW w:w="0" w:type="auto"/>
+            <w:tcBorders>
+              <w:top w:val="single" w:sz="6" w:space="0" w:color="C4C7C5"/>
+              <w:left w:val="single" w:sz="6" w:space="0" w:color="C4C7C5"/>
+              <w:bottom w:val="single" w:sz="6" w:space="0" w:color="C4C7C5"/>
+              <w:right w:val="single" w:sz="6" w:space="0" w:color="C4C7C5"/>
+            </w:tcBorders>
+            <w:tcMar>
+              <w:top w:w="120" w:type="dxa"/>
+              <w:left w:w="180" w:type="dxa"/>
+              <w:bottom w:w="120" w:type="dxa"/>
+              <w:right w:w="180" w:type="dxa"/>
+            </w:tcMar>
+            <w:vAlign w:val="center"/>
+            <w:hideMark/>
+          </w:tcPr>
+          <w:p>
+            <w:pPr>
+              <w:rPr>
+                <w:b/>
+                <w:bCs/>
+              </w:rPr>
+            </w:pPr>
+            <w:r>
+              <w:rPr>
+                <w:b/>
+                <w:bCs/>
+              </w:rPr>
+              <w:t>KI-008</w:t>
+            </w:r>
+          </w:p>
+        </w:tc>
+        <w:tc>
+          <w:tcPr>
+            <w:tcW w:w="0" w:type="auto"/>
+            <w:tcBorders>
+              <w:top w:val="single" w:sz="6" w:space="0" w:color="C4C7C5"/>
+              <w:left w:val="single" w:sz="6" w:space="0" w:color="C4C7C5"/>
+              <w:bottom w:val="single" w:sz="6" w:space="0" w:color="C4C7C5"/>
+              <w:right w:val="single" w:sz="6" w:space="0" w:color="C4C7C5"/>
+            </w:tcBorders>
+            <w:tcMar>
+              <w:top w:w="120" w:type="dxa"/>
+              <w:left w:w="180" w:type="dxa"/>
+              <w:bottom w:w="120" w:type="dxa"/>
+              <w:right w:w="180" w:type="dxa"/>
+            </w:tcMar>
+            <w:vAlign w:val="center"/>
+            <w:hideMark/>
+          </w:tcPr>
+          <w:p>
+            <w:r>
+              <w:t>Users repeatedly switch between the keyboard and mouse because they do not know the keyboard alternative.</w:t>
+            </w:r>
+          </w:p>
+        </w:tc>
+        <w:tc>
+          <w:tcPr>
+            <w:tcW w:w="0" w:type="auto"/>
+            <w:tcBorders>
+              <w:top w:val="single" w:sz="6" w:space="0" w:color="C4C7C5"/>
+              <w:left w:val="single" w:sz="6" w:space="0" w:color="C4C7C5"/>
+              <w:bottom w:val="single" w:sz="6" w:space="0" w:color="C4C7C5"/>
+              <w:right w:val="single" w:sz="6" w:space="0" w:color="C4C7C5"/>
+            </w:tcBorders>
+            <w:tcMar>
+              <w:top w:w="120" w:type="dxa"/>
+              <w:left w:w="180" w:type="dxa"/>
+              <w:bottom w:w="120" w:type="dxa"/>
+              <w:right w:w="180" w:type="dxa"/>
+            </w:tcMar>
+            <w:vAlign w:val="center"/>
+            <w:hideMark/>
+          </w:tcPr>
+          <w:p>
+            <w:r>
+              <w:t>Accepted</w:t>
+            </w:r>
+          </w:p>
+        </w:tc>
+      </w:tr>
+      <w:tr>
+        <w:trPr>
+          <w:tblCellSpacing w:w="15" w:type="dxa"/>
+        </w:trPr>
+        <w:tc>
+          <w:tcPr>
+            <w:tcW w:w="0" w:type="auto"/>
+            <w:tcBorders>
+              <w:top w:val="single" w:sz="6" w:space="0" w:color="C4C7C5"/>
+              <w:left w:val="single" w:sz="6" w:space="0" w:color="C4C7C5"/>
+              <w:bottom w:val="single" w:sz="6" w:space="0" w:color="C4C7C5"/>
+              <w:right w:val="single" w:sz="6" w:space="0" w:color="C4C7C5"/>
+            </w:tcBorders>
+            <w:tcMar>
+              <w:top w:w="120" w:type="dxa"/>
+              <w:left w:w="180" w:type="dxa"/>
+              <w:bottom w:w="120" w:type="dxa"/>
+              <w:right w:w="180" w:type="dxa"/>
+            </w:tcMar>
+            <w:vAlign w:val="center"/>
+            <w:hideMark/>
+          </w:tcPr>
+          <w:p>
+            <w:pPr>
+              <w:rPr>
+                <w:b/>
+                <w:bCs/>
+              </w:rPr>
+            </w:pPr>
+            <w:r>
+              <w:rPr>
+                <w:b/>
+                <w:bCs/>
+              </w:rPr>
+              <w:t>KI-009</w:t>
+            </w:r>
+          </w:p>
+        </w:tc>
+        <w:tc>
+          <w:tcPr>
+            <w:tcW w:w="0" w:type="auto"/>
+            <w:tcBorders>
+              <w:top w:val="single" w:sz="6" w:space="0" w:color="C4C7C5"/>
+              <w:left w:val="single" w:sz="6" w:space="0" w:color="C4C7C5"/>
+              <w:bottom w:val="single" w:sz="6" w:space="0" w:color="C4C7C5"/>
+              <w:right w:val="single" w:sz="6" w:space="0" w:color="C4C7C5"/>
+            </w:tcBorders>
+            <w:tcMar>
+              <w:top w:w="120" w:type="dxa"/>
+              <w:left w:w="180" w:type="dxa"/>
+              <w:bottom w:w="120" w:type="dxa"/>
+              <w:right w:w="180" w:type="dxa"/>
+            </w:tcMar>
+            <w:vAlign w:val="center"/>
+            <w:hideMark/>
+          </w:tcPr>
+          <w:p>
+            <w:r>
+              <w:t>Users accidentally press incorrect keys while typing quickly.</w:t>
+            </w:r>
+          </w:p>
+        </w:tc>
+        <w:tc>
+          <w:tcPr>
+            <w:tcW w:w="0" w:type="auto"/>
+            <w:tcBorders>
+              <w:top w:val="single" w:sz="6" w:space="0" w:color="C4C7C5"/>
+              <w:left w:val="single" w:sz="6" w:space="0" w:color="C4C7C5"/>
+              <w:bottom w:val="single" w:sz="6" w:space="0" w:color="C4C7C5"/>
+              <w:right w:val="single" w:sz="6" w:space="0" w:color="C4C7C5"/>
+            </w:tcBorders>
+            <w:tcMar>
+              <w:top w:w="120" w:type="dxa"/>
+              <w:left w:w="180" w:type="dxa"/>
+              <w:bottom w:w="120" w:type="dxa"/>
+              <w:right w:w="180" w:type="dxa"/>
+            </w:tcMar>
+            <w:vAlign w:val="center"/>
+            <w:hideMark/>
+          </w:tcPr>
+          <w:p>
+            <w:r>
+              <w:t>Accepted</w:t>
+            </w:r>
+          </w:p>
+        </w:tc>
+      </w:tr>
+      <w:tr>
+        <w:trPr>
+          <w:tblCellSpacing w:w="15" w:type="dxa"/>
+        </w:trPr>
+        <w:tc>
+          <w:tcPr>
+            <w:tcW w:w="0" w:type="auto"/>
+            <w:tcBorders>
+              <w:top w:val="single" w:sz="6" w:space="0" w:color="C4C7C5"/>
+              <w:left w:val="single" w:sz="6" w:space="0" w:color="C4C7C5"/>
+              <w:bottom w:val="single" w:sz="6" w:space="0" w:color="C4C7C5"/>
+              <w:right w:val="single" w:sz="6" w:space="0" w:color="C4C7C5"/>
+            </w:tcBorders>
+            <w:tcMar>
+              <w:top w:w="120" w:type="dxa"/>
+              <w:left w:w="180" w:type="dxa"/>
+              <w:bottom w:w="120" w:type="dxa"/>
+              <w:right w:w="180" w:type="dxa"/>
+            </w:tcMar>
+            <w:vAlign w:val="center"/>
+            <w:hideMark/>
+          </w:tcPr>
+          <w:p>
+            <w:pPr>
+              <w:rPr>
+                <w:b/>
+                <w:bCs/>
+              </w:rPr>
+            </w:pPr>
+            <w:r>
+              <w:rPr>
+                <w:b/>
+                <w:bCs/>
+              </w:rPr>
+              <w:t>KI-010</w:t>
+            </w:r>
+          </w:p>
+        </w:tc>
+        <w:tc>
+          <w:tcPr>
+            <w:tcW w:w="0" w:type="auto"/>
+            <w:tcBorders>
+              <w:top w:val="single" w:sz="6" w:space="0" w:color="C4C7C5"/>
+              <w:left w:val="single" w:sz="6" w:space="0" w:color="C4C7C5"/>
+              <w:bottom w:val="single" w:sz="6" w:space="0" w:color="C4C7C5"/>
+              <w:right w:val="single" w:sz="6" w:space="0" w:color="C4C7C5"/>
+            </w:tcBorders>
+            <w:tcMar>
+              <w:top w:w="120" w:type="dxa"/>
+              <w:left w:w="180" w:type="dxa"/>
+              <w:bottom w:w="120" w:type="dxa"/>
+              <w:right w:w="180" w:type="dxa"/>
+            </w:tcMar>
+            <w:vAlign w:val="center"/>
+            <w:hideMark/>
+          </w:tcPr>
+          <w:p>
+            <w:r>
+              <w:t>Users struggle to recover after accidentally triggering an unknown keyboard shortcut.</w:t>
+            </w:r>
+          </w:p>
+        </w:tc>
+        <w:tc>
+          <w:tcPr>
+            <w:tcW w:w="0" w:type="auto"/>
+            <w:tcBorders>
+              <w:top w:val="single" w:sz="6" w:space="0" w:color="C4C7C5"/>
+              <w:left w:val="single" w:sz="6" w:space="0" w:color="C4C7C5"/>
+              <w:bottom w:val="single" w:sz="6" w:space="0" w:color="C4C7C5"/>
+              <w:right w:val="single" w:sz="6" w:space="0" w:color="C4C7C5"/>
+            </w:tcBorders>
+            <w:tcMar>
+              <w:top w:w="120" w:type="dxa"/>
+              <w:left w:w="180" w:type="dxa"/>
+              <w:bottom w:w="120" w:type="dxa"/>
+              <w:right w:w="180" w:type="dxa"/>
+            </w:tcMar>
+            <w:vAlign w:val="center"/>
+            <w:hideMark/>
+          </w:tcPr>
+          <w:p>
+            <w:r>
+              <w:t>Accepted</w:t>
+            </w:r>
+          </w:p>
+        </w:tc>
+      </w:tr>
+      <w:tr>
+        <w:trPr>
+          <w:tblCellSpacing w:w="15" w:type="dxa"/>
+        </w:trPr>
+        <w:tc>
+          <w:tcPr>
+            <w:tcW w:w="0" w:type="auto"/>
+            <w:tcBorders>
+              <w:top w:val="single" w:sz="6" w:space="0" w:color="C4C7C5"/>
+              <w:left w:val="single" w:sz="6" w:space="0" w:color="C4C7C5"/>
+              <w:bottom w:val="single" w:sz="6" w:space="0" w:color="C4C7C5"/>
+              <w:right w:val="single" w:sz="6" w:space="0" w:color="C4C7C5"/>
+            </w:tcBorders>
+            <w:tcMar>
+              <w:top w:w="120" w:type="dxa"/>
+              <w:left w:w="180" w:type="dxa"/>
+              <w:bottom w:w="120" w:type="dxa"/>
+              <w:right w:w="180" w:type="dxa"/>
+            </w:tcMar>
+            <w:vAlign w:val="center"/>
+            <w:hideMark/>
+          </w:tcPr>
+          <w:p>
+            <w:pPr>
+              <w:rPr>
+                <w:b/>
+                <w:bCs/>
+              </w:rPr>
+            </w:pPr>
+            <w:r>
+              <w:rPr>
+                <w:b/>
+                <w:bCs/>
+              </w:rPr>
+              <w:t>KI-011</w:t>
+            </w:r>
+          </w:p>
+        </w:tc>
+        <w:tc>
+          <w:tcPr>
+            <w:tcW w:w="0" w:type="auto"/>
+            <w:tcBorders>
+              <w:top w:val="single" w:sz="6" w:space="0" w:color="C4C7C5"/>
+              <w:left w:val="single" w:sz="6" w:space="0" w:color="C4C7C5"/>
+              <w:bottom w:val="single" w:sz="6" w:space="0" w:color="C4C7C5"/>
+              <w:right w:val="single" w:sz="6" w:space="0" w:color="C4C7C5"/>
+            </w:tcBorders>
+            <w:tcMar>
+              <w:top w:w="120" w:type="dxa"/>
+              <w:left w:w="180" w:type="dxa"/>
+              <w:bottom w:w="120" w:type="dxa"/>
+              <w:right w:w="180" w:type="dxa"/>
+            </w:tcMar>
+            <w:vAlign w:val="center"/>
+            <w:hideMark/>
+          </w:tcPr>
+          <w:p>
+            <w:r>
+              <w:t>Users struggle to understand the purpose of modifier keys such as Ctrl, Alt, Shift, and Fn.</w:t>
+            </w:r>
+          </w:p>
+        </w:tc>
+        <w:tc>
+          <w:tcPr>
+            <w:tcW w:w="0" w:type="auto"/>
+            <w:tcBorders>
+              <w:top w:val="single" w:sz="6" w:space="0" w:color="C4C7C5"/>
+              <w:left w:val="single" w:sz="6" w:space="0" w:color="C4C7C5"/>
+              <w:bottom w:val="single" w:sz="6" w:space="0" w:color="C4C7C5"/>
+              <w:right w:val="single" w:sz="6" w:space="0" w:color="C4C7C5"/>
+            </w:tcBorders>
+            <w:tcMar>
+              <w:top w:w="120" w:type="dxa"/>
+              <w:left w:w="180" w:type="dxa"/>
+              <w:bottom w:w="120" w:type="dxa"/>
+              <w:right w:w="180" w:type="dxa"/>
+            </w:tcMar>
+            <w:vAlign w:val="center"/>
+            <w:hideMark/>
+          </w:tcPr>
+          <w:p>
+            <w:r>
+              <w:t>Accepted</w:t>
+            </w:r>
+          </w:p>
+        </w:tc>
+      </w:tr>
+      <w:tr>
+        <w:trPr>
+          <w:tblCellSpacing w:w="15" w:type="dxa"/>
+        </w:trPr>
+        <w:tc>
+          <w:tcPr>
+            <w:tcW w:w="0" w:type="auto"/>
+            <w:tcBorders>
+              <w:top w:val="single" w:sz="6" w:space="0" w:color="C4C7C5"/>
+              <w:left w:val="single" w:sz="6" w:space="0" w:color="C4C7C5"/>
+              <w:bottom w:val="single" w:sz="6" w:space="0" w:color="C4C7C5"/>
+              <w:right w:val="single" w:sz="6" w:space="0" w:color="C4C7C5"/>
+            </w:tcBorders>
+            <w:tcMar>
+              <w:top w:w="120" w:type="dxa"/>
+              <w:left w:w="180" w:type="dxa"/>
+              <w:bottom w:w="120" w:type="dxa"/>
+              <w:right w:w="180" w:type="dxa"/>
+            </w:tcMar>
+            <w:vAlign w:val="center"/>
+            <w:hideMark/>
+          </w:tcPr>
+          <w:p>
+            <w:pPr>
+              <w:rPr>
+                <w:b/>
+                <w:bCs/>
+              </w:rPr>
+            </w:pPr>
+            <w:r>
+              <w:rPr>
+                <w:b/>
+                <w:bCs/>
+              </w:rPr>
+              <w:t>KI-012</w:t>
+            </w:r>
+          </w:p>
+        </w:tc>
+        <w:tc>
+          <w:tcPr>
+            <w:tcW w:w="0" w:type="auto"/>
+            <w:tcBorders>
+              <w:top w:val="single" w:sz="6" w:space="0" w:color="C4C7C5"/>
+              <w:left w:val="single" w:sz="6" w:space="0" w:color="C4C7C5"/>
+              <w:bottom w:val="single" w:sz="6" w:space="0" w:color="C4C7C5"/>
+              <w:right w:val="single" w:sz="6" w:space="0" w:color="C4C7C5"/>
+            </w:tcBorders>
+            <w:tcMar>
+              <w:top w:w="120" w:type="dxa"/>
+              <w:left w:w="180" w:type="dxa"/>
+              <w:bottom w:w="120" w:type="dxa"/>
+              <w:right w:w="180" w:type="dxa"/>
+            </w:tcMar>
+            <w:vAlign w:val="center"/>
+            <w:hideMark/>
+          </w:tcPr>
+          <w:p>
+            <w:r>
+              <w:t>Users struggle to coordinate multiple key combinations simultaneously.</w:t>
+            </w:r>
+          </w:p>
+        </w:tc>
+        <w:tc>
+          <w:tcPr>
+            <w:tcW w:w="0" w:type="auto"/>
+            <w:tcBorders>
+              <w:top w:val="single" w:sz="6" w:space="0" w:color="C4C7C5"/>
+              <w:left w:val="single" w:sz="6" w:space="0" w:color="C4C7C5"/>
+              <w:bottom w:val="single" w:sz="6" w:space="0" w:color="C4C7C5"/>
+              <w:right w:val="single" w:sz="6" w:space="0" w:color="C4C7C5"/>
+            </w:tcBorders>
+            <w:tcMar>
+              <w:top w:w="120" w:type="dxa"/>
+              <w:left w:w="180" w:type="dxa"/>
+              <w:bottom w:w="120" w:type="dxa"/>
+              <w:right w:w="180" w:type="dxa"/>
+            </w:tcMar>
+            <w:vAlign w:val="center"/>
+            <w:hideMark/>
+          </w:tcPr>
+          <w:p>
+            <w:r>
+              <w:t>Accepted</w:t>
+            </w:r>
+          </w:p>
+        </w:tc>
+      </w:tr>
+      <w:tr>
+        <w:trPr>
+          <w:tblCellSpacing w:w="15" w:type="dxa"/>
+        </w:trPr>
+        <w:tc>
+          <w:tcPr>
+            <w:tcW w:w="0" w:type="auto"/>
+            <w:tcBorders>
+              <w:top w:val="single" w:sz="6" w:space="0" w:color="C4C7C5"/>
+              <w:left w:val="single" w:sz="6" w:space="0" w:color="C4C7C5"/>
+              <w:bottom w:val="single" w:sz="6" w:space="0" w:color="C4C7C5"/>
+              <w:right w:val="single" w:sz="6" w:space="0" w:color="C4C7C5"/>
+            </w:tcBorders>
+            <w:tcMar>
+              <w:top w:w="120" w:type="dxa"/>
+              <w:left w:w="180" w:type="dxa"/>
+              <w:bottom w:w="120" w:type="dxa"/>
+              <w:right w:w="180" w:type="dxa"/>
+            </w:tcMar>
+            <w:vAlign w:val="center"/>
+            <w:hideMark/>
+          </w:tcPr>
+          <w:p>
+            <w:pPr>
+              <w:rPr>
+                <w:b/>
+                <w:bCs/>
+              </w:rPr>
+            </w:pPr>
+            <w:r>
+              <w:rPr>
+                <w:b/>
+                <w:bCs/>
+              </w:rPr>
+              <w:t>KI-013</w:t>
+            </w:r>
+          </w:p>
+        </w:tc>
+        <w:tc>
+          <w:tcPr>
+            <w:tcW w:w="0" w:type="auto"/>
+            <w:tcBorders>
+              <w:top w:val="single" w:sz="6" w:space="0" w:color="C4C7C5"/>
+              <w:left w:val="single" w:sz="6" w:space="0" w:color="C4C7C5"/>
+              <w:bottom w:val="single" w:sz="6" w:space="0" w:color="C4C7C5"/>
+              <w:right w:val="single" w:sz="6" w:space="0" w:color="C4C7C5"/>
+            </w:tcBorders>
+            <w:tcMar>
+              <w:top w:w="120" w:type="dxa"/>
+              <w:left w:w="180" w:type="dxa"/>
+              <w:bottom w:w="120" w:type="dxa"/>
+              <w:right w:w="180" w:type="dxa"/>
+            </w:tcMar>
+            <w:vAlign w:val="center"/>
+            <w:hideMark/>
+          </w:tcPr>
+          <w:p>
+            <w:r>
+              <w:t>Users struggle to type efficiently while looking away from the keyboard.</w:t>
+            </w:r>
+          </w:p>
+        </w:tc>
+        <w:tc>
+          <w:tcPr>
+            <w:tcW w:w="0" w:type="auto"/>
+            <w:tcBorders>
+              <w:top w:val="single" w:sz="6" w:space="0" w:color="C4C7C5"/>
+              <w:left w:val="single" w:sz="6" w:space="0" w:color="C4C7C5"/>
+              <w:bottom w:val="single" w:sz="6" w:space="0" w:color="C4C7C5"/>
+              <w:right w:val="single" w:sz="6" w:space="0" w:color="C4C7C5"/>
+            </w:tcBorders>
+            <w:tcMar>
+              <w:top w:w="120" w:type="dxa"/>
+              <w:left w:w="180" w:type="dxa"/>
+              <w:bottom w:w="120" w:type="dxa"/>
+              <w:right w:w="180" w:type="dxa"/>
+            </w:tcMar>
+            <w:vAlign w:val="center"/>
+            <w:hideMark/>
+          </w:tcPr>
+          <w:p>
+            <w:r>
+              <w:t>Accepted</w:t>
+            </w:r>
+          </w:p>
+        </w:tc>
+      </w:tr>
+      <w:tr>
+        <w:trPr>
+          <w:tblCellSpacing w:w="15" w:type="dxa"/>
+        </w:trPr>
+        <w:tc>
+          <w:tcPr>
+            <w:tcW w:w="0" w:type="auto"/>
+            <w:tcBorders>
+              <w:top w:val="single" w:sz="6" w:space="0" w:color="C4C7C5"/>
+              <w:left w:val="single" w:sz="6" w:space="0" w:color="C4C7C5"/>
+              <w:bottom w:val="single" w:sz="6" w:space="0" w:color="C4C7C5"/>
+              <w:right w:val="single" w:sz="6" w:space="0" w:color="C4C7C5"/>
+            </w:tcBorders>
+            <w:tcMar>
+              <w:top w:w="120" w:type="dxa"/>
+              <w:left w:w="180" w:type="dxa"/>
+              <w:bottom w:w="120" w:type="dxa"/>
+              <w:right w:w="180" w:type="dxa"/>
+            </w:tcMar>
+            <w:vAlign w:val="center"/>
+            <w:hideMark/>
+          </w:tcPr>
+          <w:p>
+            <w:pPr>
+              <w:rPr>
+                <w:b/>
+                <w:bCs/>
+              </w:rPr>
+            </w:pPr>
+            <w:r>
+              <w:rPr>
+                <w:b/>
+                <w:bCs/>
+              </w:rPr>
+              <w:lastRenderedPageBreak/>
+              <w:t>KI-014</w:t>
+            </w:r>
+          </w:p>
+        </w:tc>
+        <w:tc>
+          <w:tcPr>
+            <w:tcW w:w="0" w:type="auto"/>
+            <w:tcBorders>
+              <w:top w:val="single" w:sz="6" w:space="0" w:color="C4C7C5"/>
+              <w:left w:val="single" w:sz="6" w:space="0" w:color="C4C7C5"/>
+              <w:bottom w:val="single" w:sz="6" w:space="0" w:color="C4C7C5"/>
+              <w:right w:val="single" w:sz="6" w:space="0" w:color="C4C7C5"/>
+            </w:tcBorders>
+            <w:tcMar>
+              <w:top w:w="120" w:type="dxa"/>
+              <w:left w:w="180" w:type="dxa"/>
+              <w:bottom w:w="120" w:type="dxa"/>
+              <w:right w:w="180" w:type="dxa"/>
+            </w:tcMar>
+            <w:vAlign w:val="center"/>
+            <w:hideMark/>
+          </w:tcPr>
+          <w:p>
+            <w:r>
+              <w:t>Users frequently interrupt typing to correct formatting mistakes.</w:t>
+            </w:r>
+          </w:p>
+        </w:tc>
+        <w:tc>
+          <w:tcPr>
+            <w:tcW w:w="0" w:type="auto"/>
+            <w:tcBorders>
+              <w:top w:val="single" w:sz="6" w:space="0" w:color="C4C7C5"/>
+              <w:left w:val="single" w:sz="6" w:space="0" w:color="C4C7C5"/>
+              <w:bottom w:val="single" w:sz="6" w:space="0" w:color="C4C7C5"/>
+              <w:right w:val="single" w:sz="6" w:space="0" w:color="C4C7C5"/>
+            </w:tcBorders>
+            <w:tcMar>
+              <w:top w:w="120" w:type="dxa"/>
+              <w:left w:w="180" w:type="dxa"/>
+              <w:bottom w:w="120" w:type="dxa"/>
+              <w:right w:w="180" w:type="dxa"/>
+            </w:tcMar>
+            <w:vAlign w:val="center"/>
+            <w:hideMark/>
+          </w:tcPr>
+          <w:p>
+            <w:r>
+              <w:t>Accepted</w:t>
+            </w:r>
+          </w:p>
+        </w:tc>
+      </w:tr>
+      <w:tr>
+        <w:trPr>
+          <w:tblCellSpacing w:w="15" w:type="dxa"/>
+        </w:trPr>
+        <w:tc>
+          <w:tcPr>
+            <w:tcW w:w="0" w:type="auto"/>
+            <w:tcBorders>
+              <w:top w:val="single" w:sz="6" w:space="0" w:color="C4C7C5"/>
+              <w:left w:val="single" w:sz="6" w:space="0" w:color="C4C7C5"/>
+              <w:bottom w:val="single" w:sz="6" w:space="0" w:color="C4C7C5"/>
+              <w:right w:val="single" w:sz="6" w:space="0" w:color="C4C7C5"/>
+            </w:tcBorders>
+            <w:tcMar>
+              <w:top w:w="120" w:type="dxa"/>
+              <w:left w:w="180" w:type="dxa"/>
+              <w:bottom w:w="120" w:type="dxa"/>
+              <w:right w:w="180" w:type="dxa"/>
+            </w:tcMar>
+            <w:vAlign w:val="center"/>
+            <w:hideMark/>
+          </w:tcPr>
+          <w:p>
+            <w:pPr>
+              <w:rPr>
+                <w:b/>
+                <w:bCs/>
+              </w:rPr>
+            </w:pPr>
+            <w:r>
+              <w:rPr>
+                <w:b/>
+                <w:bCs/>
+              </w:rPr>
+              <w:t>KI-015</w:t>
+            </w:r>
+          </w:p>
+        </w:tc>
+        <w:tc>
+          <w:tcPr>
+            <w:tcW w:w="0" w:type="auto"/>
+            <w:tcBorders>
+              <w:top w:val="single" w:sz="6" w:space="0" w:color="C4C7C5"/>
+              <w:left w:val="single" w:sz="6" w:space="0" w:color="C4C7C5"/>
+              <w:bottom w:val="single" w:sz="6" w:space="0" w:color="C4C7C5"/>
+              <w:right w:val="single" w:sz="6" w:space="0" w:color="C4C7C5"/>
+            </w:tcBorders>
+            <w:tcMar>
+              <w:top w:w="120" w:type="dxa"/>
+              <w:left w:w="180" w:type="dxa"/>
+              <w:bottom w:w="120" w:type="dxa"/>
+              <w:right w:w="180" w:type="dxa"/>
+            </w:tcMar>
+            <w:vAlign w:val="center"/>
+            <w:hideMark/>
+          </w:tcPr>
+          <w:p>
+            <w:r>
+              <w:t>Users struggle to remember application-specific keyboard shortcuts because they differ across software.</w:t>
+            </w:r>
+          </w:p>
+        </w:tc>
+        <w:tc>
+          <w:tcPr>
+            <w:tcW w:w="0" w:type="auto"/>
+            <w:tcBorders>
+              <w:top w:val="single" w:sz="6" w:space="0" w:color="C4C7C5"/>
+              <w:left w:val="single" w:sz="6" w:space="0" w:color="C4C7C5"/>
+              <w:bottom w:val="single" w:sz="6" w:space="0" w:color="C4C7C5"/>
+              <w:right w:val="single" w:sz="6" w:space="0" w:color="C4C7C5"/>
+            </w:tcBorders>
+            <w:tcMar>
+              <w:top w:w="120" w:type="dxa"/>
+              <w:left w:w="180" w:type="dxa"/>
+              <w:bottom w:w="120" w:type="dxa"/>
+              <w:right w:w="180" w:type="dxa"/>
+            </w:tcMar>
+            <w:vAlign w:val="center"/>
+            <w:hideMark/>
+          </w:tcPr>
+          <w:p>
+            <w:r>
+              <w:t>Accepted</w:t>
+            </w:r>
+          </w:p>
+        </w:tc>
+      </w:tr>
+      <w:tr>
+        <w:trPr>
+          <w:tblCellSpacing w:w="15" w:type="dxa"/>
+        </w:trPr>
+        <w:tc>
+          <w:tcPr>
+            <w:tcW w:w="0" w:type="auto"/>
+            <w:tcBorders>
+              <w:top w:val="single" w:sz="6" w:space="0" w:color="C4C7C5"/>
+              <w:left w:val="single" w:sz="6" w:space="0" w:color="C4C7C5"/>
+              <w:bottom w:val="single" w:sz="6" w:space="0" w:color="C4C7C5"/>
+              <w:right w:val="single" w:sz="6" w:space="0" w:color="C4C7C5"/>
+            </w:tcBorders>
+            <w:tcMar>
+              <w:top w:w="120" w:type="dxa"/>
+              <w:left w:w="180" w:type="dxa"/>
+              <w:bottom w:w="120" w:type="dxa"/>
+              <w:right w:w="180" w:type="dxa"/>
+            </w:tcMar>
+            <w:vAlign w:val="center"/>
+            <w:hideMark/>
+          </w:tcPr>
+          <w:p>
+            <w:pPr>
+              <w:rPr>
+                <w:b/>
+                <w:bCs/>
+              </w:rPr>
+            </w:pPr>
+            <w:r>
+              <w:rPr>
+                <w:b/>
+                <w:bCs/>
+              </w:rPr>
+              <w:t>KI-016</w:t>
+            </w:r>
+          </w:p>
+        </w:tc>
+        <w:tc>
+          <w:tcPr>
+            <w:tcW w:w="0" w:type="auto"/>
+            <w:tcBorders>
+              <w:top w:val="single" w:sz="6" w:space="0" w:color="C4C7C5"/>
+              <w:left w:val="single" w:sz="6" w:space="0" w:color="C4C7C5"/>
+              <w:bottom w:val="single" w:sz="6" w:space="0" w:color="C4C7C5"/>
+              <w:right w:val="single" w:sz="6" w:space="0" w:color="C4C7C5"/>
+            </w:tcBorders>
+            <w:tcMar>
+              <w:top w:w="120" w:type="dxa"/>
+              <w:left w:w="180" w:type="dxa"/>
+              <w:bottom w:w="120" w:type="dxa"/>
+              <w:right w:w="180" w:type="dxa"/>
+            </w:tcMar>
+            <w:vAlign w:val="center"/>
+            <w:hideMark/>
+          </w:tcPr>
+          <w:p>
+            <w:r>
+              <w:t>Users struggle to enter symbols, accented characters, or special characters not directly visible on the keyboard.</w:t>
+            </w:r>
+          </w:p>
+        </w:tc>
+        <w:tc>
+          <w:tcPr>
+            <w:tcW w:w="0" w:type="auto"/>
+            <w:tcBorders>
+              <w:top w:val="single" w:sz="6" w:space="0" w:color="C4C7C5"/>
+              <w:left w:val="single" w:sz="6" w:space="0" w:color="C4C7C5"/>
+              <w:bottom w:val="single" w:sz="6" w:space="0" w:color="C4C7C5"/>
+              <w:right w:val="single" w:sz="6" w:space="0" w:color="C4C7C5"/>
+            </w:tcBorders>
+            <w:tcMar>
+              <w:top w:w="120" w:type="dxa"/>
+              <w:left w:w="180" w:type="dxa"/>
+              <w:bottom w:w="120" w:type="dxa"/>
+              <w:right w:w="180" w:type="dxa"/>
+            </w:tcMar>
+            <w:vAlign w:val="center"/>
+            <w:hideMark/>
+          </w:tcPr>
+          <w:p>
+            <w:r>
+              <w:t>Accepted</w:t>
+            </w:r>
+          </w:p>
+        </w:tc>
+      </w:tr>
+      <w:tr>
+        <w:trPr>
+          <w:tblCellSpacing w:w="15" w:type="dxa"/>
+        </w:trPr>
+        <w:tc>
+          <w:tcPr>
+            <w:tcW w:w="0" w:type="auto"/>
+            <w:tcBorders>
+              <w:top w:val="single" w:sz="6" w:space="0" w:color="C4C7C5"/>
+              <w:left w:val="single" w:sz="6" w:space="0" w:color="C4C7C5"/>
+              <w:bottom w:val="single" w:sz="6" w:space="0" w:color="C4C7C5"/>
+              <w:right w:val="single" w:sz="6" w:space="0" w:color="C4C7C5"/>
+            </w:tcBorders>
+            <w:tcMar>
+              <w:top w:w="120" w:type="dxa"/>
+              <w:left w:w="180" w:type="dxa"/>
+              <w:bottom w:w="120" w:type="dxa"/>
+              <w:right w:w="180" w:type="dxa"/>
+            </w:tcMar>
+            <w:vAlign w:val="center"/>
+            <w:hideMark/>
+          </w:tcPr>
+          <w:p>
+            <w:pPr>
+              <w:rPr>
+                <w:b/>
+                <w:bCs/>
+              </w:rPr>
+            </w:pPr>
+            <w:r>
+              <w:rPr>
+                <w:b/>
+                <w:bCs/>
+              </w:rPr>
+              <w:t>KI-017</w:t>
+            </w:r>
+          </w:p>
+        </w:tc>
+        <w:tc>
+          <w:tcPr>
+            <w:tcW w:w="0" w:type="auto"/>
+            <w:tcBorders>
+              <w:top w:val="single" w:sz="6" w:space="0" w:color="C4C7C5"/>
+              <w:left w:val="single" w:sz="6" w:space="0" w:color="C4C7C5"/>
+              <w:bottom w:val="single" w:sz="6" w:space="0" w:color="C4C7C5"/>
+              <w:right w:val="single" w:sz="6" w:space="0" w:color="C4C7C5"/>
+            </w:tcBorders>
+            <w:tcMar>
+              <w:top w:w="120" w:type="dxa"/>
+              <w:left w:w="180" w:type="dxa"/>
+              <w:bottom w:w="120" w:type="dxa"/>
+              <w:right w:w="180" w:type="dxa"/>
+            </w:tcMar>
+            <w:vAlign w:val="center"/>
+            <w:hideMark/>
+          </w:tcPr>
+          <w:p>
+            <w:r>
+              <w:t>Users struggle to understand different keyboard layouts when using another computer.</w:t>
+            </w:r>
+          </w:p>
+        </w:tc>
+        <w:tc>
+          <w:tcPr>
+            <w:tcW w:w="0" w:type="auto"/>
+            <w:tcBorders>
+              <w:top w:val="single" w:sz="6" w:space="0" w:color="C4C7C5"/>
+              <w:left w:val="single" w:sz="6" w:space="0" w:color="C4C7C5"/>
+              <w:bottom w:val="single" w:sz="6" w:space="0" w:color="C4C7C5"/>
+              <w:right w:val="single" w:sz="6" w:space="0" w:color="C4C7C5"/>
+            </w:tcBorders>
+            <w:tcMar>
+              <w:top w:w="120" w:type="dxa"/>
+              <w:left w:w="180" w:type="dxa"/>
+              <w:bottom w:w="120" w:type="dxa"/>
+              <w:right w:w="180" w:type="dxa"/>
+            </w:tcMar>
+            <w:vAlign w:val="center"/>
+            <w:hideMark/>
+          </w:tcPr>
+          <w:p>
+            <w:r>
+              <w:t>Accepted</w:t>
+            </w:r>
+          </w:p>
+        </w:tc>
+      </w:tr>
+      <w:tr>
+        <w:trPr>
+          <w:tblCellSpacing w:w="15" w:type="dxa"/>
+        </w:trPr>
+        <w:tc>
+          <w:tcPr>
+            <w:tcW w:w="0" w:type="auto"/>
+            <w:tcBorders>
+              <w:top w:val="single" w:sz="6" w:space="0" w:color="C4C7C5"/>
+              <w:left w:val="single" w:sz="6" w:space="0" w:color="C4C7C5"/>
+              <w:bottom w:val="single" w:sz="6" w:space="0" w:color="C4C7C5"/>
+              <w:right w:val="single" w:sz="6" w:space="0" w:color="C4C7C5"/>
+            </w:tcBorders>
+            <w:tcMar>
+              <w:top w:w="120" w:type="dxa"/>
+              <w:left w:w="180" w:type="dxa"/>
+              <w:bottom w:w="120" w:type="dxa"/>
+              <w:right w:w="180" w:type="dxa"/>
+            </w:tcMar>
+            <w:vAlign w:val="center"/>
+            <w:hideMark/>
+          </w:tcPr>
+          <w:p>
+            <w:pPr>
+              <w:rPr>
+                <w:b/>
+                <w:bCs/>
+              </w:rPr>
+            </w:pPr>
+            <w:r>
+              <w:rPr>
+                <w:b/>
+                <w:bCs/>
+              </w:rPr>
+              <w:t>KI-018</w:t>
+            </w:r>
+          </w:p>
+        </w:tc>
+        <w:tc>
+          <w:tcPr>
+            <w:tcW w:w="0" w:type="auto"/>
+            <w:tcBorders>
+              <w:top w:val="single" w:sz="6" w:space="0" w:color="C4C7C5"/>
+              <w:left w:val="single" w:sz="6" w:space="0" w:color="C4C7C5"/>
+              <w:bottom w:val="single" w:sz="6" w:space="0" w:color="C4C7C5"/>
+              <w:right w:val="single" w:sz="6" w:space="0" w:color="C4C7C5"/>
+            </w:tcBorders>
+            <w:tcMar>
+              <w:top w:w="120" w:type="dxa"/>
+              <w:left w:w="180" w:type="dxa"/>
+              <w:bottom w:w="120" w:type="dxa"/>
+              <w:right w:w="180" w:type="dxa"/>
+            </w:tcMar>
+            <w:vAlign w:val="center"/>
+            <w:hideMark/>
+          </w:tcPr>
+          <w:p>
+            <w:r>
+              <w:t>Users struggle to maintain typing speed while ensuring accuracy.</w:t>
+            </w:r>
+          </w:p>
+        </w:tc>
+        <w:tc>
+          <w:tcPr>
+            <w:tcW w:w="0" w:type="auto"/>
+            <w:tcBorders>
+              <w:top w:val="single" w:sz="6" w:space="0" w:color="C4C7C5"/>
+              <w:left w:val="single" w:sz="6" w:space="0" w:color="C4C7C5"/>
+              <w:bottom w:val="single" w:sz="6" w:space="0" w:color="C4C7C5"/>
+              <w:right w:val="single" w:sz="6" w:space="0" w:color="C4C7C5"/>
+            </w:tcBorders>
+            <w:tcMar>
+              <w:top w:w="120" w:type="dxa"/>
+              <w:left w:w="180" w:type="dxa"/>
+              <w:bottom w:w="120" w:type="dxa"/>
+              <w:right w:w="180" w:type="dxa"/>
+            </w:tcMar>
+            <w:vAlign w:val="center"/>
+            <w:hideMark/>
+          </w:tcPr>
+          <w:p>
+            <w:r>
+              <w:t>Accepted</w:t>
+            </w:r>
+          </w:p>
+        </w:tc>
+      </w:tr>
+      <w:tr>
+        <w:trPr>
+          <w:tblCellSpacing w:w="15" w:type="dxa"/>
+        </w:trPr>
+        <w:tc>
+          <w:tcPr>
+            <w:tcW w:w="0" w:type="auto"/>
+            <w:tcBorders>
+              <w:top w:val="single" w:sz="6" w:space="0" w:color="C4C7C5"/>
+              <w:left w:val="single" w:sz="6" w:space="0" w:color="C4C7C5"/>
+              <w:bottom w:val="single" w:sz="6" w:space="0" w:color="C4C7C5"/>
+              <w:right w:val="single" w:sz="6" w:space="0" w:color="C4C7C5"/>
+            </w:tcBorders>
+            <w:tcMar>
+              <w:top w:w="120" w:type="dxa"/>
+              <w:left w:w="180" w:type="dxa"/>
+              <w:bottom w:w="120" w:type="dxa"/>
+              <w:right w:w="180" w:type="dxa"/>
+            </w:tcMar>
+            <w:vAlign w:val="center"/>
+            <w:hideMark/>
+          </w:tcPr>
+          <w:p>
+            <w:pPr>
+              <w:rPr>
+                <w:b/>
+                <w:bCs/>
+              </w:rPr>
+            </w:pPr>
+            <w:r>
+              <w:rPr>
+                <w:b/>
+                <w:bCs/>
+              </w:rPr>
+              <w:t>KI-019</w:t>
+            </w:r>
+          </w:p>
+        </w:tc>
+        <w:tc>
+          <w:tcPr>
+            <w:tcW w:w="0" w:type="auto"/>
+            <w:tcBorders>
+              <w:top w:val="single" w:sz="6" w:space="0" w:color="C4C7C5"/>
+              <w:left w:val="single" w:sz="6" w:space="0" w:color="C4C7C5"/>
+              <w:bottom w:val="single" w:sz="6" w:space="0" w:color="C4C7C5"/>
+              <w:right w:val="single" w:sz="6" w:space="0" w:color="C4C7C5"/>
+            </w:tcBorders>
+            <w:tcMar>
+              <w:top w:w="120" w:type="dxa"/>
+              <w:left w:w="180" w:type="dxa"/>
+              <w:bottom w:w="120" w:type="dxa"/>
+              <w:right w:w="180" w:type="dxa"/>
+            </w:tcMar>
+            <w:vAlign w:val="center"/>
+            <w:hideMark/>
+          </w:tcPr>
+          <w:p>
+            <w:r>
+              <w:t>Users frequently lose their typing position after interruptions.</w:t>
+            </w:r>
+          </w:p>
+        </w:tc>
+        <w:tc>
+          <w:tcPr>
+            <w:tcW w:w="0" w:type="auto"/>
+            <w:tcBorders>
+              <w:top w:val="single" w:sz="6" w:space="0" w:color="C4C7C5"/>
+              <w:left w:val="single" w:sz="6" w:space="0" w:color="C4C7C5"/>
+              <w:bottom w:val="single" w:sz="6" w:space="0" w:color="C4C7C5"/>
+              <w:right w:val="single" w:sz="6" w:space="0" w:color="C4C7C5"/>
+            </w:tcBorders>
+            <w:tcMar>
+              <w:top w:w="120" w:type="dxa"/>
+              <w:left w:w="180" w:type="dxa"/>
+              <w:bottom w:w="120" w:type="dxa"/>
+              <w:right w:w="180" w:type="dxa"/>
+            </w:tcMar>
+            <w:vAlign w:val="center"/>
+            <w:hideMark/>
+          </w:tcPr>
+          <w:p>
+            <w:r>
+              <w:t>Accepted</w:t>
+            </w:r>
+          </w:p>
+        </w:tc>
+      </w:tr>
+      <w:tr>
+        <w:trPr>
+          <w:tblCellSpacing w:w="15" w:type="dxa"/>
+        </w:trPr>
+        <w:tc>
+          <w:tcPr>
+            <w:tcW w:w="0" w:type="auto"/>
+            <w:tcBorders>
+              <w:top w:val="single" w:sz="6" w:space="0" w:color="C4C7C5"/>
+              <w:left w:val="single" w:sz="6" w:space="0" w:color="C4C7C5"/>
+              <w:bottom w:val="single" w:sz="6" w:space="0" w:color="C4C7C5"/>
+              <w:right w:val="single" w:sz="6" w:space="0" w:color="C4C7C5"/>
+            </w:tcBorders>
+            <w:tcMar>
+              <w:top w:w="120" w:type="dxa"/>
+              <w:left w:w="180" w:type="dxa"/>
+              <w:bottom w:w="120" w:type="dxa"/>
+              <w:right w:w="180" w:type="dxa"/>
+            </w:tcMar>
+            <w:vAlign w:val="center"/>
+            <w:hideMark/>
+          </w:tcPr>
+          <w:p>
+            <w:pPr>
+              <w:rPr>
+                <w:b/>
+                <w:bCs/>
+              </w:rPr>
+            </w:pPr>
+            <w:r>
+              <w:rPr>
+                <w:b/>
+                <w:bCs/>
+              </w:rPr>
+              <w:t>KI-020</w:t>
+            </w:r>
+          </w:p>
+        </w:tc>
+        <w:tc>
+          <w:tcPr>
+            <w:tcW w:w="0" w:type="auto"/>
+            <w:tcBorders>
+              <w:top w:val="single" w:sz="6" w:space="0" w:color="C4C7C5"/>
+              <w:left w:val="single" w:sz="6" w:space="0" w:color="C4C7C5"/>
+              <w:bottom w:val="single" w:sz="6" w:space="0" w:color="C4C7C5"/>
+              <w:right w:val="single" w:sz="6" w:space="0" w:color="C4C7C5"/>
+            </w:tcBorders>
+            <w:tcMar>
+              <w:top w:w="120" w:type="dxa"/>
+              <w:left w:w="180" w:type="dxa"/>
+              <w:bottom w:w="120" w:type="dxa"/>
+              <w:right w:w="180" w:type="dxa"/>
+            </w:tcMar>
+            <w:vAlign w:val="center"/>
+            <w:hideMark/>
+          </w:tcPr>
+          <w:p>
+            <w:r>
+              <w:t>Users struggle to understand why the same key behaves differently across applications.</w:t>
+            </w:r>
+          </w:p>
+        </w:tc>
+        <w:tc>
+          <w:tcPr>
+            <w:tcW w:w="0" w:type="auto"/>
+            <w:tcBorders>
+              <w:top w:val="single" w:sz="6" w:space="0" w:color="C4C7C5"/>
+              <w:left w:val="single" w:sz="6" w:space="0" w:color="C4C7C5"/>
+              <w:bottom w:val="single" w:sz="6" w:space="0" w:color="C4C7C5"/>
+              <w:right w:val="single" w:sz="6" w:space="0" w:color="C4C7C5"/>
+            </w:tcBorders>
+            <w:tcMar>
+              <w:top w:w="120" w:type="dxa"/>
+              <w:left w:w="180" w:type="dxa"/>
+              <w:bottom w:w="120" w:type="dxa"/>
+              <w:right w:w="180" w:type="dxa"/>
+            </w:tcMar>
+            <w:vAlign w:val="center"/>
+            <w:hideMark/>
+          </w:tcPr>
+          <w:p>
+            <w:r>
+              <w:t>Accepted</w:t>
+            </w:r>
+          </w:p>
+        </w:tc>
+      </w:tr>
+      <w:tr>
+        <w:trPr>
+          <w:tblCellSpacing w:w="15" w:type="dxa"/>
+        </w:trPr>
+        <w:tc>
+          <w:tcPr>
+            <w:tcW w:w="0" w:type="auto"/>
+            <w:tcBorders>
+              <w:top w:val="single" w:sz="6" w:space="0" w:color="C4C7C5"/>
+              <w:left w:val="single" w:sz="6" w:space="0" w:color="C4C7C5"/>
+              <w:bottom w:val="single" w:sz="6" w:space="0" w:color="C4C7C5"/>
+              <w:right w:val="single" w:sz="6" w:space="0" w:color="C4C7C5"/>
+            </w:tcBorders>
+            <w:tcMar>
+              <w:top w:w="120" w:type="dxa"/>
+              <w:left w:w="180" w:type="dxa"/>
+              <w:bottom w:w="120" w:type="dxa"/>
+              <w:right w:w="180" w:type="dxa"/>
+            </w:tcMar>
+            <w:vAlign w:val="center"/>
+            <w:hideMark/>
+          </w:tcPr>
+          <w:p>
+            <w:pPr>
+              <w:rPr>
+                <w:b/>
+                <w:bCs/>
+              </w:rPr>
+            </w:pPr>
+            <w:r>
+              <w:rPr>
+                <w:b/>
+                <w:bCs/>
+              </w:rPr>
+              <w:t>KI-021</w:t>
+            </w:r>
+          </w:p>
+        </w:tc>
+        <w:tc>
+          <w:tcPr>
+            <w:tcW w:w="0" w:type="auto"/>
+            <w:tcBorders>
+              <w:top w:val="single" w:sz="6" w:space="0" w:color="C4C7C5"/>
+              <w:left w:val="single" w:sz="6" w:space="0" w:color="C4C7C5"/>
+              <w:bottom w:val="single" w:sz="6" w:space="0" w:color="C4C7C5"/>
+              <w:right w:val="single" w:sz="6" w:space="0" w:color="C4C7C5"/>
+            </w:tcBorders>
+            <w:tcMar>
+              <w:top w:w="120" w:type="dxa"/>
+              <w:left w:w="180" w:type="dxa"/>
+              <w:bottom w:w="120" w:type="dxa"/>
+              <w:right w:w="180" w:type="dxa"/>
+            </w:tcMar>
+            <w:vAlign w:val="center"/>
+            <w:hideMark/>
+          </w:tcPr>
+          <w:p>
+            <w:r>
+              <w:t>Users struggle to switch efficiently between text input, command execution, and navigation tasks.</w:t>
+            </w:r>
+          </w:p>
+        </w:tc>
+        <w:tc>
+          <w:tcPr>
+            <w:tcW w:w="0" w:type="auto"/>
+            <w:tcBorders>
+              <w:top w:val="single" w:sz="6" w:space="0" w:color="C4C7C5"/>
+              <w:left w:val="single" w:sz="6" w:space="0" w:color="C4C7C5"/>
+              <w:bottom w:val="single" w:sz="6" w:space="0" w:color="C4C7C5"/>
+              <w:right w:val="single" w:sz="6" w:space="0" w:color="C4C7C5"/>
+            </w:tcBorders>
+            <w:tcMar>
+              <w:top w:w="120" w:type="dxa"/>
+              <w:left w:w="180" w:type="dxa"/>
+              <w:bottom w:w="120" w:type="dxa"/>
+              <w:right w:w="180" w:type="dxa"/>
+            </w:tcMar>
+            <w:vAlign w:val="center"/>
+            <w:hideMark/>
+          </w:tcPr>
+          <w:p>
+            <w:r>
+              <w:t>Accepted</w:t>
+            </w:r>
+          </w:p>
+        </w:tc>
+      </w:tr>
+      <w:tr>
+        <w:trPr>
+          <w:tblCellSpacing w:w="15" w:type="dxa"/>
+        </w:trPr>
+        <w:tc>
+          <w:tcPr>
+            <w:tcW w:w="0" w:type="auto"/>
+            <w:tcBorders>
+              <w:top w:val="single" w:sz="6" w:space="0" w:color="C4C7C5"/>
+              <w:left w:val="single" w:sz="6" w:space="0" w:color="C4C7C5"/>
+              <w:bottom w:val="single" w:sz="6" w:space="0" w:color="C4C7C5"/>
+              <w:right w:val="single" w:sz="6" w:space="0" w:color="C4C7C5"/>
+            </w:tcBorders>
+            <w:tcMar>
+              <w:top w:w="120" w:type="dxa"/>
+              <w:left w:w="180" w:type="dxa"/>
+              <w:bottom w:w="120" w:type="dxa"/>
+              <w:right w:w="180" w:type="dxa"/>
+            </w:tcMar>
+            <w:vAlign w:val="center"/>
+            <w:hideMark/>
+          </w:tcPr>
+          <w:p>
+            <w:pPr>
+              <w:rPr>
+                <w:b/>
+                <w:bCs/>
+              </w:rPr>
+            </w:pPr>
+            <w:r>
+              <w:rPr>
+                <w:b/>
+                <w:bCs/>
+              </w:rPr>
+              <w:t>KI-022</w:t>
+            </w:r>
+          </w:p>
+        </w:tc>
+        <w:tc>
+          <w:tcPr>
+            <w:tcW w:w="0" w:type="auto"/>
+            <w:tcBorders>
+              <w:top w:val="single" w:sz="6" w:space="0" w:color="C4C7C5"/>
+              <w:left w:val="single" w:sz="6" w:space="0" w:color="C4C7C5"/>
+              <w:bottom w:val="single" w:sz="6" w:space="0" w:color="C4C7C5"/>
+              <w:right w:val="single" w:sz="6" w:space="0" w:color="C4C7C5"/>
+            </w:tcBorders>
+            <w:tcMar>
+              <w:top w:w="120" w:type="dxa"/>
+              <w:left w:w="180" w:type="dxa"/>
+              <w:bottom w:w="120" w:type="dxa"/>
+              <w:right w:w="180" w:type="dxa"/>
+            </w:tcMar>
+            <w:vAlign w:val="center"/>
+            <w:hideMark/>
+          </w:tcPr>
+          <w:p>
+            <w:r>
+              <w:t>Users struggle to remember command syntax even after repeated use.</w:t>
+            </w:r>
+          </w:p>
+        </w:tc>
+        <w:tc>
+          <w:tcPr>
+            <w:tcW w:w="0" w:type="auto"/>
+            <w:tcBorders>
+              <w:top w:val="single" w:sz="6" w:space="0" w:color="C4C7C5"/>
+              <w:left w:val="single" w:sz="6" w:space="0" w:color="C4C7C5"/>
+              <w:bottom w:val="single" w:sz="6" w:space="0" w:color="C4C7C5"/>
+              <w:right w:val="single" w:sz="6" w:space="0" w:color="C4C7C5"/>
+            </w:tcBorders>
+            <w:tcMar>
+              <w:top w:w="120" w:type="dxa"/>
+              <w:left w:w="180" w:type="dxa"/>
+              <w:bottom w:w="120" w:type="dxa"/>
+              <w:right w:w="180" w:type="dxa"/>
+            </w:tcMar>
+            <w:vAlign w:val="center"/>
+            <w:hideMark/>
+          </w:tcPr>
+          <w:p>
+            <w:r>
+              <w:t>Accepted</w:t>
+            </w:r>
+          </w:p>
+        </w:tc>
+      </w:tr>
+      <w:tr>
+        <w:trPr>
+          <w:tblCellSpacing w:w="15" w:type="dxa"/>
+        </w:trPr>
+        <w:tc>
+          <w:tcPr>
+            <w:tcW w:w="0" w:type="auto"/>
+            <w:tcBorders>
+              <w:top w:val="single" w:sz="6" w:space="0" w:color="C4C7C5"/>
+              <w:left w:val="single" w:sz="6" w:space="0" w:color="C4C7C5"/>
+              <w:bottom w:val="single" w:sz="6" w:space="0" w:color="C4C7C5"/>
+              <w:right w:val="single" w:sz="6" w:space="0" w:color="C4C7C5"/>
+            </w:tcBorders>
+            <w:tcMar>
+              <w:top w:w="120" w:type="dxa"/>
+              <w:left w:w="180" w:type="dxa"/>
+              <w:bottom w:w="120" w:type="dxa"/>
+              <w:right w:w="180" w:type="dxa"/>
+            </w:tcMar>
+            <w:vAlign w:val="center"/>
+            <w:hideMark/>
+          </w:tcPr>
+          <w:p>
+            <w:pPr>
+              <w:rPr>
+                <w:b/>
+                <w:bCs/>
+              </w:rPr>
+            </w:pPr>
+            <w:r>
+              <w:rPr>
+                <w:b/>
+                <w:bCs/>
+              </w:rPr>
+              <w:t>KI-023</w:t>
+            </w:r>
+          </w:p>
+        </w:tc>
+        <w:tc>
+          <w:tcPr>
+            <w:tcW w:w="0" w:type="auto"/>
+            <w:tcBorders>
+              <w:top w:val="single" w:sz="6" w:space="0" w:color="C4C7C5"/>
+              <w:left w:val="single" w:sz="6" w:space="0" w:color="C4C7C5"/>
+              <w:bottom w:val="single" w:sz="6" w:space="0" w:color="C4C7C5"/>
+              <w:right w:val="single" w:sz="6" w:space="0" w:color="C4C7C5"/>
+            </w:tcBorders>
+            <w:tcMar>
+              <w:top w:w="120" w:type="dxa"/>
+              <w:left w:w="180" w:type="dxa"/>
+              <w:bottom w:w="120" w:type="dxa"/>
+              <w:right w:w="180" w:type="dxa"/>
+            </w:tcMar>
+            <w:vAlign w:val="center"/>
+            <w:hideMark/>
+          </w:tcPr>
+          <w:p>
+            <w:r>
+              <w:t>Users struggle to distinguish between text editing shortcuts and system shortcuts.</w:t>
+            </w:r>
+          </w:p>
+        </w:tc>
+        <w:tc>
+          <w:tcPr>
+            <w:tcW w:w="0" w:type="auto"/>
+            <w:tcBorders>
+              <w:top w:val="single" w:sz="6" w:space="0" w:color="C4C7C5"/>
+              <w:left w:val="single" w:sz="6" w:space="0" w:color="C4C7C5"/>
+              <w:bottom w:val="single" w:sz="6" w:space="0" w:color="C4C7C5"/>
+              <w:right w:val="single" w:sz="6" w:space="0" w:color="C4C7C5"/>
+            </w:tcBorders>
+            <w:tcMar>
+              <w:top w:w="120" w:type="dxa"/>
+              <w:left w:w="180" w:type="dxa"/>
+              <w:bottom w:w="120" w:type="dxa"/>
+              <w:right w:w="180" w:type="dxa"/>
+            </w:tcMar>
+            <w:vAlign w:val="center"/>
+            <w:hideMark/>
+          </w:tcPr>
+          <w:p>
+            <w:r>
+              <w:t>Accepted</w:t>
+            </w:r>
+          </w:p>
+        </w:tc>
+      </w:tr>
+      <w:tr>
+        <w:trPr>
+          <w:tblCellSpacing w:w="15" w:type="dxa"/>
+        </w:trPr>
+        <w:tc>
+          <w:tcPr>
+            <w:tcW w:w="0" w:type="auto"/>
+            <w:tcBorders>
+              <w:top w:val="single" w:sz="6" w:space="0" w:color="C4C7C5"/>
+              <w:left w:val="single" w:sz="6" w:space="0" w:color="C4C7C5"/>
+              <w:bottom w:val="single" w:sz="6" w:space="0" w:color="C4C7C5"/>
+              <w:right w:val="single" w:sz="6" w:space="0" w:color="C4C7C5"/>
+            </w:tcBorders>
+            <w:tcMar>
+              <w:top w:w="120" w:type="dxa"/>
+              <w:left w:w="180" w:type="dxa"/>
+              <w:bottom w:w="120" w:type="dxa"/>
+              <w:right w:w="180" w:type="dxa"/>
+            </w:tcMar>
+            <w:vAlign w:val="center"/>
+            <w:hideMark/>
+          </w:tcPr>
+          <w:p>
+            <w:pPr>
+              <w:rPr>
+                <w:b/>
+                <w:bCs/>
+              </w:rPr>
+            </w:pPr>
+            <w:r>
+              <w:rPr>
+                <w:b/>
+                <w:bCs/>
+              </w:rPr>
+              <w:t>KI-024</w:t>
+            </w:r>
+          </w:p>
+        </w:tc>
+        <w:tc>
+          <w:tcPr>
+            <w:tcW w:w="0" w:type="auto"/>
+            <w:tcBorders>
+              <w:top w:val="single" w:sz="6" w:space="0" w:color="C4C7C5"/>
+              <w:left w:val="single" w:sz="6" w:space="0" w:color="C4C7C5"/>
+              <w:bottom w:val="single" w:sz="6" w:space="0" w:color="C4C7C5"/>
+              <w:right w:val="single" w:sz="6" w:space="0" w:color="C4C7C5"/>
+            </w:tcBorders>
+            <w:tcMar>
+              <w:top w:w="120" w:type="dxa"/>
+              <w:left w:w="180" w:type="dxa"/>
+              <w:bottom w:w="120" w:type="dxa"/>
+              <w:right w:w="180" w:type="dxa"/>
+            </w:tcMar>
+            <w:vAlign w:val="center"/>
+            <w:hideMark/>
+          </w:tcPr>
+          <w:p>
+            <w:r>
+              <w:t>Users struggle to build long-term muscle memory for infrequently used keyboard operations.</w:t>
+            </w:r>
+          </w:p>
+        </w:tc>
+        <w:tc>
+          <w:tcPr>
+            <w:tcW w:w="0" w:type="auto"/>
+            <w:tcBorders>
+              <w:top w:val="single" w:sz="6" w:space="0" w:color="C4C7C5"/>
+              <w:left w:val="single" w:sz="6" w:space="0" w:color="C4C7C5"/>
+              <w:bottom w:val="single" w:sz="6" w:space="0" w:color="C4C7C5"/>
+              <w:right w:val="single" w:sz="6" w:space="0" w:color="C4C7C5"/>
+            </w:tcBorders>
+            <w:tcMar>
+              <w:top w:w="120" w:type="dxa"/>
+              <w:left w:w="180" w:type="dxa"/>
+              <w:bottom w:w="120" w:type="dxa"/>
+              <w:right w:w="180" w:type="dxa"/>
+            </w:tcMar>
+            <w:vAlign w:val="center"/>
+            <w:hideMark/>
+          </w:tcPr>
+          <w:p>
+            <w:r>
+              <w:t>Accepted</w:t>
+            </w:r>
+          </w:p>
+        </w:tc>
+      </w:tr>
+      <w:tr>
+        <w:trPr>
+          <w:tblCellSpacing w:w="15" w:type="dxa"/>
+        </w:trPr>
+        <w:tc>
+          <w:tcPr>
+            <w:tcW w:w="0" w:type="auto"/>
+            <w:tcBorders>
+              <w:top w:val="single" w:sz="6" w:space="0" w:color="C4C7C5"/>
+              <w:left w:val="single" w:sz="6" w:space="0" w:color="C4C7C5"/>
+              <w:bottom w:val="single" w:sz="6" w:space="0" w:color="C4C7C5"/>
+              <w:right w:val="single" w:sz="6" w:space="0" w:color="C4C7C5"/>
+            </w:tcBorders>
+            <w:tcMar>
+              <w:top w:w="120" w:type="dxa"/>
+              <w:left w:w="180" w:type="dxa"/>
+              <w:bottom w:w="120" w:type="dxa"/>
+              <w:right w:w="180" w:type="dxa"/>
+            </w:tcMar>
+            <w:vAlign w:val="center"/>
+            <w:hideMark/>
+          </w:tcPr>
+          <w:p>
+            <w:pPr>
+              <w:rPr>
+                <w:b/>
+                <w:bCs/>
+              </w:rPr>
+            </w:pPr>
+            <w:r>
+              <w:rPr>
+                <w:b/>
+                <w:bCs/>
+              </w:rPr>
+              <w:lastRenderedPageBreak/>
+              <w:t>KI-025</w:t>
+            </w:r>
+          </w:p>
+        </w:tc>
+        <w:tc>
+          <w:tcPr>
+            <w:tcW w:w="0" w:type="auto"/>
+            <w:tcBorders>
+              <w:top w:val="single" w:sz="6" w:space="0" w:color="C4C7C5"/>
+              <w:left w:val="single" w:sz="6" w:space="0" w:color="C4C7C5"/>
+              <w:bottom w:val="single" w:sz="6" w:space="0" w:color="C4C7C5"/>
+              <w:right w:val="single" w:sz="6" w:space="0" w:color="C4C7C5"/>
+            </w:tcBorders>
+            <w:tcMar>
+              <w:top w:w="120" w:type="dxa"/>
+              <w:left w:w="180" w:type="dxa"/>
+              <w:bottom w:w="120" w:type="dxa"/>
+              <w:right w:w="180" w:type="dxa"/>
+            </w:tcMar>
+            <w:vAlign w:val="center"/>
+            <w:hideMark/>
+          </w:tcPr>
+          <w:p>
+            <w:r>
+              <w:t>Users gradually become dependent on recognition rather than recall when interacting with keyboards and input systems.</w:t>
+            </w:r>
+          </w:p>
+        </w:tc>
+        <w:tc>
+          <w:tcPr>
+            <w:tcW w:w="0" w:type="auto"/>
+            <w:tcBorders>
+              <w:top w:val="single" w:sz="6" w:space="0" w:color="C4C7C5"/>
+              <w:left w:val="single" w:sz="6" w:space="0" w:color="C4C7C5"/>
+              <w:bottom w:val="single" w:sz="6" w:space="0" w:color="C4C7C5"/>
+              <w:right w:val="single" w:sz="6" w:space="0" w:color="C4C7C5"/>
+            </w:tcBorders>
+            <w:tcMar>
+              <w:top w:w="120" w:type="dxa"/>
+              <w:left w:w="180" w:type="dxa"/>
+              <w:bottom w:w="120" w:type="dxa"/>
+              <w:right w:w="180" w:type="dxa"/>
+            </w:tcMar>
+            <w:vAlign w:val="center"/>
+            <w:hideMark/>
+          </w:tcPr>
+          <w:p>
+            <w:r>
+              <w:t>Accepted</w:t>
+            </w:r>
+          </w:p>
+        </w:tc>
+      </w:tr>
+      <w:tr>
+        <w:trPr>
+          <w:tblCellSpacing w:w="15" w:type="dxa"/>
+        </w:trPr>
+        <w:tc>
+          <w:tcPr>
+            <w:tcW w:w="0" w:type="auto"/>
+            <w:tcBorders>
+              <w:top w:val="single" w:sz="6" w:space="0" w:color="C4C7C5"/>
+              <w:left w:val="single" w:sz="6" w:space="0" w:color="C4C7C5"/>
+              <w:bottom w:val="single" w:sz="6" w:space="0" w:color="C4C7C5"/>
+              <w:right w:val="single" w:sz="6" w:space="0" w:color="C4C7C5"/>
+            </w:tcBorders>
+            <w:tcMar>
+              <w:top w:w="120" w:type="dxa"/>
+              <w:left w:w="180" w:type="dxa"/>
+              <w:bottom w:w="120" w:type="dxa"/>
+              <w:right w:w="180" w:type="dxa"/>
+            </w:tcMar>
+            <w:vAlign w:val="center"/>
+            <w:hideMark/>
+          </w:tcPr>
+          <w:p>
+            <w:pPr>
+              <w:rPr>
+                <w:b/>
+                <w:bCs/>
+              </w:rPr>
+            </w:pPr>
+            <w:r>
+              <w:rPr>
+                <w:b/>
+                <w:bCs/>
+              </w:rPr>
+              <w:t>KI-026</w:t>
+            </w:r>
+          </w:p>
+        </w:tc>
+        <w:tc>
+          <w:tcPr>
+            <w:tcW w:w="0" w:type="auto"/>
+            <w:tcBorders>
+              <w:top w:val="single" w:sz="6" w:space="0" w:color="C4C7C5"/>
+              <w:left w:val="single" w:sz="6" w:space="0" w:color="C4C7C5"/>
+              <w:bottom w:val="single" w:sz="6" w:space="0" w:color="C4C7C5"/>
+              <w:right w:val="single" w:sz="6" w:space="0" w:color="C4C7C5"/>
+            </w:tcBorders>
+            <w:tcMar>
+              <w:top w:w="120" w:type="dxa"/>
+              <w:left w:w="180" w:type="dxa"/>
+              <w:bottom w:w="120" w:type="dxa"/>
+              <w:right w:w="180" w:type="dxa"/>
+            </w:tcMar>
+            <w:vAlign w:val="center"/>
+            <w:hideMark/>
+          </w:tcPr>
+          <w:p>
+            <w:r>
+              <w:t>Users struggle to remember the correct order of keys in complex keyboard shortcuts.</w:t>
+            </w:r>
+          </w:p>
+        </w:tc>
+        <w:tc>
+          <w:tcPr>
+            <w:tcW w:w="0" w:type="auto"/>
+            <w:tcBorders>
+              <w:top w:val="single" w:sz="6" w:space="0" w:color="C4C7C5"/>
+              <w:left w:val="single" w:sz="6" w:space="0" w:color="C4C7C5"/>
+              <w:bottom w:val="single" w:sz="6" w:space="0" w:color="C4C7C5"/>
+              <w:right w:val="single" w:sz="6" w:space="0" w:color="C4C7C5"/>
+            </w:tcBorders>
+            <w:tcMar>
+              <w:top w:w="120" w:type="dxa"/>
+              <w:left w:w="180" w:type="dxa"/>
+              <w:bottom w:w="120" w:type="dxa"/>
+              <w:right w:w="180" w:type="dxa"/>
+            </w:tcMar>
+            <w:vAlign w:val="center"/>
+            <w:hideMark/>
+          </w:tcPr>
+          <w:p>
+            <w:r>
+              <w:t>Accepted</w:t>
+            </w:r>
+          </w:p>
+        </w:tc>
+      </w:tr>
+      <w:tr>
+        <w:trPr>
+          <w:tblCellSpacing w:w="15" w:type="dxa"/>
+        </w:trPr>
+        <w:tc>
+          <w:tcPr>
+            <w:tcW w:w="0" w:type="auto"/>
+            <w:tcBorders>
+              <w:top w:val="single" w:sz="6" w:space="0" w:color="C4C7C5"/>
+              <w:left w:val="single" w:sz="6" w:space="0" w:color="C4C7C5"/>
+              <w:bottom w:val="single" w:sz="6" w:space="0" w:color="C4C7C5"/>
+              <w:right w:val="single" w:sz="6" w:space="0" w:color="C4C7C5"/>
+            </w:tcBorders>
+            <w:tcMar>
+              <w:top w:w="120" w:type="dxa"/>
+              <w:left w:w="180" w:type="dxa"/>
+              <w:bottom w:w="120" w:type="dxa"/>
+              <w:right w:w="180" w:type="dxa"/>
+            </w:tcMar>
+            <w:vAlign w:val="center"/>
+            <w:hideMark/>
+          </w:tcPr>
+          <w:p>
+            <w:pPr>
+              <w:rPr>
+                <w:b/>
+                <w:bCs/>
+              </w:rPr>
+            </w:pPr>
+            <w:r>
+              <w:rPr>
+                <w:b/>
+                <w:bCs/>
+              </w:rPr>
+              <w:t>KI-027</w:t>
+            </w:r>
+          </w:p>
+        </w:tc>
+        <w:tc>
+          <w:tcPr>
+            <w:tcW w:w="0" w:type="auto"/>
+            <w:tcBorders>
+              <w:top w:val="single" w:sz="6" w:space="0" w:color="C4C7C5"/>
+              <w:left w:val="single" w:sz="6" w:space="0" w:color="C4C7C5"/>
+              <w:bottom w:val="single" w:sz="6" w:space="0" w:color="C4C7C5"/>
+              <w:right w:val="single" w:sz="6" w:space="0" w:color="C4C7C5"/>
+            </w:tcBorders>
+            <w:tcMar>
+              <w:top w:w="120" w:type="dxa"/>
+              <w:left w:w="180" w:type="dxa"/>
+              <w:bottom w:w="120" w:type="dxa"/>
+              <w:right w:w="180" w:type="dxa"/>
+            </w:tcMar>
+            <w:vAlign w:val="center"/>
+            <w:hideMark/>
+          </w:tcPr>
+          <w:p>
+            <w:r>
+              <w:t>Users struggle to adapt when switching between different keyboard layouts.</w:t>
+            </w:r>
+          </w:p>
+        </w:tc>
+        <w:tc>
+          <w:tcPr>
+            <w:tcW w:w="0" w:type="auto"/>
+            <w:tcBorders>
+              <w:top w:val="single" w:sz="6" w:space="0" w:color="C4C7C5"/>
+              <w:left w:val="single" w:sz="6" w:space="0" w:color="C4C7C5"/>
+              <w:bottom w:val="single" w:sz="6" w:space="0" w:color="C4C7C5"/>
+              <w:right w:val="single" w:sz="6" w:space="0" w:color="C4C7C5"/>
+            </w:tcBorders>
+            <w:tcMar>
+              <w:top w:w="120" w:type="dxa"/>
+              <w:left w:w="180" w:type="dxa"/>
+              <w:bottom w:w="120" w:type="dxa"/>
+              <w:right w:w="180" w:type="dxa"/>
+            </w:tcMar>
+            <w:vAlign w:val="center"/>
+            <w:hideMark/>
+          </w:tcPr>
+          <w:p>
+            <w:r>
+              <w:t>Accepted</w:t>
+            </w:r>
+          </w:p>
+        </w:tc>
+      </w:tr>
+      <w:tr>
+        <w:trPr>
+          <w:tblCellSpacing w:w="15" w:type="dxa"/>
+        </w:trPr>
+        <w:tc>
+          <w:tcPr>
+            <w:tcW w:w="0" w:type="auto"/>
+            <w:tcBorders>
+              <w:top w:val="single" w:sz="6" w:space="0" w:color="C4C7C5"/>
+              <w:left w:val="single" w:sz="6" w:space="0" w:color="C4C7C5"/>
+              <w:bottom w:val="single" w:sz="6" w:space="0" w:color="C4C7C5"/>
+              <w:right w:val="single" w:sz="6" w:space="0" w:color="C4C7C5"/>
+            </w:tcBorders>
+            <w:tcMar>
+              <w:top w:w="120" w:type="dxa"/>
+              <w:left w:w="180" w:type="dxa"/>
+              <w:bottom w:w="120" w:type="dxa"/>
+              <w:right w:w="180" w:type="dxa"/>
+            </w:tcMar>
+            <w:vAlign w:val="center"/>
+            <w:hideMark/>
+          </w:tcPr>
+          <w:p>
+            <w:pPr>
+              <w:rPr>
+                <w:b/>
+                <w:bCs/>
+              </w:rPr>
+            </w:pPr>
+            <w:r>
+              <w:rPr>
+                <w:b/>
+                <w:bCs/>
+              </w:rPr>
+              <w:t>KI-028</w:t>
+            </w:r>
+          </w:p>
+        </w:tc>
+        <w:tc>
+          <w:tcPr>
+            <w:tcW w:w="0" w:type="auto"/>
+            <w:tcBorders>
+              <w:top w:val="single" w:sz="6" w:space="0" w:color="C4C7C5"/>
+              <w:left w:val="single" w:sz="6" w:space="0" w:color="C4C7C5"/>
+              <w:bottom w:val="single" w:sz="6" w:space="0" w:color="C4C7C5"/>
+              <w:right w:val="single" w:sz="6" w:space="0" w:color="C4C7C5"/>
+            </w:tcBorders>
+            <w:tcMar>
+              <w:top w:w="120" w:type="dxa"/>
+              <w:left w:w="180" w:type="dxa"/>
+              <w:bottom w:w="120" w:type="dxa"/>
+              <w:right w:w="180" w:type="dxa"/>
+            </w:tcMar>
+            <w:vAlign w:val="center"/>
+            <w:hideMark/>
+          </w:tcPr>
+          <w:p>
+            <w:r>
+              <w:t>Users struggle to use unfamiliar keyboards on different devices.</w:t>
+            </w:r>
+          </w:p>
+        </w:tc>
+        <w:tc>
+          <w:tcPr>
+            <w:tcW w:w="0" w:type="auto"/>
+            <w:tcBorders>
+              <w:top w:val="single" w:sz="6" w:space="0" w:color="C4C7C5"/>
+              <w:left w:val="single" w:sz="6" w:space="0" w:color="C4C7C5"/>
+              <w:bottom w:val="single" w:sz="6" w:space="0" w:color="C4C7C5"/>
+              <w:right w:val="single" w:sz="6" w:space="0" w:color="C4C7C5"/>
+            </w:tcBorders>
+            <w:tcMar>
+              <w:top w:w="120" w:type="dxa"/>
+              <w:left w:w="180" w:type="dxa"/>
+              <w:bottom w:w="120" w:type="dxa"/>
+              <w:right w:w="180" w:type="dxa"/>
+            </w:tcMar>
+            <w:vAlign w:val="center"/>
+            <w:hideMark/>
+          </w:tcPr>
+          <w:p>
+            <w:r>
+              <w:t>Accepted</w:t>
+            </w:r>
+          </w:p>
+        </w:tc>
+      </w:tr>
+      <w:tr>
+        <w:trPr>
+          <w:tblCellSpacing w:w="15" w:type="dxa"/>
+        </w:trPr>
+        <w:tc>
+          <w:tcPr>
+            <w:tcW w:w="0" w:type="auto"/>
+            <w:tcBorders>
+              <w:top w:val="single" w:sz="6" w:space="0" w:color="C4C7C5"/>
+              <w:left w:val="single" w:sz="6" w:space="0" w:color="C4C7C5"/>
+              <w:bottom w:val="single" w:sz="6" w:space="0" w:color="C4C7C5"/>
+              <w:right w:val="single" w:sz="6" w:space="0" w:color="C4C7C5"/>
+            </w:tcBorders>
+            <w:tcMar>
+              <w:top w:w="120" w:type="dxa"/>
+              <w:left w:w="180" w:type="dxa"/>
+              <w:bottom w:w="120" w:type="dxa"/>
+              <w:right w:w="180" w:type="dxa"/>
+            </w:tcMar>
+            <w:vAlign w:val="center"/>
+            <w:hideMark/>
+          </w:tcPr>
+          <w:p>
+            <w:pPr>
+              <w:rPr>
+                <w:b/>
+                <w:bCs/>
+              </w:rPr>
+            </w:pPr>
+            <w:r>
+              <w:rPr>
+                <w:b/>
+                <w:bCs/>
+              </w:rPr>
+              <w:t>KI-029</w:t>
+            </w:r>
+          </w:p>
+        </w:tc>
+        <w:tc>
+          <w:tcPr>
+            <w:tcW w:w="0" w:type="auto"/>
+            <w:tcBorders>
+              <w:top w:val="single" w:sz="6" w:space="0" w:color="C4C7C5"/>
+              <w:left w:val="single" w:sz="6" w:space="0" w:color="C4C7C5"/>
+              <w:bottom w:val="single" w:sz="6" w:space="0" w:color="C4C7C5"/>
+              <w:right w:val="single" w:sz="6" w:space="0" w:color="C4C7C5"/>
+            </w:tcBorders>
+            <w:tcMar>
+              <w:top w:w="120" w:type="dxa"/>
+              <w:left w:w="180" w:type="dxa"/>
+              <w:bottom w:w="120" w:type="dxa"/>
+              <w:right w:w="180" w:type="dxa"/>
+            </w:tcMar>
+            <w:vAlign w:val="center"/>
+            <w:hideMark/>
+          </w:tcPr>
+          <w:p>
+            <w:r>
+              <w:t>Users struggle to understand why identical key combinations produce different results across operating systems.</w:t>
+            </w:r>
+          </w:p>
+        </w:tc>
+        <w:tc>
+          <w:tcPr>
+            <w:tcW w:w="0" w:type="auto"/>
+            <w:tcBorders>
+              <w:top w:val="single" w:sz="6" w:space="0" w:color="C4C7C5"/>
+              <w:left w:val="single" w:sz="6" w:space="0" w:color="C4C7C5"/>
+              <w:bottom w:val="single" w:sz="6" w:space="0" w:color="C4C7C5"/>
+              <w:right w:val="single" w:sz="6" w:space="0" w:color="C4C7C5"/>
+            </w:tcBorders>
+            <w:tcMar>
+              <w:top w:w="120" w:type="dxa"/>
+              <w:left w:w="180" w:type="dxa"/>
+              <w:bottom w:w="120" w:type="dxa"/>
+              <w:right w:w="180" w:type="dxa"/>
+            </w:tcMar>
+            <w:vAlign w:val="center"/>
+            <w:hideMark/>
+          </w:tcPr>
+          <w:p>
+            <w:r>
+              <w:t>Accepted</w:t>
+            </w:r>
+          </w:p>
+        </w:tc>
+      </w:tr>
+      <w:tr>
+        <w:trPr>
+          <w:tblCellSpacing w:w="15" w:type="dxa"/>
+        </w:trPr>
+        <w:tc>
+          <w:tcPr>
+            <w:tcW w:w="0" w:type="auto"/>
+            <w:tcBorders>
+              <w:top w:val="single" w:sz="6" w:space="0" w:color="C4C7C5"/>
+              <w:left w:val="single" w:sz="6" w:space="0" w:color="C4C7C5"/>
+              <w:bottom w:val="single" w:sz="6" w:space="0" w:color="C4C7C5"/>
+              <w:right w:val="single" w:sz="6" w:space="0" w:color="C4C7C5"/>
+            </w:tcBorders>
+            <w:tcMar>
+              <w:top w:w="120" w:type="dxa"/>
+              <w:left w:w="180" w:type="dxa"/>
+              <w:bottom w:w="120" w:type="dxa"/>
+              <w:right w:w="180" w:type="dxa"/>
+            </w:tcMar>
+            <w:vAlign w:val="center"/>
+            <w:hideMark/>
+          </w:tcPr>
+          <w:p>
+            <w:pPr>
+              <w:rPr>
+                <w:b/>
+                <w:bCs/>
+              </w:rPr>
+            </w:pPr>
+            <w:r>
+              <w:rPr>
+                <w:b/>
+                <w:bCs/>
+              </w:rPr>
+              <w:t>KI-030</w:t>
+            </w:r>
+          </w:p>
+        </w:tc>
+        <w:tc>
+          <w:tcPr>
+            <w:tcW w:w="0" w:type="auto"/>
+            <w:tcBorders>
+              <w:top w:val="single" w:sz="6" w:space="0" w:color="C4C7C5"/>
+              <w:left w:val="single" w:sz="6" w:space="0" w:color="C4C7C5"/>
+              <w:bottom w:val="single" w:sz="6" w:space="0" w:color="C4C7C5"/>
+              <w:right w:val="single" w:sz="6" w:space="0" w:color="C4C7C5"/>
+            </w:tcBorders>
+            <w:tcMar>
+              <w:top w:w="120" w:type="dxa"/>
+              <w:left w:w="180" w:type="dxa"/>
+              <w:bottom w:w="120" w:type="dxa"/>
+              <w:right w:w="180" w:type="dxa"/>
+            </w:tcMar>
+            <w:vAlign w:val="center"/>
+            <w:hideMark/>
+          </w:tcPr>
+          <w:p>
+            <w:r>
+              <w:t>Users struggle to determine whether an action is faster using the keyboard or the mouse.</w:t>
+            </w:r>
+          </w:p>
+        </w:tc>
+        <w:tc>
+          <w:tcPr>
+            <w:tcW w:w="0" w:type="auto"/>
+            <w:tcBorders>
+              <w:top w:val="single" w:sz="6" w:space="0" w:color="C4C7C5"/>
+              <w:left w:val="single" w:sz="6" w:space="0" w:color="C4C7C5"/>
+              <w:bottom w:val="single" w:sz="6" w:space="0" w:color="C4C7C5"/>
+              <w:right w:val="single" w:sz="6" w:space="0" w:color="C4C7C5"/>
+            </w:tcBorders>
+            <w:tcMar>
+              <w:top w:w="120" w:type="dxa"/>
+              <w:left w:w="180" w:type="dxa"/>
+              <w:bottom w:w="120" w:type="dxa"/>
+              <w:right w:w="180" w:type="dxa"/>
+            </w:tcMar>
+            <w:vAlign w:val="center"/>
+            <w:hideMark/>
+          </w:tcPr>
+          <w:p>
+            <w:r>
+              <w:t>Accepted</w:t>
+            </w:r>
+          </w:p>
+        </w:tc>
+      </w:tr>
+      <w:tr>
+        <w:trPr>
+          <w:tblCellSpacing w:w="15" w:type="dxa"/>
+        </w:trPr>
+        <w:tc>
+          <w:tcPr>
+            <w:tcW w:w="0" w:type="auto"/>
+            <w:tcBorders>
+              <w:top w:val="single" w:sz="6" w:space="0" w:color="C4C7C5"/>
+              <w:left w:val="single" w:sz="6" w:space="0" w:color="C4C7C5"/>
+              <w:bottom w:val="single" w:sz="6" w:space="0" w:color="C4C7C5"/>
+              <w:right w:val="single" w:sz="6" w:space="0" w:color="C4C7C5"/>
+            </w:tcBorders>
+            <w:tcMar>
+              <w:top w:w="120" w:type="dxa"/>
+              <w:left w:w="180" w:type="dxa"/>
+              <w:bottom w:w="120" w:type="dxa"/>
+              <w:right w:w="180" w:type="dxa"/>
+            </w:tcMar>
+            <w:vAlign w:val="center"/>
+            <w:hideMark/>
+          </w:tcPr>
+          <w:p>
+            <w:pPr>
+              <w:rPr>
+                <w:b/>
+                <w:bCs/>
+              </w:rPr>
+            </w:pPr>
+            <w:r>
+              <w:rPr>
+                <w:b/>
+                <w:bCs/>
+              </w:rPr>
+              <w:t>KI-031</w:t>
+            </w:r>
+          </w:p>
+        </w:tc>
+        <w:tc>
+          <w:tcPr>
+            <w:tcW w:w="0" w:type="auto"/>
+            <w:tcBorders>
+              <w:top w:val="single" w:sz="6" w:space="0" w:color="C4C7C5"/>
+              <w:left w:val="single" w:sz="6" w:space="0" w:color="C4C7C5"/>
+              <w:bottom w:val="single" w:sz="6" w:space="0" w:color="C4C7C5"/>
+              <w:right w:val="single" w:sz="6" w:space="0" w:color="C4C7C5"/>
+            </w:tcBorders>
+            <w:tcMar>
+              <w:top w:w="120" w:type="dxa"/>
+              <w:left w:w="180" w:type="dxa"/>
+              <w:bottom w:w="120" w:type="dxa"/>
+              <w:right w:w="180" w:type="dxa"/>
+            </w:tcMar>
+            <w:vAlign w:val="center"/>
+            <w:hideMark/>
+          </w:tcPr>
+          <w:p>
+            <w:r>
+              <w:t>Users repeatedly interrupt typing to reposition their hands on the keyboard.</w:t>
+            </w:r>
+          </w:p>
+        </w:tc>
+        <w:tc>
+          <w:tcPr>
+            <w:tcW w:w="0" w:type="auto"/>
+            <w:tcBorders>
+              <w:top w:val="single" w:sz="6" w:space="0" w:color="C4C7C5"/>
+              <w:left w:val="single" w:sz="6" w:space="0" w:color="C4C7C5"/>
+              <w:bottom w:val="single" w:sz="6" w:space="0" w:color="C4C7C5"/>
+              <w:right w:val="single" w:sz="6" w:space="0" w:color="C4C7C5"/>
+            </w:tcBorders>
+            <w:tcMar>
+              <w:top w:w="120" w:type="dxa"/>
+              <w:left w:w="180" w:type="dxa"/>
+              <w:bottom w:w="120" w:type="dxa"/>
+              <w:right w:w="180" w:type="dxa"/>
+            </w:tcMar>
+            <w:vAlign w:val="center"/>
+            <w:hideMark/>
+          </w:tcPr>
+          <w:p>
+            <w:r>
+              <w:t>Accepted</w:t>
+            </w:r>
+          </w:p>
+        </w:tc>
+      </w:tr>
+      <w:tr>
+        <w:trPr>
+          <w:tblCellSpacing w:w="15" w:type="dxa"/>
+        </w:trPr>
+        <w:tc>
+          <w:tcPr>
+            <w:tcW w:w="0" w:type="auto"/>
+            <w:tcBorders>
+              <w:top w:val="single" w:sz="6" w:space="0" w:color="C4C7C5"/>
+              <w:left w:val="single" w:sz="6" w:space="0" w:color="C4C7C5"/>
+              <w:bottom w:val="single" w:sz="6" w:space="0" w:color="C4C7C5"/>
+              <w:right w:val="single" w:sz="6" w:space="0" w:color="C4C7C5"/>
+            </w:tcBorders>
+            <w:tcMar>
+              <w:top w:w="120" w:type="dxa"/>
+              <w:left w:w="180" w:type="dxa"/>
+              <w:bottom w:w="120" w:type="dxa"/>
+              <w:right w:w="180" w:type="dxa"/>
+            </w:tcMar>
+            <w:vAlign w:val="center"/>
+            <w:hideMark/>
+          </w:tcPr>
+          <w:p>
+            <w:pPr>
+              <w:rPr>
+                <w:b/>
+                <w:bCs/>
+              </w:rPr>
+            </w:pPr>
+            <w:r>
+              <w:rPr>
+                <w:b/>
+                <w:bCs/>
+              </w:rPr>
+              <w:t>KI-032</w:t>
+            </w:r>
+          </w:p>
+        </w:tc>
+        <w:tc>
+          <w:tcPr>
+            <w:tcW w:w="0" w:type="auto"/>
+            <w:tcBorders>
+              <w:top w:val="single" w:sz="6" w:space="0" w:color="C4C7C5"/>
+              <w:left w:val="single" w:sz="6" w:space="0" w:color="C4C7C5"/>
+              <w:bottom w:val="single" w:sz="6" w:space="0" w:color="C4C7C5"/>
+              <w:right w:val="single" w:sz="6" w:space="0" w:color="C4C7C5"/>
+            </w:tcBorders>
+            <w:tcMar>
+              <w:top w:w="120" w:type="dxa"/>
+              <w:left w:w="180" w:type="dxa"/>
+              <w:bottom w:w="120" w:type="dxa"/>
+              <w:right w:w="180" w:type="dxa"/>
+            </w:tcMar>
+            <w:vAlign w:val="center"/>
+            <w:hideMark/>
+          </w:tcPr>
+          <w:p>
+            <w:r>
+              <w:t>Users accidentally activate functions because nearby keys are pressed unintentionally.</w:t>
+            </w:r>
+          </w:p>
+        </w:tc>
+        <w:tc>
+          <w:tcPr>
+            <w:tcW w:w="0" w:type="auto"/>
+            <w:tcBorders>
+              <w:top w:val="single" w:sz="6" w:space="0" w:color="C4C7C5"/>
+              <w:left w:val="single" w:sz="6" w:space="0" w:color="C4C7C5"/>
+              <w:bottom w:val="single" w:sz="6" w:space="0" w:color="C4C7C5"/>
+              <w:right w:val="single" w:sz="6" w:space="0" w:color="C4C7C5"/>
+            </w:tcBorders>
+            <w:tcMar>
+              <w:top w:w="120" w:type="dxa"/>
+              <w:left w:w="180" w:type="dxa"/>
+              <w:bottom w:w="120" w:type="dxa"/>
+              <w:right w:w="180" w:type="dxa"/>
+            </w:tcMar>
+            <w:vAlign w:val="center"/>
+            <w:hideMark/>
+          </w:tcPr>
+          <w:p>
+            <w:r>
+              <w:t>Accepted</w:t>
+            </w:r>
+          </w:p>
+        </w:tc>
+      </w:tr>
+      <w:tr>
+        <w:trPr>
+          <w:tblCellSpacing w:w="15" w:type="dxa"/>
+        </w:trPr>
+        <w:tc>
+          <w:tcPr>
+            <w:tcW w:w="0" w:type="auto"/>
+            <w:tcBorders>
+              <w:top w:val="single" w:sz="6" w:space="0" w:color="C4C7C5"/>
+              <w:left w:val="single" w:sz="6" w:space="0" w:color="C4C7C5"/>
+              <w:bottom w:val="single" w:sz="6" w:space="0" w:color="C4C7C5"/>
+              <w:right w:val="single" w:sz="6" w:space="0" w:color="C4C7C5"/>
+            </w:tcBorders>
+            <w:tcMar>
+              <w:top w:w="120" w:type="dxa"/>
+              <w:left w:w="180" w:type="dxa"/>
+              <w:bottom w:w="120" w:type="dxa"/>
+              <w:right w:w="180" w:type="dxa"/>
+            </w:tcMar>
+            <w:vAlign w:val="center"/>
+            <w:hideMark/>
+          </w:tcPr>
+          <w:p>
+            <w:pPr>
+              <w:rPr>
+                <w:b/>
+                <w:bCs/>
+              </w:rPr>
+            </w:pPr>
+            <w:r>
+              <w:rPr>
+                <w:b/>
+                <w:bCs/>
+              </w:rPr>
+              <w:t>KI-033</w:t>
+            </w:r>
+          </w:p>
+        </w:tc>
+        <w:tc>
+          <w:tcPr>
+            <w:tcW w:w="0" w:type="auto"/>
+            <w:tcBorders>
+              <w:top w:val="single" w:sz="6" w:space="0" w:color="C4C7C5"/>
+              <w:left w:val="single" w:sz="6" w:space="0" w:color="C4C7C5"/>
+              <w:bottom w:val="single" w:sz="6" w:space="0" w:color="C4C7C5"/>
+              <w:right w:val="single" w:sz="6" w:space="0" w:color="C4C7C5"/>
+            </w:tcBorders>
+            <w:tcMar>
+              <w:top w:w="120" w:type="dxa"/>
+              <w:left w:w="180" w:type="dxa"/>
+              <w:bottom w:w="120" w:type="dxa"/>
+              <w:right w:w="180" w:type="dxa"/>
+            </w:tcMar>
+            <w:vAlign w:val="center"/>
+            <w:hideMark/>
+          </w:tcPr>
+          <w:p>
+            <w:r>
+              <w:t>Users struggle to maintain typing rhythm while entering numbers, symbols, and text together.</w:t>
+            </w:r>
+          </w:p>
+        </w:tc>
+        <w:tc>
+          <w:tcPr>
+            <w:tcW w:w="0" w:type="auto"/>
+            <w:tcBorders>
+              <w:top w:val="single" w:sz="6" w:space="0" w:color="C4C7C5"/>
+              <w:left w:val="single" w:sz="6" w:space="0" w:color="C4C7C5"/>
+              <w:bottom w:val="single" w:sz="6" w:space="0" w:color="C4C7C5"/>
+              <w:right w:val="single" w:sz="6" w:space="0" w:color="C4C7C5"/>
+            </w:tcBorders>
+            <w:tcMar>
+              <w:top w:w="120" w:type="dxa"/>
+              <w:left w:w="180" w:type="dxa"/>
+              <w:bottom w:w="120" w:type="dxa"/>
+              <w:right w:w="180" w:type="dxa"/>
+            </w:tcMar>
+            <w:vAlign w:val="center"/>
+            <w:hideMark/>
+          </w:tcPr>
+          <w:p>
+            <w:r>
+              <w:t>Accepted</w:t>
+            </w:r>
+          </w:p>
+        </w:tc>
+      </w:tr>
+      <w:tr>
+        <w:trPr>
+          <w:tblCellSpacing w:w="15" w:type="dxa"/>
+        </w:trPr>
+        <w:tc>
+          <w:tcPr>
+            <w:tcW w:w="0" w:type="auto"/>
+            <w:tcBorders>
+              <w:top w:val="single" w:sz="6" w:space="0" w:color="C4C7C5"/>
+              <w:left w:val="single" w:sz="6" w:space="0" w:color="C4C7C5"/>
+              <w:bottom w:val="single" w:sz="6" w:space="0" w:color="C4C7C5"/>
+              <w:right w:val="single" w:sz="6" w:space="0" w:color="C4C7C5"/>
+            </w:tcBorders>
+            <w:tcMar>
+              <w:top w:w="120" w:type="dxa"/>
+              <w:left w:w="180" w:type="dxa"/>
+              <w:bottom w:w="120" w:type="dxa"/>
+              <w:right w:w="180" w:type="dxa"/>
+            </w:tcMar>
+            <w:vAlign w:val="center"/>
+            <w:hideMark/>
+          </w:tcPr>
+          <w:p>
+            <w:pPr>
+              <w:rPr>
+                <w:b/>
+                <w:bCs/>
+              </w:rPr>
+            </w:pPr>
+            <w:r>
+              <w:rPr>
+                <w:b/>
+                <w:bCs/>
+              </w:rPr>
+              <w:t>KI-034</w:t>
+            </w:r>
+          </w:p>
+        </w:tc>
+        <w:tc>
+          <w:tcPr>
+            <w:tcW w:w="0" w:type="auto"/>
+            <w:tcBorders>
+              <w:top w:val="single" w:sz="6" w:space="0" w:color="C4C7C5"/>
+              <w:left w:val="single" w:sz="6" w:space="0" w:color="C4C7C5"/>
+              <w:bottom w:val="single" w:sz="6" w:space="0" w:color="C4C7C5"/>
+              <w:right w:val="single" w:sz="6" w:space="0" w:color="C4C7C5"/>
+            </w:tcBorders>
+            <w:tcMar>
+              <w:top w:w="120" w:type="dxa"/>
+              <w:left w:w="180" w:type="dxa"/>
+              <w:bottom w:w="120" w:type="dxa"/>
+              <w:right w:w="180" w:type="dxa"/>
+            </w:tcMar>
+            <w:vAlign w:val="center"/>
+            <w:hideMark/>
+          </w:tcPr>
+          <w:p>
+            <w:r>
+              <w:t>Users struggle to understand the difference between character input and command input.</w:t>
+            </w:r>
+          </w:p>
+        </w:tc>
+        <w:tc>
+          <w:tcPr>
+            <w:tcW w:w="0" w:type="auto"/>
+            <w:tcBorders>
+              <w:top w:val="single" w:sz="6" w:space="0" w:color="C4C7C5"/>
+              <w:left w:val="single" w:sz="6" w:space="0" w:color="C4C7C5"/>
+              <w:bottom w:val="single" w:sz="6" w:space="0" w:color="C4C7C5"/>
+              <w:right w:val="single" w:sz="6" w:space="0" w:color="C4C7C5"/>
+            </w:tcBorders>
+            <w:tcMar>
+              <w:top w:w="120" w:type="dxa"/>
+              <w:left w:w="180" w:type="dxa"/>
+              <w:bottom w:w="120" w:type="dxa"/>
+              <w:right w:w="180" w:type="dxa"/>
+            </w:tcMar>
+            <w:vAlign w:val="center"/>
+            <w:hideMark/>
+          </w:tcPr>
+          <w:p>
+            <w:r>
+              <w:t>Accepted</w:t>
+            </w:r>
+          </w:p>
+        </w:tc>
+      </w:tr>
+      <w:tr>
+        <w:trPr>
+          <w:tblCellSpacing w:w="15" w:type="dxa"/>
+        </w:trPr>
+        <w:tc>
+          <w:tcPr>
+            <w:tcW w:w="0" w:type="auto"/>
+            <w:tcBorders>
+              <w:top w:val="single" w:sz="6" w:space="0" w:color="C4C7C5"/>
+              <w:left w:val="single" w:sz="6" w:space="0" w:color="C4C7C5"/>
+              <w:bottom w:val="single" w:sz="6" w:space="0" w:color="C4C7C5"/>
+              <w:right w:val="single" w:sz="6" w:space="0" w:color="C4C7C5"/>
+            </w:tcBorders>
+            <w:tcMar>
+              <w:top w:w="120" w:type="dxa"/>
+              <w:left w:w="180" w:type="dxa"/>
+              <w:bottom w:w="120" w:type="dxa"/>
+              <w:right w:w="180" w:type="dxa"/>
+            </w:tcMar>
+            <w:vAlign w:val="center"/>
+            <w:hideMark/>
+          </w:tcPr>
+          <w:p>
+            <w:pPr>
+              <w:rPr>
+                <w:b/>
+                <w:bCs/>
+              </w:rPr>
+            </w:pPr>
+            <w:r>
+              <w:rPr>
+                <w:b/>
+                <w:bCs/>
+              </w:rPr>
+              <w:lastRenderedPageBreak/>
+              <w:t>KI-035</w:t>
+            </w:r>
+          </w:p>
+        </w:tc>
+        <w:tc>
+          <w:tcPr>
+            <w:tcW w:w="0" w:type="auto"/>
+            <w:tcBorders>
+              <w:top w:val="single" w:sz="6" w:space="0" w:color="C4C7C5"/>
+              <w:left w:val="single" w:sz="6" w:space="0" w:color="C4C7C5"/>
+              <w:bottom w:val="single" w:sz="6" w:space="0" w:color="C4C7C5"/>
+              <w:right w:val="single" w:sz="6" w:space="0" w:color="C4C7C5"/>
+            </w:tcBorders>
+            <w:tcMar>
+              <w:top w:w="120" w:type="dxa"/>
+              <w:left w:w="180" w:type="dxa"/>
+              <w:bottom w:w="120" w:type="dxa"/>
+              <w:right w:w="180" w:type="dxa"/>
+            </w:tcMar>
+            <w:vAlign w:val="center"/>
+            <w:hideMark/>
+          </w:tcPr>
+          <w:p>
+            <w:r>
+              <w:t>Users struggle to recover after unintentionally deleting or modifying text using keyboard shortcuts.</w:t>
+            </w:r>
+          </w:p>
+        </w:tc>
+        <w:tc>
+          <w:tcPr>
+            <w:tcW w:w="0" w:type="auto"/>
+            <w:tcBorders>
+              <w:top w:val="single" w:sz="6" w:space="0" w:color="C4C7C5"/>
+              <w:left w:val="single" w:sz="6" w:space="0" w:color="C4C7C5"/>
+              <w:bottom w:val="single" w:sz="6" w:space="0" w:color="C4C7C5"/>
+              <w:right w:val="single" w:sz="6" w:space="0" w:color="C4C7C5"/>
+            </w:tcBorders>
+            <w:tcMar>
+              <w:top w:w="120" w:type="dxa"/>
+              <w:left w:w="180" w:type="dxa"/>
+              <w:bottom w:w="120" w:type="dxa"/>
+              <w:right w:w="180" w:type="dxa"/>
+            </w:tcMar>
+            <w:vAlign w:val="center"/>
+            <w:hideMark/>
+          </w:tcPr>
+          <w:p>
+            <w:r>
+              <w:t>Accepted</w:t>
+            </w:r>
+          </w:p>
+        </w:tc>
+      </w:tr>
+      <w:tr>
+        <w:trPr>
+          <w:tblCellSpacing w:w="15" w:type="dxa"/>
+        </w:trPr>
+        <w:tc>
+          <w:tcPr>
+            <w:tcW w:w="0" w:type="auto"/>
+            <w:tcBorders>
+              <w:top w:val="single" w:sz="6" w:space="0" w:color="C4C7C5"/>
+              <w:left w:val="single" w:sz="6" w:space="0" w:color="C4C7C5"/>
+              <w:bottom w:val="single" w:sz="6" w:space="0" w:color="C4C7C5"/>
+              <w:right w:val="single" w:sz="6" w:space="0" w:color="C4C7C5"/>
+            </w:tcBorders>
+            <w:tcMar>
+              <w:top w:w="120" w:type="dxa"/>
+              <w:left w:w="180" w:type="dxa"/>
+              <w:bottom w:w="120" w:type="dxa"/>
+              <w:right w:w="180" w:type="dxa"/>
+            </w:tcMar>
+            <w:vAlign w:val="center"/>
+            <w:hideMark/>
+          </w:tcPr>
+          <w:p>
+            <w:pPr>
+              <w:rPr>
+                <w:b/>
+                <w:bCs/>
+              </w:rPr>
+            </w:pPr>
+            <w:r>
+              <w:rPr>
+                <w:b/>
+                <w:bCs/>
+              </w:rPr>
+              <w:t>KI-036</w:t>
+            </w:r>
+          </w:p>
+        </w:tc>
+        <w:tc>
+          <w:tcPr>
+            <w:tcW w:w="0" w:type="auto"/>
+            <w:tcBorders>
+              <w:top w:val="single" w:sz="6" w:space="0" w:color="C4C7C5"/>
+              <w:left w:val="single" w:sz="6" w:space="0" w:color="C4C7C5"/>
+              <w:bottom w:val="single" w:sz="6" w:space="0" w:color="C4C7C5"/>
+              <w:right w:val="single" w:sz="6" w:space="0" w:color="C4C7C5"/>
+            </w:tcBorders>
+            <w:tcMar>
+              <w:top w:w="120" w:type="dxa"/>
+              <w:left w:w="180" w:type="dxa"/>
+              <w:bottom w:w="120" w:type="dxa"/>
+              <w:right w:w="180" w:type="dxa"/>
+            </w:tcMar>
+            <w:vAlign w:val="center"/>
+            <w:hideMark/>
+          </w:tcPr>
+          <w:p>
+            <w:r>
+              <w:t>Users struggle to remember shortcut sequences for professional software.</w:t>
+            </w:r>
+          </w:p>
+        </w:tc>
+        <w:tc>
+          <w:tcPr>
+            <w:tcW w:w="0" w:type="auto"/>
+            <w:tcBorders>
+              <w:top w:val="single" w:sz="6" w:space="0" w:color="C4C7C5"/>
+              <w:left w:val="single" w:sz="6" w:space="0" w:color="C4C7C5"/>
+              <w:bottom w:val="single" w:sz="6" w:space="0" w:color="C4C7C5"/>
+              <w:right w:val="single" w:sz="6" w:space="0" w:color="C4C7C5"/>
+            </w:tcBorders>
+            <w:tcMar>
+              <w:top w:w="120" w:type="dxa"/>
+              <w:left w:w="180" w:type="dxa"/>
+              <w:bottom w:w="120" w:type="dxa"/>
+              <w:right w:w="180" w:type="dxa"/>
+            </w:tcMar>
+            <w:vAlign w:val="center"/>
+            <w:hideMark/>
+          </w:tcPr>
+          <w:p>
+            <w:r>
+              <w:t>Accepted</w:t>
+            </w:r>
+          </w:p>
+        </w:tc>
+      </w:tr>
+      <w:tr>
+        <w:trPr>
+          <w:tblCellSpacing w:w="15" w:type="dxa"/>
+        </w:trPr>
+        <w:tc>
+          <w:tcPr>
+            <w:tcW w:w="0" w:type="auto"/>
+            <w:tcBorders>
+              <w:top w:val="single" w:sz="6" w:space="0" w:color="C4C7C5"/>
+              <w:left w:val="single" w:sz="6" w:space="0" w:color="C4C7C5"/>
+              <w:bottom w:val="single" w:sz="6" w:space="0" w:color="C4C7C5"/>
+              <w:right w:val="single" w:sz="6" w:space="0" w:color="C4C7C5"/>
+            </w:tcBorders>
+            <w:tcMar>
+              <w:top w:w="120" w:type="dxa"/>
+              <w:left w:w="180" w:type="dxa"/>
+              <w:bottom w:w="120" w:type="dxa"/>
+              <w:right w:w="180" w:type="dxa"/>
+            </w:tcMar>
+            <w:vAlign w:val="center"/>
+            <w:hideMark/>
+          </w:tcPr>
+          <w:p>
+            <w:pPr>
+              <w:rPr>
+                <w:b/>
+                <w:bCs/>
+              </w:rPr>
+            </w:pPr>
+            <w:r>
+              <w:rPr>
+                <w:b/>
+                <w:bCs/>
+              </w:rPr>
+              <w:t>KI-037</w:t>
+            </w:r>
+          </w:p>
+        </w:tc>
+        <w:tc>
+          <w:tcPr>
+            <w:tcW w:w="0" w:type="auto"/>
+            <w:tcBorders>
+              <w:top w:val="single" w:sz="6" w:space="0" w:color="C4C7C5"/>
+              <w:left w:val="single" w:sz="6" w:space="0" w:color="C4C7C5"/>
+              <w:bottom w:val="single" w:sz="6" w:space="0" w:color="C4C7C5"/>
+              <w:right w:val="single" w:sz="6" w:space="0" w:color="C4C7C5"/>
+            </w:tcBorders>
+            <w:tcMar>
+              <w:top w:w="120" w:type="dxa"/>
+              <w:left w:w="180" w:type="dxa"/>
+              <w:bottom w:w="120" w:type="dxa"/>
+              <w:right w:w="180" w:type="dxa"/>
+            </w:tcMar>
+            <w:vAlign w:val="center"/>
+            <w:hideMark/>
+          </w:tcPr>
+          <w:p>
+            <w:r>
+              <w:t>Users struggle to learn advanced keyboard shortcuts because they receive little practical guidance.</w:t>
+            </w:r>
+          </w:p>
+        </w:tc>
+        <w:tc>
+          <w:tcPr>
+            <w:tcW w:w="0" w:type="auto"/>
+            <w:tcBorders>
+              <w:top w:val="single" w:sz="6" w:space="0" w:color="C4C7C5"/>
+              <w:left w:val="single" w:sz="6" w:space="0" w:color="C4C7C5"/>
+              <w:bottom w:val="single" w:sz="6" w:space="0" w:color="C4C7C5"/>
+              <w:right w:val="single" w:sz="6" w:space="0" w:color="C4C7C5"/>
+            </w:tcBorders>
+            <w:tcMar>
+              <w:top w:w="120" w:type="dxa"/>
+              <w:left w:w="180" w:type="dxa"/>
+              <w:bottom w:w="120" w:type="dxa"/>
+              <w:right w:w="180" w:type="dxa"/>
+            </w:tcMar>
+            <w:vAlign w:val="center"/>
+            <w:hideMark/>
+          </w:tcPr>
+          <w:p>
+            <w:r>
+              <w:t>Accepted</w:t>
+            </w:r>
+          </w:p>
+        </w:tc>
+      </w:tr>
+      <w:tr>
+        <w:trPr>
+          <w:tblCellSpacing w:w="15" w:type="dxa"/>
+        </w:trPr>
+        <w:tc>
+          <w:tcPr>
+            <w:tcW w:w="0" w:type="auto"/>
+            <w:tcBorders>
+              <w:top w:val="single" w:sz="6" w:space="0" w:color="C4C7C5"/>
+              <w:left w:val="single" w:sz="6" w:space="0" w:color="C4C7C5"/>
+              <w:bottom w:val="single" w:sz="6" w:space="0" w:color="C4C7C5"/>
+              <w:right w:val="single" w:sz="6" w:space="0" w:color="C4C7C5"/>
+            </w:tcBorders>
+            <w:tcMar>
+              <w:top w:w="120" w:type="dxa"/>
+              <w:left w:w="180" w:type="dxa"/>
+              <w:bottom w:w="120" w:type="dxa"/>
+              <w:right w:w="180" w:type="dxa"/>
+            </w:tcMar>
+            <w:vAlign w:val="center"/>
+            <w:hideMark/>
+          </w:tcPr>
+          <w:p>
+            <w:pPr>
+              <w:rPr>
+                <w:b/>
+                <w:bCs/>
+              </w:rPr>
+            </w:pPr>
+            <w:r>
+              <w:rPr>
+                <w:b/>
+                <w:bCs/>
+              </w:rPr>
+              <w:t>KI-038</w:t>
+            </w:r>
+          </w:p>
+        </w:tc>
+        <w:tc>
+          <w:tcPr>
+            <w:tcW w:w="0" w:type="auto"/>
+            <w:tcBorders>
+              <w:top w:val="single" w:sz="6" w:space="0" w:color="C4C7C5"/>
+              <w:left w:val="single" w:sz="6" w:space="0" w:color="C4C7C5"/>
+              <w:bottom w:val="single" w:sz="6" w:space="0" w:color="C4C7C5"/>
+              <w:right w:val="single" w:sz="6" w:space="0" w:color="C4C7C5"/>
+            </w:tcBorders>
+            <w:tcMar>
+              <w:top w:w="120" w:type="dxa"/>
+              <w:left w:w="180" w:type="dxa"/>
+              <w:bottom w:w="120" w:type="dxa"/>
+              <w:right w:w="180" w:type="dxa"/>
+            </w:tcMar>
+            <w:vAlign w:val="center"/>
+            <w:hideMark/>
+          </w:tcPr>
+          <w:p>
+            <w:r>
+              <w:t>Users struggle to locate rarely used function keys during work.</w:t>
+            </w:r>
+          </w:p>
+        </w:tc>
+        <w:tc>
+          <w:tcPr>
+            <w:tcW w:w="0" w:type="auto"/>
+            <w:tcBorders>
+              <w:top w:val="single" w:sz="6" w:space="0" w:color="C4C7C5"/>
+              <w:left w:val="single" w:sz="6" w:space="0" w:color="C4C7C5"/>
+              <w:bottom w:val="single" w:sz="6" w:space="0" w:color="C4C7C5"/>
+              <w:right w:val="single" w:sz="6" w:space="0" w:color="C4C7C5"/>
+            </w:tcBorders>
+            <w:tcMar>
+              <w:top w:w="120" w:type="dxa"/>
+              <w:left w:w="180" w:type="dxa"/>
+              <w:bottom w:w="120" w:type="dxa"/>
+              <w:right w:w="180" w:type="dxa"/>
+            </w:tcMar>
+            <w:vAlign w:val="center"/>
+            <w:hideMark/>
+          </w:tcPr>
+          <w:p>
+            <w:r>
+              <w:t>Accepted</w:t>
+            </w:r>
+          </w:p>
+        </w:tc>
+      </w:tr>
+      <w:tr>
+        <w:trPr>
+          <w:tblCellSpacing w:w="15" w:type="dxa"/>
+        </w:trPr>
+        <w:tc>
+          <w:tcPr>
+            <w:tcW w:w="0" w:type="auto"/>
+            <w:tcBorders>
+              <w:top w:val="single" w:sz="6" w:space="0" w:color="C4C7C5"/>
+              <w:left w:val="single" w:sz="6" w:space="0" w:color="C4C7C5"/>
+              <w:bottom w:val="single" w:sz="6" w:space="0" w:color="C4C7C5"/>
+              <w:right w:val="single" w:sz="6" w:space="0" w:color="C4C7C5"/>
+            </w:tcBorders>
+            <w:tcMar>
+              <w:top w:w="120" w:type="dxa"/>
+              <w:left w:w="180" w:type="dxa"/>
+              <w:bottom w:w="120" w:type="dxa"/>
+              <w:right w:w="180" w:type="dxa"/>
+            </w:tcMar>
+            <w:vAlign w:val="center"/>
+            <w:hideMark/>
+          </w:tcPr>
+          <w:p>
+            <w:pPr>
+              <w:rPr>
+                <w:b/>
+                <w:bCs/>
+              </w:rPr>
+            </w:pPr>
+            <w:r>
+              <w:rPr>
+                <w:b/>
+                <w:bCs/>
+              </w:rPr>
+              <w:t>KI-039</w:t>
+            </w:r>
+          </w:p>
+        </w:tc>
+        <w:tc>
+          <w:tcPr>
+            <w:tcW w:w="0" w:type="auto"/>
+            <w:tcBorders>
+              <w:top w:val="single" w:sz="6" w:space="0" w:color="C4C7C5"/>
+              <w:left w:val="single" w:sz="6" w:space="0" w:color="C4C7C5"/>
+              <w:bottom w:val="single" w:sz="6" w:space="0" w:color="C4C7C5"/>
+              <w:right w:val="single" w:sz="6" w:space="0" w:color="C4C7C5"/>
+            </w:tcBorders>
+            <w:tcMar>
+              <w:top w:w="120" w:type="dxa"/>
+              <w:left w:w="180" w:type="dxa"/>
+              <w:bottom w:w="120" w:type="dxa"/>
+              <w:right w:w="180" w:type="dxa"/>
+            </w:tcMar>
+            <w:vAlign w:val="center"/>
+            <w:hideMark/>
+          </w:tcPr>
+          <w:p>
+            <w:r>
+              <w:t>Users struggle to understand the purpose of lock keys such as Caps Lock, Num Lock, and Scroll Lock.</w:t>
+            </w:r>
+          </w:p>
+        </w:tc>
+        <w:tc>
+          <w:tcPr>
+            <w:tcW w:w="0" w:type="auto"/>
+            <w:tcBorders>
+              <w:top w:val="single" w:sz="6" w:space="0" w:color="C4C7C5"/>
+              <w:left w:val="single" w:sz="6" w:space="0" w:color="C4C7C5"/>
+              <w:bottom w:val="single" w:sz="6" w:space="0" w:color="C4C7C5"/>
+              <w:right w:val="single" w:sz="6" w:space="0" w:color="C4C7C5"/>
+            </w:tcBorders>
+            <w:tcMar>
+              <w:top w:w="120" w:type="dxa"/>
+              <w:left w:w="180" w:type="dxa"/>
+              <w:bottom w:w="120" w:type="dxa"/>
+              <w:right w:w="180" w:type="dxa"/>
+            </w:tcMar>
+            <w:vAlign w:val="center"/>
+            <w:hideMark/>
+          </w:tcPr>
+          <w:p>
+            <w:r>
+              <w:t>Accepted</w:t>
+            </w:r>
+          </w:p>
+        </w:tc>
+      </w:tr>
+      <w:tr>
+        <w:trPr>
+          <w:tblCellSpacing w:w="15" w:type="dxa"/>
+        </w:trPr>
+        <w:tc>
+          <w:tcPr>
+            <w:tcW w:w="0" w:type="auto"/>
+            <w:tcBorders>
+              <w:top w:val="single" w:sz="6" w:space="0" w:color="C4C7C5"/>
+              <w:left w:val="single" w:sz="6" w:space="0" w:color="C4C7C5"/>
+              <w:bottom w:val="single" w:sz="6" w:space="0" w:color="C4C7C5"/>
+              <w:right w:val="single" w:sz="6" w:space="0" w:color="C4C7C5"/>
+            </w:tcBorders>
+            <w:tcMar>
+              <w:top w:w="120" w:type="dxa"/>
+              <w:left w:w="180" w:type="dxa"/>
+              <w:bottom w:w="120" w:type="dxa"/>
+              <w:right w:w="180" w:type="dxa"/>
+            </w:tcMar>
+            <w:vAlign w:val="center"/>
+            <w:hideMark/>
+          </w:tcPr>
+          <w:p>
+            <w:pPr>
+              <w:rPr>
+                <w:b/>
+                <w:bCs/>
+              </w:rPr>
+            </w:pPr>
+            <w:r>
+              <w:rPr>
+                <w:b/>
+                <w:bCs/>
+              </w:rPr>
+              <w:t>KI-040</w:t>
+            </w:r>
+          </w:p>
+        </w:tc>
+        <w:tc>
+          <w:tcPr>
+            <w:tcW w:w="0" w:type="auto"/>
+            <w:tcBorders>
+              <w:top w:val="single" w:sz="6" w:space="0" w:color="C4C7C5"/>
+              <w:left w:val="single" w:sz="6" w:space="0" w:color="C4C7C5"/>
+              <w:bottom w:val="single" w:sz="6" w:space="0" w:color="C4C7C5"/>
+              <w:right w:val="single" w:sz="6" w:space="0" w:color="C4C7C5"/>
+            </w:tcBorders>
+            <w:tcMar>
+              <w:top w:w="120" w:type="dxa"/>
+              <w:left w:w="180" w:type="dxa"/>
+              <w:bottom w:w="120" w:type="dxa"/>
+              <w:right w:w="180" w:type="dxa"/>
+            </w:tcMar>
+            <w:vAlign w:val="center"/>
+            <w:hideMark/>
+          </w:tcPr>
+          <w:p>
+            <w:r>
+              <w:t>Users struggle to predict the outcome of unfamiliar keyboard combinations before pressing them.</w:t>
+            </w:r>
+          </w:p>
+        </w:tc>
+        <w:tc>
+          <w:tcPr>
+            <w:tcW w:w="0" w:type="auto"/>
+            <w:tcBorders>
+              <w:top w:val="single" w:sz="6" w:space="0" w:color="C4C7C5"/>
+              <w:left w:val="single" w:sz="6" w:space="0" w:color="C4C7C5"/>
+              <w:bottom w:val="single" w:sz="6" w:space="0" w:color="C4C7C5"/>
+              <w:right w:val="single" w:sz="6" w:space="0" w:color="C4C7C5"/>
+            </w:tcBorders>
+            <w:tcMar>
+              <w:top w:w="120" w:type="dxa"/>
+              <w:left w:w="180" w:type="dxa"/>
+              <w:bottom w:w="120" w:type="dxa"/>
+              <w:right w:w="180" w:type="dxa"/>
+            </w:tcMar>
+            <w:vAlign w:val="center"/>
+            <w:hideMark/>
+          </w:tcPr>
+          <w:p>
+            <w:r>
+              <w:t>Accepted</w:t>
+            </w:r>
+          </w:p>
+        </w:tc>
+      </w:tr>
+      <w:tr>
+        <w:trPr>
+          <w:tblCellSpacing w:w="15" w:type="dxa"/>
+        </w:trPr>
+        <w:tc>
+          <w:tcPr>
+            <w:tcW w:w="0" w:type="auto"/>
+            <w:tcBorders>
+              <w:top w:val="single" w:sz="6" w:space="0" w:color="C4C7C5"/>
+              <w:left w:val="single" w:sz="6" w:space="0" w:color="C4C7C5"/>
+              <w:bottom w:val="single" w:sz="6" w:space="0" w:color="C4C7C5"/>
+              <w:right w:val="single" w:sz="6" w:space="0" w:color="C4C7C5"/>
+            </w:tcBorders>
+            <w:tcMar>
+              <w:top w:w="120" w:type="dxa"/>
+              <w:left w:w="180" w:type="dxa"/>
+              <w:bottom w:w="120" w:type="dxa"/>
+              <w:right w:w="180" w:type="dxa"/>
+            </w:tcMar>
+            <w:vAlign w:val="center"/>
+            <w:hideMark/>
+          </w:tcPr>
+          <w:p>
+            <w:pPr>
+              <w:rPr>
+                <w:b/>
+                <w:bCs/>
+              </w:rPr>
+            </w:pPr>
+            <w:r>
+              <w:rPr>
+                <w:b/>
+                <w:bCs/>
+              </w:rPr>
+              <w:t>KI-041</w:t>
+            </w:r>
+          </w:p>
+        </w:tc>
+        <w:tc>
+          <w:tcPr>
+            <w:tcW w:w="0" w:type="auto"/>
+            <w:tcBorders>
+              <w:top w:val="single" w:sz="6" w:space="0" w:color="C4C7C5"/>
+              <w:left w:val="single" w:sz="6" w:space="0" w:color="C4C7C5"/>
+              <w:bottom w:val="single" w:sz="6" w:space="0" w:color="C4C7C5"/>
+              <w:right w:val="single" w:sz="6" w:space="0" w:color="C4C7C5"/>
+            </w:tcBorders>
+            <w:tcMar>
+              <w:top w:w="120" w:type="dxa"/>
+              <w:left w:w="180" w:type="dxa"/>
+              <w:bottom w:w="120" w:type="dxa"/>
+              <w:right w:w="180" w:type="dxa"/>
+            </w:tcMar>
+            <w:vAlign w:val="center"/>
+            <w:hideMark/>
+          </w:tcPr>
+          <w:p>
+            <w:r>
+              <w:t>Users struggle to maintain consistent typing performance after switching between multiple input languages.</w:t>
+            </w:r>
+          </w:p>
+        </w:tc>
+        <w:tc>
+          <w:tcPr>
+            <w:tcW w:w="0" w:type="auto"/>
+            <w:tcBorders>
+              <w:top w:val="single" w:sz="6" w:space="0" w:color="C4C7C5"/>
+              <w:left w:val="single" w:sz="6" w:space="0" w:color="C4C7C5"/>
+              <w:bottom w:val="single" w:sz="6" w:space="0" w:color="C4C7C5"/>
+              <w:right w:val="single" w:sz="6" w:space="0" w:color="C4C7C5"/>
+            </w:tcBorders>
+            <w:tcMar>
+              <w:top w:w="120" w:type="dxa"/>
+              <w:left w:w="180" w:type="dxa"/>
+              <w:bottom w:w="120" w:type="dxa"/>
+              <w:right w:w="180" w:type="dxa"/>
+            </w:tcMar>
+            <w:vAlign w:val="center"/>
+            <w:hideMark/>
+          </w:tcPr>
+          <w:p>
+            <w:r>
+              <w:t>Accepted</w:t>
+            </w:r>
+          </w:p>
+        </w:tc>
+      </w:tr>
+      <w:tr>
+        <w:trPr>
+          <w:tblCellSpacing w:w="15" w:type="dxa"/>
+        </w:trPr>
+        <w:tc>
+          <w:tcPr>
+            <w:tcW w:w="0" w:type="auto"/>
+            <w:tcBorders>
+              <w:top w:val="single" w:sz="6" w:space="0" w:color="C4C7C5"/>
+              <w:left w:val="single" w:sz="6" w:space="0" w:color="C4C7C5"/>
+              <w:bottom w:val="single" w:sz="6" w:space="0" w:color="C4C7C5"/>
+              <w:right w:val="single" w:sz="6" w:space="0" w:color="C4C7C5"/>
+            </w:tcBorders>
+            <w:tcMar>
+              <w:top w:w="120" w:type="dxa"/>
+              <w:left w:w="180" w:type="dxa"/>
+              <w:bottom w:w="120" w:type="dxa"/>
+              <w:right w:w="180" w:type="dxa"/>
+            </w:tcMar>
+            <w:vAlign w:val="center"/>
+            <w:hideMark/>
+          </w:tcPr>
+          <w:p>
+            <w:pPr>
+              <w:rPr>
+                <w:b/>
+                <w:bCs/>
+              </w:rPr>
+            </w:pPr>
+            <w:r>
+              <w:rPr>
+                <w:b/>
+                <w:bCs/>
+              </w:rPr>
+              <w:t>KI-042</w:t>
+            </w:r>
+          </w:p>
+        </w:tc>
+        <w:tc>
+          <w:tcPr>
+            <w:tcW w:w="0" w:type="auto"/>
+            <w:tcBorders>
+              <w:top w:val="single" w:sz="6" w:space="0" w:color="C4C7C5"/>
+              <w:left w:val="single" w:sz="6" w:space="0" w:color="C4C7C5"/>
+              <w:bottom w:val="single" w:sz="6" w:space="0" w:color="C4C7C5"/>
+              <w:right w:val="single" w:sz="6" w:space="0" w:color="C4C7C5"/>
+            </w:tcBorders>
+            <w:tcMar>
+              <w:top w:w="120" w:type="dxa"/>
+              <w:left w:w="180" w:type="dxa"/>
+              <w:bottom w:w="120" w:type="dxa"/>
+              <w:right w:w="180" w:type="dxa"/>
+            </w:tcMar>
+            <w:vAlign w:val="center"/>
+            <w:hideMark/>
+          </w:tcPr>
+          <w:p>
+            <w:r>
+              <w:t>Users struggle to use keyboard shortcuts efficiently while multitasking.</w:t>
+            </w:r>
+          </w:p>
+        </w:tc>
+        <w:tc>
+          <w:tcPr>
+            <w:tcW w:w="0" w:type="auto"/>
+            <w:tcBorders>
+              <w:top w:val="single" w:sz="6" w:space="0" w:color="C4C7C5"/>
+              <w:left w:val="single" w:sz="6" w:space="0" w:color="C4C7C5"/>
+              <w:bottom w:val="single" w:sz="6" w:space="0" w:color="C4C7C5"/>
+              <w:right w:val="single" w:sz="6" w:space="0" w:color="C4C7C5"/>
+            </w:tcBorders>
+            <w:tcMar>
+              <w:top w:w="120" w:type="dxa"/>
+              <w:left w:w="180" w:type="dxa"/>
+              <w:bottom w:w="120" w:type="dxa"/>
+              <w:right w:w="180" w:type="dxa"/>
+            </w:tcMar>
+            <w:vAlign w:val="center"/>
+            <w:hideMark/>
+          </w:tcPr>
+          <w:p>
+            <w:r>
+              <w:t>Accepted</w:t>
+            </w:r>
+          </w:p>
+        </w:tc>
+      </w:tr>
+      <w:tr>
+        <w:trPr>
+          <w:tblCellSpacing w:w="15" w:type="dxa"/>
+        </w:trPr>
+        <w:tc>
+          <w:tcPr>
+            <w:tcW w:w="0" w:type="auto"/>
+            <w:tcBorders>
+              <w:top w:val="single" w:sz="6" w:space="0" w:color="C4C7C5"/>
+              <w:left w:val="single" w:sz="6" w:space="0" w:color="C4C7C5"/>
+              <w:bottom w:val="single" w:sz="6" w:space="0" w:color="C4C7C5"/>
+              <w:right w:val="single" w:sz="6" w:space="0" w:color="C4C7C5"/>
+            </w:tcBorders>
+            <w:tcMar>
+              <w:top w:w="120" w:type="dxa"/>
+              <w:left w:w="180" w:type="dxa"/>
+              <w:bottom w:w="120" w:type="dxa"/>
+              <w:right w:w="180" w:type="dxa"/>
+            </w:tcMar>
+            <w:vAlign w:val="center"/>
+            <w:hideMark/>
+          </w:tcPr>
+          <w:p>
+            <w:pPr>
+              <w:rPr>
+                <w:b/>
+                <w:bCs/>
+              </w:rPr>
+            </w:pPr>
+            <w:r>
+              <w:rPr>
+                <w:b/>
+                <w:bCs/>
+              </w:rPr>
+              <w:t>KI-043</w:t>
+            </w:r>
+          </w:p>
+        </w:tc>
+        <w:tc>
+          <w:tcPr>
+            <w:tcW w:w="0" w:type="auto"/>
+            <w:tcBorders>
+              <w:top w:val="single" w:sz="6" w:space="0" w:color="C4C7C5"/>
+              <w:left w:val="single" w:sz="6" w:space="0" w:color="C4C7C5"/>
+              <w:bottom w:val="single" w:sz="6" w:space="0" w:color="C4C7C5"/>
+              <w:right w:val="single" w:sz="6" w:space="0" w:color="C4C7C5"/>
+            </w:tcBorders>
+            <w:tcMar>
+              <w:top w:w="120" w:type="dxa"/>
+              <w:left w:w="180" w:type="dxa"/>
+              <w:bottom w:w="120" w:type="dxa"/>
+              <w:right w:w="180" w:type="dxa"/>
+            </w:tcMar>
+            <w:vAlign w:val="center"/>
+            <w:hideMark/>
+          </w:tcPr>
+          <w:p>
+            <w:r>
+              <w:t>Users struggle to build confidence using keyboard-driven workflows without visual confirmation.</w:t>
+            </w:r>
+          </w:p>
+        </w:tc>
+        <w:tc>
+          <w:tcPr>
+            <w:tcW w:w="0" w:type="auto"/>
+            <w:tcBorders>
+              <w:top w:val="single" w:sz="6" w:space="0" w:color="C4C7C5"/>
+              <w:left w:val="single" w:sz="6" w:space="0" w:color="C4C7C5"/>
+              <w:bottom w:val="single" w:sz="6" w:space="0" w:color="C4C7C5"/>
+              <w:right w:val="single" w:sz="6" w:space="0" w:color="C4C7C5"/>
+            </w:tcBorders>
+            <w:tcMar>
+              <w:top w:w="120" w:type="dxa"/>
+              <w:left w:w="180" w:type="dxa"/>
+              <w:bottom w:w="120" w:type="dxa"/>
+              <w:right w:w="180" w:type="dxa"/>
+            </w:tcMar>
+            <w:vAlign w:val="center"/>
+            <w:hideMark/>
+          </w:tcPr>
+          <w:p>
+            <w:r>
+              <w:t>Accepted</w:t>
+            </w:r>
+          </w:p>
+        </w:tc>
+      </w:tr>
+      <w:tr>
+        <w:trPr>
+          <w:tblCellSpacing w:w="15" w:type="dxa"/>
+        </w:trPr>
+        <w:tc>
+          <w:tcPr>
+            <w:tcW w:w="0" w:type="auto"/>
+            <w:tcBorders>
+              <w:top w:val="single" w:sz="6" w:space="0" w:color="C4C7C5"/>
+              <w:left w:val="single" w:sz="6" w:space="0" w:color="C4C7C5"/>
+              <w:bottom w:val="single" w:sz="6" w:space="0" w:color="C4C7C5"/>
+              <w:right w:val="single" w:sz="6" w:space="0" w:color="C4C7C5"/>
+            </w:tcBorders>
+            <w:tcMar>
+              <w:top w:w="120" w:type="dxa"/>
+              <w:left w:w="180" w:type="dxa"/>
+              <w:bottom w:w="120" w:type="dxa"/>
+              <w:right w:w="180" w:type="dxa"/>
+            </w:tcMar>
+            <w:vAlign w:val="center"/>
+            <w:hideMark/>
+          </w:tcPr>
+          <w:p>
+            <w:pPr>
+              <w:rPr>
+                <w:b/>
+                <w:bCs/>
+              </w:rPr>
+            </w:pPr>
+            <w:r>
+              <w:rPr>
+                <w:b/>
+                <w:bCs/>
+              </w:rPr>
+              <w:t>KI-044</w:t>
+            </w:r>
+          </w:p>
+        </w:tc>
+        <w:tc>
+          <w:tcPr>
+            <w:tcW w:w="0" w:type="auto"/>
+            <w:tcBorders>
+              <w:top w:val="single" w:sz="6" w:space="0" w:color="C4C7C5"/>
+              <w:left w:val="single" w:sz="6" w:space="0" w:color="C4C7C5"/>
+              <w:bottom w:val="single" w:sz="6" w:space="0" w:color="C4C7C5"/>
+              <w:right w:val="single" w:sz="6" w:space="0" w:color="C4C7C5"/>
+            </w:tcBorders>
+            <w:tcMar>
+              <w:top w:w="120" w:type="dxa"/>
+              <w:left w:w="180" w:type="dxa"/>
+              <w:bottom w:w="120" w:type="dxa"/>
+              <w:right w:w="180" w:type="dxa"/>
+            </w:tcMar>
+            <w:vAlign w:val="center"/>
+            <w:hideMark/>
+          </w:tcPr>
+          <w:p>
+            <w:r>
+              <w:t>Users struggle to memorize command syntax that requires precise keyboard input.</w:t>
+            </w:r>
+          </w:p>
+        </w:tc>
+        <w:tc>
+          <w:tcPr>
+            <w:tcW w:w="0" w:type="auto"/>
+            <w:tcBorders>
+              <w:top w:val="single" w:sz="6" w:space="0" w:color="C4C7C5"/>
+              <w:left w:val="single" w:sz="6" w:space="0" w:color="C4C7C5"/>
+              <w:bottom w:val="single" w:sz="6" w:space="0" w:color="C4C7C5"/>
+              <w:right w:val="single" w:sz="6" w:space="0" w:color="C4C7C5"/>
+            </w:tcBorders>
+            <w:tcMar>
+              <w:top w:w="120" w:type="dxa"/>
+              <w:left w:w="180" w:type="dxa"/>
+              <w:bottom w:w="120" w:type="dxa"/>
+              <w:right w:w="180" w:type="dxa"/>
+            </w:tcMar>
+            <w:vAlign w:val="center"/>
+            <w:hideMark/>
+          </w:tcPr>
+          <w:p>
+            <w:r>
+              <w:t>Accepted</w:t>
+            </w:r>
+          </w:p>
+        </w:tc>
+      </w:tr>
+      <w:tr>
+        <w:trPr>
+          <w:tblCellSpacing w:w="15" w:type="dxa"/>
+        </w:trPr>
+        <w:tc>
+          <w:tcPr>
+            <w:tcW w:w="0" w:type="auto"/>
+            <w:tcBorders>
+              <w:top w:val="single" w:sz="6" w:space="0" w:color="C4C7C5"/>
+              <w:left w:val="single" w:sz="6" w:space="0" w:color="C4C7C5"/>
+              <w:bottom w:val="single" w:sz="6" w:space="0" w:color="C4C7C5"/>
+              <w:right w:val="single" w:sz="6" w:space="0" w:color="C4C7C5"/>
+            </w:tcBorders>
+            <w:tcMar>
+              <w:top w:w="120" w:type="dxa"/>
+              <w:left w:w="180" w:type="dxa"/>
+              <w:bottom w:w="120" w:type="dxa"/>
+              <w:right w:w="180" w:type="dxa"/>
+            </w:tcMar>
+            <w:vAlign w:val="center"/>
+            <w:hideMark/>
+          </w:tcPr>
+          <w:p>
+            <w:pPr>
+              <w:rPr>
+                <w:b/>
+                <w:bCs/>
+              </w:rPr>
+            </w:pPr>
+            <w:r>
+              <w:rPr>
+                <w:b/>
+                <w:bCs/>
+              </w:rPr>
+              <w:t>KI-045</w:t>
+            </w:r>
+          </w:p>
+        </w:tc>
+        <w:tc>
+          <w:tcPr>
+            <w:tcW w:w="0" w:type="auto"/>
+            <w:tcBorders>
+              <w:top w:val="single" w:sz="6" w:space="0" w:color="C4C7C5"/>
+              <w:left w:val="single" w:sz="6" w:space="0" w:color="C4C7C5"/>
+              <w:bottom w:val="single" w:sz="6" w:space="0" w:color="C4C7C5"/>
+              <w:right w:val="single" w:sz="6" w:space="0" w:color="C4C7C5"/>
+            </w:tcBorders>
+            <w:tcMar>
+              <w:top w:w="120" w:type="dxa"/>
+              <w:left w:w="180" w:type="dxa"/>
+              <w:bottom w:w="120" w:type="dxa"/>
+              <w:right w:w="180" w:type="dxa"/>
+            </w:tcMar>
+            <w:vAlign w:val="center"/>
+            <w:hideMark/>
+          </w:tcPr>
+          <w:p>
+            <w:r>
+              <w:t>Users struggle to combine typing, navigation, and shortcut execution into a continuous workflow.</w:t>
+            </w:r>
+          </w:p>
+        </w:tc>
+        <w:tc>
+          <w:tcPr>
+            <w:tcW w:w="0" w:type="auto"/>
+            <w:tcBorders>
+              <w:top w:val="single" w:sz="6" w:space="0" w:color="C4C7C5"/>
+              <w:left w:val="single" w:sz="6" w:space="0" w:color="C4C7C5"/>
+              <w:bottom w:val="single" w:sz="6" w:space="0" w:color="C4C7C5"/>
+              <w:right w:val="single" w:sz="6" w:space="0" w:color="C4C7C5"/>
+            </w:tcBorders>
+            <w:tcMar>
+              <w:top w:w="120" w:type="dxa"/>
+              <w:left w:w="180" w:type="dxa"/>
+              <w:bottom w:w="120" w:type="dxa"/>
+              <w:right w:w="180" w:type="dxa"/>
+            </w:tcMar>
+            <w:vAlign w:val="center"/>
+            <w:hideMark/>
+          </w:tcPr>
+          <w:p>
+            <w:r>
+              <w:t>Accepted</w:t>
+            </w:r>
+          </w:p>
+        </w:tc>
+      </w:tr>
+      <w:tr>
+        <w:trPr>
+          <w:tblCellSpacing w:w="15" w:type="dxa"/>
+        </w:trPr>
+        <w:tc>
+          <w:tcPr>
+            <w:tcW w:w="0" w:type="auto"/>
+            <w:tcBorders>
+              <w:top w:val="single" w:sz="6" w:space="0" w:color="C4C7C5"/>
+              <w:left w:val="single" w:sz="6" w:space="0" w:color="C4C7C5"/>
+              <w:bottom w:val="single" w:sz="6" w:space="0" w:color="C4C7C5"/>
+              <w:right w:val="single" w:sz="6" w:space="0" w:color="C4C7C5"/>
+            </w:tcBorders>
+            <w:tcMar>
+              <w:top w:w="120" w:type="dxa"/>
+              <w:left w:w="180" w:type="dxa"/>
+              <w:bottom w:w="120" w:type="dxa"/>
+              <w:right w:w="180" w:type="dxa"/>
+            </w:tcMar>
+            <w:vAlign w:val="center"/>
+            <w:hideMark/>
+          </w:tcPr>
+          <w:p>
+            <w:pPr>
+              <w:rPr>
+                <w:b/>
+                <w:bCs/>
+              </w:rPr>
+            </w:pPr>
+            <w:r>
+              <w:rPr>
+                <w:b/>
+                <w:bCs/>
+              </w:rPr>
+              <w:lastRenderedPageBreak/>
+              <w:t>KI-046</w:t>
+            </w:r>
+          </w:p>
+        </w:tc>
+        <w:tc>
+          <w:tcPr>
+            <w:tcW w:w="0" w:type="auto"/>
+            <w:tcBorders>
+              <w:top w:val="single" w:sz="6" w:space="0" w:color="C4C7C5"/>
+              <w:left w:val="single" w:sz="6" w:space="0" w:color="C4C7C5"/>
+              <w:bottom w:val="single" w:sz="6" w:space="0" w:color="C4C7C5"/>
+              <w:right w:val="single" w:sz="6" w:space="0" w:color="C4C7C5"/>
+            </w:tcBorders>
+            <w:tcMar>
+              <w:top w:w="120" w:type="dxa"/>
+              <w:left w:w="180" w:type="dxa"/>
+              <w:bottom w:w="120" w:type="dxa"/>
+              <w:right w:w="180" w:type="dxa"/>
+            </w:tcMar>
+            <w:vAlign w:val="center"/>
+            <w:hideMark/>
+          </w:tcPr>
+          <w:p>
+            <w:r>
+              <w:t>Users struggle to transition from beginner keyboard usage to expert keyboard usage.</w:t>
+            </w:r>
+          </w:p>
+        </w:tc>
+        <w:tc>
+          <w:tcPr>
+            <w:tcW w:w="0" w:type="auto"/>
+            <w:tcBorders>
+              <w:top w:val="single" w:sz="6" w:space="0" w:color="C4C7C5"/>
+              <w:left w:val="single" w:sz="6" w:space="0" w:color="C4C7C5"/>
+              <w:bottom w:val="single" w:sz="6" w:space="0" w:color="C4C7C5"/>
+              <w:right w:val="single" w:sz="6" w:space="0" w:color="C4C7C5"/>
+            </w:tcBorders>
+            <w:tcMar>
+              <w:top w:w="120" w:type="dxa"/>
+              <w:left w:w="180" w:type="dxa"/>
+              <w:bottom w:w="120" w:type="dxa"/>
+              <w:right w:w="180" w:type="dxa"/>
+            </w:tcMar>
+            <w:vAlign w:val="center"/>
+            <w:hideMark/>
+          </w:tcPr>
+          <w:p>
+            <w:r>
+              <w:t>Accepted</w:t>
+            </w:r>
+          </w:p>
+        </w:tc>
+      </w:tr>
+      <w:tr>
+        <w:trPr>
+          <w:tblCellSpacing w:w="15" w:type="dxa"/>
+        </w:trPr>
+        <w:tc>
+          <w:tcPr>
+            <w:tcW w:w="0" w:type="auto"/>
+            <w:tcBorders>
+              <w:top w:val="single" w:sz="6" w:space="0" w:color="C4C7C5"/>
+              <w:left w:val="single" w:sz="6" w:space="0" w:color="C4C7C5"/>
+              <w:bottom w:val="single" w:sz="6" w:space="0" w:color="C4C7C5"/>
+              <w:right w:val="single" w:sz="6" w:space="0" w:color="C4C7C5"/>
+            </w:tcBorders>
+            <w:tcMar>
+              <w:top w:w="120" w:type="dxa"/>
+              <w:left w:w="180" w:type="dxa"/>
+              <w:bottom w:w="120" w:type="dxa"/>
+              <w:right w:w="180" w:type="dxa"/>
+            </w:tcMar>
+            <w:vAlign w:val="center"/>
+            <w:hideMark/>
+          </w:tcPr>
+          <w:p>
+            <w:pPr>
+              <w:rPr>
+                <w:b/>
+                <w:bCs/>
+              </w:rPr>
+            </w:pPr>
+            <w:r>
+              <w:rPr>
+                <w:b/>
+                <w:bCs/>
+              </w:rPr>
+              <w:t>KI-047</w:t>
+            </w:r>
+          </w:p>
+        </w:tc>
+        <w:tc>
+          <w:tcPr>
+            <w:tcW w:w="0" w:type="auto"/>
+            <w:tcBorders>
+              <w:top w:val="single" w:sz="6" w:space="0" w:color="C4C7C5"/>
+              <w:left w:val="single" w:sz="6" w:space="0" w:color="C4C7C5"/>
+              <w:bottom w:val="single" w:sz="6" w:space="0" w:color="C4C7C5"/>
+              <w:right w:val="single" w:sz="6" w:space="0" w:color="C4C7C5"/>
+            </w:tcBorders>
+            <w:tcMar>
+              <w:top w:w="120" w:type="dxa"/>
+              <w:left w:w="180" w:type="dxa"/>
+              <w:bottom w:w="120" w:type="dxa"/>
+              <w:right w:w="180" w:type="dxa"/>
+            </w:tcMar>
+            <w:vAlign w:val="center"/>
+            <w:hideMark/>
+          </w:tcPr>
+          <w:p>
+            <w:r>
+              <w:t>Users struggle to replace long-established keyboard habits with more efficient techniques.</w:t>
+            </w:r>
+          </w:p>
+        </w:tc>
+        <w:tc>
+          <w:tcPr>
+            <w:tcW w:w="0" w:type="auto"/>
+            <w:tcBorders>
+              <w:top w:val="single" w:sz="6" w:space="0" w:color="C4C7C5"/>
+              <w:left w:val="single" w:sz="6" w:space="0" w:color="C4C7C5"/>
+              <w:bottom w:val="single" w:sz="6" w:space="0" w:color="C4C7C5"/>
+              <w:right w:val="single" w:sz="6" w:space="0" w:color="C4C7C5"/>
+            </w:tcBorders>
+            <w:tcMar>
+              <w:top w:w="120" w:type="dxa"/>
+              <w:left w:w="180" w:type="dxa"/>
+              <w:bottom w:w="120" w:type="dxa"/>
+              <w:right w:w="180" w:type="dxa"/>
+            </w:tcMar>
+            <w:vAlign w:val="center"/>
+            <w:hideMark/>
+          </w:tcPr>
+          <w:p>
+            <w:r>
+              <w:t>Accepted</w:t>
+            </w:r>
+          </w:p>
+        </w:tc>
+      </w:tr>
+      <w:tr>
+        <w:trPr>
+          <w:tblCellSpacing w:w="15" w:type="dxa"/>
+        </w:trPr>
+        <w:tc>
+          <w:tcPr>
+            <w:tcW w:w="0" w:type="auto"/>
+            <w:tcBorders>
+              <w:top w:val="single" w:sz="6" w:space="0" w:color="C4C7C5"/>
+              <w:left w:val="single" w:sz="6" w:space="0" w:color="C4C7C5"/>
+              <w:bottom w:val="single" w:sz="6" w:space="0" w:color="C4C7C5"/>
+              <w:right w:val="single" w:sz="6" w:space="0" w:color="C4C7C5"/>
+            </w:tcBorders>
+            <w:tcMar>
+              <w:top w:w="120" w:type="dxa"/>
+              <w:left w:w="180" w:type="dxa"/>
+              <w:bottom w:w="120" w:type="dxa"/>
+              <w:right w:w="180" w:type="dxa"/>
+            </w:tcMar>
+            <w:vAlign w:val="center"/>
+            <w:hideMark/>
+          </w:tcPr>
+          <w:p>
+            <w:pPr>
+              <w:rPr>
+                <w:b/>
+                <w:bCs/>
+              </w:rPr>
+            </w:pPr>
+            <w:r>
+              <w:rPr>
+                <w:b/>
+                <w:bCs/>
+              </w:rPr>
+              <w:t>KI-048</w:t>
+            </w:r>
+          </w:p>
+        </w:tc>
+        <w:tc>
+          <w:tcPr>
+            <w:tcW w:w="0" w:type="auto"/>
+            <w:tcBorders>
+              <w:top w:val="single" w:sz="6" w:space="0" w:color="C4C7C5"/>
+              <w:left w:val="single" w:sz="6" w:space="0" w:color="C4C7C5"/>
+              <w:bottom w:val="single" w:sz="6" w:space="0" w:color="C4C7C5"/>
+              <w:right w:val="single" w:sz="6" w:space="0" w:color="C4C7C5"/>
+            </w:tcBorders>
+            <w:tcMar>
+              <w:top w:w="120" w:type="dxa"/>
+              <w:left w:w="180" w:type="dxa"/>
+              <w:bottom w:w="120" w:type="dxa"/>
+              <w:right w:w="180" w:type="dxa"/>
+            </w:tcMar>
+            <w:vAlign w:val="center"/>
+            <w:hideMark/>
+          </w:tcPr>
+          <w:p>
+            <w:r>
+              <w:t>Users struggle to understand why keyboard behavior changes between applications and development environments.</w:t>
+            </w:r>
+          </w:p>
+        </w:tc>
+        <w:tc>
+          <w:tcPr>
+            <w:tcW w:w="0" w:type="auto"/>
+            <w:tcBorders>
+              <w:top w:val="single" w:sz="6" w:space="0" w:color="C4C7C5"/>
+              <w:left w:val="single" w:sz="6" w:space="0" w:color="C4C7C5"/>
+              <w:bottom w:val="single" w:sz="6" w:space="0" w:color="C4C7C5"/>
+              <w:right w:val="single" w:sz="6" w:space="0" w:color="C4C7C5"/>
+            </w:tcBorders>
+            <w:tcMar>
+              <w:top w:w="120" w:type="dxa"/>
+              <w:left w:w="180" w:type="dxa"/>
+              <w:bottom w:w="120" w:type="dxa"/>
+              <w:right w:w="180" w:type="dxa"/>
+            </w:tcMar>
+            <w:vAlign w:val="center"/>
+            <w:hideMark/>
+          </w:tcPr>
+          <w:p>
+            <w:r>
+              <w:t>Accepted</w:t>
+            </w:r>
+          </w:p>
+        </w:tc>
+      </w:tr>
+      <w:tr>
+        <w:trPr>
+          <w:tblCellSpacing w:w="15" w:type="dxa"/>
+        </w:trPr>
+        <w:tc>
+          <w:tcPr>
+            <w:tcW w:w="0" w:type="auto"/>
+            <w:tcBorders>
+              <w:top w:val="single" w:sz="6" w:space="0" w:color="C4C7C5"/>
+              <w:left w:val="single" w:sz="6" w:space="0" w:color="C4C7C5"/>
+              <w:bottom w:val="single" w:sz="6" w:space="0" w:color="C4C7C5"/>
+              <w:right w:val="single" w:sz="6" w:space="0" w:color="C4C7C5"/>
+            </w:tcBorders>
+            <w:tcMar>
+              <w:top w:w="120" w:type="dxa"/>
+              <w:left w:w="180" w:type="dxa"/>
+              <w:bottom w:w="120" w:type="dxa"/>
+              <w:right w:w="180" w:type="dxa"/>
+            </w:tcMar>
+            <w:vAlign w:val="center"/>
+            <w:hideMark/>
+          </w:tcPr>
+          <w:p>
+            <w:pPr>
+              <w:rPr>
+                <w:b/>
+                <w:bCs/>
+              </w:rPr>
+            </w:pPr>
+            <w:r>
+              <w:rPr>
+                <w:b/>
+                <w:bCs/>
+              </w:rPr>
+              <w:t>KI-049</w:t>
+            </w:r>
+          </w:p>
+        </w:tc>
+        <w:tc>
+          <w:tcPr>
+            <w:tcW w:w="0" w:type="auto"/>
+            <w:tcBorders>
+              <w:top w:val="single" w:sz="6" w:space="0" w:color="C4C7C5"/>
+              <w:left w:val="single" w:sz="6" w:space="0" w:color="C4C7C5"/>
+              <w:bottom w:val="single" w:sz="6" w:space="0" w:color="C4C7C5"/>
+              <w:right w:val="single" w:sz="6" w:space="0" w:color="C4C7C5"/>
+            </w:tcBorders>
+            <w:tcMar>
+              <w:top w:w="120" w:type="dxa"/>
+              <w:left w:w="180" w:type="dxa"/>
+              <w:bottom w:w="120" w:type="dxa"/>
+              <w:right w:w="180" w:type="dxa"/>
+            </w:tcMar>
+            <w:vAlign w:val="center"/>
+            <w:hideMark/>
+          </w:tcPr>
+          <w:p>
+            <w:r>
+              <w:t>Users struggle to maintain efficient keyboard usage as software complexity and available shortcuts increase.</w:t>
+            </w:r>
+          </w:p>
+        </w:tc>
+        <w:tc>
+          <w:tcPr>
+            <w:tcW w:w="0" w:type="auto"/>
+            <w:tcBorders>
+              <w:top w:val="single" w:sz="6" w:space="0" w:color="C4C7C5"/>
+              <w:left w:val="single" w:sz="6" w:space="0" w:color="C4C7C5"/>
+              <w:bottom w:val="single" w:sz="6" w:space="0" w:color="C4C7C5"/>
+              <w:right w:val="single" w:sz="6" w:space="0" w:color="C4C7C5"/>
+            </w:tcBorders>
+            <w:tcMar>
+              <w:top w:w="120" w:type="dxa"/>
+              <w:left w:w="180" w:type="dxa"/>
+              <w:bottom w:w="120" w:type="dxa"/>
+              <w:right w:w="180" w:type="dxa"/>
+            </w:tcMar>
+            <w:vAlign w:val="center"/>
+            <w:hideMark/>
+          </w:tcPr>
+          <w:p>
+            <w:r>
+              <w:t>Accepted</w:t>
+            </w:r>
+          </w:p>
+        </w:tc>
+      </w:tr>
+      <w:tr>
+        <w:trPr>
+          <w:tblCellSpacing w:w="15" w:type="dxa"/>
+        </w:trPr>
+        <w:tc>
+          <w:tcPr>
+            <w:tcW w:w="0" w:type="auto"/>
+            <w:tcBorders>
+              <w:top w:val="single" w:sz="6" w:space="0" w:color="C4C7C5"/>
+              <w:left w:val="single" w:sz="6" w:space="0" w:color="C4C7C5"/>
+              <w:bottom w:val="single" w:sz="6" w:space="0" w:color="C4C7C5"/>
+              <w:right w:val="single" w:sz="6" w:space="0" w:color="C4C7C5"/>
+            </w:tcBorders>
+            <w:tcMar>
+              <w:top w:w="120" w:type="dxa"/>
+              <w:left w:w="180" w:type="dxa"/>
+              <w:bottom w:w="120" w:type="dxa"/>
+              <w:right w:w="180" w:type="dxa"/>
+            </w:tcMar>
+            <w:vAlign w:val="center"/>
+            <w:hideMark/>
+          </w:tcPr>
+          <w:p>
+            <w:pPr>
+              <w:rPr>
+                <w:b/>
+                <w:bCs/>
+              </w:rPr>
+            </w:pPr>
+            <w:r>
+              <w:rPr>
+                <w:b/>
+                <w:bCs/>
+              </w:rPr>
+              <w:t>KI-050</w:t>
+            </w:r>
+          </w:p>
+        </w:tc>
+        <w:tc>
+          <w:tcPr>
+            <w:tcW w:w="0" w:type="auto"/>
+            <w:tcBorders>
+              <w:top w:val="single" w:sz="6" w:space="0" w:color="C4C7C5"/>
+              <w:left w:val="single" w:sz="6" w:space="0" w:color="C4C7C5"/>
+              <w:bottom w:val="single" w:sz="6" w:space="0" w:color="C4C7C5"/>
+              <w:right w:val="single" w:sz="6" w:space="0" w:color="C4C7C5"/>
+            </w:tcBorders>
+            <w:tcMar>
+              <w:top w:w="120" w:type="dxa"/>
+              <w:left w:w="180" w:type="dxa"/>
+              <w:bottom w:w="120" w:type="dxa"/>
+              <w:right w:w="180" w:type="dxa"/>
+            </w:tcMar>
+            <w:vAlign w:val="center"/>
+            <w:hideMark/>
+          </w:tcPr>
+          <w:p>
+            <w:r>
+              <w:t>Users gradually develop personalized keyboard interaction habits that differ from standard usage while adapting to their own workflows.</w:t>
+            </w:r>
+          </w:p>
+        </w:tc>
+        <w:tc>
+          <w:tcPr>
+            <w:tcW w:w="0" w:type="auto"/>
+            <w:tcBorders>
+              <w:top w:val="single" w:sz="6" w:space="0" w:color="C4C7C5"/>
+              <w:left w:val="single" w:sz="6" w:space="0" w:color="C4C7C5"/>
+              <w:bottom w:val="single" w:sz="6" w:space="0" w:color="C4C7C5"/>
+              <w:right w:val="single" w:sz="6" w:space="0" w:color="C4C7C5"/>
+            </w:tcBorders>
+            <w:tcMar>
+              <w:top w:w="120" w:type="dxa"/>
+              <w:left w:w="180" w:type="dxa"/>
+              <w:bottom w:w="120" w:type="dxa"/>
+              <w:right w:w="180" w:type="dxa"/>
+            </w:tcMar>
+            <w:vAlign w:val="center"/>
+            <w:hideMark/>
+          </w:tcPr>
+          <w:p>
+            <w:r>
+              <w:t>Accepted</w:t>
+            </w:r>
+          </w:p>
+        </w:tc>
+      </w:tr>
+    </w:tbl>
+    <w:p>
+      <w:pPr>
+        <w:rPr>
+          <w:b/>
+          <w:bCs/>
+        </w:rPr>
+      </w:pPr>
+    </w:p>
+    <w:p>
+      <w:pPr>
+        <w:rPr>
+          <w:b/>
+          <w:bCs/>
+        </w:rPr>
+      </w:pPr>
+    </w:p>
+    <w:p>
+      <w:pPr>
+        <w:rPr>
+          <w:b/>
+          <w:bCs/>
+        </w:rPr>
+      </w:pPr>
+    </w:p>
     <w:p>
       <w:pPr>
         <w:rPr>
@@ -19974,7 +24512,7 @@
           </w:tcPr>
           <w:p>
             <w:r>
-              <w:t>4</w:t>
+              <w:t>5</w:t>
             </w:r>
           </w:p>
         </w:tc>
@@ -20031,64 +24569,70 @@
           </w:tcPr>
           <w:p>
             <w:r>
-              <w:t>200</w:t>
-            </w:r>
-          </w:p>
-        </w:tc>
-      </w:tr>
-      <w:tr>
-        <w:trPr>
-          <w:tblCellSpacing w:w="15" w:type="dxa"/>
-        </w:trPr>
-        <w:tc>
-          <w:tcPr>
-            <w:tcW w:w="0" w:type="auto"/>
-            <w:tcBorders>
-              <w:top w:val="single" w:sz="6" w:space="0" w:color="C4C7C5"/>
-              <w:left w:val="single" w:sz="6" w:space="0" w:color="C4C7C5"/>
-              <w:bottom w:val="single" w:sz="6" w:space="0" w:color="C4C7C5"/>
-              <w:right w:val="single" w:sz="6" w:space="0" w:color="C4C7C5"/>
-            </w:tcBorders>
-            <w:tcMar>
-              <w:top w:w="120" w:type="dxa"/>
-              <w:left w:w="180" w:type="dxa"/>
-              <w:bottom w:w="120" w:type="dxa"/>
-              <w:right w:w="180" w:type="dxa"/>
-            </w:tcMar>
-            <w:vAlign w:val="center"/>
-            <w:hideMark/>
-          </w:tcPr>
-          <w:p>
-            <w:r>
-              <w:rPr>
-                <w:b/>
-                <w:bCs/>
-              </w:rPr>
-              <w:t>Accepted</w:t>
-            </w:r>
-          </w:p>
-        </w:tc>
-        <w:tc>
-          <w:tcPr>
-            <w:tcW w:w="0" w:type="auto"/>
-            <w:tcBorders>
-              <w:top w:val="single" w:sz="6" w:space="0" w:color="C4C7C5"/>
-              <w:left w:val="single" w:sz="6" w:space="0" w:color="C4C7C5"/>
-              <w:bottom w:val="single" w:sz="6" w:space="0" w:color="C4C7C5"/>
-              <w:right w:val="single" w:sz="6" w:space="0" w:color="C4C7C5"/>
-            </w:tcBorders>
-            <w:tcMar>
-              <w:top w:w="120" w:type="dxa"/>
-              <w:left w:w="180" w:type="dxa"/>
-              <w:bottom w:w="120" w:type="dxa"/>
-              <w:right w:w="180" w:type="dxa"/>
-            </w:tcMar>
-            <w:vAlign w:val="center"/>
-            <w:hideMark/>
-          </w:tcPr>
-          <w:p>
-            <w:r>
-              <w:t>200</w:t>
+              <w:t>2</w:t>
+            </w:r>
+            <w:r>
+              <w:t>75</w:t>
+            </w:r>
+          </w:p>
+        </w:tc>
+      </w:tr>
+      <w:tr>
+        <w:trPr>
+          <w:tblCellSpacing w:w="15" w:type="dxa"/>
+        </w:trPr>
+        <w:tc>
+          <w:tcPr>
+            <w:tcW w:w="0" w:type="auto"/>
+            <w:tcBorders>
+              <w:top w:val="single" w:sz="6" w:space="0" w:color="C4C7C5"/>
+              <w:left w:val="single" w:sz="6" w:space="0" w:color="C4C7C5"/>
+              <w:bottom w:val="single" w:sz="6" w:space="0" w:color="C4C7C5"/>
+              <w:right w:val="single" w:sz="6" w:space="0" w:color="C4C7C5"/>
+            </w:tcBorders>
+            <w:tcMar>
+              <w:top w:w="120" w:type="dxa"/>
+              <w:left w:w="180" w:type="dxa"/>
+              <w:bottom w:w="120" w:type="dxa"/>
+              <w:right w:w="180" w:type="dxa"/>
+            </w:tcMar>
+            <w:vAlign w:val="center"/>
+            <w:hideMark/>
+          </w:tcPr>
+          <w:p>
+            <w:r>
+              <w:rPr>
+                <w:b/>
+                <w:bCs/>
+              </w:rPr>
+              <w:t>Accepted</w:t>
+            </w:r>
+          </w:p>
+        </w:tc>
+        <w:tc>
+          <w:tcPr>
+            <w:tcW w:w="0" w:type="auto"/>
+            <w:tcBorders>
+              <w:top w:val="single" w:sz="6" w:space="0" w:color="C4C7C5"/>
+              <w:left w:val="single" w:sz="6" w:space="0" w:color="C4C7C5"/>
+              <w:bottom w:val="single" w:sz="6" w:space="0" w:color="C4C7C5"/>
+              <w:right w:val="single" w:sz="6" w:space="0" w:color="C4C7C5"/>
+            </w:tcBorders>
+            <w:tcMar>
+              <w:top w:w="120" w:type="dxa"/>
+              <w:left w:w="180" w:type="dxa"/>
+              <w:bottom w:w="120" w:type="dxa"/>
+              <w:right w:w="180" w:type="dxa"/>
+            </w:tcMar>
+            <w:vAlign w:val="center"/>
+            <w:hideMark/>
+          </w:tcPr>
+          <w:p>
+            <w:r>
+              <w:t>2</w:t>
+            </w:r>
+            <w:r>
+              <w:t>75</w:t>
             </w:r>
           </w:p>
         </w:tc>

</xml_diff>